<commit_message>
Add Tetra Pak time-series SSL project
</commit_message>
<xml_diff>
--- a/downloads/student-project-portfolio.docx
+++ b/downloads/student-project-portfolio.docx
@@ -48,7 +48,7 @@
         <w:spacing w:before="0" w:after="80" w:line="254" w:lineRule="auto"/>
       </w:pPr>
       <w:r>
-        <w:t>The portfolio contains sixteen projects in four categories. Each entry states the task, public dataset, starting papers and code, required baselines, evaluation protocol, Bachelor scope and possible Master contribution.</w:t>
+        <w:t>The portfolio contains seventeen projects in four categories. Each entry states the task, data source and access conditions, starting papers and code, required baselines, evaluation protocol, Bachelor scope and possible Master contribution.</w:t>
       </w:r>
     </w:p>
     <w:p>
@@ -1054,177 +1054,7 @@
               <w:spacing w:after="0" w:line="240" w:lineRule="auto"/>
             </w:pPr>
             <w:r>
-              <w:t>Contrastive learning for wearable activity recognition</w:t>
-            </w:r>
-          </w:p>
-        </w:tc>
-        <w:tc>
-          <w:tcPr>
-            <w:tcW w:type="dxa" w:w="2438"/>
-            <w:shd w:fill="F4F6F8"/>
-            <w:tcMar>
-              <w:top w:w="70" w:type="dxa"/>
-              <w:start w:w="110" w:type="dxa"/>
-              <w:bottom w:w="70" w:type="dxa"/>
-              <w:end w:w="110" w:type="dxa"/>
-            </w:tcMar>
-          </w:tcPr>
-          <w:p>
-            <w:pPr>
-              <w:spacing w:after="0" w:line="240" w:lineRule="auto"/>
-            </w:pPr>
-            <w:r>
-              <w:t>Both</w:t>
-            </w:r>
-          </w:p>
-        </w:tc>
-        <w:tc>
-          <w:tcPr>
-            <w:tcW w:type="dxa" w:w="2438"/>
-            <w:shd w:fill="F4F6F8"/>
-            <w:tcMar>
-              <w:top w:w="70" w:type="dxa"/>
-              <w:start w:w="110" w:type="dxa"/>
-              <w:bottom w:w="70" w:type="dxa"/>
-              <w:end w:w="110" w:type="dxa"/>
-            </w:tcMar>
-          </w:tcPr>
-          <w:p>
-            <w:pPr>
-              <w:spacing w:after="0" w:line="240" w:lineRule="auto"/>
-            </w:pPr>
-            <w:r>
-              <w:t>Light</w:t>
-            </w:r>
-          </w:p>
-        </w:tc>
-      </w:tr>
-      <w:tr>
-        <w:trPr>
-          <w:cantSplit/>
-        </w:trPr>
-        <w:tc>
-          <w:tcPr>
-            <w:tcW w:type="dxa" w:w="2438"/>
-            <w:shd w:fill="FFFFFF"/>
-            <w:tcMar>
-              <w:top w:w="70" w:type="dxa"/>
-              <w:start w:w="110" w:type="dxa"/>
-              <w:bottom w:w="70" w:type="dxa"/>
-              <w:end w:w="110" w:type="dxa"/>
-            </w:tcMar>
-          </w:tcPr>
-          <w:p>
-            <w:pPr>
-              <w:spacing w:after="0" w:line="240" w:lineRule="auto"/>
-            </w:pPr>
-            <w:r>
-              <w:t>2.2</w:t>
-            </w:r>
-          </w:p>
-        </w:tc>
-        <w:tc>
-          <w:tcPr>
-            <w:tcW w:type="dxa" w:w="2438"/>
-            <w:shd w:fill="FFFFFF"/>
-            <w:tcMar>
-              <w:top w:w="70" w:type="dxa"/>
-              <w:start w:w="110" w:type="dxa"/>
-              <w:bottom w:w="70" w:type="dxa"/>
-              <w:end w:w="110" w:type="dxa"/>
-            </w:tcMar>
-          </w:tcPr>
-          <w:p>
-            <w:pPr>
-              <w:spacing w:after="0" w:line="240" w:lineRule="auto"/>
-            </w:pPr>
-            <w:r>
-              <w:t>Lead-aware masked learning for 12-lead ECG</w:t>
-            </w:r>
-          </w:p>
-        </w:tc>
-        <w:tc>
-          <w:tcPr>
-            <w:tcW w:type="dxa" w:w="2438"/>
-            <w:shd w:fill="FFFFFF"/>
-            <w:tcMar>
-              <w:top w:w="70" w:type="dxa"/>
-              <w:start w:w="110" w:type="dxa"/>
-              <w:bottom w:w="70" w:type="dxa"/>
-              <w:end w:w="110" w:type="dxa"/>
-            </w:tcMar>
-          </w:tcPr>
-          <w:p>
-            <w:pPr>
-              <w:spacing w:after="0" w:line="240" w:lineRule="auto"/>
-            </w:pPr>
-            <w:r>
-              <w:t>MSc preferred</w:t>
-            </w:r>
-          </w:p>
-        </w:tc>
-        <w:tc>
-          <w:tcPr>
-            <w:tcW w:type="dxa" w:w="2438"/>
-            <w:shd w:fill="FFFFFF"/>
-            <w:tcMar>
-              <w:top w:w="70" w:type="dxa"/>
-              <w:start w:w="110" w:type="dxa"/>
-              <w:bottom w:w="70" w:type="dxa"/>
-              <w:end w:w="110" w:type="dxa"/>
-            </w:tcMar>
-          </w:tcPr>
-          <w:p>
-            <w:pPr>
-              <w:spacing w:after="0" w:line="240" w:lineRule="auto"/>
-            </w:pPr>
-            <w:r>
-              <w:t>Moderate</w:t>
-            </w:r>
-          </w:p>
-        </w:tc>
-      </w:tr>
-      <w:tr>
-        <w:trPr>
-          <w:cantSplit/>
-        </w:trPr>
-        <w:tc>
-          <w:tcPr>
-            <w:tcW w:type="dxa" w:w="2438"/>
-            <w:shd w:fill="F4F6F8"/>
-            <w:tcMar>
-              <w:top w:w="70" w:type="dxa"/>
-              <w:start w:w="110" w:type="dxa"/>
-              <w:bottom w:w="70" w:type="dxa"/>
-              <w:end w:w="110" w:type="dxa"/>
-            </w:tcMar>
-          </w:tcPr>
-          <w:p>
-            <w:pPr>
-              <w:spacing w:after="0" w:line="240" w:lineRule="auto"/>
-            </w:pPr>
-            <w:r>
-              <w:t>2.3</w:t>
-            </w:r>
-          </w:p>
-        </w:tc>
-        <w:tc>
-          <w:tcPr>
-            <w:tcW w:type="dxa" w:w="2438"/>
-            <w:shd w:fill="F4F6F8"/>
-            <w:tcMar>
-              <w:top w:w="70" w:type="dxa"/>
-              <w:start w:w="110" w:type="dxa"/>
-              <w:bottom w:w="70" w:type="dxa"/>
-              <w:end w:w="110" w:type="dxa"/>
-            </w:tcMar>
-          </w:tcPr>
-          <w:p>
-            <w:pPr>
-              <w:spacing w:after="0" w:line="240" w:lineRule="auto"/>
-            </w:pPr>
-            <w:r>
-              <w:t>Self-supervised forecasting representations for energy series</w:t>
+              <w:t>Tetra Pak industrial collaboration: Regime-aware self-supervised learning for non-stationary filtration cycles</w:t>
             </w:r>
           </w:p>
         </w:tc>
@@ -1289,7 +1119,7 @@
               <w:spacing w:after="0" w:line="240" w:lineRule="auto"/>
             </w:pPr>
             <w:r>
-              <w:t>2.4</w:t>
+              <w:t>2.2</w:t>
             </w:r>
           </w:p>
         </w:tc>
@@ -1309,7 +1139,7 @@
               <w:spacing w:after="0" w:line="240" w:lineRule="auto"/>
             </w:pPr>
             <w:r>
-              <w:t>Self-supervised learning on heat-pump smart-meter data</w:t>
+              <w:t>Contrastive learning for wearable activity recognition</w:t>
             </w:r>
           </w:p>
         </w:tc>
@@ -1329,7 +1159,7 @@
               <w:spacing w:after="0" w:line="240" w:lineRule="auto"/>
             </w:pPr>
             <w:r>
-              <w:t>Preliminary check</w:t>
+              <w:t>Both</w:t>
             </w:r>
           </w:p>
         </w:tc>
@@ -1349,7 +1179,7 @@
               <w:spacing w:after="0" w:line="240" w:lineRule="auto"/>
             </w:pPr>
             <w:r>
-              <w:t>Light to moderate after preprocessing</w:t>
+              <w:t>Light</w:t>
             </w:r>
           </w:p>
         </w:tc>
@@ -1374,7 +1204,7 @@
               <w:spacing w:after="0" w:line="240" w:lineRule="auto"/>
             </w:pPr>
             <w:r>
-              <w:t>2.5</w:t>
+              <w:t>2.3</w:t>
             </w:r>
           </w:p>
         </w:tc>
@@ -1394,7 +1224,7 @@
               <w:spacing w:after="0" w:line="240" w:lineRule="auto"/>
             </w:pPr>
             <w:r>
-              <w:t>Graph self-supervised learning from vibration signals</w:t>
+              <w:t>Lead-aware masked learning for 12-lead ECG</w:t>
             </w:r>
           </w:p>
         </w:tc>
@@ -1434,7 +1264,7 @@
               <w:spacing w:after="0" w:line="240" w:lineRule="auto"/>
             </w:pPr>
             <w:r>
-              <w:t>Moderate preprocessing</w:t>
+              <w:t>Moderate</w:t>
             </w:r>
           </w:p>
         </w:tc>
@@ -1459,7 +1289,7 @@
               <w:spacing w:after="0" w:line="240" w:lineRule="auto"/>
             </w:pPr>
             <w:r>
-              <w:t>3.1</w:t>
+              <w:t>2.4</w:t>
             </w:r>
           </w:p>
         </w:tc>
@@ -1479,177 +1309,7 @@
               <w:spacing w:after="0" w:line="240" w:lineRule="auto"/>
             </w:pPr>
             <w:r>
-              <w:t>Inductive sensor embeddings for STAEformer</w:t>
-            </w:r>
-          </w:p>
-        </w:tc>
-        <w:tc>
-          <w:tcPr>
-            <w:tcW w:type="dxa" w:w="2438"/>
-            <w:shd w:fill="FFFFFF"/>
-            <w:tcMar>
-              <w:top w:w="70" w:type="dxa"/>
-              <w:start w:w="110" w:type="dxa"/>
-              <w:bottom w:w="70" w:type="dxa"/>
-              <w:end w:w="110" w:type="dxa"/>
-            </w:tcMar>
-          </w:tcPr>
-          <w:p>
-            <w:pPr>
-              <w:spacing w:after="0" w:line="240" w:lineRule="auto"/>
-            </w:pPr>
-            <w:r>
-              <w:t>MSc preferred</w:t>
-            </w:r>
-          </w:p>
-        </w:tc>
-        <w:tc>
-          <w:tcPr>
-            <w:tcW w:type="dxa" w:w="2438"/>
-            <w:shd w:fill="FFFFFF"/>
-            <w:tcMar>
-              <w:top w:w="70" w:type="dxa"/>
-              <w:start w:w="110" w:type="dxa"/>
-              <w:bottom w:w="70" w:type="dxa"/>
-              <w:end w:w="110" w:type="dxa"/>
-            </w:tcMar>
-          </w:tcPr>
-          <w:p>
-            <w:pPr>
-              <w:spacing w:after="0" w:line="240" w:lineRule="auto"/>
-            </w:pPr>
-            <w:r>
-              <w:t>Moderate</w:t>
-            </w:r>
-          </w:p>
-        </w:tc>
-      </w:tr>
-      <w:tr>
-        <w:trPr>
-          <w:cantSplit/>
-        </w:trPr>
-        <w:tc>
-          <w:tcPr>
-            <w:tcW w:type="dxa" w:w="2438"/>
-            <w:shd w:fill="F4F6F8"/>
-            <w:tcMar>
-              <w:top w:w="70" w:type="dxa"/>
-              <w:start w:w="110" w:type="dxa"/>
-              <w:bottom w:w="70" w:type="dxa"/>
-              <w:end w:w="110" w:type="dxa"/>
-            </w:tcMar>
-          </w:tcPr>
-          <w:p>
-            <w:pPr>
-              <w:spacing w:after="0" w:line="240" w:lineRule="auto"/>
-            </w:pPr>
-            <w:r>
-              <w:t>3.2</w:t>
-            </w:r>
-          </w:p>
-        </w:tc>
-        <w:tc>
-          <w:tcPr>
-            <w:tcW w:type="dxa" w:w="2438"/>
-            <w:shd w:fill="F4F6F8"/>
-            <w:tcMar>
-              <w:top w:w="70" w:type="dxa"/>
-              <w:start w:w="110" w:type="dxa"/>
-              <w:bottom w:w="70" w:type="dxa"/>
-              <w:end w:w="110" w:type="dxa"/>
-            </w:tcMar>
-          </w:tcPr>
-          <w:p>
-            <w:pPr>
-              <w:spacing w:after="0" w:line="240" w:lineRule="auto"/>
-            </w:pPr>
-            <w:r>
-              <w:t>Inductive evaluation of GRACE</w:t>
-            </w:r>
-          </w:p>
-        </w:tc>
-        <w:tc>
-          <w:tcPr>
-            <w:tcW w:type="dxa" w:w="2438"/>
-            <w:shd w:fill="F4F6F8"/>
-            <w:tcMar>
-              <w:top w:w="70" w:type="dxa"/>
-              <w:start w:w="110" w:type="dxa"/>
-              <w:bottom w:w="70" w:type="dxa"/>
-              <w:end w:w="110" w:type="dxa"/>
-            </w:tcMar>
-          </w:tcPr>
-          <w:p>
-            <w:pPr>
-              <w:spacing w:after="0" w:line="240" w:lineRule="auto"/>
-            </w:pPr>
-            <w:r>
-              <w:t>Both</w:t>
-            </w:r>
-          </w:p>
-        </w:tc>
-        <w:tc>
-          <w:tcPr>
-            <w:tcW w:type="dxa" w:w="2438"/>
-            <w:shd w:fill="F4F6F8"/>
-            <w:tcMar>
-              <w:top w:w="70" w:type="dxa"/>
-              <w:start w:w="110" w:type="dxa"/>
-              <w:bottom w:w="70" w:type="dxa"/>
-              <w:end w:w="110" w:type="dxa"/>
-            </w:tcMar>
-          </w:tcPr>
-          <w:p>
-            <w:pPr>
-              <w:spacing w:after="0" w:line="240" w:lineRule="auto"/>
-            </w:pPr>
-            <w:r>
-              <w:t>Very light</w:t>
-            </w:r>
-          </w:p>
-        </w:tc>
-      </w:tr>
-      <w:tr>
-        <w:trPr>
-          <w:cantSplit/>
-        </w:trPr>
-        <w:tc>
-          <w:tcPr>
-            <w:tcW w:type="dxa" w:w="2438"/>
-            <w:shd w:fill="FFFFFF"/>
-            <w:tcMar>
-              <w:top w:w="70" w:type="dxa"/>
-              <w:start w:w="110" w:type="dxa"/>
-              <w:bottom w:w="70" w:type="dxa"/>
-              <w:end w:w="110" w:type="dxa"/>
-            </w:tcMar>
-          </w:tcPr>
-          <w:p>
-            <w:pPr>
-              <w:spacing w:after="0" w:line="240" w:lineRule="auto"/>
-            </w:pPr>
-            <w:r>
-              <w:t>3.3</w:t>
-            </w:r>
-          </w:p>
-        </w:tc>
-        <w:tc>
-          <w:tcPr>
-            <w:tcW w:type="dxa" w:w="2438"/>
-            <w:shd w:fill="FFFFFF"/>
-            <w:tcMar>
-              <w:top w:w="70" w:type="dxa"/>
-              <w:start w:w="110" w:type="dxa"/>
-              <w:bottom w:w="70" w:type="dxa"/>
-              <w:end w:w="110" w:type="dxa"/>
-            </w:tcMar>
-          </w:tcPr>
-          <w:p>
-            <w:pPr>
-              <w:spacing w:after="0" w:line="240" w:lineRule="auto"/>
-            </w:pPr>
-            <w:r>
-              <w:t>Structure-aware augmentations for graph contrastive learning</w:t>
+              <w:t>Self-supervised forecasting representations for energy series</w:t>
             </w:r>
           </w:p>
         </w:tc>
@@ -1714,7 +1374,7 @@
               <w:spacing w:after="0" w:line="240" w:lineRule="auto"/>
             </w:pPr>
             <w:r>
-              <w:t>3.4</w:t>
+              <w:t>2.5</w:t>
             </w:r>
           </w:p>
         </w:tc>
@@ -1734,7 +1394,177 @@
               <w:spacing w:after="0" w:line="240" w:lineRule="auto"/>
             </w:pPr>
             <w:r>
-              <w:t>Compute-aware routing between GraphGPS branches</w:t>
+              <w:t>Self-supervised learning on heat-pump smart-meter data</w:t>
+            </w:r>
+          </w:p>
+        </w:tc>
+        <w:tc>
+          <w:tcPr>
+            <w:tcW w:type="dxa" w:w="2438"/>
+            <w:shd w:fill="F4F6F8"/>
+            <w:tcMar>
+              <w:top w:w="70" w:type="dxa"/>
+              <w:start w:w="110" w:type="dxa"/>
+              <w:bottom w:w="70" w:type="dxa"/>
+              <w:end w:w="110" w:type="dxa"/>
+            </w:tcMar>
+          </w:tcPr>
+          <w:p>
+            <w:pPr>
+              <w:spacing w:after="0" w:line="240" w:lineRule="auto"/>
+            </w:pPr>
+            <w:r>
+              <w:t>Preliminary check</w:t>
+            </w:r>
+          </w:p>
+        </w:tc>
+        <w:tc>
+          <w:tcPr>
+            <w:tcW w:type="dxa" w:w="2438"/>
+            <w:shd w:fill="F4F6F8"/>
+            <w:tcMar>
+              <w:top w:w="70" w:type="dxa"/>
+              <w:start w:w="110" w:type="dxa"/>
+              <w:bottom w:w="70" w:type="dxa"/>
+              <w:end w:w="110" w:type="dxa"/>
+            </w:tcMar>
+          </w:tcPr>
+          <w:p>
+            <w:pPr>
+              <w:spacing w:after="0" w:line="240" w:lineRule="auto"/>
+            </w:pPr>
+            <w:r>
+              <w:t>Light to moderate after preprocessing</w:t>
+            </w:r>
+          </w:p>
+        </w:tc>
+      </w:tr>
+      <w:tr>
+        <w:trPr>
+          <w:cantSplit/>
+        </w:trPr>
+        <w:tc>
+          <w:tcPr>
+            <w:tcW w:type="dxa" w:w="2438"/>
+            <w:shd w:fill="FFFFFF"/>
+            <w:tcMar>
+              <w:top w:w="70" w:type="dxa"/>
+              <w:start w:w="110" w:type="dxa"/>
+              <w:bottom w:w="70" w:type="dxa"/>
+              <w:end w:w="110" w:type="dxa"/>
+            </w:tcMar>
+          </w:tcPr>
+          <w:p>
+            <w:pPr>
+              <w:spacing w:after="0" w:line="240" w:lineRule="auto"/>
+            </w:pPr>
+            <w:r>
+              <w:t>2.6</w:t>
+            </w:r>
+          </w:p>
+        </w:tc>
+        <w:tc>
+          <w:tcPr>
+            <w:tcW w:type="dxa" w:w="2438"/>
+            <w:shd w:fill="FFFFFF"/>
+            <w:tcMar>
+              <w:top w:w="70" w:type="dxa"/>
+              <w:start w:w="110" w:type="dxa"/>
+              <w:bottom w:w="70" w:type="dxa"/>
+              <w:end w:w="110" w:type="dxa"/>
+            </w:tcMar>
+          </w:tcPr>
+          <w:p>
+            <w:pPr>
+              <w:spacing w:after="0" w:line="240" w:lineRule="auto"/>
+            </w:pPr>
+            <w:r>
+              <w:t>Graph self-supervised learning from vibration signals</w:t>
+            </w:r>
+          </w:p>
+        </w:tc>
+        <w:tc>
+          <w:tcPr>
+            <w:tcW w:type="dxa" w:w="2438"/>
+            <w:shd w:fill="FFFFFF"/>
+            <w:tcMar>
+              <w:top w:w="70" w:type="dxa"/>
+              <w:start w:w="110" w:type="dxa"/>
+              <w:bottom w:w="70" w:type="dxa"/>
+              <w:end w:w="110" w:type="dxa"/>
+            </w:tcMar>
+          </w:tcPr>
+          <w:p>
+            <w:pPr>
+              <w:spacing w:after="0" w:line="240" w:lineRule="auto"/>
+            </w:pPr>
+            <w:r>
+              <w:t>MSc preferred</w:t>
+            </w:r>
+          </w:p>
+        </w:tc>
+        <w:tc>
+          <w:tcPr>
+            <w:tcW w:type="dxa" w:w="2438"/>
+            <w:shd w:fill="FFFFFF"/>
+            <w:tcMar>
+              <w:top w:w="70" w:type="dxa"/>
+              <w:start w:w="110" w:type="dxa"/>
+              <w:bottom w:w="70" w:type="dxa"/>
+              <w:end w:w="110" w:type="dxa"/>
+            </w:tcMar>
+          </w:tcPr>
+          <w:p>
+            <w:pPr>
+              <w:spacing w:after="0" w:line="240" w:lineRule="auto"/>
+            </w:pPr>
+            <w:r>
+              <w:t>Moderate preprocessing</w:t>
+            </w:r>
+          </w:p>
+        </w:tc>
+      </w:tr>
+      <w:tr>
+        <w:trPr>
+          <w:cantSplit/>
+        </w:trPr>
+        <w:tc>
+          <w:tcPr>
+            <w:tcW w:type="dxa" w:w="2438"/>
+            <w:shd w:fill="F4F6F8"/>
+            <w:tcMar>
+              <w:top w:w="70" w:type="dxa"/>
+              <w:start w:w="110" w:type="dxa"/>
+              <w:bottom w:w="70" w:type="dxa"/>
+              <w:end w:w="110" w:type="dxa"/>
+            </w:tcMar>
+          </w:tcPr>
+          <w:p>
+            <w:pPr>
+              <w:spacing w:after="0" w:line="240" w:lineRule="auto"/>
+            </w:pPr>
+            <w:r>
+              <w:t>3.1</w:t>
+            </w:r>
+          </w:p>
+        </w:tc>
+        <w:tc>
+          <w:tcPr>
+            <w:tcW w:type="dxa" w:w="2438"/>
+            <w:shd w:fill="F4F6F8"/>
+            <w:tcMar>
+              <w:top w:w="70" w:type="dxa"/>
+              <w:start w:w="110" w:type="dxa"/>
+              <w:bottom w:w="70" w:type="dxa"/>
+              <w:end w:w="110" w:type="dxa"/>
+            </w:tcMar>
+          </w:tcPr>
+          <w:p>
+            <w:pPr>
+              <w:spacing w:after="0" w:line="240" w:lineRule="auto"/>
+            </w:pPr>
+            <w:r>
+              <w:t>Inductive sensor embeddings for STAEformer</w:t>
             </w:r>
           </w:p>
         </w:tc>
@@ -1755,6 +1585,176 @@
             </w:pPr>
             <w:r>
               <w:t>MSc preferred</w:t>
+            </w:r>
+          </w:p>
+        </w:tc>
+        <w:tc>
+          <w:tcPr>
+            <w:tcW w:type="dxa" w:w="2438"/>
+            <w:shd w:fill="F4F6F8"/>
+            <w:tcMar>
+              <w:top w:w="70" w:type="dxa"/>
+              <w:start w:w="110" w:type="dxa"/>
+              <w:bottom w:w="70" w:type="dxa"/>
+              <w:end w:w="110" w:type="dxa"/>
+            </w:tcMar>
+          </w:tcPr>
+          <w:p>
+            <w:pPr>
+              <w:spacing w:after="0" w:line="240" w:lineRule="auto"/>
+            </w:pPr>
+            <w:r>
+              <w:t>Moderate</w:t>
+            </w:r>
+          </w:p>
+        </w:tc>
+      </w:tr>
+      <w:tr>
+        <w:trPr>
+          <w:cantSplit/>
+        </w:trPr>
+        <w:tc>
+          <w:tcPr>
+            <w:tcW w:type="dxa" w:w="2438"/>
+            <w:shd w:fill="FFFFFF"/>
+            <w:tcMar>
+              <w:top w:w="70" w:type="dxa"/>
+              <w:start w:w="110" w:type="dxa"/>
+              <w:bottom w:w="70" w:type="dxa"/>
+              <w:end w:w="110" w:type="dxa"/>
+            </w:tcMar>
+          </w:tcPr>
+          <w:p>
+            <w:pPr>
+              <w:spacing w:after="0" w:line="240" w:lineRule="auto"/>
+            </w:pPr>
+            <w:r>
+              <w:t>3.2</w:t>
+            </w:r>
+          </w:p>
+        </w:tc>
+        <w:tc>
+          <w:tcPr>
+            <w:tcW w:type="dxa" w:w="2438"/>
+            <w:shd w:fill="FFFFFF"/>
+            <w:tcMar>
+              <w:top w:w="70" w:type="dxa"/>
+              <w:start w:w="110" w:type="dxa"/>
+              <w:bottom w:w="70" w:type="dxa"/>
+              <w:end w:w="110" w:type="dxa"/>
+            </w:tcMar>
+          </w:tcPr>
+          <w:p>
+            <w:pPr>
+              <w:spacing w:after="0" w:line="240" w:lineRule="auto"/>
+            </w:pPr>
+            <w:r>
+              <w:t>Inductive evaluation of GRACE</w:t>
+            </w:r>
+          </w:p>
+        </w:tc>
+        <w:tc>
+          <w:tcPr>
+            <w:tcW w:type="dxa" w:w="2438"/>
+            <w:shd w:fill="FFFFFF"/>
+            <w:tcMar>
+              <w:top w:w="70" w:type="dxa"/>
+              <w:start w:w="110" w:type="dxa"/>
+              <w:bottom w:w="70" w:type="dxa"/>
+              <w:end w:w="110" w:type="dxa"/>
+            </w:tcMar>
+          </w:tcPr>
+          <w:p>
+            <w:pPr>
+              <w:spacing w:after="0" w:line="240" w:lineRule="auto"/>
+            </w:pPr>
+            <w:r>
+              <w:t>Both</w:t>
+            </w:r>
+          </w:p>
+        </w:tc>
+        <w:tc>
+          <w:tcPr>
+            <w:tcW w:type="dxa" w:w="2438"/>
+            <w:shd w:fill="FFFFFF"/>
+            <w:tcMar>
+              <w:top w:w="70" w:type="dxa"/>
+              <w:start w:w="110" w:type="dxa"/>
+              <w:bottom w:w="70" w:type="dxa"/>
+              <w:end w:w="110" w:type="dxa"/>
+            </w:tcMar>
+          </w:tcPr>
+          <w:p>
+            <w:pPr>
+              <w:spacing w:after="0" w:line="240" w:lineRule="auto"/>
+            </w:pPr>
+            <w:r>
+              <w:t>Very light</w:t>
+            </w:r>
+          </w:p>
+        </w:tc>
+      </w:tr>
+      <w:tr>
+        <w:trPr>
+          <w:cantSplit/>
+        </w:trPr>
+        <w:tc>
+          <w:tcPr>
+            <w:tcW w:type="dxa" w:w="2438"/>
+            <w:shd w:fill="F4F6F8"/>
+            <w:tcMar>
+              <w:top w:w="70" w:type="dxa"/>
+              <w:start w:w="110" w:type="dxa"/>
+              <w:bottom w:w="70" w:type="dxa"/>
+              <w:end w:w="110" w:type="dxa"/>
+            </w:tcMar>
+          </w:tcPr>
+          <w:p>
+            <w:pPr>
+              <w:spacing w:after="0" w:line="240" w:lineRule="auto"/>
+            </w:pPr>
+            <w:r>
+              <w:t>3.3</w:t>
+            </w:r>
+          </w:p>
+        </w:tc>
+        <w:tc>
+          <w:tcPr>
+            <w:tcW w:type="dxa" w:w="2438"/>
+            <w:shd w:fill="F4F6F8"/>
+            <w:tcMar>
+              <w:top w:w="70" w:type="dxa"/>
+              <w:start w:w="110" w:type="dxa"/>
+              <w:bottom w:w="70" w:type="dxa"/>
+              <w:end w:w="110" w:type="dxa"/>
+            </w:tcMar>
+          </w:tcPr>
+          <w:p>
+            <w:pPr>
+              <w:spacing w:after="0" w:line="240" w:lineRule="auto"/>
+            </w:pPr>
+            <w:r>
+              <w:t>Structure-aware augmentations for graph contrastive learning</w:t>
+            </w:r>
+          </w:p>
+        </w:tc>
+        <w:tc>
+          <w:tcPr>
+            <w:tcW w:type="dxa" w:w="2438"/>
+            <w:shd w:fill="F4F6F8"/>
+            <w:tcMar>
+              <w:top w:w="70" w:type="dxa"/>
+              <w:start w:w="110" w:type="dxa"/>
+              <w:bottom w:w="70" w:type="dxa"/>
+              <w:end w:w="110" w:type="dxa"/>
+            </w:tcMar>
+          </w:tcPr>
+          <w:p>
+            <w:pPr>
+              <w:spacing w:after="0" w:line="240" w:lineRule="auto"/>
+            </w:pPr>
+            <w:r>
+              <w:t>Both</w:t>
             </w:r>
           </w:p>
         </w:tc>
@@ -1799,7 +1799,7 @@
               <w:spacing w:after="0" w:line="240" w:lineRule="auto"/>
             </w:pPr>
             <w:r>
-              <w:t>3.5</w:t>
+              <w:t>3.4</w:t>
             </w:r>
           </w:p>
         </w:tc>
@@ -1819,7 +1819,7 @@
               <w:spacing w:after="0" w:line="240" w:lineRule="auto"/>
             </w:pPr>
             <w:r>
-              <w:t>Question-adaptive retrieval budgets for G-Retriever</w:t>
+              <w:t>Compute-aware routing between GraphGPS branches</w:t>
             </w:r>
           </w:p>
         </w:tc>
@@ -1839,7 +1839,177 @@
               <w:spacing w:after="0" w:line="240" w:lineRule="auto"/>
             </w:pPr>
             <w:r>
+              <w:t>MSc preferred</w:t>
+            </w:r>
+          </w:p>
+        </w:tc>
+        <w:tc>
+          <w:tcPr>
+            <w:tcW w:type="dxa" w:w="2438"/>
+            <w:shd w:fill="FFFFFF"/>
+            <w:tcMar>
+              <w:top w:w="70" w:type="dxa"/>
+              <w:start w:w="110" w:type="dxa"/>
+              <w:bottom w:w="70" w:type="dxa"/>
+              <w:end w:w="110" w:type="dxa"/>
+            </w:tcMar>
+          </w:tcPr>
+          <w:p>
+            <w:pPr>
+              <w:spacing w:after="0" w:line="240" w:lineRule="auto"/>
+            </w:pPr>
+            <w:r>
+              <w:t>Light to moderate</w:t>
+            </w:r>
+          </w:p>
+        </w:tc>
+      </w:tr>
+      <w:tr>
+        <w:trPr>
+          <w:cantSplit/>
+        </w:trPr>
+        <w:tc>
+          <w:tcPr>
+            <w:tcW w:type="dxa" w:w="2438"/>
+            <w:shd w:fill="F4F6F8"/>
+            <w:tcMar>
+              <w:top w:w="70" w:type="dxa"/>
+              <w:start w:w="110" w:type="dxa"/>
+              <w:bottom w:w="70" w:type="dxa"/>
+              <w:end w:w="110" w:type="dxa"/>
+            </w:tcMar>
+          </w:tcPr>
+          <w:p>
+            <w:pPr>
+              <w:spacing w:after="0" w:line="240" w:lineRule="auto"/>
+            </w:pPr>
+            <w:r>
+              <w:t>3.5</w:t>
+            </w:r>
+          </w:p>
+        </w:tc>
+        <w:tc>
+          <w:tcPr>
+            <w:tcW w:type="dxa" w:w="2438"/>
+            <w:shd w:fill="F4F6F8"/>
+            <w:tcMar>
+              <w:top w:w="70" w:type="dxa"/>
+              <w:start w:w="110" w:type="dxa"/>
+              <w:bottom w:w="70" w:type="dxa"/>
+              <w:end w:w="110" w:type="dxa"/>
+            </w:tcMar>
+          </w:tcPr>
+          <w:p>
+            <w:pPr>
+              <w:spacing w:after="0" w:line="240" w:lineRule="auto"/>
+            </w:pPr>
+            <w:r>
+              <w:t>Question-adaptive retrieval budgets for G-Retriever</w:t>
+            </w:r>
+          </w:p>
+        </w:tc>
+        <w:tc>
+          <w:tcPr>
+            <w:tcW w:type="dxa" w:w="2438"/>
+            <w:shd w:fill="F4F6F8"/>
+            <w:tcMar>
+              <w:top w:w="70" w:type="dxa"/>
+              <w:start w:w="110" w:type="dxa"/>
+              <w:bottom w:w="70" w:type="dxa"/>
+              <w:end w:w="110" w:type="dxa"/>
+            </w:tcMar>
+          </w:tcPr>
+          <w:p>
+            <w:pPr>
+              <w:spacing w:after="0" w:line="240" w:lineRule="auto"/>
+            </w:pPr>
+            <w:r>
               <w:t>MSc optional</w:t>
+            </w:r>
+          </w:p>
+        </w:tc>
+        <w:tc>
+          <w:tcPr>
+            <w:tcW w:type="dxa" w:w="2438"/>
+            <w:shd w:fill="F4F6F8"/>
+            <w:tcMar>
+              <w:top w:w="70" w:type="dxa"/>
+              <w:start w:w="110" w:type="dxa"/>
+              <w:bottom w:w="70" w:type="dxa"/>
+              <w:end w:w="110" w:type="dxa"/>
+            </w:tcMar>
+          </w:tcPr>
+          <w:p>
+            <w:pPr>
+              <w:spacing w:after="0" w:line="240" w:lineRule="auto"/>
+            </w:pPr>
+            <w:r>
+              <w:t>Moderate</w:t>
+            </w:r>
+          </w:p>
+        </w:tc>
+      </w:tr>
+      <w:tr>
+        <w:trPr>
+          <w:cantSplit/>
+        </w:trPr>
+        <w:tc>
+          <w:tcPr>
+            <w:tcW w:type="dxa" w:w="2438"/>
+            <w:shd w:fill="FFFFFF"/>
+            <w:tcMar>
+              <w:top w:w="70" w:type="dxa"/>
+              <w:start w:w="110" w:type="dxa"/>
+              <w:bottom w:w="70" w:type="dxa"/>
+              <w:end w:w="110" w:type="dxa"/>
+            </w:tcMar>
+          </w:tcPr>
+          <w:p>
+            <w:pPr>
+              <w:spacing w:after="0" w:line="240" w:lineRule="auto"/>
+            </w:pPr>
+            <w:r>
+              <w:t>4.1</w:t>
+            </w:r>
+          </w:p>
+        </w:tc>
+        <w:tc>
+          <w:tcPr>
+            <w:tcW w:type="dxa" w:w="2438"/>
+            <w:shd w:fill="FFFFFF"/>
+            <w:tcMar>
+              <w:top w:w="70" w:type="dxa"/>
+              <w:start w:w="110" w:type="dxa"/>
+              <w:bottom w:w="70" w:type="dxa"/>
+              <w:end w:w="110" w:type="dxa"/>
+            </w:tcMar>
+          </w:tcPr>
+          <w:p>
+            <w:pPr>
+              <w:spacing w:after="0" w:line="240" w:lineRule="auto"/>
+            </w:pPr>
+            <w:r>
+              <w:t>Adapting DINO backbones for land cover or industrial anomalies</w:t>
+            </w:r>
+          </w:p>
+        </w:tc>
+        <w:tc>
+          <w:tcPr>
+            <w:tcW w:type="dxa" w:w="2438"/>
+            <w:shd w:fill="FFFFFF"/>
+            <w:tcMar>
+              <w:top w:w="70" w:type="dxa"/>
+              <w:start w:w="110" w:type="dxa"/>
+              <w:bottom w:w="70" w:type="dxa"/>
+              <w:end w:w="110" w:type="dxa"/>
+            </w:tcMar>
+          </w:tcPr>
+          <w:p>
+            <w:pPr>
+              <w:spacing w:after="0" w:line="240" w:lineRule="auto"/>
+            </w:pPr>
+            <w:r>
+              <w:t>Both</w:t>
             </w:r>
           </w:p>
         </w:tc>
@@ -1864,91 +2034,6 @@
           </w:p>
         </w:tc>
       </w:tr>
-      <w:tr>
-        <w:trPr>
-          <w:cantSplit/>
-        </w:trPr>
-        <w:tc>
-          <w:tcPr>
-            <w:tcW w:type="dxa" w:w="2438"/>
-            <w:shd w:fill="F4F6F8"/>
-            <w:tcMar>
-              <w:top w:w="70" w:type="dxa"/>
-              <w:start w:w="110" w:type="dxa"/>
-              <w:bottom w:w="70" w:type="dxa"/>
-              <w:end w:w="110" w:type="dxa"/>
-            </w:tcMar>
-          </w:tcPr>
-          <w:p>
-            <w:pPr>
-              <w:spacing w:after="0" w:line="240" w:lineRule="auto"/>
-            </w:pPr>
-            <w:r>
-              <w:t>4.1</w:t>
-            </w:r>
-          </w:p>
-        </w:tc>
-        <w:tc>
-          <w:tcPr>
-            <w:tcW w:type="dxa" w:w="2438"/>
-            <w:shd w:fill="F4F6F8"/>
-            <w:tcMar>
-              <w:top w:w="70" w:type="dxa"/>
-              <w:start w:w="110" w:type="dxa"/>
-              <w:bottom w:w="70" w:type="dxa"/>
-              <w:end w:w="110" w:type="dxa"/>
-            </w:tcMar>
-          </w:tcPr>
-          <w:p>
-            <w:pPr>
-              <w:spacing w:after="0" w:line="240" w:lineRule="auto"/>
-            </w:pPr>
-            <w:r>
-              <w:t>Adapting DINO backbones for land cover or industrial anomalies</w:t>
-            </w:r>
-          </w:p>
-        </w:tc>
-        <w:tc>
-          <w:tcPr>
-            <w:tcW w:type="dxa" w:w="2438"/>
-            <w:shd w:fill="F4F6F8"/>
-            <w:tcMar>
-              <w:top w:w="70" w:type="dxa"/>
-              <w:start w:w="110" w:type="dxa"/>
-              <w:bottom w:w="70" w:type="dxa"/>
-              <w:end w:w="110" w:type="dxa"/>
-            </w:tcMar>
-          </w:tcPr>
-          <w:p>
-            <w:pPr>
-              <w:spacing w:after="0" w:line="240" w:lineRule="auto"/>
-            </w:pPr>
-            <w:r>
-              <w:t>Both</w:t>
-            </w:r>
-          </w:p>
-        </w:tc>
-        <w:tc>
-          <w:tcPr>
-            <w:tcW w:type="dxa" w:w="2438"/>
-            <w:shd w:fill="F4F6F8"/>
-            <w:tcMar>
-              <w:top w:w="70" w:type="dxa"/>
-              <w:start w:w="110" w:type="dxa"/>
-              <w:bottom w:w="70" w:type="dxa"/>
-              <w:end w:w="110" w:type="dxa"/>
-            </w:tcMar>
-          </w:tcPr>
-          <w:p>
-            <w:pPr>
-              <w:spacing w:after="0" w:line="240" w:lineRule="auto"/>
-            </w:pPr>
-            <w:r>
-              <w:t>Moderate</w:t>
-            </w:r>
-          </w:p>
-        </w:tc>
-      </w:tr>
     </w:tbl>
     <w:p>
       <w:r>
@@ -2038,7 +2123,7 @@
         <w:spacing w:before="0" w:after="100" w:line="254" w:lineRule="auto"/>
       </w:pPr>
       <w:r>
-        <w:t>Projects 2.1–2.5, 3.2, 3.3 and 4.1 must report the following settings whenever they are meaningful:</w:t>
+        <w:t>Projects 2.1–2.6, 3.2, 3.3 and 4.1 must report the following settings whenever they are meaningful:</w:t>
       </w:r>
     </w:p>
     <w:p>
@@ -2129,7 +2214,7 @@
         <w:spacing w:before="0" w:after="80" w:line="254" w:lineRule="auto"/>
       </w:pPr>
       <w:r>
-        <w:t>Group splits by the real independent unit: subject, patient, household, engine or bearing—never by window. On graphs, state whether pretraining is transductive (evaluation nodes/graphs visible without labels) or strict inductive (held out entirely). On time series, use chronological splits where the task is forecasting.</w:t>
+        <w:t>Group splits by the real independent unit: subject, patient, household, engine, bearing or process cycle—never by window. On graphs, state whether pretraining is transductive (evaluation nodes/graphs visible without labels) or strict inductive (held out entirely). On time series, use chronological splits where the task is forecasting.</w:t>
       </w:r>
     </w:p>
     <w:p>
@@ -2138,6 +2223,11 @@
       </w:pPr>
       <w:r>
         <w:t>Report ten seeds for small citation networks and at least three elsewhere. Report results even when they do not beat a leaderboard; the evaluation should answer the stated question.</w:t>
+      </w:r>
+    </w:p>
+    <w:p>
+      <w:r>
+        <w:br w:type="page"/>
       </w:r>
     </w:p>
     <w:p>
@@ -2669,6 +2759,71 @@
           </w:p>
         </w:tc>
       </w:tr>
+      <w:tr>
+        <w:trPr>
+          <w:cantSplit/>
+        </w:trPr>
+        <w:tc>
+          <w:tcPr>
+            <w:tcW w:type="dxa" w:w="3251"/>
+            <w:shd w:fill="F4F6F8"/>
+            <w:tcMar>
+              <w:top w:w="90" w:type="dxa"/>
+              <w:start w:w="110" w:type="dxa"/>
+              <w:bottom w:w="90" w:type="dxa"/>
+              <w:end w:w="110" w:type="dxa"/>
+            </w:tcMar>
+          </w:tcPr>
+          <w:p>
+            <w:pPr>
+              <w:spacing w:after="0"/>
+            </w:pPr>
+            <w:r>
+              <w:t>Tetra Pak process data</w:t>
+            </w:r>
+          </w:p>
+        </w:tc>
+        <w:tc>
+          <w:tcPr>
+            <w:tcW w:type="dxa" w:w="3251"/>
+            <w:shd w:fill="F4F6F8"/>
+            <w:tcMar>
+              <w:top w:w="90" w:type="dxa"/>
+              <w:start w:w="110" w:type="dxa"/>
+              <w:bottom w:w="90" w:type="dxa"/>
+              <w:end w:w="110" w:type="dxa"/>
+            </w:tcMar>
+          </w:tcPr>
+          <w:p>
+            <w:pPr>
+              <w:spacing w:after="0"/>
+            </w:pPr>
+            <w:r>
+              <w:t>Partner-supplied under an approved agreement</w:t>
+            </w:r>
+          </w:p>
+        </w:tc>
+        <w:tc>
+          <w:tcPr>
+            <w:tcW w:type="dxa" w:w="3251"/>
+            <w:shd w:fill="F4F6F8"/>
+            <w:tcMar>
+              <w:top w:w="90" w:type="dxa"/>
+              <w:start w:w="110" w:type="dxa"/>
+              <w:bottom w:w="90" w:type="dxa"/>
+              <w:end w:w="110" w:type="dxa"/>
+            </w:tcMar>
+          </w:tcPr>
+          <w:p>
+            <w:pPr>
+              <w:spacing w:after="0"/>
+            </w:pPr>
+            <w:r>
+              <w:t>Restricted access; confirm scope and secure environment before allocation</w:t>
+            </w:r>
+          </w:p>
+        </w:tc>
+      </w:tr>
     </w:tbl>
     <w:p>
       <w:r>
@@ -5278,7 +5433,442 @@
         <w:spacing w:after="140"/>
       </w:pPr>
       <w:r>
-        <w:t>Project 2.1  Contrastive learning for wearable activity recognition</w:t>
+        <w:t>Project 2.1  Tetra Pak industrial collaboration: Regime-aware self-supervised learning for non-stationary filtration cycles</w:t>
+      </w:r>
+    </w:p>
+    <w:tbl>
+      <w:tblPr>
+        <w:tblW w:type="auto" w:w="0"/>
+        <w:jc w:val="center"/>
+        <w:tblLayout w:type="fixed"/>
+        <w:tblLook w:firstColumn="1" w:firstRow="1" w:lastColumn="0" w:lastRow="0" w:noHBand="0" w:noVBand="1" w:val="04A0"/>
+        <w:tblBorders>
+          <w:top w:val="single" w:sz="5" w:space="0" w:color="D9E0E6"/>
+          <w:left w:val="single" w:sz="5" w:space="0" w:color="D9E0E6"/>
+          <w:bottom w:val="single" w:sz="5" w:space="0" w:color="D9E0E6"/>
+          <w:right w:val="single" w:sz="5" w:space="0" w:color="D9E0E6"/>
+          <w:insideH w:val="single" w:sz="5" w:space="0" w:color="D9E0E6"/>
+          <w:insideV w:val="single" w:sz="5" w:space="0" w:color="D9E0E6"/>
+        </w:tblBorders>
+      </w:tblPr>
+      <w:tblGrid>
+        <w:gridCol w:w="1944"/>
+        <w:gridCol w:w="7704"/>
+      </w:tblGrid>
+      <w:tr>
+        <w:trPr>
+          <w:cantSplit/>
+        </w:trPr>
+        <w:tc>
+          <w:tcPr>
+            <w:tcW w:type="dxa" w:w="1944"/>
+            <w:shd w:fill="EAF2F8"/>
+            <w:tcMar>
+              <w:top w:w="90" w:type="dxa"/>
+              <w:start w:w="110" w:type="dxa"/>
+              <w:bottom w:w="90" w:type="dxa"/>
+              <w:end w:w="110" w:type="dxa"/>
+            </w:tcMar>
+            <w:vAlign w:val="center"/>
+          </w:tcPr>
+          <w:p>
+            <w:pPr>
+              <w:spacing w:after="0"/>
+            </w:pPr>
+            <w:r>
+              <w:rPr>
+                <w:b/>
+                <w:color w:val="17365D"/>
+              </w:rPr>
+              <w:t>Task</w:t>
+            </w:r>
+          </w:p>
+        </w:tc>
+        <w:tc>
+          <w:tcPr>
+            <w:tcW w:type="dxa" w:w="7704"/>
+            <w:shd w:fill="FFFFFF"/>
+            <w:tcMar>
+              <w:top w:w="90" w:type="dxa"/>
+              <w:start w:w="110" w:type="dxa"/>
+              <w:bottom w:w="90" w:type="dxa"/>
+              <w:end w:w="110" w:type="dxa"/>
+            </w:tcMar>
+            <w:vAlign w:val="center"/>
+          </w:tcPr>
+          <w:p>
+            <w:pPr>
+              <w:spacing w:after="0"/>
+            </w:pPr>
+            <w:r>
+              <w:t>Self-supervised multivariate time-series learning followed by cycle-level regression or anomaly detection</w:t>
+            </w:r>
+          </w:p>
+        </w:tc>
+      </w:tr>
+      <w:tr>
+        <w:trPr>
+          <w:cantSplit/>
+        </w:trPr>
+        <w:tc>
+          <w:tcPr>
+            <w:tcW w:type="dxa" w:w="1944"/>
+            <w:shd w:fill="EAF2F8"/>
+            <w:tcMar>
+              <w:top w:w="90" w:type="dxa"/>
+              <w:start w:w="110" w:type="dxa"/>
+              <w:bottom w:w="90" w:type="dxa"/>
+              <w:end w:w="110" w:type="dxa"/>
+            </w:tcMar>
+            <w:vAlign w:val="center"/>
+          </w:tcPr>
+          <w:p>
+            <w:pPr>
+              <w:spacing w:after="0"/>
+            </w:pPr>
+            <w:r>
+              <w:rPr>
+                <w:b/>
+                <w:color w:val="17365D"/>
+              </w:rPr>
+              <w:t>Recommended level</w:t>
+            </w:r>
+          </w:p>
+        </w:tc>
+        <w:tc>
+          <w:tcPr>
+            <w:tcW w:type="dxa" w:w="7704"/>
+            <w:shd w:fill="F4F6F8"/>
+            <w:tcMar>
+              <w:top w:w="90" w:type="dxa"/>
+              <w:start w:w="110" w:type="dxa"/>
+              <w:bottom w:w="90" w:type="dxa"/>
+              <w:end w:w="110" w:type="dxa"/>
+            </w:tcMar>
+            <w:vAlign w:val="center"/>
+          </w:tcPr>
+          <w:p>
+            <w:pPr>
+              <w:spacing w:after="0"/>
+            </w:pPr>
+            <w:r>
+              <w:t>BSc or MSc; scope confirmed after an initial data profile</w:t>
+            </w:r>
+          </w:p>
+        </w:tc>
+      </w:tr>
+      <w:tr>
+        <w:trPr>
+          <w:cantSplit/>
+        </w:trPr>
+        <w:tc>
+          <w:tcPr>
+            <w:tcW w:type="dxa" w:w="1944"/>
+            <w:shd w:fill="EAF2F8"/>
+            <w:tcMar>
+              <w:top w:w="90" w:type="dxa"/>
+              <w:start w:w="110" w:type="dxa"/>
+              <w:bottom w:w="90" w:type="dxa"/>
+              <w:end w:w="110" w:type="dxa"/>
+            </w:tcMar>
+            <w:vAlign w:val="center"/>
+          </w:tcPr>
+          <w:p>
+            <w:pPr>
+              <w:spacing w:after="0"/>
+            </w:pPr>
+            <w:r>
+              <w:rPr>
+                <w:b/>
+                <w:color w:val="17365D"/>
+              </w:rPr>
+              <w:t>Compute</w:t>
+            </w:r>
+          </w:p>
+        </w:tc>
+        <w:tc>
+          <w:tcPr>
+            <w:tcW w:type="dxa" w:w="7704"/>
+            <w:shd w:fill="FFFFFF"/>
+            <w:tcMar>
+              <w:top w:w="90" w:type="dxa"/>
+              <w:start w:w="110" w:type="dxa"/>
+              <w:bottom w:w="90" w:type="dxa"/>
+              <w:end w:w="110" w:type="dxa"/>
+            </w:tcMar>
+            <w:vAlign w:val="center"/>
+          </w:tcPr>
+          <w:p>
+            <w:pPr>
+              <w:spacing w:after="0"/>
+            </w:pPr>
+            <w:r>
+              <w:t>Light to moderate; compact models on a 4-8 GB GPU</w:t>
+            </w:r>
+          </w:p>
+        </w:tc>
+      </w:tr>
+      <w:tr>
+        <w:trPr>
+          <w:cantSplit/>
+        </w:trPr>
+        <w:tc>
+          <w:tcPr>
+            <w:tcW w:type="dxa" w:w="1944"/>
+            <w:shd w:fill="EAF2F8"/>
+            <w:tcMar>
+              <w:top w:w="90" w:type="dxa"/>
+              <w:start w:w="110" w:type="dxa"/>
+              <w:bottom w:w="90" w:type="dxa"/>
+              <w:end w:w="110" w:type="dxa"/>
+            </w:tcMar>
+            <w:vAlign w:val="center"/>
+          </w:tcPr>
+          <w:p>
+            <w:pPr>
+              <w:spacing w:after="0"/>
+            </w:pPr>
+            <w:r>
+              <w:rPr>
+                <w:b/>
+                <w:color w:val="17365D"/>
+              </w:rPr>
+              <w:t>Starting paper</w:t>
+            </w:r>
+          </w:p>
+        </w:tc>
+        <w:tc>
+          <w:tcPr>
+            <w:tcW w:type="dxa" w:w="7704"/>
+            <w:shd w:fill="F4F6F8"/>
+            <w:tcMar>
+              <w:top w:w="90" w:type="dxa"/>
+              <w:start w:w="110" w:type="dxa"/>
+              <w:bottom w:w="90" w:type="dxa"/>
+              <w:end w:w="110" w:type="dxa"/>
+            </w:tcMar>
+            <w:vAlign w:val="center"/>
+          </w:tcPr>
+          <w:p>
+            <w:pPr>
+              <w:spacing w:after="0"/>
+            </w:pPr>
+            <w:r>
+              <w:t xml:space="preserve">Yue et al., </w:t>
+            </w:r>
+            <w:hyperlink r:id="rId48">
+              <w:r>
+                <w:rPr>
+                  <w:color w:val="2F5597"/>
+                  <w:u w:val="single"/>
+                </w:rPr>
+                <w:t>TS2Vec</w:t>
+              </w:r>
+            </w:hyperlink>
+            <w:r>
+              <w:t>, AAAI 2022</w:t>
+            </w:r>
+          </w:p>
+        </w:tc>
+      </w:tr>
+    </w:tbl>
+    <w:p>
+      <w:pPr>
+        <w:spacing w:after="0"/>
+      </w:pPr>
+    </w:p>
+    <w:p>
+      <w:pPr>
+        <w:spacing w:before="80" w:after="100" w:line="254" w:lineRule="auto"/>
+      </w:pPr>
+      <w:r>
+        <w:rPr>
+          <w:b/>
+          <w:color w:val="25313C"/>
+        </w:rPr>
+        <w:t xml:space="preserve">What you will do. </w:t>
+      </w:r>
+      <w:r>
+        <w:t>Membrane-filtration plants generate repeated production and cleaning cycles containing flow, pressure, temperature and energy measurements. Earlier work found substantial cycle-to-cycle differences. The student will identify whether these reflect operating settings, process phases, fouling, sensor drift or abnormal operation, then learn representations that account for the resulting regimes.</w:t>
+      </w:r>
+    </w:p>
+    <w:p>
+      <w:pPr>
+        <w:spacing w:before="0" w:after="100" w:line="254" w:lineRule="auto"/>
+      </w:pPr>
+      <w:r>
+        <w:rPr>
+          <w:b/>
+          <w:color w:val="25313C"/>
+        </w:rPr>
+        <w:t xml:space="preserve">Project goal. </w:t>
+      </w:r>
+      <w:r>
+        <w:t>Test whether regime-aware self-supervised pretraining improves low-label prediction and transfer. The preferred task is early prediction of final specific energy consumption, such as electrical energy per unit of permeate or product. If that target cannot be constructed, use regime-conditioned anomaly detection.</w:t>
+      </w:r>
+    </w:p>
+    <w:p>
+      <w:pPr>
+        <w:spacing w:before="0" w:after="100" w:line="254" w:lineRule="auto"/>
+      </w:pPr>
+      <w:r>
+        <w:rPr>
+          <w:b/>
+          <w:color w:val="25313C"/>
+        </w:rPr>
+        <w:t xml:space="preserve">Data. </w:t>
+      </w:r>
+      <w:r>
+        <w:t>Tetra Pak will provide anonymised process data or an approved secure environment; the data are not public. Sources may include customer production for one product, pilot-plant trials or a new installation. Requested signals include flow, pressure, temperature, power or energy, setpoints, product/line/phase identifiers, cycle boundaries and available alarms or cleaning records. The current estimate is a few months of approximately minute-level data; the exact installation, channels and usable-cycle count must be confirmed.</w:t>
+      </w:r>
+    </w:p>
+    <w:p>
+      <w:pPr>
+        <w:spacing w:before="0" w:after="100" w:line="254" w:lineRule="auto"/>
+      </w:pPr>
+      <w:r>
+        <w:rPr>
+          <w:b/>
+          <w:color w:val="25313C"/>
+        </w:rPr>
+        <w:t xml:space="preserve">Methods and starting code. </w:t>
+      </w:r>
+      <w:r>
+        <w:t xml:space="preserve">Start with </w:t>
+      </w:r>
+      <w:hyperlink r:id="rId40">
+        <w:r>
+          <w:rPr>
+            <w:color w:val="2F5597"/>
+            <w:u w:val="single"/>
+          </w:rPr>
+          <w:t>TS2Vec and code</w:t>
+        </w:r>
+      </w:hyperlink>
+      <w:r>
+        <w:t xml:space="preserve">, </w:t>
+      </w:r>
+      <w:hyperlink r:id="rId39">
+        <w:r>
+          <w:rPr>
+            <w:color w:val="2F5597"/>
+            <w:u w:val="single"/>
+          </w:rPr>
+          <w:t>TS-TCC and code</w:t>
+        </w:r>
+      </w:hyperlink>
+      <w:r>
+        <w:t xml:space="preserve">, or </w:t>
+      </w:r>
+      <w:hyperlink r:id="rId42">
+        <w:r>
+          <w:rPr>
+            <w:color w:val="2F5597"/>
+            <w:u w:val="single"/>
+          </w:rPr>
+          <w:t>SimMTM and code</w:t>
+        </w:r>
+      </w:hyperlink>
+      <w:r>
+        <w:t>, using a compact 1-D CNN, TCN or GRU. The MSc method should make positive pairs or masks aware of cycle phase and regime, or condition the encoder on product, line and setpoints. Use change-point detection, clustering and PCA/UMAP for the initial regime analysis.</w:t>
+      </w:r>
+    </w:p>
+    <w:p>
+      <w:pPr>
+        <w:spacing w:before="0" w:after="100" w:line="254" w:lineRule="auto"/>
+      </w:pPr>
+      <w:r>
+        <w:rPr>
+          <w:b/>
+          <w:color w:val="25313C"/>
+        </w:rPr>
+        <w:t xml:space="preserve">Required baselines. </w:t>
+      </w:r>
+      <w:r>
+        <w:t>Regime-specific mean or running energy extrapolation; XGBoost or linear regression on cycle-prefix features; supervised TCN/GRU; generic SSL across all cycles; and a per-regime or regime-conditioned model. Include random-frozen, frozen-probe, fine-tuned and fully supervised controls when labels support them.</w:t>
+      </w:r>
+    </w:p>
+    <w:p>
+      <w:pPr>
+        <w:spacing w:before="0" w:after="100" w:line="254" w:lineRule="auto"/>
+      </w:pPr>
+      <w:r>
+        <w:rPr>
+          <w:b/>
+          <w:color w:val="25313C"/>
+        </w:rPr>
+        <w:t xml:space="preserve">Evaluation. </w:t>
+      </w:r>
+      <w:r>
+        <w:t>Split by complete cycle and preserve time order; never place windows from one cycle in both training and test sets. For energy regression, report MAE, RMSE and normalized MAE when predicting final specific energy from fixed prefixes such as 20%, 30% and 50%. Test a held-out period, line, product or regime where possible. For anomalies, use AUPRC plus precision and recall at an agreed alert budget. Include label-efficiency budgets and at least three seeds where sample size permits.</w:t>
+      </w:r>
+    </w:p>
+    <w:p>
+      <w:pPr>
+        <w:spacing w:before="80" w:after="100" w:line="254" w:lineRule="auto"/>
+      </w:pPr>
+      <w:r>
+        <w:rPr>
+          <w:b/>
+          <w:color w:val="25313C"/>
+        </w:rPr>
+        <w:t xml:space="preserve">Bachelor scope. </w:t>
+      </w:r>
+      <w:r>
+        <w:t>Profile and segment cycles, identify operating regimes, implement one supervised baseline and one established SSL method, and evaluate one target. Compare a global model with a regime-specific or conditioned variant and include one process-aware view or masking ablation. No new architecture is required.</w:t>
+      </w:r>
+    </w:p>
+    <w:p>
+      <w:pPr>
+        <w:spacing w:before="80" w:after="100" w:line="254" w:lineRule="auto"/>
+      </w:pPr>
+      <w:r>
+        <w:rPr>
+          <w:b/>
+          <w:color w:val="25313C"/>
+        </w:rPr>
+        <w:t xml:space="preserve">Master research question and contribution. </w:t>
+      </w:r>
+      <w:r>
+        <w:t xml:space="preserve">Research question: </w:t>
+      </w:r>
+      <w:r>
+        <w:rPr>
+          <w:b/>
+        </w:rPr>
+        <w:t>Can cycle-phase and operating-regime-aware self-supervised views separate legitimate cycle variation from energy inefficiency or abnormal behaviour better than generic augmentations?</w:t>
+      </w:r>
+      <w:r>
+        <w:t xml:space="preserve"> Compare global, per-regime and conditioned encoders at matched capacity; define positives or masks using process context; and test label efficiency plus held-out-regime transfer. The contribution is the regime-aware representation and analysis, not an unchanged TS2Vec or TS-TCC run.</w:t>
+      </w:r>
+    </w:p>
+    <w:p>
+      <w:pPr>
+        <w:spacing w:before="0" w:after="100" w:line="254" w:lineRule="auto"/>
+      </w:pPr>
+      <w:r>
+        <w:rPr>
+          <w:b/>
+          <w:color w:val="25313C"/>
+        </w:rPr>
+        <w:t xml:space="preserve">Practical notes. </w:t>
+      </w:r>
+      <w:r>
+        <w:t>First confirm cycle boundaries, units, synchronization, missingness, regime metadata, independent-cycle count and one defensible target. Overlapping windows do not replace independent cycles. Avoid trivial full-cycle energy calculation by forecasting early or using normalized efficiency. Data and trained artefacts remain subject to the AU-Tetra Pak agreement.</w:t>
+      </w:r>
+    </w:p>
+    <w:p>
+      <w:r>
+        <w:br w:type="page"/>
+      </w:r>
+    </w:p>
+    <w:p>
+      <w:pPr>
+        <w:pStyle w:val="Heading2"/>
+        <w:spacing w:after="140"/>
+      </w:pPr>
+      <w:r>
+        <w:t>Project 2.2  Contrastive learning for wearable activity recognition</w:t>
       </w:r>
     </w:p>
     <w:tbl>
@@ -5501,7 +6091,7 @@
             <w:r>
               <w:t xml:space="preserve">Eldele et al., </w:t>
             </w:r>
-            <w:hyperlink r:id="rId48">
+            <w:hyperlink r:id="rId49">
               <w:r>
                 <w:rPr>
                   <w:color w:val="2F5597"/>
@@ -5566,7 +6156,7 @@
       <w:r>
         <w:t xml:space="preserve">Use </w:t>
       </w:r>
-      <w:hyperlink r:id="rId49">
+      <w:hyperlink r:id="rId50">
         <w:r>
           <w:rPr>
             <w:color w:val="2F5597"/>
@@ -5605,7 +6195,7 @@
       <w:r>
         <w:t xml:space="preserve">, </w:t>
       </w:r>
-      <w:hyperlink r:id="rId50">
+      <w:hyperlink r:id="rId48">
         <w:r>
           <w:rPr>
             <w:color w:val="2F5597"/>
@@ -5737,7 +6327,7 @@
         <w:spacing w:after="140"/>
       </w:pPr>
       <w:r>
-        <w:t>Project 2.2  Lead-aware masked learning for 12-lead ECG</w:t>
+        <w:t>Project 2.3  Lead-aware masked learning for 12-lead ECG</w:t>
       </w:r>
     </w:p>
     <w:tbl>
@@ -6184,7 +6774,7 @@
         <w:spacing w:after="140"/>
       </w:pPr>
       <w:r>
-        <w:t>Project 2.3  Self-supervised forecasting representations for energy series</w:t>
+        <w:t>Project 2.4  Self-supervised forecasting representations for energy series</w:t>
       </w:r>
     </w:p>
     <w:tbl>
@@ -6661,7 +7251,7 @@
         <w:spacing w:after="140"/>
       </w:pPr>
       <w:r>
-        <w:t>Project 2.4  Self-supervised learning on heat-pump smart-meter data</w:t>
+        <w:t>Project 2.5  Self-supervised learning on heat-pump smart-meter data</w:t>
       </w:r>
     </w:p>
     <w:tbl>
@@ -7084,7 +7674,7 @@
         <w:spacing w:after="140"/>
       </w:pPr>
       <w:r>
-        <w:t>Project 2.5  Graph self-supervised learning from vibration signals</w:t>
+        <w:t>Project 2.6  Graph self-supervised learning from vibration signals</w:t>
       </w:r>
     </w:p>
     <w:tbl>
@@ -10796,7 +11386,7 @@
               <w:spacing w:after="0"/>
             </w:pPr>
             <w:r>
-              <w:t>1.1 C-MAPSS, 1.4 MovieLens, 2.1 UCI-HAR, 3.2 GRACE reproduction, 4.1 EuroSAT RGB</w:t>
+              <w:t>1.1 C-MAPSS, 1.4 MovieLens, 2.2 UCI-HAR, 3.2 GRACE reproduction, 4.1 EuroSAT RGB</w:t>
             </w:r>
           </w:p>
         </w:tc>
@@ -10898,7 +11488,7 @@
               <w:spacing w:after="0"/>
             </w:pPr>
             <w:r>
-              <w:t>2.2 lead-aware latent prediction, 2.3 decomposition-aware forecasting, 2.5 physics-grounded vibration graphs</w:t>
+              <w:t>2.1 Tetra Pak regime-aware SSL, 2.3 lead-aware latent prediction, 2.4 decomposition-aware forecasting, 2.6 physics-grounded vibration graphs</w:t>
             </w:r>
           </w:p>
         </w:tc>
@@ -10949,7 +11539,7 @@
               <w:spacing w:after="0"/>
             </w:pPr>
             <w:r>
-              <w:t>2.4 HEAPO after a licence and data check; 3.5 G-Retriever for students prepared for substantial retrieval engineering</w:t>
+              <w:t>2.1 Tetra Pak after the partner-data profile and agreement; 2.5 HEAPO after a licence and data check; 3.5 G-Retriever for students prepared for substantial retrieval engineering</w:t>
             </w:r>
           </w:p>
         </w:tc>
@@ -10974,7 +11564,7 @@
         <w:spacing w:before="0" w:after="40" w:line="254" w:lineRule="auto"/>
       </w:pPr>
       <w:r>
-        <w:t>Download the exact dataset and record its version, size, licence and checksum or release date.</w:t>
+        <w:t>Obtain access to the exact dataset and record its version, size, licence or data agreement, and checksum, release date or extraction period.</w:t>
       </w:r>
     </w:p>
     <w:p>
@@ -10992,7 +11582,7 @@
         <w:spacing w:before="0" w:after="40" w:line="254" w:lineRule="auto"/>
       </w:pPr>
       <w:r>
-        <w:t>Write the independent split unit and verify there is no subject/patient/household/engine/bearing overlap.</w:t>
+        <w:t>Write the independent split unit and verify there is no subject, patient, household, engine, bearing or process-cycle overlap.</w:t>
       </w:r>
     </w:p>
     <w:p>
@@ -11098,7 +11688,7 @@
         <w:spacing w:before="0" w:after="100" w:line="254" w:lineRule="auto"/>
       </w:pPr>
       <w:r>
-        <w:t>Select one primary question, fix the evaluation protocol before extensive experimentation and report negative as well as positive results. Two industrial-partner projects with Tetra Pak and Siemens Gamesa are offered separately and remain outside this portfolio.</w:t>
+        <w:t>Select one primary question, fix the evaluation protocol before extensive experimentation and report negative as well as positive results.</w:t>
       </w:r>
     </w:p>
     <w:sectPr>

</xml_diff>

<commit_message>
Replace graph research category with signal processing
</commit_message>
<xml_diff>
--- a/downloads/student-project-portfolio.docx
+++ b/downloads/student-project-portfolio.docx
@@ -32,7 +32,7 @@
           <w:color w:val="000000"/>
           <w:sz w:val="32"/>
         </w:rPr>
-        <w:t>Graph applications, self-supervised time series, modern Graph ML and vision foundation models</w:t>
+        <w:t>Graph applications, self-supervised time series, vision models and signal processing</w:t>
       </w:r>
     </w:p>
     <w:p>
@@ -48,7 +48,7 @@
         <w:spacing w:before="0" w:after="80" w:line="254" w:lineRule="auto"/>
       </w:pPr>
       <w:r>
-        <w:t>The portfolio contains seventeen projects in four categories. Each entry states the task, data source and access conditions, starting papers and code, required baselines, evaluation protocol, Bachelor scope and possible Master contribution.</w:t>
+        <w:t>The portfolio contains thirteen projects in four categories. Each entry states the task, data source and access conditions, starting papers and code, required baselines, evaluation protocol, Bachelor scope and possible Master contribution.</w:t>
       </w:r>
     </w:p>
     <w:p>
@@ -1564,177 +1564,7 @@
               <w:spacing w:after="0" w:line="240" w:lineRule="auto"/>
             </w:pPr>
             <w:r>
-              <w:t>Inductive sensor embeddings for STAEformer</w:t>
-            </w:r>
-          </w:p>
-        </w:tc>
-        <w:tc>
-          <w:tcPr>
-            <w:tcW w:type="dxa" w:w="2438"/>
-            <w:shd w:fill="F4F6F8"/>
-            <w:tcMar>
-              <w:top w:w="70" w:type="dxa"/>
-              <w:start w:w="110" w:type="dxa"/>
-              <w:bottom w:w="70" w:type="dxa"/>
-              <w:end w:w="110" w:type="dxa"/>
-            </w:tcMar>
-          </w:tcPr>
-          <w:p>
-            <w:pPr>
-              <w:spacing w:after="0" w:line="240" w:lineRule="auto"/>
-            </w:pPr>
-            <w:r>
-              <w:t>MSc preferred</w:t>
-            </w:r>
-          </w:p>
-        </w:tc>
-        <w:tc>
-          <w:tcPr>
-            <w:tcW w:type="dxa" w:w="2438"/>
-            <w:shd w:fill="F4F6F8"/>
-            <w:tcMar>
-              <w:top w:w="70" w:type="dxa"/>
-              <w:start w:w="110" w:type="dxa"/>
-              <w:bottom w:w="70" w:type="dxa"/>
-              <w:end w:w="110" w:type="dxa"/>
-            </w:tcMar>
-          </w:tcPr>
-          <w:p>
-            <w:pPr>
-              <w:spacing w:after="0" w:line="240" w:lineRule="auto"/>
-            </w:pPr>
-            <w:r>
-              <w:t>Moderate</w:t>
-            </w:r>
-          </w:p>
-        </w:tc>
-      </w:tr>
-      <w:tr>
-        <w:trPr>
-          <w:cantSplit/>
-        </w:trPr>
-        <w:tc>
-          <w:tcPr>
-            <w:tcW w:type="dxa" w:w="2438"/>
-            <w:shd w:fill="FFFFFF"/>
-            <w:tcMar>
-              <w:top w:w="70" w:type="dxa"/>
-              <w:start w:w="110" w:type="dxa"/>
-              <w:bottom w:w="70" w:type="dxa"/>
-              <w:end w:w="110" w:type="dxa"/>
-            </w:tcMar>
-          </w:tcPr>
-          <w:p>
-            <w:pPr>
-              <w:spacing w:after="0" w:line="240" w:lineRule="auto"/>
-            </w:pPr>
-            <w:r>
-              <w:t>3.2</w:t>
-            </w:r>
-          </w:p>
-        </w:tc>
-        <w:tc>
-          <w:tcPr>
-            <w:tcW w:type="dxa" w:w="2438"/>
-            <w:shd w:fill="FFFFFF"/>
-            <w:tcMar>
-              <w:top w:w="70" w:type="dxa"/>
-              <w:start w:w="110" w:type="dxa"/>
-              <w:bottom w:w="70" w:type="dxa"/>
-              <w:end w:w="110" w:type="dxa"/>
-            </w:tcMar>
-          </w:tcPr>
-          <w:p>
-            <w:pPr>
-              <w:spacing w:after="0" w:line="240" w:lineRule="auto"/>
-            </w:pPr>
-            <w:r>
-              <w:t>Inductive evaluation of GRACE</w:t>
-            </w:r>
-          </w:p>
-        </w:tc>
-        <w:tc>
-          <w:tcPr>
-            <w:tcW w:type="dxa" w:w="2438"/>
-            <w:shd w:fill="FFFFFF"/>
-            <w:tcMar>
-              <w:top w:w="70" w:type="dxa"/>
-              <w:start w:w="110" w:type="dxa"/>
-              <w:bottom w:w="70" w:type="dxa"/>
-              <w:end w:w="110" w:type="dxa"/>
-            </w:tcMar>
-          </w:tcPr>
-          <w:p>
-            <w:pPr>
-              <w:spacing w:after="0" w:line="240" w:lineRule="auto"/>
-            </w:pPr>
-            <w:r>
-              <w:t>Both</w:t>
-            </w:r>
-          </w:p>
-        </w:tc>
-        <w:tc>
-          <w:tcPr>
-            <w:tcW w:type="dxa" w:w="2438"/>
-            <w:shd w:fill="FFFFFF"/>
-            <w:tcMar>
-              <w:top w:w="70" w:type="dxa"/>
-              <w:start w:w="110" w:type="dxa"/>
-              <w:bottom w:w="70" w:type="dxa"/>
-              <w:end w:w="110" w:type="dxa"/>
-            </w:tcMar>
-          </w:tcPr>
-          <w:p>
-            <w:pPr>
-              <w:spacing w:after="0" w:line="240" w:lineRule="auto"/>
-            </w:pPr>
-            <w:r>
-              <w:t>Very light</w:t>
-            </w:r>
-          </w:p>
-        </w:tc>
-      </w:tr>
-      <w:tr>
-        <w:trPr>
-          <w:cantSplit/>
-        </w:trPr>
-        <w:tc>
-          <w:tcPr>
-            <w:tcW w:type="dxa" w:w="2438"/>
-            <w:shd w:fill="F4F6F8"/>
-            <w:tcMar>
-              <w:top w:w="70" w:type="dxa"/>
-              <w:start w:w="110" w:type="dxa"/>
-              <w:bottom w:w="70" w:type="dxa"/>
-              <w:end w:w="110" w:type="dxa"/>
-            </w:tcMar>
-          </w:tcPr>
-          <w:p>
-            <w:pPr>
-              <w:spacing w:after="0" w:line="240" w:lineRule="auto"/>
-            </w:pPr>
-            <w:r>
-              <w:t>3.3</w:t>
-            </w:r>
-          </w:p>
-        </w:tc>
-        <w:tc>
-          <w:tcPr>
-            <w:tcW w:type="dxa" w:w="2438"/>
-            <w:shd w:fill="F4F6F8"/>
-            <w:tcMar>
-              <w:top w:w="70" w:type="dxa"/>
-              <w:start w:w="110" w:type="dxa"/>
-              <w:bottom w:w="70" w:type="dxa"/>
-              <w:end w:w="110" w:type="dxa"/>
-            </w:tcMar>
-          </w:tcPr>
-          <w:p>
-            <w:pPr>
-              <w:spacing w:after="0" w:line="240" w:lineRule="auto"/>
-            </w:pPr>
-            <w:r>
-              <w:t>Structure-aware augmentations for graph contrastive learning</w:t>
+              <w:t>Adapting DINO backbones for land cover or industrial anomalies</w:t>
             </w:r>
           </w:p>
         </w:tc>
@@ -1755,176 +1585,6 @@
             </w:pPr>
             <w:r>
               <w:t>Both</w:t>
-            </w:r>
-          </w:p>
-        </w:tc>
-        <w:tc>
-          <w:tcPr>
-            <w:tcW w:type="dxa" w:w="2438"/>
-            <w:shd w:fill="F4F6F8"/>
-            <w:tcMar>
-              <w:top w:w="70" w:type="dxa"/>
-              <w:start w:w="110" w:type="dxa"/>
-              <w:bottom w:w="70" w:type="dxa"/>
-              <w:end w:w="110" w:type="dxa"/>
-            </w:tcMar>
-          </w:tcPr>
-          <w:p>
-            <w:pPr>
-              <w:spacing w:after="0" w:line="240" w:lineRule="auto"/>
-            </w:pPr>
-            <w:r>
-              <w:t>Light to moderate</w:t>
-            </w:r>
-          </w:p>
-        </w:tc>
-      </w:tr>
-      <w:tr>
-        <w:trPr>
-          <w:cantSplit/>
-        </w:trPr>
-        <w:tc>
-          <w:tcPr>
-            <w:tcW w:type="dxa" w:w="2438"/>
-            <w:shd w:fill="FFFFFF"/>
-            <w:tcMar>
-              <w:top w:w="70" w:type="dxa"/>
-              <w:start w:w="110" w:type="dxa"/>
-              <w:bottom w:w="70" w:type="dxa"/>
-              <w:end w:w="110" w:type="dxa"/>
-            </w:tcMar>
-          </w:tcPr>
-          <w:p>
-            <w:pPr>
-              <w:spacing w:after="0" w:line="240" w:lineRule="auto"/>
-            </w:pPr>
-            <w:r>
-              <w:t>3.4</w:t>
-            </w:r>
-          </w:p>
-        </w:tc>
-        <w:tc>
-          <w:tcPr>
-            <w:tcW w:type="dxa" w:w="2438"/>
-            <w:shd w:fill="FFFFFF"/>
-            <w:tcMar>
-              <w:top w:w="70" w:type="dxa"/>
-              <w:start w:w="110" w:type="dxa"/>
-              <w:bottom w:w="70" w:type="dxa"/>
-              <w:end w:w="110" w:type="dxa"/>
-            </w:tcMar>
-          </w:tcPr>
-          <w:p>
-            <w:pPr>
-              <w:spacing w:after="0" w:line="240" w:lineRule="auto"/>
-            </w:pPr>
-            <w:r>
-              <w:t>Compute-aware routing between GraphGPS branches</w:t>
-            </w:r>
-          </w:p>
-        </w:tc>
-        <w:tc>
-          <w:tcPr>
-            <w:tcW w:type="dxa" w:w="2438"/>
-            <w:shd w:fill="FFFFFF"/>
-            <w:tcMar>
-              <w:top w:w="70" w:type="dxa"/>
-              <w:start w:w="110" w:type="dxa"/>
-              <w:bottom w:w="70" w:type="dxa"/>
-              <w:end w:w="110" w:type="dxa"/>
-            </w:tcMar>
-          </w:tcPr>
-          <w:p>
-            <w:pPr>
-              <w:spacing w:after="0" w:line="240" w:lineRule="auto"/>
-            </w:pPr>
-            <w:r>
-              <w:t>MSc preferred</w:t>
-            </w:r>
-          </w:p>
-        </w:tc>
-        <w:tc>
-          <w:tcPr>
-            <w:tcW w:type="dxa" w:w="2438"/>
-            <w:shd w:fill="FFFFFF"/>
-            <w:tcMar>
-              <w:top w:w="70" w:type="dxa"/>
-              <w:start w:w="110" w:type="dxa"/>
-              <w:bottom w:w="70" w:type="dxa"/>
-              <w:end w:w="110" w:type="dxa"/>
-            </w:tcMar>
-          </w:tcPr>
-          <w:p>
-            <w:pPr>
-              <w:spacing w:after="0" w:line="240" w:lineRule="auto"/>
-            </w:pPr>
-            <w:r>
-              <w:t>Light to moderate</w:t>
-            </w:r>
-          </w:p>
-        </w:tc>
-      </w:tr>
-      <w:tr>
-        <w:trPr>
-          <w:cantSplit/>
-        </w:trPr>
-        <w:tc>
-          <w:tcPr>
-            <w:tcW w:type="dxa" w:w="2438"/>
-            <w:shd w:fill="F4F6F8"/>
-            <w:tcMar>
-              <w:top w:w="70" w:type="dxa"/>
-              <w:start w:w="110" w:type="dxa"/>
-              <w:bottom w:w="70" w:type="dxa"/>
-              <w:end w:w="110" w:type="dxa"/>
-            </w:tcMar>
-          </w:tcPr>
-          <w:p>
-            <w:pPr>
-              <w:spacing w:after="0" w:line="240" w:lineRule="auto"/>
-            </w:pPr>
-            <w:r>
-              <w:t>3.5</w:t>
-            </w:r>
-          </w:p>
-        </w:tc>
-        <w:tc>
-          <w:tcPr>
-            <w:tcW w:type="dxa" w:w="2438"/>
-            <w:shd w:fill="F4F6F8"/>
-            <w:tcMar>
-              <w:top w:w="70" w:type="dxa"/>
-              <w:start w:w="110" w:type="dxa"/>
-              <w:bottom w:w="70" w:type="dxa"/>
-              <w:end w:w="110" w:type="dxa"/>
-            </w:tcMar>
-          </w:tcPr>
-          <w:p>
-            <w:pPr>
-              <w:spacing w:after="0" w:line="240" w:lineRule="auto"/>
-            </w:pPr>
-            <w:r>
-              <w:t>Question-adaptive retrieval budgets for G-Retriever</w:t>
-            </w:r>
-          </w:p>
-        </w:tc>
-        <w:tc>
-          <w:tcPr>
-            <w:tcW w:type="dxa" w:w="2438"/>
-            <w:shd w:fill="F4F6F8"/>
-            <w:tcMar>
-              <w:top w:w="70" w:type="dxa"/>
-              <w:start w:w="110" w:type="dxa"/>
-              <w:bottom w:w="70" w:type="dxa"/>
-              <w:end w:w="110" w:type="dxa"/>
-            </w:tcMar>
-          </w:tcPr>
-          <w:p>
-            <w:pPr>
-              <w:spacing w:after="0" w:line="240" w:lineRule="auto"/>
-            </w:pPr>
-            <w:r>
-              <w:t>MSc optional</w:t>
             </w:r>
           </w:p>
         </w:tc>
@@ -1989,7 +1649,7 @@
               <w:spacing w:after="0" w:line="240" w:lineRule="auto"/>
             </w:pPr>
             <w:r>
-              <w:t>Adapting DINO backbones for land cover or industrial anomalies</w:t>
+              <w:t>Deep-unfolded multivariate VMD for correlated multichannel signals</w:t>
             </w:r>
           </w:p>
         </w:tc>
@@ -2009,7 +1669,7 @@
               <w:spacing w:after="0" w:line="240" w:lineRule="auto"/>
             </w:pPr>
             <w:r>
-              <w:t>Both</w:t>
+              <w:t>MSc preferred</w:t>
             </w:r>
           </w:p>
         </w:tc>
@@ -2029,7 +1689,7 @@
               <w:spacing w:after="0" w:line="240" w:lineRule="auto"/>
             </w:pPr>
             <w:r>
-              <w:t>Moderate</w:t>
+              <w:t>Light for synthetic data</w:t>
             </w:r>
           </w:p>
         </w:tc>
@@ -2123,7 +1783,7 @@
         <w:spacing w:before="0" w:after="100" w:line="254" w:lineRule="auto"/>
       </w:pPr>
       <w:r>
-        <w:t>Projects 2.1–2.6, 3.2, 3.3 and 4.1 must report the following settings whenever they are meaningful:</w:t>
+        <w:t>Projects 2.1–2.6, 3.1 and 4.1 must report the following settings whenever they are meaningful:</w:t>
       </w:r>
     </w:p>
     <w:p>
@@ -8120,7 +7780,7 @@
         <w:pStyle w:val="Heading1"/>
       </w:pPr>
       <w:r>
-        <w:t>Category 3  Implementing modern Graph ML research</w:t>
+        <w:t>Category 3  Deep-learning vision models and applications</w:t>
       </w:r>
     </w:p>
     <w:p>
@@ -8128,7 +7788,7 @@
         <w:spacing w:before="0" w:after="100" w:line="254" w:lineRule="auto"/>
       </w:pPr>
       <w:r>
-        <w:t>These projects begin from an anchor paper with public code and a public benchmark. The first milestone is to reproduce the central mechanism. The Master project adds and tests a new mechanism or a stronger evaluation protocol.</w:t>
+        <w:t>Large self-supervised vision backbones provide general-purpose features without task-specific labels. A student project should not retrain such a backbone. It should measure what a frozen model already supplies, what a small adapter adds and whether the gain justifies its trainable parameters.</w:t>
       </w:r>
     </w:p>
     <w:p>
@@ -8136,7 +7796,7 @@
         <w:pStyle w:val="Heading3"/>
       </w:pPr>
       <w:r>
-        <w:t>From repository to research question</w:t>
+        <w:t>Choosing a project track</w:t>
       </w:r>
     </w:p>
     <w:p>
@@ -8144,7 +7804,7 @@
         <w:spacing w:before="0" w:after="80" w:line="254" w:lineRule="auto"/>
       </w:pPr>
       <w:r>
-        <w:t>Installing code, reproducing a table, tuning hyperparameters or moving an unchanged model to another dataset is a starting point, not an MSc contribution. The proposed contributions in this category concern sensor representations, induction protocols, graph augmentations, compute routing and retrieval budgets.</w:t>
+        <w:t>The project has two separate task tracks. EuroSAT RGB supports the Bachelor classification route. MVTec dense anomaly localisation or multispectral EuroSAT supports a more complex Master route.</w:t>
       </w:r>
     </w:p>
     <w:p>
@@ -8152,7 +7812,7 @@
         <w:spacing w:before="0" w:after="80" w:line="254" w:lineRule="auto"/>
       </w:pPr>
       <w:r>
-        <w:t>For graph self-supervision, compare the pretrained encoder with a randomly initialised frozen encoder and the same architecture trained fully supervised.</w:t>
+        <w:t>Compare frozen features, an adapter and supervised training under the same split and label budget. Report trainable parameters and the evaluation protocol alongside accuracy.</w:t>
       </w:r>
     </w:p>
     <w:p>
@@ -8160,7 +7820,7 @@
         <w:pStyle w:val="Heading2"/>
       </w:pPr>
       <w:r>
-        <w:t>Reading map and Stanford examples</w:t>
+        <w:t>Learn first and find data</w:t>
       </w:r>
     </w:p>
     <w:p>
@@ -8169,2510 +7829,9 @@
         <w:spacing w:before="0" w:after="40" w:line="254" w:lineRule="auto"/>
       </w:pPr>
       <w:r>
-        <w:t xml:space="preserve">Spatiotemporal graphs: </w:t>
+        <w:t xml:space="preserve">Core reading: </w:t>
       </w:r>
       <w:hyperlink r:id="rId67">
-        <w:r>
-          <w:rPr>
-            <w:color w:val="2F5597"/>
-            <w:u w:val="single"/>
-          </w:rPr>
-          <w:t>survey</w:t>
-        </w:r>
-      </w:hyperlink>
-      <w:r>
-        <w:t xml:space="preserve">, </w:t>
-      </w:r>
-      <w:hyperlink r:id="rId27">
-        <w:r>
-          <w:rPr>
-            <w:color w:val="2F5597"/>
-            <w:u w:val="single"/>
-          </w:rPr>
-          <w:t>DCRNN</w:t>
-        </w:r>
-      </w:hyperlink>
-      <w:r>
-        <w:t xml:space="preserve">, </w:t>
-      </w:r>
-      <w:hyperlink r:id="rId68">
-        <w:r>
-          <w:rPr>
-            <w:color w:val="2F5597"/>
-            <w:u w:val="single"/>
-          </w:rPr>
-          <w:t>STAEformer</w:t>
-        </w:r>
-      </w:hyperlink>
-      <w:r>
-        <w:t xml:space="preserve">. Dynamic graphs: </w:t>
-      </w:r>
-      <w:hyperlink r:id="rId69">
-        <w:r>
-          <w:rPr>
-            <w:color w:val="2F5597"/>
-            <w:u w:val="single"/>
-          </w:rPr>
-          <w:t>TGN</w:t>
-        </w:r>
-      </w:hyperlink>
-      <w:r>
-        <w:t xml:space="preserve"> and </w:t>
-      </w:r>
-      <w:hyperlink r:id="rId70">
-        <w:r>
-          <w:rPr>
-            <w:color w:val="2F5597"/>
-            <w:u w:val="single"/>
-          </w:rPr>
-          <w:t>DyGFormer</w:t>
-        </w:r>
-      </w:hyperlink>
-      <w:r>
-        <w:t>.</w:t>
-      </w:r>
-    </w:p>
-    <w:p>
-      <w:pPr>
-        <w:pStyle w:val="ListBullet"/>
-        <w:spacing w:before="0" w:after="40" w:line="254" w:lineRule="auto"/>
-      </w:pPr>
-      <w:r>
-        <w:t xml:space="preserve">Graph Transformers: </w:t>
-      </w:r>
-      <w:hyperlink r:id="rId71">
-        <w:r>
-          <w:rPr>
-            <w:color w:val="2F5597"/>
-            <w:u w:val="single"/>
-          </w:rPr>
-          <w:t>Graphormer</w:t>
-        </w:r>
-      </w:hyperlink>
-      <w:r>
-        <w:t xml:space="preserve">, </w:t>
-      </w:r>
-      <w:hyperlink r:id="rId72">
-        <w:r>
-          <w:rPr>
-            <w:color w:val="2F5597"/>
-            <w:u w:val="single"/>
-          </w:rPr>
-          <w:t>GraphGPS</w:t>
-        </w:r>
-      </w:hyperlink>
-      <w:r>
-        <w:t xml:space="preserve">. Self-supervision: </w:t>
-      </w:r>
-      <w:hyperlink r:id="rId73">
-        <w:r>
-          <w:rPr>
-            <w:color w:val="2F5597"/>
-            <w:u w:val="single"/>
-          </w:rPr>
-          <w:t>DGI</w:t>
-        </w:r>
-      </w:hyperlink>
-      <w:r>
-        <w:t xml:space="preserve">, </w:t>
-      </w:r>
-      <w:hyperlink r:id="rId74">
-        <w:r>
-          <w:rPr>
-            <w:color w:val="2F5597"/>
-            <w:u w:val="single"/>
-          </w:rPr>
-          <w:t>GRACE</w:t>
-        </w:r>
-      </w:hyperlink>
-      <w:r>
-        <w:t xml:space="preserve">, </w:t>
-      </w:r>
-      <w:hyperlink r:id="rId75">
-        <w:r>
-          <w:rPr>
-            <w:color w:val="2F5597"/>
-            <w:u w:val="single"/>
-          </w:rPr>
-          <w:t>GraphCL</w:t>
-        </w:r>
-      </w:hyperlink>
-      <w:r>
-        <w:t xml:space="preserve">, </w:t>
-      </w:r>
-      <w:hyperlink r:id="rId62">
-        <w:r>
-          <w:rPr>
-            <w:color w:val="2F5597"/>
-            <w:u w:val="single"/>
-          </w:rPr>
-          <w:t>GraphMAE</w:t>
-        </w:r>
-      </w:hyperlink>
-      <w:r>
-        <w:t xml:space="preserve">. Graph RAG: </w:t>
-      </w:r>
-      <w:hyperlink r:id="rId76">
-        <w:r>
-          <w:rPr>
-            <w:color w:val="2F5597"/>
-            <w:u w:val="single"/>
-          </w:rPr>
-          <w:t>G-Retriever</w:t>
-        </w:r>
-      </w:hyperlink>
-      <w:r>
-        <w:t>.</w:t>
-      </w:r>
-    </w:p>
-    <w:p>
-      <w:pPr>
-        <w:pStyle w:val="ListBullet"/>
-        <w:spacing w:before="0" w:after="40" w:line="254" w:lineRule="auto"/>
-      </w:pPr>
-      <w:r>
-        <w:t xml:space="preserve">Stanford introductions: </w:t>
-      </w:r>
-      <w:hyperlink r:id="rId77">
-        <w:r>
-          <w:rPr>
-            <w:color w:val="2F5597"/>
-            <w:u w:val="single"/>
-          </w:rPr>
-          <w:t>Self-Supervised Learning for Graphs</w:t>
-        </w:r>
-      </w:hyperlink>
-      <w:r>
-        <w:t xml:space="preserve">, </w:t>
-      </w:r>
-      <w:hyperlink r:id="rId78">
-        <w:r>
-          <w:rPr>
-            <w:color w:val="2F5597"/>
-            <w:u w:val="single"/>
-          </w:rPr>
-          <w:t>contrastive molecular pretraining</w:t>
-        </w:r>
-      </w:hyperlink>
-      <w:r>
-        <w:t xml:space="preserve">, </w:t>
-      </w:r>
-      <w:hyperlink r:id="rId79">
-        <w:r>
-          <w:rPr>
-            <w:color w:val="2F5597"/>
-            <w:u w:val="single"/>
-          </w:rPr>
-          <w:t>RingSAGE</w:t>
-        </w:r>
-      </w:hyperlink>
-      <w:r>
-        <w:t xml:space="preserve"> and </w:t>
-      </w:r>
-      <w:hyperlink r:id="rId80">
-        <w:r>
-          <w:rPr>
-            <w:color w:val="2F5597"/>
-            <w:u w:val="single"/>
-          </w:rPr>
-          <w:t>Graph Transformers for TSP</w:t>
-        </w:r>
-      </w:hyperlink>
-      <w:r>
-        <w:t>.</w:t>
-      </w:r>
-    </w:p>
-    <w:p>
-      <w:r>
-        <w:br w:type="page"/>
-      </w:r>
-    </w:p>
-    <w:p>
-      <w:pPr>
-        <w:pStyle w:val="Heading2"/>
-        <w:spacing w:after="140"/>
-      </w:pPr>
-      <w:r>
-        <w:t>Project 3.1  Inductive sensor embeddings for STAEformer</w:t>
-      </w:r>
-    </w:p>
-    <w:tbl>
-      <w:tblPr>
-        <w:tblW w:type="auto" w:w="0"/>
-        <w:jc w:val="center"/>
-        <w:tblLayout w:type="fixed"/>
-        <w:tblLook w:firstColumn="1" w:firstRow="1" w:lastColumn="0" w:lastRow="0" w:noHBand="0" w:noVBand="1" w:val="04A0"/>
-        <w:tblBorders>
-          <w:top w:val="single" w:sz="5" w:space="0" w:color="D9E0E6"/>
-          <w:left w:val="single" w:sz="5" w:space="0" w:color="D9E0E6"/>
-          <w:bottom w:val="single" w:sz="5" w:space="0" w:color="D9E0E6"/>
-          <w:right w:val="single" w:sz="5" w:space="0" w:color="D9E0E6"/>
-          <w:insideH w:val="single" w:sz="5" w:space="0" w:color="D9E0E6"/>
-          <w:insideV w:val="single" w:sz="5" w:space="0" w:color="D9E0E6"/>
-        </w:tblBorders>
-      </w:tblPr>
-      <w:tblGrid>
-        <w:gridCol w:w="1944"/>
-        <w:gridCol w:w="7704"/>
-      </w:tblGrid>
-      <w:tr>
-        <w:trPr>
-          <w:cantSplit/>
-        </w:trPr>
-        <w:tc>
-          <w:tcPr>
-            <w:tcW w:type="dxa" w:w="1944"/>
-            <w:shd w:fill="EAF2F8"/>
-            <w:tcMar>
-              <w:top w:w="90" w:type="dxa"/>
-              <w:start w:w="110" w:type="dxa"/>
-              <w:bottom w:w="90" w:type="dxa"/>
-              <w:end w:w="110" w:type="dxa"/>
-            </w:tcMar>
-            <w:vAlign w:val="center"/>
-          </w:tcPr>
-          <w:p>
-            <w:pPr>
-              <w:spacing w:after="0"/>
-            </w:pPr>
-            <w:r>
-              <w:rPr>
-                <w:b/>
-                <w:color w:val="17365D"/>
-              </w:rPr>
-              <w:t>Task</w:t>
-            </w:r>
-          </w:p>
-        </w:tc>
-        <w:tc>
-          <w:tcPr>
-            <w:tcW w:type="dxa" w:w="7704"/>
-            <w:shd w:fill="FFFFFF"/>
-            <w:tcMar>
-              <w:top w:w="90" w:type="dxa"/>
-              <w:start w:w="110" w:type="dxa"/>
-              <w:bottom w:w="90" w:type="dxa"/>
-              <w:end w:w="110" w:type="dxa"/>
-            </w:tcMar>
-            <w:vAlign w:val="center"/>
-          </w:tcPr>
-          <w:p>
-            <w:pPr>
-              <w:spacing w:after="0"/>
-            </w:pPr>
-            <w:r>
-              <w:t>Node-level multi-horizon regression</w:t>
-            </w:r>
-          </w:p>
-        </w:tc>
-      </w:tr>
-      <w:tr>
-        <w:trPr>
-          <w:cantSplit/>
-        </w:trPr>
-        <w:tc>
-          <w:tcPr>
-            <w:tcW w:type="dxa" w:w="1944"/>
-            <w:shd w:fill="EAF2F8"/>
-            <w:tcMar>
-              <w:top w:w="90" w:type="dxa"/>
-              <w:start w:w="110" w:type="dxa"/>
-              <w:bottom w:w="90" w:type="dxa"/>
-              <w:end w:w="110" w:type="dxa"/>
-            </w:tcMar>
-            <w:vAlign w:val="center"/>
-          </w:tcPr>
-          <w:p>
-            <w:pPr>
-              <w:spacing w:after="0"/>
-            </w:pPr>
-            <w:r>
-              <w:rPr>
-                <w:b/>
-                <w:color w:val="17365D"/>
-              </w:rPr>
-              <w:t>Recommended level</w:t>
-            </w:r>
-          </w:p>
-        </w:tc>
-        <w:tc>
-          <w:tcPr>
-            <w:tcW w:type="dxa" w:w="7704"/>
-            <w:shd w:fill="F4F6F8"/>
-            <w:tcMar>
-              <w:top w:w="90" w:type="dxa"/>
-              <w:start w:w="110" w:type="dxa"/>
-              <w:bottom w:w="90" w:type="dxa"/>
-              <w:end w:w="110" w:type="dxa"/>
-            </w:tcMar>
-            <w:vAlign w:val="center"/>
-          </w:tcPr>
-          <w:p>
-            <w:pPr>
-              <w:spacing w:after="0"/>
-            </w:pPr>
-            <w:r>
-              <w:t>MSc preferred; BSc reproduction variant</w:t>
-            </w:r>
-          </w:p>
-        </w:tc>
-      </w:tr>
-      <w:tr>
-        <w:trPr>
-          <w:cantSplit/>
-        </w:trPr>
-        <w:tc>
-          <w:tcPr>
-            <w:tcW w:type="dxa" w:w="1944"/>
-            <w:shd w:fill="EAF2F8"/>
-            <w:tcMar>
-              <w:top w:w="90" w:type="dxa"/>
-              <w:start w:w="110" w:type="dxa"/>
-              <w:bottom w:w="90" w:type="dxa"/>
-              <w:end w:w="110" w:type="dxa"/>
-            </w:tcMar>
-            <w:vAlign w:val="center"/>
-          </w:tcPr>
-          <w:p>
-            <w:pPr>
-              <w:spacing w:after="0"/>
-            </w:pPr>
-            <w:r>
-              <w:rPr>
-                <w:b/>
-                <w:color w:val="17365D"/>
-              </w:rPr>
-              <w:t>Compute</w:t>
-            </w:r>
-          </w:p>
-        </w:tc>
-        <w:tc>
-          <w:tcPr>
-            <w:tcW w:type="dxa" w:w="7704"/>
-            <w:shd w:fill="FFFFFF"/>
-            <w:tcMar>
-              <w:top w:w="90" w:type="dxa"/>
-              <w:start w:w="110" w:type="dxa"/>
-              <w:bottom w:w="90" w:type="dxa"/>
-              <w:end w:w="110" w:type="dxa"/>
-            </w:tcMar>
-            <w:vAlign w:val="center"/>
-          </w:tcPr>
-          <w:p>
-            <w:pPr>
-              <w:spacing w:after="0"/>
-            </w:pPr>
-            <w:r>
-              <w:t>Moderate; 4–8 GB GPU</w:t>
-            </w:r>
-          </w:p>
-        </w:tc>
-      </w:tr>
-      <w:tr>
-        <w:trPr>
-          <w:cantSplit/>
-        </w:trPr>
-        <w:tc>
-          <w:tcPr>
-            <w:tcW w:type="dxa" w:w="1944"/>
-            <w:shd w:fill="EAF2F8"/>
-            <w:tcMar>
-              <w:top w:w="90" w:type="dxa"/>
-              <w:start w:w="110" w:type="dxa"/>
-              <w:bottom w:w="90" w:type="dxa"/>
-              <w:end w:w="110" w:type="dxa"/>
-            </w:tcMar>
-            <w:vAlign w:val="center"/>
-          </w:tcPr>
-          <w:p>
-            <w:pPr>
-              <w:spacing w:after="0"/>
-            </w:pPr>
-            <w:r>
-              <w:rPr>
-                <w:b/>
-                <w:color w:val="17365D"/>
-              </w:rPr>
-              <w:t>Starting paper</w:t>
-            </w:r>
-          </w:p>
-        </w:tc>
-        <w:tc>
-          <w:tcPr>
-            <w:tcW w:type="dxa" w:w="7704"/>
-            <w:shd w:fill="F4F6F8"/>
-            <w:tcMar>
-              <w:top w:w="90" w:type="dxa"/>
-              <w:start w:w="110" w:type="dxa"/>
-              <w:bottom w:w="90" w:type="dxa"/>
-              <w:end w:w="110" w:type="dxa"/>
-            </w:tcMar>
-            <w:vAlign w:val="center"/>
-          </w:tcPr>
-          <w:p>
-            <w:pPr>
-              <w:spacing w:after="0"/>
-            </w:pPr>
-            <w:r>
-              <w:t xml:space="preserve">Liu et al., </w:t>
-            </w:r>
-            <w:hyperlink r:id="rId68">
-              <w:r>
-                <w:rPr>
-                  <w:color w:val="2F5597"/>
-                  <w:u w:val="single"/>
-                </w:rPr>
-                <w:t>STAEformer</w:t>
-              </w:r>
-            </w:hyperlink>
-            <w:r>
-              <w:t>, CIKM 2023</w:t>
-            </w:r>
-          </w:p>
-        </w:tc>
-      </w:tr>
-    </w:tbl>
-    <w:p>
-      <w:pPr>
-        <w:spacing w:after="0"/>
-      </w:pPr>
-    </w:p>
-    <w:p>
-      <w:pPr>
-        <w:spacing w:before="80" w:after="100" w:line="254" w:lineRule="auto"/>
-      </w:pPr>
-      <w:r>
-        <w:rPr>
-          <w:b/>
-          <w:color w:val="25313C"/>
-        </w:rPr>
-        <w:t xml:space="preserve">What you will do. </w:t>
-      </w:r>
-      <w:r>
-        <w:t>STAEformer learns a separate adaptive representation for each sensor and input time position. The sensor-specific representation cannot directly handle a sensor that was absent during training. This project develops an embedding generated from the new sensor's graph context and short calibration history.</w:t>
-      </w:r>
-    </w:p>
-    <w:p>
-      <w:pPr>
-        <w:spacing w:before="0" w:after="100" w:line="254" w:lineRule="auto"/>
-      </w:pPr>
-      <w:r>
-        <w:rPr>
-          <w:b/>
-          <w:color w:val="25313C"/>
-        </w:rPr>
-        <w:t xml:space="preserve">Project goal. </w:t>
-      </w:r>
-      <w:r>
-        <w:t>Preserve ordinary forecasting accuracy while improving forecasts for sensors deliberately held out of training.</w:t>
-      </w:r>
-    </w:p>
-    <w:p>
-      <w:pPr>
-        <w:spacing w:before="0" w:after="100" w:line="254" w:lineRule="auto"/>
-      </w:pPr>
-      <w:r>
-        <w:rPr>
-          <w:b/>
-          <w:color w:val="25313C"/>
-        </w:rPr>
-        <w:t xml:space="preserve">Data. </w:t>
-      </w:r>
-      <w:r>
-        <w:t xml:space="preserve">Use </w:t>
-      </w:r>
-      <w:r>
-        <w:rPr>
-          <w:b/>
-        </w:rPr>
-        <w:t>PEMS04</w:t>
-      </w:r>
-      <w:r>
-        <w:t xml:space="preserve">, supplied by the </w:t>
-      </w:r>
-      <w:hyperlink r:id="rId81">
-        <w:r>
-          <w:rPr>
-            <w:color w:val="2F5597"/>
-            <w:u w:val="single"/>
-          </w:rPr>
-          <w:t>official STAEformer repository</w:t>
-        </w:r>
-      </w:hyperlink>
-      <w:r>
-        <w:t>: 307 sensors and 16,992 five-minute observations, with the official chronological split and 12-step input/output. PEMS08 is optional confirmation.</w:t>
-      </w:r>
-    </w:p>
-    <w:p>
-      <w:pPr>
-        <w:spacing w:before="0" w:after="100" w:line="254" w:lineRule="auto"/>
-      </w:pPr>
-      <w:r>
-        <w:rPr>
-          <w:b/>
-          <w:color w:val="25313C"/>
-        </w:rPr>
-        <w:t xml:space="preserve">Methods and starting code. </w:t>
-      </w:r>
-      <w:r>
-        <w:t>Compact STAEformer, vanilla Transformer, GRU and STGCN/DCRNN. Replace or complement the free sensor-indexed embedding with a shared encoder using calibration summaries, graph statistics and positional encodings.</w:t>
-      </w:r>
-    </w:p>
-    <w:p>
-      <w:pPr>
-        <w:spacing w:before="0" w:after="100" w:line="254" w:lineRule="auto"/>
-      </w:pPr>
-      <w:r>
-        <w:rPr>
-          <w:b/>
-          <w:color w:val="25313C"/>
-        </w:rPr>
-        <w:t xml:space="preserve">Required baselines. </w:t>
-      </w:r>
-      <w:r>
-        <w:t>Original STAEformer, mean/zero/random embeddings for unseen sensors, the proposed inductive encoder and a hybrid seen-sensor model. Reproduce the adaptive-embedding benefit before changing the method.</w:t>
-      </w:r>
-    </w:p>
-    <w:p>
-      <w:pPr>
-        <w:spacing w:before="0" w:after="100" w:line="254" w:lineRule="auto"/>
-      </w:pPr>
-      <w:r>
-        <w:rPr>
-          <w:b/>
-          <w:color w:val="25313C"/>
-        </w:rPr>
-        <w:t xml:space="preserve">Evaluation. </w:t>
-      </w:r>
-      <w:r>
-        <w:t>Report standard forecasting and seeded 10/20/30% sensor cold-start settings. Remove held-out sensors and incident correlation edges during training, then expose only 1, 3 or 7 days of unlabelled calibration history. MAE is primary; report RMSE/MAPE by horizon and separately for seen/unseen sensors, plus at least three seeds.</w:t>
-      </w:r>
-    </w:p>
-    <w:p>
-      <w:pPr>
-        <w:spacing w:before="80" w:after="100" w:line="254" w:lineRule="auto"/>
-      </w:pPr>
-      <w:r>
-        <w:rPr>
-          <w:b/>
-          <w:color w:val="25313C"/>
-        </w:rPr>
-        <w:t xml:space="preserve">Bachelor scope. </w:t>
-      </w:r>
-      <w:r>
-        <w:t>Reproduce compact STAEformer on PEMS04 and its embedding ablation. Random sensor masking may be explored, but no new inductive encoder is required.</w:t>
-      </w:r>
-    </w:p>
-    <w:p>
-      <w:pPr>
-        <w:spacing w:before="80" w:after="100" w:line="254" w:lineRule="auto"/>
-      </w:pPr>
-      <w:r>
-        <w:rPr>
-          <w:b/>
-          <w:color w:val="25313C"/>
-        </w:rPr>
-        <w:t xml:space="preserve">Master research question and contribution. </w:t>
-      </w:r>
-      <w:r>
-        <w:t xml:space="preserve">Research question: </w:t>
-      </w:r>
-      <w:r>
-        <w:rPr>
-          <w:b/>
-        </w:rPr>
-        <w:t>Can a graph-conditioned shared sensor encoder recover useful representations for newly installed sensors without harming the fixed-network model?</w:t>
-      </w:r>
-      <w:r>
-        <w:t xml:space="preserve"> The contribution is the encoder, a leakage-safe cold-start protocol and analysis by degree, correlation strength and calibration length. If it fails, quantify when sensor-specific parameters are indispensable.</w:t>
-      </w:r>
-    </w:p>
-    <w:p>
-      <w:pPr>
-        <w:spacing w:before="0" w:after="100" w:line="254" w:lineRule="auto"/>
-      </w:pPr>
-      <w:r>
-        <w:rPr>
-          <w:b/>
-          <w:color w:val="25313C"/>
-        </w:rPr>
-        <w:t xml:space="preserve">Practical notes. </w:t>
-      </w:r>
-      <w:r>
-        <w:t>Public data and official code reduce setup work. Keep the unseen-sensor protocol separate from Project 1.2: that project learns changing edges, while this project represents nodes that were absent during training.</w:t>
-      </w:r>
-    </w:p>
-    <w:p>
-      <w:r>
-        <w:br w:type="page"/>
-      </w:r>
-    </w:p>
-    <w:p>
-      <w:pPr>
-        <w:pStyle w:val="Heading2"/>
-        <w:spacing w:after="140"/>
-      </w:pPr>
-      <w:r>
-        <w:t>Project 3.2  Inductive evaluation of GRACE</w:t>
-      </w:r>
-    </w:p>
-    <w:tbl>
-      <w:tblPr>
-        <w:tblW w:type="auto" w:w="0"/>
-        <w:jc w:val="center"/>
-        <w:tblLayout w:type="fixed"/>
-        <w:tblLook w:firstColumn="1" w:firstRow="1" w:lastColumn="0" w:lastRow="0" w:noHBand="0" w:noVBand="1" w:val="04A0"/>
-        <w:tblBorders>
-          <w:top w:val="single" w:sz="5" w:space="0" w:color="D9E0E6"/>
-          <w:left w:val="single" w:sz="5" w:space="0" w:color="D9E0E6"/>
-          <w:bottom w:val="single" w:sz="5" w:space="0" w:color="D9E0E6"/>
-          <w:right w:val="single" w:sz="5" w:space="0" w:color="D9E0E6"/>
-          <w:insideH w:val="single" w:sz="5" w:space="0" w:color="D9E0E6"/>
-          <w:insideV w:val="single" w:sz="5" w:space="0" w:color="D9E0E6"/>
-        </w:tblBorders>
-      </w:tblPr>
-      <w:tblGrid>
-        <w:gridCol w:w="1944"/>
-        <w:gridCol w:w="7704"/>
-      </w:tblGrid>
-      <w:tr>
-        <w:trPr>
-          <w:cantSplit/>
-        </w:trPr>
-        <w:tc>
-          <w:tcPr>
-            <w:tcW w:type="dxa" w:w="1944"/>
-            <w:shd w:fill="EAF2F8"/>
-            <w:tcMar>
-              <w:top w:w="90" w:type="dxa"/>
-              <w:start w:w="110" w:type="dxa"/>
-              <w:bottom w:w="90" w:type="dxa"/>
-              <w:end w:w="110" w:type="dxa"/>
-            </w:tcMar>
-            <w:vAlign w:val="center"/>
-          </w:tcPr>
-          <w:p>
-            <w:pPr>
-              <w:spacing w:after="0"/>
-            </w:pPr>
-            <w:r>
-              <w:rPr>
-                <w:b/>
-                <w:color w:val="17365D"/>
-              </w:rPr>
-              <w:t>Task</w:t>
-            </w:r>
-          </w:p>
-        </w:tc>
-        <w:tc>
-          <w:tcPr>
-            <w:tcW w:type="dxa" w:w="7704"/>
-            <w:shd w:fill="FFFFFF"/>
-            <w:tcMar>
-              <w:top w:w="90" w:type="dxa"/>
-              <w:start w:w="110" w:type="dxa"/>
-              <w:bottom w:w="90" w:type="dxa"/>
-              <w:end w:w="110" w:type="dxa"/>
-            </w:tcMar>
-            <w:vAlign w:val="center"/>
-          </w:tcPr>
-          <w:p>
-            <w:pPr>
-              <w:spacing w:after="0"/>
-            </w:pPr>
-            <w:r>
-              <w:t>Self-supervised node representation learning then node classification</w:t>
-            </w:r>
-          </w:p>
-        </w:tc>
-      </w:tr>
-      <w:tr>
-        <w:trPr>
-          <w:cantSplit/>
-        </w:trPr>
-        <w:tc>
-          <w:tcPr>
-            <w:tcW w:type="dxa" w:w="1944"/>
-            <w:shd w:fill="EAF2F8"/>
-            <w:tcMar>
-              <w:top w:w="90" w:type="dxa"/>
-              <w:start w:w="110" w:type="dxa"/>
-              <w:bottom w:w="90" w:type="dxa"/>
-              <w:end w:w="110" w:type="dxa"/>
-            </w:tcMar>
-            <w:vAlign w:val="center"/>
-          </w:tcPr>
-          <w:p>
-            <w:pPr>
-              <w:spacing w:after="0"/>
-            </w:pPr>
-            <w:r>
-              <w:rPr>
-                <w:b/>
-                <w:color w:val="17365D"/>
-              </w:rPr>
-              <w:t>Recommended level</w:t>
-            </w:r>
-          </w:p>
-        </w:tc>
-        <w:tc>
-          <w:tcPr>
-            <w:tcW w:type="dxa" w:w="7704"/>
-            <w:shd w:fill="F4F6F8"/>
-            <w:tcMar>
-              <w:top w:w="90" w:type="dxa"/>
-              <w:start w:w="110" w:type="dxa"/>
-              <w:bottom w:w="90" w:type="dxa"/>
-              <w:end w:w="110" w:type="dxa"/>
-            </w:tcMar>
-            <w:vAlign w:val="center"/>
-          </w:tcPr>
-          <w:p>
-            <w:pPr>
-              <w:spacing w:after="0"/>
-            </w:pPr>
-            <w:r>
-              <w:t>BSc or MSc</w:t>
-            </w:r>
-          </w:p>
-        </w:tc>
-      </w:tr>
-      <w:tr>
-        <w:trPr>
-          <w:cantSplit/>
-        </w:trPr>
-        <w:tc>
-          <w:tcPr>
-            <w:tcW w:type="dxa" w:w="1944"/>
-            <w:shd w:fill="EAF2F8"/>
-            <w:tcMar>
-              <w:top w:w="90" w:type="dxa"/>
-              <w:start w:w="110" w:type="dxa"/>
-              <w:bottom w:w="90" w:type="dxa"/>
-              <w:end w:w="110" w:type="dxa"/>
-            </w:tcMar>
-            <w:vAlign w:val="center"/>
-          </w:tcPr>
-          <w:p>
-            <w:pPr>
-              <w:spacing w:after="0"/>
-            </w:pPr>
-            <w:r>
-              <w:rPr>
-                <w:b/>
-                <w:color w:val="17365D"/>
-              </w:rPr>
-              <w:t>Compute</w:t>
-            </w:r>
-          </w:p>
-        </w:tc>
-        <w:tc>
-          <w:tcPr>
-            <w:tcW w:type="dxa" w:w="7704"/>
-            <w:shd w:fill="FFFFFF"/>
-            <w:tcMar>
-              <w:top w:w="90" w:type="dxa"/>
-              <w:start w:w="110" w:type="dxa"/>
-              <w:bottom w:w="90" w:type="dxa"/>
-              <w:end w:w="110" w:type="dxa"/>
-            </w:tcMar>
-            <w:vAlign w:val="center"/>
-          </w:tcPr>
-          <w:p>
-            <w:pPr>
-              <w:spacing w:after="0"/>
-            </w:pPr>
-            <w:r>
-              <w:t>Very light; CPU or low-memory GPU</w:t>
-            </w:r>
-          </w:p>
-        </w:tc>
-      </w:tr>
-      <w:tr>
-        <w:trPr>
-          <w:cantSplit/>
-        </w:trPr>
-        <w:tc>
-          <w:tcPr>
-            <w:tcW w:type="dxa" w:w="1944"/>
-            <w:shd w:fill="EAF2F8"/>
-            <w:tcMar>
-              <w:top w:w="90" w:type="dxa"/>
-              <w:start w:w="110" w:type="dxa"/>
-              <w:bottom w:w="90" w:type="dxa"/>
-              <w:end w:w="110" w:type="dxa"/>
-            </w:tcMar>
-            <w:vAlign w:val="center"/>
-          </w:tcPr>
-          <w:p>
-            <w:pPr>
-              <w:spacing w:after="0"/>
-            </w:pPr>
-            <w:r>
-              <w:rPr>
-                <w:b/>
-                <w:color w:val="17365D"/>
-              </w:rPr>
-              <w:t>Starting paper</w:t>
-            </w:r>
-          </w:p>
-        </w:tc>
-        <w:tc>
-          <w:tcPr>
-            <w:tcW w:type="dxa" w:w="7704"/>
-            <w:shd w:fill="F4F6F8"/>
-            <w:tcMar>
-              <w:top w:w="90" w:type="dxa"/>
-              <w:start w:w="110" w:type="dxa"/>
-              <w:bottom w:w="90" w:type="dxa"/>
-              <w:end w:w="110" w:type="dxa"/>
-            </w:tcMar>
-            <w:vAlign w:val="center"/>
-          </w:tcPr>
-          <w:p>
-            <w:pPr>
-              <w:spacing w:after="0"/>
-            </w:pPr>
-            <w:r>
-              <w:t xml:space="preserve">Zhu et al., </w:t>
-            </w:r>
-            <w:hyperlink r:id="rId74">
-              <w:r>
-                <w:rPr>
-                  <w:color w:val="2F5597"/>
-                  <w:u w:val="single"/>
-                </w:rPr>
-                <w:t>GRACE</w:t>
-              </w:r>
-            </w:hyperlink>
-            <w:r>
-              <w:t>, 2020</w:t>
-            </w:r>
-          </w:p>
-        </w:tc>
-      </w:tr>
-    </w:tbl>
-    <w:p>
-      <w:pPr>
-        <w:spacing w:after="0"/>
-      </w:pPr>
-    </w:p>
-    <w:p>
-      <w:pPr>
-        <w:spacing w:before="80" w:after="100" w:line="254" w:lineRule="auto"/>
-      </w:pPr>
-      <w:r>
-        <w:rPr>
-          <w:b/>
-          <w:color w:val="25313C"/>
-        </w:rPr>
-        <w:t xml:space="preserve">What you will do. </w:t>
-      </w:r>
-      <w:r>
-        <w:t>GRACE makes two corrupted views of a citation graph agree. Standard evaluation is transductive: features and edges of test nodes can be visible during self-supervised pretraining. This project measures how much that access matters and develops a local variant for genuinely unseen nodes.</w:t>
-      </w:r>
-    </w:p>
-    <w:p>
-      <w:pPr>
-        <w:spacing w:before="0" w:after="100" w:line="254" w:lineRule="auto"/>
-      </w:pPr>
-      <w:r>
-        <w:rPr>
-          <w:b/>
-          <w:color w:val="25313C"/>
-        </w:rPr>
-        <w:t xml:space="preserve">Project goal. </w:t>
-      </w:r>
-      <w:r>
-        <w:t>Separate representation quality from the advantage of seeing the evaluation graph during pretraining.</w:t>
-      </w:r>
-    </w:p>
-    <w:p>
-      <w:pPr>
-        <w:spacing w:before="0" w:after="100" w:line="254" w:lineRule="auto"/>
-      </w:pPr>
-      <w:r>
-        <w:rPr>
-          <w:b/>
-          <w:color w:val="25313C"/>
-        </w:rPr>
-        <w:t xml:space="preserve">Data. </w:t>
-      </w:r>
-      <w:r>
-        <w:t xml:space="preserve">Use </w:t>
-      </w:r>
-      <w:r>
-        <w:rPr>
-          <w:b/>
-        </w:rPr>
-        <w:t>Cora</w:t>
-      </w:r>
-      <w:r>
-        <w:t xml:space="preserve"> and </w:t>
-      </w:r>
-      <w:r>
-        <w:rPr>
-          <w:b/>
-        </w:rPr>
-        <w:t>CiteSeer</w:t>
-      </w:r>
-      <w:r>
-        <w:t xml:space="preserve">, with PubMed optional, through the </w:t>
-      </w:r>
-      <w:hyperlink r:id="rId82">
-        <w:r>
-          <w:rPr>
-            <w:color w:val="2F5597"/>
-            <w:u w:val="single"/>
-          </w:rPr>
-          <w:t>PyG Planetoid loader</w:t>
-        </w:r>
-      </w:hyperlink>
-      <w:r>
-        <w:t>. The downstream task predicts a paper topic for each node.</w:t>
-      </w:r>
-    </w:p>
-    <w:p>
-      <w:pPr>
-        <w:spacing w:before="0" w:after="100" w:line="254" w:lineRule="auto"/>
-      </w:pPr>
-      <w:r>
-        <w:rPr>
-          <w:b/>
-          <w:color w:val="25313C"/>
-        </w:rPr>
-        <w:t xml:space="preserve">Methods and starting code. </w:t>
-      </w:r>
-      <w:r>
-        <w:t xml:space="preserve">Implement GRACE edge removal, feature masking, shared GCN encoder, projection head and node contrastive loss. Start from the </w:t>
-      </w:r>
-      <w:hyperlink r:id="rId83">
-        <w:r>
-          <w:rPr>
-            <w:color w:val="2F5597"/>
-            <w:u w:val="single"/>
-          </w:rPr>
-          <w:t>official GRACE repository</w:t>
-        </w:r>
-      </w:hyperlink>
-      <w:r>
-        <w:t>. Compare Deep Graph Infomax, a feature-only MLP, GraphSAGE and a supervised GCN.</w:t>
-      </w:r>
-    </w:p>
-    <w:p>
-      <w:pPr>
-        <w:spacing w:before="0" w:after="100" w:line="254" w:lineRule="auto"/>
-      </w:pPr>
-      <w:r>
-        <w:rPr>
-          <w:b/>
-          <w:color w:val="25313C"/>
-        </w:rPr>
-        <w:t xml:space="preserve">Required baselines. </w:t>
-      </w:r>
-      <w:r>
-        <w:t>Random frozen encoder, GRACE frozen probe, GRACE fine-tuning and the same encoder fully supervised. Standard transductive and strict inductive pretraining must be separately labelled.</w:t>
-      </w:r>
-    </w:p>
-    <w:p>
-      <w:pPr>
-        <w:spacing w:before="0" w:after="100" w:line="254" w:lineRule="auto"/>
-      </w:pPr>
-      <w:r>
-        <w:rPr>
-          <w:b/>
-          <w:color w:val="25313C"/>
-        </w:rPr>
-        <w:t xml:space="preserve">Evaluation. </w:t>
-      </w:r>
-      <w:r>
-        <w:t>Accuracy and macro-F1 at 1/5/10/100% label budgets. Use at least ten seeded splits with confidence intervals. In strict induction, remove validation/test nodes and incident edges until evaluation, then use the same inference-time neighbourhood policy for all methods.</w:t>
-      </w:r>
-    </w:p>
-    <w:p>
-      <w:pPr>
-        <w:spacing w:before="80" w:after="100" w:line="254" w:lineRule="auto"/>
-      </w:pPr>
-      <w:r>
-        <w:rPr>
-          <w:b/>
-          <w:color w:val="25313C"/>
-        </w:rPr>
-        <w:t xml:space="preserve">Bachelor scope. </w:t>
-      </w:r>
-      <w:r>
-        <w:t>Reproduce transductive GRACE on Cora plus a second dataset, compare frozen, fine-tuned and supervised GCN, and plot label efficiency.</w:t>
-      </w:r>
-    </w:p>
-    <w:p>
-      <w:pPr>
-        <w:spacing w:before="80" w:after="100" w:line="254" w:lineRule="auto"/>
-      </w:pPr>
-      <w:r>
-        <w:rPr>
-          <w:b/>
-          <w:color w:val="25313C"/>
-        </w:rPr>
-        <w:t xml:space="preserve">Master research question and contribution. </w:t>
-      </w:r>
-      <w:r>
-        <w:t xml:space="preserve">Research question: </w:t>
-      </w:r>
-      <w:r>
-        <w:rPr>
-          <w:b/>
-        </w:rPr>
-        <w:t>How much of GRACE's label efficiency survives strict induction, and can contrastive pretraining on sampled ego-graphs recover the loss?</w:t>
-      </w:r>
-      <w:r>
-        <w:t xml:space="preserve"> Build a GraphSAGE-style local encoder and analyse performance by held-out node degree, homophily and neighbourhood size. The leakage-controlled benchmark is itself part of the contribution.</w:t>
-      </w:r>
-    </w:p>
-    <w:p>
-      <w:pPr>
-        <w:spacing w:before="0" w:after="100" w:line="254" w:lineRule="auto"/>
-      </w:pPr>
-      <w:r>
-        <w:rPr>
-          <w:b/>
-          <w:color w:val="25313C"/>
-        </w:rPr>
-        <w:t xml:space="preserve">Practical notes. </w:t>
-      </w:r>
-      <w:r>
-        <w:t>Small datasets make multi-seed evaluation realistic. Never place transductive and inductive figures in one undifferentiated leaderboard.</w:t>
-      </w:r>
-    </w:p>
-    <w:p>
-      <w:r>
-        <w:br w:type="page"/>
-      </w:r>
-    </w:p>
-    <w:p>
-      <w:pPr>
-        <w:pStyle w:val="Heading2"/>
-        <w:spacing w:after="140"/>
-      </w:pPr>
-      <w:r>
-        <w:t>Project 3.3  Structure-aware augmentations for graph contrastive learning</w:t>
-      </w:r>
-    </w:p>
-    <w:tbl>
-      <w:tblPr>
-        <w:tblW w:type="auto" w:w="0"/>
-        <w:jc w:val="center"/>
-        <w:tblLayout w:type="fixed"/>
-        <w:tblLook w:firstColumn="1" w:firstRow="1" w:lastColumn="0" w:lastRow="0" w:noHBand="0" w:noVBand="1" w:val="04A0"/>
-        <w:tblBorders>
-          <w:top w:val="single" w:sz="5" w:space="0" w:color="D9E0E6"/>
-          <w:left w:val="single" w:sz="5" w:space="0" w:color="D9E0E6"/>
-          <w:bottom w:val="single" w:sz="5" w:space="0" w:color="D9E0E6"/>
-          <w:right w:val="single" w:sz="5" w:space="0" w:color="D9E0E6"/>
-          <w:insideH w:val="single" w:sz="5" w:space="0" w:color="D9E0E6"/>
-          <w:insideV w:val="single" w:sz="5" w:space="0" w:color="D9E0E6"/>
-        </w:tblBorders>
-      </w:tblPr>
-      <w:tblGrid>
-        <w:gridCol w:w="1944"/>
-        <w:gridCol w:w="7704"/>
-      </w:tblGrid>
-      <w:tr>
-        <w:trPr>
-          <w:cantSplit/>
-        </w:trPr>
-        <w:tc>
-          <w:tcPr>
-            <w:tcW w:type="dxa" w:w="1944"/>
-            <w:shd w:fill="EAF2F8"/>
-            <w:tcMar>
-              <w:top w:w="90" w:type="dxa"/>
-              <w:start w:w="110" w:type="dxa"/>
-              <w:bottom w:w="90" w:type="dxa"/>
-              <w:end w:w="110" w:type="dxa"/>
-            </w:tcMar>
-            <w:vAlign w:val="center"/>
-          </w:tcPr>
-          <w:p>
-            <w:pPr>
-              <w:spacing w:after="0"/>
-            </w:pPr>
-            <w:r>
-              <w:rPr>
-                <w:b/>
-                <w:color w:val="17365D"/>
-              </w:rPr>
-              <w:t>Task</w:t>
-            </w:r>
-          </w:p>
-        </w:tc>
-        <w:tc>
-          <w:tcPr>
-            <w:tcW w:type="dxa" w:w="7704"/>
-            <w:shd w:fill="FFFFFF"/>
-            <w:tcMar>
-              <w:top w:w="90" w:type="dxa"/>
-              <w:start w:w="110" w:type="dxa"/>
-              <w:bottom w:w="90" w:type="dxa"/>
-              <w:end w:w="110" w:type="dxa"/>
-            </w:tcMar>
-            <w:vAlign w:val="center"/>
-          </w:tcPr>
-          <w:p>
-            <w:pPr>
-              <w:spacing w:after="0"/>
-            </w:pPr>
-            <w:r>
-              <w:t>Self-supervised graph representation learning then graph classification</w:t>
-            </w:r>
-          </w:p>
-        </w:tc>
-      </w:tr>
-      <w:tr>
-        <w:trPr>
-          <w:cantSplit/>
-        </w:trPr>
-        <w:tc>
-          <w:tcPr>
-            <w:tcW w:type="dxa" w:w="1944"/>
-            <w:shd w:fill="EAF2F8"/>
-            <w:tcMar>
-              <w:top w:w="90" w:type="dxa"/>
-              <w:start w:w="110" w:type="dxa"/>
-              <w:bottom w:w="90" w:type="dxa"/>
-              <w:end w:w="110" w:type="dxa"/>
-            </w:tcMar>
-            <w:vAlign w:val="center"/>
-          </w:tcPr>
-          <w:p>
-            <w:pPr>
-              <w:spacing w:after="0"/>
-            </w:pPr>
-            <w:r>
-              <w:rPr>
-                <w:b/>
-                <w:color w:val="17365D"/>
-              </w:rPr>
-              <w:t>Recommended level</w:t>
-            </w:r>
-          </w:p>
-        </w:tc>
-        <w:tc>
-          <w:tcPr>
-            <w:tcW w:type="dxa" w:w="7704"/>
-            <w:shd w:fill="F4F6F8"/>
-            <w:tcMar>
-              <w:top w:w="90" w:type="dxa"/>
-              <w:start w:w="110" w:type="dxa"/>
-              <w:bottom w:w="90" w:type="dxa"/>
-              <w:end w:w="110" w:type="dxa"/>
-            </w:tcMar>
-            <w:vAlign w:val="center"/>
-          </w:tcPr>
-          <w:p>
-            <w:pPr>
-              <w:spacing w:after="0"/>
-            </w:pPr>
-            <w:r>
-              <w:t>BSc reproduction; MSc method project</w:t>
-            </w:r>
-          </w:p>
-        </w:tc>
-      </w:tr>
-      <w:tr>
-        <w:trPr>
-          <w:cantSplit/>
-        </w:trPr>
-        <w:tc>
-          <w:tcPr>
-            <w:tcW w:type="dxa" w:w="1944"/>
-            <w:shd w:fill="EAF2F8"/>
-            <w:tcMar>
-              <w:top w:w="90" w:type="dxa"/>
-              <w:start w:w="110" w:type="dxa"/>
-              <w:bottom w:w="90" w:type="dxa"/>
-              <w:end w:w="110" w:type="dxa"/>
-            </w:tcMar>
-            <w:vAlign w:val="center"/>
-          </w:tcPr>
-          <w:p>
-            <w:pPr>
-              <w:spacing w:after="0"/>
-            </w:pPr>
-            <w:r>
-              <w:rPr>
-                <w:b/>
-                <w:color w:val="17365D"/>
-              </w:rPr>
-              <w:t>Compute</w:t>
-            </w:r>
-          </w:p>
-        </w:tc>
-        <w:tc>
-          <w:tcPr>
-            <w:tcW w:type="dxa" w:w="7704"/>
-            <w:shd w:fill="FFFFFF"/>
-            <w:tcMar>
-              <w:top w:w="90" w:type="dxa"/>
-              <w:start w:w="110" w:type="dxa"/>
-              <w:bottom w:w="90" w:type="dxa"/>
-              <w:end w:w="110" w:type="dxa"/>
-            </w:tcMar>
-            <w:vAlign w:val="center"/>
-          </w:tcPr>
-          <w:p>
-            <w:pPr>
-              <w:spacing w:after="0"/>
-            </w:pPr>
-            <w:r>
-              <w:t>Light to moderate; CPU or low-memory GPU</w:t>
-            </w:r>
-          </w:p>
-        </w:tc>
-      </w:tr>
-      <w:tr>
-        <w:trPr>
-          <w:cantSplit/>
-        </w:trPr>
-        <w:tc>
-          <w:tcPr>
-            <w:tcW w:type="dxa" w:w="1944"/>
-            <w:shd w:fill="EAF2F8"/>
-            <w:tcMar>
-              <w:top w:w="90" w:type="dxa"/>
-              <w:start w:w="110" w:type="dxa"/>
-              <w:bottom w:w="90" w:type="dxa"/>
-              <w:end w:w="110" w:type="dxa"/>
-            </w:tcMar>
-            <w:vAlign w:val="center"/>
-          </w:tcPr>
-          <w:p>
-            <w:pPr>
-              <w:spacing w:after="0"/>
-            </w:pPr>
-            <w:r>
-              <w:rPr>
-                <w:b/>
-                <w:color w:val="17365D"/>
-              </w:rPr>
-              <w:t>Starting paper</w:t>
-            </w:r>
-          </w:p>
-        </w:tc>
-        <w:tc>
-          <w:tcPr>
-            <w:tcW w:type="dxa" w:w="7704"/>
-            <w:shd w:fill="F4F6F8"/>
-            <w:tcMar>
-              <w:top w:w="90" w:type="dxa"/>
-              <w:start w:w="110" w:type="dxa"/>
-              <w:bottom w:w="90" w:type="dxa"/>
-              <w:end w:w="110" w:type="dxa"/>
-            </w:tcMar>
-            <w:vAlign w:val="center"/>
-          </w:tcPr>
-          <w:p>
-            <w:pPr>
-              <w:spacing w:after="0"/>
-            </w:pPr>
-            <w:r>
-              <w:t xml:space="preserve">You et al., </w:t>
-            </w:r>
-            <w:hyperlink r:id="rId75">
-              <w:r>
-                <w:rPr>
-                  <w:color w:val="2F5597"/>
-                  <w:u w:val="single"/>
-                </w:rPr>
-                <w:t>GraphCL</w:t>
-              </w:r>
-            </w:hyperlink>
-            <w:r>
-              <w:t>, NeurIPS 2020</w:t>
-            </w:r>
-          </w:p>
-        </w:tc>
-      </w:tr>
-    </w:tbl>
-    <w:p>
-      <w:pPr>
-        <w:spacing w:after="0"/>
-      </w:pPr>
-    </w:p>
-    <w:p>
-      <w:pPr>
-        <w:spacing w:before="80" w:after="100" w:line="254" w:lineRule="auto"/>
-      </w:pPr>
-      <w:r>
-        <w:rPr>
-          <w:b/>
-          <w:color w:val="25313C"/>
-        </w:rPr>
-        <w:t xml:space="preserve">What you will do. </w:t>
-      </w:r>
-      <w:r>
-        <w:t>GraphCL learns by making two augmented versions of the same graph agree. Random deletion can destroy bridges, cycles or community structure and accidentally change the graph's meaning. This project controls that damage rather than merely tuning an augmentation rate.</w:t>
-      </w:r>
-    </w:p>
-    <w:p>
-      <w:pPr>
-        <w:spacing w:before="0" w:after="100" w:line="254" w:lineRule="auto"/>
-      </w:pPr>
-      <w:r>
-        <w:rPr>
-          <w:b/>
-          <w:color w:val="25313C"/>
-        </w:rPr>
-        <w:t xml:space="preserve">Project goal. </w:t>
-      </w:r>
-      <w:r>
-        <w:t>Test whether structure-aware views are more label-efficient and less sensitive to augmentation strength than uniformly random views at the same number of edits.</w:t>
-      </w:r>
-    </w:p>
-    <w:p>
-      <w:pPr>
-        <w:spacing w:before="0" w:after="100" w:line="254" w:lineRule="auto"/>
-      </w:pPr>
-      <w:r>
-        <w:rPr>
-          <w:b/>
-          <w:color w:val="25313C"/>
-        </w:rPr>
-        <w:t xml:space="preserve">Data. </w:t>
-      </w:r>
-      <w:r>
-        <w:t xml:space="preserve">Use </w:t>
-      </w:r>
-      <w:r>
-        <w:rPr>
-          <w:b/>
-        </w:rPr>
-        <w:t>NCI1</w:t>
-      </w:r>
-      <w:r>
-        <w:t xml:space="preserve"> (4,110 graphs) and </w:t>
-      </w:r>
-      <w:r>
-        <w:rPr>
-          <w:b/>
-        </w:rPr>
-        <w:t>PROTEINS</w:t>
-      </w:r>
-      <w:r>
-        <w:t xml:space="preserve"> (1,113) from </w:t>
-      </w:r>
-      <w:hyperlink r:id="rId84">
-        <w:r>
-          <w:rPr>
-            <w:color w:val="2F5597"/>
-            <w:u w:val="single"/>
-          </w:rPr>
-          <w:t>TU Dortmund</w:t>
-        </w:r>
-      </w:hyperlink>
-      <w:r>
-        <w:t xml:space="preserve"> via the </w:t>
-      </w:r>
-      <w:hyperlink r:id="rId85">
-        <w:r>
-          <w:rPr>
-            <w:color w:val="2F5597"/>
-            <w:u w:val="single"/>
-          </w:rPr>
-          <w:t>PyG TUDataset loader</w:t>
-        </w:r>
-      </w:hyperlink>
-      <w:r>
-        <w:t>. Cora/CiteSeer are optional only for a node-level spectral extension.</w:t>
-      </w:r>
-    </w:p>
-    <w:p>
-      <w:pPr>
-        <w:spacing w:before="0" w:after="100" w:line="254" w:lineRule="auto"/>
-      </w:pPr>
-      <w:r>
-        <w:rPr>
-          <w:b/>
-          <w:color w:val="25313C"/>
-        </w:rPr>
-        <w:t xml:space="preserve">Methods and starting code. </w:t>
-      </w:r>
-      <w:r>
-        <w:t xml:space="preserve">Start with the </w:t>
-      </w:r>
-      <w:hyperlink r:id="rId86">
-        <w:r>
-          <w:rPr>
-            <w:color w:val="2F5597"/>
-            <w:u w:val="single"/>
-          </w:rPr>
-          <w:t>official GraphCL repository</w:t>
-        </w:r>
-      </w:hyperlink>
-      <w:r>
-        <w:t xml:space="preserve"> and a GIN encoder. Compare GraphMAE, and optionally GRACE/BGRL for node experiments. </w:t>
-      </w:r>
-      <w:r>
-        <w:rPr>
-          <w:b/>
-        </w:rPr>
-        <w:t>Core MSc mechanism:</w:t>
-      </w:r>
-      <w:r>
-        <w:t xml:space="preserve"> preserve combinatorial structure using bridges, articulation points, cycles or connected components. </w:t>
-      </w:r>
-      <w:r>
-        <w:rPr>
-          <w:b/>
-        </w:rPr>
-        <w:t>Stretch mechanism:</w:t>
-      </w:r>
-      <w:r>
-        <w:t xml:space="preserve"> protect a low-frequency Laplacian band; compare with </w:t>
-      </w:r>
-      <w:hyperlink r:id="rId87">
-        <w:r>
-          <w:rPr>
-            <w:color w:val="2F5597"/>
-            <w:u w:val="single"/>
-          </w:rPr>
-          <w:t>GCL-SPAN</w:t>
-        </w:r>
-      </w:hyperlink>
-      <w:r>
-        <w:t>.</w:t>
-      </w:r>
-    </w:p>
-    <w:p>
-      <w:pPr>
-        <w:spacing w:before="0" w:after="100" w:line="254" w:lineRule="auto"/>
-      </w:pPr>
-      <w:r>
-        <w:rPr>
-          <w:b/>
-          <w:color w:val="25313C"/>
-        </w:rPr>
-        <w:t xml:space="preserve">Required baselines. </w:t>
-      </w:r>
-      <w:r>
-        <w:t>Original random GraphCL augmentations at matched edit counts, random frozen GIN, fully supervised GIN and GraphMAE. Pretrain inside each training fold for the strict protocol.</w:t>
-      </w:r>
-    </w:p>
-    <w:p>
-      <w:pPr>
-        <w:spacing w:before="0" w:after="100" w:line="254" w:lineRule="auto"/>
-      </w:pPr>
-      <w:r>
-        <w:rPr>
-          <w:b/>
-          <w:color w:val="25313C"/>
-        </w:rPr>
-        <w:t xml:space="preserve">Evaluation. </w:t>
-      </w:r>
-      <w:r>
-        <w:t>Accuracy and macro-F1 with confidence intervals; frozen probe and fine-tuning at 10/25/100% labels. Also report component-count change, cycle-rank change, degree-distribution distance and, for the spectral route, protected-band distance. Test edit rates such as 5/10/20/30%.</w:t>
-      </w:r>
-    </w:p>
-    <w:p>
-      <w:pPr>
-        <w:spacing w:before="80" w:after="100" w:line="254" w:lineRule="auto"/>
-      </w:pPr>
-      <w:r>
-        <w:rPr>
-          <w:b/>
-          <w:color w:val="25313C"/>
-        </w:rPr>
-        <w:t xml:space="preserve">Bachelor scope. </w:t>
-      </w:r>
-      <w:r>
-        <w:t>Reproduce GraphCL on NCI1, compare its four augmentations and evaluate frozen, fine-tuned and supervised GIN on identical splits. Protecting articulation points only is an optional extension.</w:t>
-      </w:r>
-    </w:p>
-    <w:p>
-      <w:pPr>
-        <w:spacing w:before="80" w:after="100" w:line="254" w:lineRule="auto"/>
-      </w:pPr>
-      <w:r>
-        <w:rPr>
-          <w:b/>
-          <w:color w:val="25313C"/>
-        </w:rPr>
-        <w:t xml:space="preserve">Master research question and contribution. </w:t>
-      </w:r>
-      <w:r>
-        <w:t xml:space="preserve">Research question: </w:t>
-      </w:r>
-      <w:r>
-        <w:rPr>
-          <w:b/>
-        </w:rPr>
-        <w:t>At matched edit budgets, which measurable notion of structural damage best predicts downstream representation failure?</w:t>
-      </w:r>
-      <w:r>
-        <w:t xml:space="preserve"> The minimum MSc contribution is one defensible structure-aware operator plus matched-budget analysis. A full combinatorial-versus-spectral comparison is an optional 30-ECTS extension. If accuracy does not improve, explain when preservation makes the two views too similar to provide contrastive signal.</w:t>
-      </w:r>
-    </w:p>
-    <w:p>
-      <w:pPr>
-        <w:spacing w:before="0" w:after="100" w:line="254" w:lineRule="auto"/>
-      </w:pPr>
-      <w:r>
-        <w:rPr>
-          <w:b/>
-          <w:color w:val="25313C"/>
-        </w:rPr>
-        <w:t xml:space="preserve">Practical notes. </w:t>
-      </w:r>
-      <w:r>
-        <w:t>Exact spectral work is feasible on these small graphs. Do not begin with ogbn-arxiv; scalable eigenspectrum approximation is a separate advanced problem. Label transductive test-graph exposure explicitly.</w:t>
-      </w:r>
-    </w:p>
-    <w:p>
-      <w:r>
-        <w:br w:type="page"/>
-      </w:r>
-    </w:p>
-    <w:p>
-      <w:pPr>
-        <w:pStyle w:val="Heading2"/>
-        <w:spacing w:after="140"/>
-      </w:pPr>
-      <w:r>
-        <w:t>Project 3.4  Compute-aware routing between GraphGPS branches</w:t>
-      </w:r>
-    </w:p>
-    <w:tbl>
-      <w:tblPr>
-        <w:tblW w:type="auto" w:w="0"/>
-        <w:jc w:val="center"/>
-        <w:tblLayout w:type="fixed"/>
-        <w:tblLook w:firstColumn="1" w:firstRow="1" w:lastColumn="0" w:lastRow="0" w:noHBand="0" w:noVBand="1" w:val="04A0"/>
-        <w:tblBorders>
-          <w:top w:val="single" w:sz="5" w:space="0" w:color="D9E0E6"/>
-          <w:left w:val="single" w:sz="5" w:space="0" w:color="D9E0E6"/>
-          <w:bottom w:val="single" w:sz="5" w:space="0" w:color="D9E0E6"/>
-          <w:right w:val="single" w:sz="5" w:space="0" w:color="D9E0E6"/>
-          <w:insideH w:val="single" w:sz="5" w:space="0" w:color="D9E0E6"/>
-          <w:insideV w:val="single" w:sz="5" w:space="0" w:color="D9E0E6"/>
-        </w:tblBorders>
-      </w:tblPr>
-      <w:tblGrid>
-        <w:gridCol w:w="1944"/>
-        <w:gridCol w:w="7704"/>
-      </w:tblGrid>
-      <w:tr>
-        <w:trPr>
-          <w:cantSplit/>
-        </w:trPr>
-        <w:tc>
-          <w:tcPr>
-            <w:tcW w:type="dxa" w:w="1944"/>
-            <w:shd w:fill="EAF2F8"/>
-            <w:tcMar>
-              <w:top w:w="90" w:type="dxa"/>
-              <w:start w:w="110" w:type="dxa"/>
-              <w:bottom w:w="90" w:type="dxa"/>
-              <w:end w:w="110" w:type="dxa"/>
-            </w:tcMar>
-            <w:vAlign w:val="center"/>
-          </w:tcPr>
-          <w:p>
-            <w:pPr>
-              <w:spacing w:after="0"/>
-            </w:pPr>
-            <w:r>
-              <w:rPr>
-                <w:b/>
-                <w:color w:val="17365D"/>
-              </w:rPr>
-              <w:t>Task</w:t>
-            </w:r>
-          </w:p>
-        </w:tc>
-        <w:tc>
-          <w:tcPr>
-            <w:tcW w:type="dxa" w:w="7704"/>
-            <w:shd w:fill="FFFFFF"/>
-            <w:tcMar>
-              <w:top w:w="90" w:type="dxa"/>
-              <w:start w:w="110" w:type="dxa"/>
-              <w:bottom w:w="90" w:type="dxa"/>
-              <w:end w:w="110" w:type="dxa"/>
-            </w:tcMar>
-            <w:vAlign w:val="center"/>
-          </w:tcPr>
-          <w:p>
-            <w:pPr>
-              <w:spacing w:after="0"/>
-            </w:pPr>
-            <w:r>
-              <w:t>Graph regression</w:t>
-            </w:r>
-          </w:p>
-        </w:tc>
-      </w:tr>
-      <w:tr>
-        <w:trPr>
-          <w:cantSplit/>
-        </w:trPr>
-        <w:tc>
-          <w:tcPr>
-            <w:tcW w:type="dxa" w:w="1944"/>
-            <w:shd w:fill="EAF2F8"/>
-            <w:tcMar>
-              <w:top w:w="90" w:type="dxa"/>
-              <w:start w:w="110" w:type="dxa"/>
-              <w:bottom w:w="90" w:type="dxa"/>
-              <w:end w:w="110" w:type="dxa"/>
-            </w:tcMar>
-            <w:vAlign w:val="center"/>
-          </w:tcPr>
-          <w:p>
-            <w:pPr>
-              <w:spacing w:after="0"/>
-            </w:pPr>
-            <w:r>
-              <w:rPr>
-                <w:b/>
-                <w:color w:val="17365D"/>
-              </w:rPr>
-              <w:t>Recommended level</w:t>
-            </w:r>
-          </w:p>
-        </w:tc>
-        <w:tc>
-          <w:tcPr>
-            <w:tcW w:type="dxa" w:w="7704"/>
-            <w:shd w:fill="F4F6F8"/>
-            <w:tcMar>
-              <w:top w:w="90" w:type="dxa"/>
-              <w:start w:w="110" w:type="dxa"/>
-              <w:bottom w:w="90" w:type="dxa"/>
-              <w:end w:w="110" w:type="dxa"/>
-            </w:tcMar>
-            <w:vAlign w:val="center"/>
-          </w:tcPr>
-          <w:p>
-            <w:pPr>
-              <w:spacing w:after="0"/>
-            </w:pPr>
-            <w:r>
-              <w:t>BSc reproduction; MSc preferred</w:t>
-            </w:r>
-          </w:p>
-        </w:tc>
-      </w:tr>
-      <w:tr>
-        <w:trPr>
-          <w:cantSplit/>
-        </w:trPr>
-        <w:tc>
-          <w:tcPr>
-            <w:tcW w:type="dxa" w:w="1944"/>
-            <w:shd w:fill="EAF2F8"/>
-            <w:tcMar>
-              <w:top w:w="90" w:type="dxa"/>
-              <w:start w:w="110" w:type="dxa"/>
-              <w:bottom w:w="90" w:type="dxa"/>
-              <w:end w:w="110" w:type="dxa"/>
-            </w:tcMar>
-            <w:vAlign w:val="center"/>
-          </w:tcPr>
-          <w:p>
-            <w:pPr>
-              <w:spacing w:after="0"/>
-            </w:pPr>
-            <w:r>
-              <w:rPr>
-                <w:b/>
-                <w:color w:val="17365D"/>
-              </w:rPr>
-              <w:t>Compute</w:t>
-            </w:r>
-          </w:p>
-        </w:tc>
-        <w:tc>
-          <w:tcPr>
-            <w:tcW w:type="dxa" w:w="7704"/>
-            <w:shd w:fill="FFFFFF"/>
-            <w:tcMar>
-              <w:top w:w="90" w:type="dxa"/>
-              <w:start w:w="110" w:type="dxa"/>
-              <w:bottom w:w="90" w:type="dxa"/>
-              <w:end w:w="110" w:type="dxa"/>
-            </w:tcMar>
-            <w:vAlign w:val="center"/>
-          </w:tcPr>
-          <w:p>
-            <w:pPr>
-              <w:spacing w:after="0"/>
-            </w:pPr>
-            <w:r>
-              <w:t>Light to moderate; 8 GB GPU preferred</w:t>
-            </w:r>
-          </w:p>
-        </w:tc>
-      </w:tr>
-      <w:tr>
-        <w:trPr>
-          <w:cantSplit/>
-        </w:trPr>
-        <w:tc>
-          <w:tcPr>
-            <w:tcW w:type="dxa" w:w="1944"/>
-            <w:shd w:fill="EAF2F8"/>
-            <w:tcMar>
-              <w:top w:w="90" w:type="dxa"/>
-              <w:start w:w="110" w:type="dxa"/>
-              <w:bottom w:w="90" w:type="dxa"/>
-              <w:end w:w="110" w:type="dxa"/>
-            </w:tcMar>
-            <w:vAlign w:val="center"/>
-          </w:tcPr>
-          <w:p>
-            <w:pPr>
-              <w:spacing w:after="0"/>
-            </w:pPr>
-            <w:r>
-              <w:rPr>
-                <w:b/>
-                <w:color w:val="17365D"/>
-              </w:rPr>
-              <w:t>Starting paper</w:t>
-            </w:r>
-          </w:p>
-        </w:tc>
-        <w:tc>
-          <w:tcPr>
-            <w:tcW w:type="dxa" w:w="7704"/>
-            <w:shd w:fill="F4F6F8"/>
-            <w:tcMar>
-              <w:top w:w="90" w:type="dxa"/>
-              <w:start w:w="110" w:type="dxa"/>
-              <w:bottom w:w="90" w:type="dxa"/>
-              <w:end w:w="110" w:type="dxa"/>
-            </w:tcMar>
-            <w:vAlign w:val="center"/>
-          </w:tcPr>
-          <w:p>
-            <w:pPr>
-              <w:spacing w:after="0"/>
-            </w:pPr>
-            <w:r>
-              <w:t xml:space="preserve">Rampášek et al., </w:t>
-            </w:r>
-            <w:hyperlink r:id="rId72">
-              <w:r>
-                <w:rPr>
-                  <w:color w:val="2F5597"/>
-                  <w:u w:val="single"/>
-                </w:rPr>
-                <w:t>GraphGPS</w:t>
-              </w:r>
-            </w:hyperlink>
-            <w:r>
-              <w:t>, NeurIPS 2022</w:t>
-            </w:r>
-          </w:p>
-        </w:tc>
-      </w:tr>
-    </w:tbl>
-    <w:p>
-      <w:pPr>
-        <w:spacing w:after="0"/>
-      </w:pPr>
-    </w:p>
-    <w:p>
-      <w:pPr>
-        <w:spacing w:before="80" w:after="100" w:line="254" w:lineRule="auto"/>
-      </w:pPr>
-      <w:r>
-        <w:rPr>
-          <w:b/>
-          <w:color w:val="25313C"/>
-        </w:rPr>
-        <w:t xml:space="preserve">What you will do. </w:t>
-      </w:r>
-      <w:r>
-        <w:t>A GraphGPS layer computes both local message passing and global attention for every graph. This project asks whether a small gate can learn when global attention is worth its cost.</w:t>
-      </w:r>
-    </w:p>
-    <w:p>
-      <w:pPr>
-        <w:spacing w:before="0" w:after="100" w:line="254" w:lineRule="auto"/>
-      </w:pPr>
-      <w:r>
-        <w:rPr>
-          <w:b/>
-          <w:color w:val="25313C"/>
-        </w:rPr>
-        <w:t xml:space="preserve">Project goal. </w:t>
-      </w:r>
-      <w:r>
-        <w:t>Find an accuracy–efficiency trade-off and determine whether graphs with stronger long-range structure use the global branch more often.</w:t>
-      </w:r>
-    </w:p>
-    <w:p>
-      <w:pPr>
-        <w:spacing w:before="0" w:after="100" w:line="254" w:lineRule="auto"/>
-      </w:pPr>
-      <w:r>
-        <w:rPr>
-          <w:b/>
-          <w:color w:val="25313C"/>
-        </w:rPr>
-        <w:t xml:space="preserve">Data. </w:t>
-      </w:r>
-      <w:r>
-        <w:t xml:space="preserve">Use the 12,000-graph </w:t>
-      </w:r>
-      <w:r>
-        <w:rPr>
-          <w:b/>
-        </w:rPr>
-        <w:t>ZINC subset</w:t>
-      </w:r>
-      <w:r>
-        <w:t xml:space="preserve"> from the </w:t>
-      </w:r>
-      <w:hyperlink r:id="rId88">
-        <w:r>
-          <w:rPr>
-            <w:color w:val="2F5597"/>
-            <w:u w:val="single"/>
-          </w:rPr>
-          <w:t>PyG ZINC loader</w:t>
-        </w:r>
-      </w:hyperlink>
-      <w:r>
-        <w:t xml:space="preserve">. Confirm only the selected final settings on </w:t>
-      </w:r>
-      <w:r>
-        <w:rPr>
-          <w:b/>
-        </w:rPr>
-        <w:t>Peptides-struct</w:t>
-      </w:r>
-      <w:r>
-        <w:t xml:space="preserve"> through the </w:t>
-      </w:r>
-      <w:hyperlink r:id="rId89">
-        <w:r>
-          <w:rPr>
-            <w:color w:val="2F5597"/>
-            <w:u w:val="single"/>
-          </w:rPr>
-          <w:t>PyG LRGB loader</w:t>
-        </w:r>
-      </w:hyperlink>
-      <w:r>
-        <w:t>.</w:t>
-      </w:r>
-    </w:p>
-    <w:p>
-      <w:pPr>
-        <w:spacing w:before="0" w:after="100" w:line="254" w:lineRule="auto"/>
-      </w:pPr>
-      <w:r>
-        <w:rPr>
-          <w:b/>
-          <w:color w:val="25313C"/>
-        </w:rPr>
-        <w:t xml:space="preserve">Methods and starting code. </w:t>
-      </w:r>
-      <w:r>
-        <w:t xml:space="preserve">Start from the </w:t>
-      </w:r>
-      <w:hyperlink r:id="rId90">
-        <w:r>
-          <w:rPr>
-            <w:color w:val="2F5597"/>
-            <w:u w:val="single"/>
-          </w:rPr>
-          <w:t>official GraphGPS repository</w:t>
-        </w:r>
-      </w:hyperlink>
-      <w:r>
-        <w:t>. Implement a positional/structural encoding, local GINE or GatedGCN, and global Transformer or Performer. Add a soft gate during training and an optional budgeted hard gate at inference.</w:t>
-      </w:r>
-    </w:p>
-    <w:p>
-      <w:pPr>
-        <w:spacing w:before="0" w:after="100" w:line="254" w:lineRule="auto"/>
-      </w:pPr>
-      <w:r>
-        <w:rPr>
-          <w:b/>
-          <w:color w:val="25313C"/>
-        </w:rPr>
-        <w:t xml:space="preserve">Required baselines. </w:t>
-      </w:r>
-      <w:r>
-        <w:t>Local-only, global-only, standard GPS and a fixed scalar mixture, followed by learned soft and hard gates. Keep depth, width and parameters approximately matched.</w:t>
-      </w:r>
-    </w:p>
-    <w:p>
-      <w:pPr>
-        <w:spacing w:before="0" w:after="100" w:line="254" w:lineRule="auto"/>
-      </w:pPr>
-      <w:r>
-        <w:rPr>
-          <w:b/>
-          <w:color w:val="25313C"/>
-        </w:rPr>
-        <w:t xml:space="preserve">Evaluation. </w:t>
-      </w:r>
-      <w:r>
-        <w:t>MAE with at least three seeds. Report trainable parameters, estimated FLOPs, peak memory and measured latency at a fixed batch size. Plot the accuracy–compute Pareto curve and stratify by graph size and a long-range proxy.</w:t>
-      </w:r>
-    </w:p>
-    <w:p>
-      <w:pPr>
-        <w:spacing w:before="80" w:after="100" w:line="254" w:lineRule="auto"/>
-      </w:pPr>
-      <w:r>
-        <w:rPr>
-          <w:b/>
-          <w:color w:val="25313C"/>
-        </w:rPr>
-        <w:t xml:space="preserve">Bachelor scope. </w:t>
-      </w:r>
-      <w:r>
-        <w:t>Implement a compact GPS layer on ZINC and reproduce local-only, global-only and combined branches with one positional encoding.</w:t>
-      </w:r>
-    </w:p>
-    <w:p>
-      <w:pPr>
-        <w:spacing w:before="80" w:after="100" w:line="254" w:lineRule="auto"/>
-      </w:pPr>
-      <w:r>
-        <w:rPr>
-          <w:b/>
-          <w:color w:val="25313C"/>
-        </w:rPr>
-        <w:t xml:space="preserve">Master research question and contribution. </w:t>
-      </w:r>
-      <w:r>
-        <w:t xml:space="preserve">Research question: </w:t>
-      </w:r>
-      <w:r>
-        <w:rPr>
-          <w:b/>
-        </w:rPr>
-        <w:t>Can graph- or layer-conditioned routing reduce global-attention computation while retaining GraphGPS accuracy, and are gate decisions structurally interpretable?</w:t>
-      </w:r>
-      <w:r>
-        <w:t xml:space="preserve"> Compare multiple compute penalties and test whether simple size/diameter/positional statistics predict routing. The contribution is the router and controlled Pareto analysis, not another GraphGPS run.</w:t>
-      </w:r>
-    </w:p>
-    <w:p>
-      <w:pPr>
-        <w:spacing w:before="0" w:after="100" w:line="254" w:lineRule="auto"/>
-      </w:pPr>
-      <w:r>
-        <w:rPr>
-          <w:b/>
-          <w:color w:val="25313C"/>
-        </w:rPr>
-        <w:t xml:space="preserve">Practical notes. </w:t>
-      </w:r>
-      <w:r>
-        <w:t>ZINC is light. Restrict Peptides-struct to the selected final settings. FLOPs and wall-clock latency answer different questions; report both.</w:t>
-      </w:r>
-    </w:p>
-    <w:p>
-      <w:r>
-        <w:br w:type="page"/>
-      </w:r>
-    </w:p>
-    <w:p>
-      <w:pPr>
-        <w:pStyle w:val="Heading2"/>
-        <w:spacing w:after="140"/>
-      </w:pPr>
-      <w:r>
-        <w:t>Project 3.5  Question-adaptive retrieval budgets for G-Retriever</w:t>
-      </w:r>
-    </w:p>
-    <w:tbl>
-      <w:tblPr>
-        <w:tblW w:type="auto" w:w="0"/>
-        <w:jc w:val="center"/>
-        <w:tblLayout w:type="fixed"/>
-        <w:tblLook w:firstColumn="1" w:firstRow="1" w:lastColumn="0" w:lastRow="0" w:noHBand="0" w:noVBand="1" w:val="04A0"/>
-        <w:tblBorders>
-          <w:top w:val="single" w:sz="5" w:space="0" w:color="D9E0E6"/>
-          <w:left w:val="single" w:sz="5" w:space="0" w:color="D9E0E6"/>
-          <w:bottom w:val="single" w:sz="5" w:space="0" w:color="D9E0E6"/>
-          <w:right w:val="single" w:sz="5" w:space="0" w:color="D9E0E6"/>
-          <w:insideH w:val="single" w:sz="5" w:space="0" w:color="D9E0E6"/>
-          <w:insideV w:val="single" w:sz="5" w:space="0" w:color="D9E0E6"/>
-        </w:tblBorders>
-      </w:tblPr>
-      <w:tblGrid>
-        <w:gridCol w:w="1944"/>
-        <w:gridCol w:w="7704"/>
-      </w:tblGrid>
-      <w:tr>
-        <w:trPr>
-          <w:cantSplit/>
-        </w:trPr>
-        <w:tc>
-          <w:tcPr>
-            <w:tcW w:type="dxa" w:w="1944"/>
-            <w:shd w:fill="EAF2F8"/>
-            <w:tcMar>
-              <w:top w:w="90" w:type="dxa"/>
-              <w:start w:w="110" w:type="dxa"/>
-              <w:bottom w:w="90" w:type="dxa"/>
-              <w:end w:w="110" w:type="dxa"/>
-            </w:tcMar>
-            <w:vAlign w:val="center"/>
-          </w:tcPr>
-          <w:p>
-            <w:pPr>
-              <w:spacing w:after="0"/>
-            </w:pPr>
-            <w:r>
-              <w:rPr>
-                <w:b/>
-                <w:color w:val="17365D"/>
-              </w:rPr>
-              <w:t>Task</w:t>
-            </w:r>
-          </w:p>
-        </w:tc>
-        <w:tc>
-          <w:tcPr>
-            <w:tcW w:type="dxa" w:w="7704"/>
-            <w:shd w:fill="FFFFFF"/>
-            <w:tcMar>
-              <w:top w:w="90" w:type="dxa"/>
-              <w:start w:w="110" w:type="dxa"/>
-              <w:bottom w:w="90" w:type="dxa"/>
-              <w:end w:w="110" w:type="dxa"/>
-            </w:tcMar>
-            <w:vAlign w:val="center"/>
-          </w:tcPr>
-          <w:p>
-            <w:pPr>
-              <w:spacing w:after="0"/>
-            </w:pPr>
-            <w:r>
-              <w:t>Query-conditioned evidence retrieval and answer ranking</w:t>
-            </w:r>
-          </w:p>
-        </w:tc>
-      </w:tr>
-      <w:tr>
-        <w:trPr>
-          <w:cantSplit/>
-        </w:trPr>
-        <w:tc>
-          <w:tcPr>
-            <w:tcW w:type="dxa" w:w="1944"/>
-            <w:shd w:fill="EAF2F8"/>
-            <w:tcMar>
-              <w:top w:w="90" w:type="dxa"/>
-              <w:start w:w="110" w:type="dxa"/>
-              <w:bottom w:w="90" w:type="dxa"/>
-              <w:end w:w="110" w:type="dxa"/>
-            </w:tcMar>
-            <w:vAlign w:val="center"/>
-          </w:tcPr>
-          <w:p>
-            <w:pPr>
-              <w:spacing w:after="0"/>
-            </w:pPr>
-            <w:r>
-              <w:rPr>
-                <w:b/>
-                <w:color w:val="17365D"/>
-              </w:rPr>
-              <w:t>Recommended level</w:t>
-            </w:r>
-          </w:p>
-        </w:tc>
-        <w:tc>
-          <w:tcPr>
-            <w:tcW w:type="dxa" w:w="7704"/>
-            <w:shd w:fill="F4F6F8"/>
-            <w:tcMar>
-              <w:top w:w="90" w:type="dxa"/>
-              <w:start w:w="110" w:type="dxa"/>
-              <w:bottom w:w="90" w:type="dxa"/>
-              <w:end w:w="110" w:type="dxa"/>
-            </w:tcMar>
-            <w:vAlign w:val="center"/>
-          </w:tcPr>
-          <w:p>
-            <w:pPr>
-              <w:spacing w:after="0"/>
-            </w:pPr>
-            <w:r>
-              <w:t>Advanced MSc optional; BSc retrieval-only variant</w:t>
-            </w:r>
-          </w:p>
-        </w:tc>
-      </w:tr>
-      <w:tr>
-        <w:trPr>
-          <w:cantSplit/>
-        </w:trPr>
-        <w:tc>
-          <w:tcPr>
-            <w:tcW w:type="dxa" w:w="1944"/>
-            <w:shd w:fill="EAF2F8"/>
-            <w:tcMar>
-              <w:top w:w="90" w:type="dxa"/>
-              <w:start w:w="110" w:type="dxa"/>
-              <w:bottom w:w="90" w:type="dxa"/>
-              <w:end w:w="110" w:type="dxa"/>
-            </w:tcMar>
-            <w:vAlign w:val="center"/>
-          </w:tcPr>
-          <w:p>
-            <w:pPr>
-              <w:spacing w:after="0"/>
-            </w:pPr>
-            <w:r>
-              <w:rPr>
-                <w:b/>
-                <w:color w:val="17365D"/>
-              </w:rPr>
-              <w:t>Compute</w:t>
-            </w:r>
-          </w:p>
-        </w:tc>
-        <w:tc>
-          <w:tcPr>
-            <w:tcW w:type="dxa" w:w="7704"/>
-            <w:shd w:fill="FFFFFF"/>
-            <w:tcMar>
-              <w:top w:w="90" w:type="dxa"/>
-              <w:start w:w="110" w:type="dxa"/>
-              <w:bottom w:w="90" w:type="dxa"/>
-              <w:end w:w="110" w:type="dxa"/>
-            </w:tcMar>
-            <w:vAlign w:val="center"/>
-          </w:tcPr>
-          <w:p>
-            <w:pPr>
-              <w:spacing w:after="0"/>
-            </w:pPr>
-            <w:r>
-              <w:t>Moderate; no 7B model training required</w:t>
-            </w:r>
-          </w:p>
-        </w:tc>
-      </w:tr>
-      <w:tr>
-        <w:trPr>
-          <w:cantSplit/>
-        </w:trPr>
-        <w:tc>
-          <w:tcPr>
-            <w:tcW w:type="dxa" w:w="1944"/>
-            <w:shd w:fill="EAF2F8"/>
-            <w:tcMar>
-              <w:top w:w="90" w:type="dxa"/>
-              <w:start w:w="110" w:type="dxa"/>
-              <w:bottom w:w="90" w:type="dxa"/>
-              <w:end w:w="110" w:type="dxa"/>
-            </w:tcMar>
-            <w:vAlign w:val="center"/>
-          </w:tcPr>
-          <w:p>
-            <w:pPr>
-              <w:spacing w:after="0"/>
-            </w:pPr>
-            <w:r>
-              <w:rPr>
-                <w:b/>
-                <w:color w:val="17365D"/>
-              </w:rPr>
-              <w:t>Starting paper</w:t>
-            </w:r>
-          </w:p>
-        </w:tc>
-        <w:tc>
-          <w:tcPr>
-            <w:tcW w:type="dxa" w:w="7704"/>
-            <w:shd w:fill="F4F6F8"/>
-            <w:tcMar>
-              <w:top w:w="90" w:type="dxa"/>
-              <w:start w:w="110" w:type="dxa"/>
-              <w:bottom w:w="90" w:type="dxa"/>
-              <w:end w:w="110" w:type="dxa"/>
-            </w:tcMar>
-            <w:vAlign w:val="center"/>
-          </w:tcPr>
-          <w:p>
-            <w:pPr>
-              <w:spacing w:after="0"/>
-            </w:pPr>
-            <w:r>
-              <w:t xml:space="preserve">He et al., </w:t>
-            </w:r>
-            <w:hyperlink r:id="rId76">
-              <w:r>
-                <w:rPr>
-                  <w:color w:val="2F5597"/>
-                  <w:u w:val="single"/>
-                </w:rPr>
-                <w:t>G-Retriever</w:t>
-              </w:r>
-            </w:hyperlink>
-            <w:r>
-              <w:t>, NeurIPS 2024</w:t>
-            </w:r>
-          </w:p>
-        </w:tc>
-      </w:tr>
-    </w:tbl>
-    <w:p>
-      <w:pPr>
-        <w:spacing w:after="0"/>
-      </w:pPr>
-    </w:p>
-    <w:p>
-      <w:pPr>
-        <w:spacing w:before="80" w:after="100" w:line="254" w:lineRule="auto"/>
-      </w:pPr>
-      <w:r>
-        <w:rPr>
-          <w:b/>
-          <w:color w:val="25313C"/>
-        </w:rPr>
-        <w:t xml:space="preserve">What you will do. </w:t>
-      </w:r>
-      <w:r>
-        <w:t>G-Retriever scores graph elements, selects a compact connected evidence subgraph and then uses it for question answering. A single global retrieval size trades answer recall against irrelevant context. This project predicts the budget separately for each question.</w:t>
-      </w:r>
-    </w:p>
-    <w:p>
-      <w:pPr>
-        <w:spacing w:before="0" w:after="100" w:line="254" w:lineRule="auto"/>
-      </w:pPr>
-      <w:r>
-        <w:rPr>
-          <w:b/>
-          <w:color w:val="25313C"/>
-        </w:rPr>
-        <w:t xml:space="preserve">Project goal. </w:t>
-      </w:r>
-      <w:r>
-        <w:t>Retrieve substantially smaller evidence subgraphs without reducing answer-entity recall and ranking quality.</w:t>
-      </w:r>
-    </w:p>
-    <w:p>
-      <w:pPr>
-        <w:spacing w:before="0" w:after="100" w:line="254" w:lineRule="auto"/>
-      </w:pPr>
-      <w:r>
-        <w:rPr>
-          <w:b/>
-          <w:color w:val="25313C"/>
-        </w:rPr>
-        <w:t xml:space="preserve">Data. </w:t>
-      </w:r>
-      <w:r>
-        <w:t xml:space="preserve">Use </w:t>
-      </w:r>
-      <w:r>
-        <w:rPr>
-          <w:b/>
-        </w:rPr>
-        <w:t>WebQSP</w:t>
-      </w:r>
-      <w:r>
-        <w:t xml:space="preserve">, 4,737 questions, through the </w:t>
-      </w:r>
-      <w:hyperlink r:id="rId91">
-        <w:r>
-          <w:rPr>
-            <w:color w:val="2F5597"/>
-            <w:u w:val="single"/>
-          </w:rPr>
-          <w:t>PyG WebQSP loader</w:t>
-        </w:r>
-      </w:hyperlink>
-      <w:r>
-        <w:t xml:space="preserve"> and preprocessing in the </w:t>
-      </w:r>
-      <w:hyperlink r:id="rId92">
-        <w:r>
-          <w:rPr>
-            <w:color w:val="2F5597"/>
-            <w:u w:val="single"/>
-          </w:rPr>
-          <w:t>official G-Retriever repository</w:t>
-        </w:r>
-      </w:hyperlink>
-      <w:r>
-        <w:t>. A 1,000–2,000-question subset is acceptable for development; use the official split for final MSc reporting if feasible.</w:t>
-      </w:r>
-    </w:p>
-    <w:p>
-      <w:pPr>
-        <w:spacing w:before="0" w:after="100" w:line="254" w:lineRule="auto"/>
-      </w:pPr>
-      <w:r>
-        <w:rPr>
-          <w:b/>
-          <w:color w:val="25313C"/>
-        </w:rPr>
-        <w:t xml:space="preserve">Methods and starting code. </w:t>
-      </w:r>
-      <w:r>
-        <w:t>Reproduce graph-element scoring and PCST or a documented connected approximation. Compare one-hop, text-similarity top-k, personalized PageRank and fixed PCST budgets. Predict k from non-leaking query, seed-entity and relevance-score features. A language generator is optional.</w:t>
-      </w:r>
-    </w:p>
-    <w:p>
-      <w:pPr>
-        <w:spacing w:before="0" w:after="100" w:line="254" w:lineRule="auto"/>
-      </w:pPr>
-      <w:r>
-        <w:rPr>
-          <w:b/>
-          <w:color w:val="25313C"/>
-        </w:rPr>
-        <w:t xml:space="preserve">Required baselines. </w:t>
-      </w:r>
-      <w:r>
-        <w:t>Fixed k in {3,5,10,20}, a simple validation heuristic, non-connected top-k and an oracle budget used only for analysis. The required downstream task is answer-entity ranking, not full Llama 2–7B reproduction.</w:t>
-      </w:r>
-    </w:p>
-    <w:p>
-      <w:pPr>
-        <w:spacing w:before="0" w:after="100" w:line="254" w:lineRule="auto"/>
-      </w:pPr>
-      <w:r>
-        <w:rPr>
-          <w:b/>
-          <w:color w:val="25313C"/>
-        </w:rPr>
-        <w:t xml:space="preserve">Evaluation. </w:t>
-      </w:r>
-      <w:r>
-        <w:t>Answer-entity recall, Hits@1 or answer F1, retrieved node/edge count and latency. Plot the full quality–size Pareto curve, stratify by path length and question complexity, and test 5/10/20% candidate-edge deletion.</w:t>
-      </w:r>
-    </w:p>
-    <w:p>
-      <w:pPr>
-        <w:spacing w:before="80" w:after="100" w:line="254" w:lineRule="auto"/>
-      </w:pPr>
-      <w:r>
-        <w:rPr>
-          <w:b/>
-          <w:color w:val="25313C"/>
-        </w:rPr>
-        <w:t xml:space="preserve">Bachelor scope. </w:t>
-      </w:r>
-      <w:r>
-        <w:t>Implement retrieval and answer ranking and compare one-hop, text-only, PageRank and fixed-budget PCST. No LLM fine-tuning.</w:t>
-      </w:r>
-    </w:p>
-    <w:p>
-      <w:pPr>
-        <w:spacing w:before="80" w:after="100" w:line="254" w:lineRule="auto"/>
-      </w:pPr>
-      <w:r>
-        <w:rPr>
-          <w:b/>
-          <w:color w:val="25313C"/>
-        </w:rPr>
-        <w:t xml:space="preserve">Master research question and contribution. </w:t>
-      </w:r>
-      <w:r>
-        <w:t xml:space="preserve">Research question: </w:t>
-      </w:r>
-      <w:r>
-        <w:rPr>
-          <w:b/>
-        </w:rPr>
-        <w:t>Can query- and retrieval-confidence features choose the smallest adequate connected subgraph per question?</w:t>
-      </w:r>
-      <w:r>
-        <w:t xml:space="preserve"> Train a budget selector only on training/validation questions and analyse its calibration and failure modes. A negative result should identify which observable features predict retrieval difficulty.</w:t>
-      </w:r>
-    </w:p>
-    <w:p>
-      <w:pPr>
-        <w:spacing w:before="0" w:after="100" w:line="254" w:lineRule="auto"/>
-      </w:pPr>
-      <w:r>
-        <w:rPr>
-          <w:b/>
-          <w:color w:val="25313C"/>
-        </w:rPr>
-        <w:t xml:space="preserve">Practical notes. </w:t>
-      </w:r>
-      <w:r>
-        <w:t>This project has substantial preprocessing and retrieval-engineering work. It is suitable for a student who specifically wants graph RAG and is comfortable debugging data pipelines. Cache text embeddings and avoid paid APIs or 7B+ fine-tuning.</w:t>
-      </w:r>
-    </w:p>
-    <w:p>
-      <w:r>
-        <w:br w:type="page"/>
-      </w:r>
-    </w:p>
-    <w:p>
-      <w:pPr>
-        <w:pStyle w:val="Heading1"/>
-      </w:pPr>
-      <w:r>
-        <w:t>Category 4  Vision foundation models</w:t>
-      </w:r>
-    </w:p>
-    <w:p>
-      <w:pPr>
-        <w:spacing w:before="0" w:after="100" w:line="254" w:lineRule="auto"/>
-      </w:pPr>
-      <w:r>
-        <w:t>Large self-supervised vision backbones provide general-purpose features without task-specific labels. A student project should not retrain such a backbone. It should measure what a frozen model already supplies, what a small adapter adds and whether the gain justifies its trainable parameters.</w:t>
-      </w:r>
-    </w:p>
-    <w:p>
-      <w:pPr>
-        <w:pStyle w:val="Heading3"/>
-      </w:pPr>
-      <w:r>
-        <w:t>Choosing a project track</w:t>
-      </w:r>
-    </w:p>
-    <w:p>
-      <w:pPr>
-        <w:spacing w:before="0" w:after="80" w:line="254" w:lineRule="auto"/>
-      </w:pPr>
-      <w:r>
-        <w:t>The project has two separate task tracks. EuroSAT RGB supports the Bachelor classification route. MVTec dense anomaly localisation or multispectral EuroSAT supports a more complex Master route.</w:t>
-      </w:r>
-    </w:p>
-    <w:p>
-      <w:pPr>
-        <w:spacing w:before="0" w:after="80" w:line="254" w:lineRule="auto"/>
-      </w:pPr>
-      <w:r>
-        <w:t>Compare frozen features, an adapter and supervised training under the same split and label budget. Report trainable parameters and the evaluation protocol alongside accuracy.</w:t>
-      </w:r>
-    </w:p>
-    <w:p>
-      <w:pPr>
-        <w:pStyle w:val="Heading2"/>
-      </w:pPr>
-      <w:r>
-        <w:t>Learn first and find data</w:t>
-      </w:r>
-    </w:p>
-    <w:p>
-      <w:pPr>
-        <w:pStyle w:val="ListBullet"/>
-        <w:spacing w:before="0" w:after="40" w:line="254" w:lineRule="auto"/>
-      </w:pPr>
-      <w:r>
-        <w:t xml:space="preserve">Core reading: </w:t>
-      </w:r>
-      <w:hyperlink r:id="rId93">
         <w:r>
           <w:rPr>
             <w:color w:val="2F5597"/>
@@ -10684,7 +7843,7 @@
       <w:r>
         <w:t xml:space="preserve">, </w:t>
       </w:r>
-      <w:hyperlink r:id="rId94">
+      <w:hyperlink r:id="rId68">
         <w:r>
           <w:rPr>
             <w:color w:val="2F5597"/>
@@ -10696,7 +7855,7 @@
       <w:r>
         <w:t xml:space="preserve">, the </w:t>
       </w:r>
-      <w:hyperlink r:id="rId95">
+      <w:hyperlink r:id="rId69">
         <w:r>
           <w:rPr>
             <w:color w:val="2F5597"/>
@@ -10708,7 +7867,7 @@
       <w:r>
         <w:t xml:space="preserve">, </w:t>
       </w:r>
-      <w:hyperlink r:id="rId96">
+      <w:hyperlink r:id="rId70">
         <w:r>
           <w:rPr>
             <w:color w:val="2F5597"/>
@@ -10720,7 +7879,7 @@
       <w:r>
         <w:t xml:space="preserve"> and </w:t>
       </w:r>
-      <w:hyperlink r:id="rId97">
+      <w:hyperlink r:id="rId71">
         <w:r>
           <w:rPr>
             <w:color w:val="2F5597"/>
@@ -10741,7 +7900,7 @@
       <w:r>
         <w:t xml:space="preserve">Data and model hubs: </w:t>
       </w:r>
-      <w:hyperlink r:id="rId98">
+      <w:hyperlink r:id="rId72">
         <w:r>
           <w:rPr>
             <w:color w:val="2F5597"/>
@@ -10753,7 +7912,7 @@
       <w:r>
         <w:t xml:space="preserve">, </w:t>
       </w:r>
-      <w:hyperlink r:id="rId99">
+      <w:hyperlink r:id="rId73">
         <w:r>
           <w:rPr>
             <w:color w:val="2F5597"/>
@@ -10765,7 +7924,7 @@
       <w:r>
         <w:t xml:space="preserve">, </w:t>
       </w:r>
-      <w:hyperlink r:id="rId100">
+      <w:hyperlink r:id="rId74">
         <w:r>
           <w:rPr>
             <w:color w:val="2F5597"/>
@@ -10777,7 +7936,7 @@
       <w:r>
         <w:t xml:space="preserve"> and </w:t>
       </w:r>
-      <w:hyperlink r:id="rId101">
+      <w:hyperlink r:id="rId75">
         <w:r>
           <w:rPr>
             <w:color w:val="2F5597"/>
@@ -10810,7 +7969,7 @@
         <w:spacing w:after="140"/>
       </w:pPr>
       <w:r>
-        <w:t>Project 4.1  Adapting DINO backbones for land cover or industrial anomalies</w:t>
+        <w:t>Project 3.1  Adapting DINO backbones for land cover or industrial anomalies</w:t>
       </w:r>
     </w:p>
     <w:tbl>
@@ -11033,7 +8192,7 @@
             <w:r>
               <w:t xml:space="preserve">Oquab et al., </w:t>
             </w:r>
-            <w:hyperlink r:id="rId94">
+            <w:hyperlink r:id="rId68">
               <w:r>
                 <w:rPr>
                   <w:color w:val="2F5597"/>
@@ -11113,7 +8272,7 @@
       <w:r>
         <w:t xml:space="preserve"> </w:t>
       </w:r>
-      <w:hyperlink r:id="rId99">
+      <w:hyperlink r:id="rId73">
         <w:r>
           <w:rPr>
             <w:color w:val="2F5597"/>
@@ -11143,7 +8302,7 @@
       <w:r>
         <w:t xml:space="preserve"> </w:t>
       </w:r>
-      <w:hyperlink r:id="rId98">
+      <w:hyperlink r:id="rId72">
         <w:r>
           <w:rPr>
             <w:color w:val="2F5597"/>
@@ -11170,7 +8329,7 @@
       <w:r>
         <w:t xml:space="preserve">Default to DINOv2 ViT-S/14 from the </w:t>
       </w:r>
-      <w:hyperlink r:id="rId95">
+      <w:hyperlink r:id="rId69">
         <w:r>
           <w:rPr>
             <w:color w:val="2F5597"/>
@@ -11182,7 +8341,7 @@
       <w:r>
         <w:t xml:space="preserve">. Compare frozen linear/MLP probes, k-NN or </w:t>
       </w:r>
-      <w:hyperlink r:id="rId97">
+      <w:hyperlink r:id="rId71">
         <w:r>
           <w:rPr>
             <w:color w:val="2F5597"/>
@@ -11194,7 +8353,7 @@
       <w:r>
         <w:t xml:space="preserve"> patch similarity, and a lightweight multi-scale adapter. DINOv3 is optional through the </w:t>
       </w:r>
-      <w:hyperlink r:id="rId102">
+      <w:hyperlink r:id="rId76">
         <w:r>
           <w:rPr>
             <w:color w:val="2F5597"/>
@@ -11298,6 +8457,621 @@
       </w:r>
       <w:r>
         <w:t>Do not attempt DINOv3 ViT-7B. DINOv2 is ungated and Apache 2.0; build the pipeline on it first. DINOv3's licence is non-standard and gated but not stated as categorically non-commercial; an industry use requires institutional/legal review. MVTec itself is non-commercial, so it cannot serve as an industry dataset without separate permission.</w:t>
+      </w:r>
+    </w:p>
+    <w:p>
+      <w:r>
+        <w:br w:type="page"/>
+      </w:r>
+    </w:p>
+    <w:p>
+      <w:pPr>
+        <w:pStyle w:val="Heading1"/>
+      </w:pPr>
+      <w:r>
+        <w:t>Category 4  Signal processing and deep-unfolded models</w:t>
+      </w:r>
+    </w:p>
+    <w:p>
+      <w:pPr>
+        <w:spacing w:before="0" w:after="100" w:line="254" w:lineRule="auto"/>
+      </w:pPr>
+      <w:r>
+        <w:t>Many signal-processing methods are iterative optimisation algorithms. Deep unfolding rewrites a fixed number of their iterations as trainable layers, retaining the algorithm's structure while learning useful parameters from data. These projects are a bridge between classical signal processing and modern deep learning.</w:t>
+      </w:r>
+    </w:p>
+    <w:p>
+      <w:pPr>
+        <w:pStyle w:val="Heading3"/>
+      </w:pPr>
+      <w:r>
+        <w:t>From classical algorithm to learnable layer</w:t>
+      </w:r>
+    </w:p>
+    <w:p>
+      <w:pPr>
+        <w:spacing w:before="0" w:after="80" w:line="254" w:lineRule="auto"/>
+      </w:pPr>
+      <w:r>
+        <w:t>The Bachelor bar is a correct unrolled implementation verified against the classical algorithm. The Master bar is a justified change to what is learned or how multiple channels are coupled, followed by controlled synthetic and applied evaluation.</w:t>
+      </w:r>
+    </w:p>
+    <w:p>
+      <w:pPr>
+        <w:pStyle w:val="Heading2"/>
+      </w:pPr>
+      <w:r>
+        <w:t>Learn first and find ideas</w:t>
+      </w:r>
+    </w:p>
+    <w:p>
+      <w:pPr>
+        <w:pStyle w:val="ListBullet"/>
+        <w:spacing w:before="0" w:after="40" w:line="254" w:lineRule="auto"/>
+      </w:pPr>
+      <w:r>
+        <w:t xml:space="preserve">General background: </w:t>
+      </w:r>
+      <w:hyperlink r:id="rId77">
+        <w:r>
+          <w:rPr>
+            <w:color w:val="2F5597"/>
+            <w:u w:val="single"/>
+          </w:rPr>
+          <w:t>Algorithm Unrolling survey</w:t>
+        </w:r>
+      </w:hyperlink>
+      <w:r>
+        <w:t xml:space="preserve">, </w:t>
+      </w:r>
+      <w:hyperlink r:id="rId78">
+        <w:r>
+          <w:rPr>
+            <w:color w:val="2F5597"/>
+            <w:u w:val="single"/>
+          </w:rPr>
+          <w:t>LISTA</w:t>
+        </w:r>
+      </w:hyperlink>
+      <w:r>
+        <w:t xml:space="preserve"> and </w:t>
+      </w:r>
+      <w:hyperlink r:id="rId79">
+        <w:r>
+          <w:rPr>
+            <w:color w:val="2F5597"/>
+            <w:u w:val="single"/>
+          </w:rPr>
+          <w:t>Deep ADMM-Net</w:t>
+        </w:r>
+      </w:hyperlink>
+      <w:r>
+        <w:t>.</w:t>
+      </w:r>
+    </w:p>
+    <w:p>
+      <w:pPr>
+        <w:pStyle w:val="ListBullet"/>
+        <w:spacing w:before="0" w:after="40" w:line="254" w:lineRule="auto"/>
+      </w:pPr>
+      <w:r>
+        <w:t xml:space="preserve">Signal decomposition: </w:t>
+      </w:r>
+      <w:hyperlink r:id="rId80">
+        <w:r>
+          <w:rPr>
+            <w:color w:val="2F5597"/>
+            <w:u w:val="single"/>
+          </w:rPr>
+          <w:t>Variational Mode Decomposition</w:t>
+        </w:r>
+      </w:hyperlink>
+      <w:r>
+        <w:t xml:space="preserve">, </w:t>
+      </w:r>
+      <w:hyperlink r:id="rId81">
+        <w:r>
+          <w:rPr>
+            <w:color w:val="2F5597"/>
+            <w:u w:val="single"/>
+          </w:rPr>
+          <w:t>Multivariate VMD</w:t>
+        </w:r>
+      </w:hyperlink>
+      <w:r>
+        <w:t xml:space="preserve">, </w:t>
+      </w:r>
+      <w:hyperlink r:id="rId82">
+        <w:r>
+          <w:rPr>
+            <w:color w:val="2F5597"/>
+            <w:u w:val="single"/>
+          </w:rPr>
+          <w:t>vmdpy</w:t>
+        </w:r>
+      </w:hyperlink>
+      <w:r>
+        <w:t xml:space="preserve"> and the anchor paper </w:t>
+      </w:r>
+      <w:hyperlink r:id="rId83">
+        <w:r>
+          <w:rPr>
+            <w:color w:val="2F5597"/>
+            <w:u w:val="single"/>
+          </w:rPr>
+          <w:t>Adaptive Deep-Unfolded VMD</w:t>
+        </w:r>
+      </w:hyperlink>
+      <w:r>
+        <w:t>.</w:t>
+      </w:r>
+    </w:p>
+    <w:p>
+      <w:pPr>
+        <w:pStyle w:val="ListBullet"/>
+        <w:spacing w:before="0" w:after="40" w:line="254" w:lineRule="auto"/>
+      </w:pPr>
+      <w:r>
+        <w:t>Stanford CS224W is not a signal-processing course; use its project rubric for scoping and reproducibility, and use the signal-processing papers and repositories above for the technical method.</w:t>
+      </w:r>
+    </w:p>
+    <w:p>
+      <w:r>
+        <w:br w:type="page"/>
+      </w:r>
+    </w:p>
+    <w:p>
+      <w:pPr>
+        <w:pStyle w:val="Heading2"/>
+        <w:spacing w:after="140"/>
+      </w:pPr>
+      <w:r>
+        <w:t>Project 4.1  Deep-unfolded multivariate VMD for correlated multichannel signals</w:t>
+      </w:r>
+    </w:p>
+    <w:tbl>
+      <w:tblPr>
+        <w:tblW w:type="auto" w:w="0"/>
+        <w:jc w:val="center"/>
+        <w:tblLayout w:type="fixed"/>
+        <w:tblLook w:firstColumn="1" w:firstRow="1" w:lastColumn="0" w:lastRow="0" w:noHBand="0" w:noVBand="1" w:val="04A0"/>
+        <w:tblBorders>
+          <w:top w:val="single" w:sz="5" w:space="0" w:color="D9E0E6"/>
+          <w:left w:val="single" w:sz="5" w:space="0" w:color="D9E0E6"/>
+          <w:bottom w:val="single" w:sz="5" w:space="0" w:color="D9E0E6"/>
+          <w:right w:val="single" w:sz="5" w:space="0" w:color="D9E0E6"/>
+          <w:insideH w:val="single" w:sz="5" w:space="0" w:color="D9E0E6"/>
+          <w:insideV w:val="single" w:sz="5" w:space="0" w:color="D9E0E6"/>
+        </w:tblBorders>
+      </w:tblPr>
+      <w:tblGrid>
+        <w:gridCol w:w="1944"/>
+        <w:gridCol w:w="7704"/>
+      </w:tblGrid>
+      <w:tr>
+        <w:trPr>
+          <w:cantSplit/>
+        </w:trPr>
+        <w:tc>
+          <w:tcPr>
+            <w:tcW w:type="dxa" w:w="1944"/>
+            <w:shd w:fill="EAF2F8"/>
+            <w:tcMar>
+              <w:top w:w="90" w:type="dxa"/>
+              <w:start w:w="110" w:type="dxa"/>
+              <w:bottom w:w="90" w:type="dxa"/>
+              <w:end w:w="110" w:type="dxa"/>
+            </w:tcMar>
+            <w:vAlign w:val="center"/>
+          </w:tcPr>
+          <w:p>
+            <w:pPr>
+              <w:spacing w:after="0"/>
+            </w:pPr>
+            <w:r>
+              <w:rPr>
+                <w:b/>
+                <w:color w:val="17365D"/>
+              </w:rPr>
+              <w:t>Task</w:t>
+            </w:r>
+          </w:p>
+        </w:tc>
+        <w:tc>
+          <w:tcPr>
+            <w:tcW w:type="dxa" w:w="7704"/>
+            <w:shd w:fill="FFFFFF"/>
+            <w:tcMar>
+              <w:top w:w="90" w:type="dxa"/>
+              <w:start w:w="110" w:type="dxa"/>
+              <w:bottom w:w="90" w:type="dxa"/>
+              <w:end w:w="110" w:type="dxa"/>
+            </w:tcMar>
+            <w:vAlign w:val="center"/>
+          </w:tcPr>
+          <w:p>
+            <w:pPr>
+              <w:spacing w:after="0"/>
+            </w:pPr>
+            <w:r>
+              <w:t>Algorithm unrolling for multichannel signal decomposition and forecasting</w:t>
+            </w:r>
+          </w:p>
+        </w:tc>
+      </w:tr>
+      <w:tr>
+        <w:trPr>
+          <w:cantSplit/>
+        </w:trPr>
+        <w:tc>
+          <w:tcPr>
+            <w:tcW w:type="dxa" w:w="1944"/>
+            <w:shd w:fill="EAF2F8"/>
+            <w:tcMar>
+              <w:top w:w="90" w:type="dxa"/>
+              <w:start w:w="110" w:type="dxa"/>
+              <w:bottom w:w="90" w:type="dxa"/>
+              <w:end w:w="110" w:type="dxa"/>
+            </w:tcMar>
+            <w:vAlign w:val="center"/>
+          </w:tcPr>
+          <w:p>
+            <w:pPr>
+              <w:spacing w:after="0"/>
+            </w:pPr>
+            <w:r>
+              <w:rPr>
+                <w:b/>
+                <w:color w:val="17365D"/>
+              </w:rPr>
+              <w:t>Recommended level</w:t>
+            </w:r>
+          </w:p>
+        </w:tc>
+        <w:tc>
+          <w:tcPr>
+            <w:tcW w:type="dxa" w:w="7704"/>
+            <w:shd w:fill="F4F6F8"/>
+            <w:tcMar>
+              <w:top w:w="90" w:type="dxa"/>
+              <w:start w:w="110" w:type="dxa"/>
+              <w:bottom w:w="90" w:type="dxa"/>
+              <w:end w:w="110" w:type="dxa"/>
+            </w:tcMar>
+            <w:vAlign w:val="center"/>
+          </w:tcPr>
+          <w:p>
+            <w:pPr>
+              <w:spacing w:after="0"/>
+            </w:pPr>
+            <w:r>
+              <w:t>MSc preferred; narrower BSc reproduction variant</w:t>
+            </w:r>
+          </w:p>
+        </w:tc>
+      </w:tr>
+      <w:tr>
+        <w:trPr>
+          <w:cantSplit/>
+        </w:trPr>
+        <w:tc>
+          <w:tcPr>
+            <w:tcW w:type="dxa" w:w="1944"/>
+            <w:shd w:fill="EAF2F8"/>
+            <w:tcMar>
+              <w:top w:w="90" w:type="dxa"/>
+              <w:start w:w="110" w:type="dxa"/>
+              <w:bottom w:w="90" w:type="dxa"/>
+              <w:end w:w="110" w:type="dxa"/>
+            </w:tcMar>
+            <w:vAlign w:val="center"/>
+          </w:tcPr>
+          <w:p>
+            <w:pPr>
+              <w:spacing w:after="0"/>
+            </w:pPr>
+            <w:r>
+              <w:rPr>
+                <w:b/>
+                <w:color w:val="17365D"/>
+              </w:rPr>
+              <w:t>Compute</w:t>
+            </w:r>
+          </w:p>
+        </w:tc>
+        <w:tc>
+          <w:tcPr>
+            <w:tcW w:type="dxa" w:w="7704"/>
+            <w:shd w:fill="FFFFFF"/>
+            <w:tcMar>
+              <w:top w:w="90" w:type="dxa"/>
+              <w:start w:w="110" w:type="dxa"/>
+              <w:bottom w:w="90" w:type="dxa"/>
+              <w:end w:w="110" w:type="dxa"/>
+            </w:tcMar>
+            <w:vAlign w:val="center"/>
+          </w:tcPr>
+          <w:p>
+            <w:pPr>
+              <w:spacing w:after="0"/>
+            </w:pPr>
+            <w:r>
+              <w:t>Light for synthetic data; moderate for the applied forecasting task</w:t>
+            </w:r>
+          </w:p>
+        </w:tc>
+      </w:tr>
+      <w:tr>
+        <w:trPr>
+          <w:cantSplit/>
+        </w:trPr>
+        <w:tc>
+          <w:tcPr>
+            <w:tcW w:type="dxa" w:w="1944"/>
+            <w:shd w:fill="EAF2F8"/>
+            <w:tcMar>
+              <w:top w:w="90" w:type="dxa"/>
+              <w:start w:w="110" w:type="dxa"/>
+              <w:bottom w:w="90" w:type="dxa"/>
+              <w:end w:w="110" w:type="dxa"/>
+            </w:tcMar>
+            <w:vAlign w:val="center"/>
+          </w:tcPr>
+          <w:p>
+            <w:pPr>
+              <w:spacing w:after="0"/>
+            </w:pPr>
+            <w:r>
+              <w:rPr>
+                <w:b/>
+                <w:color w:val="17365D"/>
+              </w:rPr>
+              <w:t>Starting paper</w:t>
+            </w:r>
+          </w:p>
+        </w:tc>
+        <w:tc>
+          <w:tcPr>
+            <w:tcW w:type="dxa" w:w="7704"/>
+            <w:shd w:fill="F4F6F8"/>
+            <w:tcMar>
+              <w:top w:w="90" w:type="dxa"/>
+              <w:start w:w="110" w:type="dxa"/>
+              <w:bottom w:w="90" w:type="dxa"/>
+              <w:end w:w="110" w:type="dxa"/>
+            </w:tcMar>
+            <w:vAlign w:val="center"/>
+          </w:tcPr>
+          <w:p>
+            <w:pPr>
+              <w:spacing w:after="0"/>
+            </w:pPr>
+            <w:r>
+              <w:t xml:space="preserve">Ahmad et al., </w:t>
+            </w:r>
+            <w:hyperlink r:id="rId83">
+              <w:r>
+                <w:rPr>
+                  <w:color w:val="2F5597"/>
+                  <w:u w:val="single"/>
+                </w:rPr>
+                <w:t>Adaptive Deep-Unfolded VMD</w:t>
+              </w:r>
+            </w:hyperlink>
+            <w:r>
+              <w:t>, 2025</w:t>
+            </w:r>
+          </w:p>
+        </w:tc>
+      </w:tr>
+    </w:tbl>
+    <w:p>
+      <w:pPr>
+        <w:spacing w:after="0"/>
+      </w:pPr>
+    </w:p>
+    <w:p>
+      <w:pPr>
+        <w:spacing w:before="80" w:after="100" w:line="254" w:lineRule="auto"/>
+      </w:pPr>
+      <w:r>
+        <w:rPr>
+          <w:b/>
+          <w:color w:val="25313C"/>
+        </w:rPr>
+        <w:t xml:space="preserve">What you will do. </w:t>
+      </w:r>
+      <w:r>
+        <w:t>Unroll the alternating-direction method of multipliers used by multivariate variational mode decomposition (MVMD) into a small trainable network. The project tests whether shared oscillatory structure across correlated channels can be learned without losing the interpretability of the classical algorithm.</w:t>
+      </w:r>
+    </w:p>
+    <w:p>
+      <w:pPr>
+        <w:spacing w:before="0" w:after="100" w:line="254" w:lineRule="auto"/>
+      </w:pPr>
+      <w:r>
+        <w:rPr>
+          <w:b/>
+          <w:color w:val="25313C"/>
+        </w:rPr>
+        <w:t xml:space="preserve">Project goal. </w:t>
+      </w:r>
+      <w:r>
+        <w:t>Compare a jointly coupled, learnably weighted unrolled MVMD with classical MVMD and independently applied single-channel UVMD, first on synthetic signals with known modes and then on a downstream multichannel forecasting task.</w:t>
+      </w:r>
+    </w:p>
+    <w:p>
+      <w:pPr>
+        <w:spacing w:before="0" w:after="100" w:line="254" w:lineRule="auto"/>
+      </w:pPr>
+      <w:r>
+        <w:rPr>
+          <w:b/>
+          <w:color w:val="25313C"/>
+        </w:rPr>
+        <w:t xml:space="preserve">Data. </w:t>
+      </w:r>
+      <w:r>
+        <w:t xml:space="preserve">Required synthetic benchmark: generate multichannel signals with known modes, centre frequencies, channel counts and signal-to-noise ratios following the VMD/MVMD papers. Applied benchmark: </w:t>
+      </w:r>
+      <w:hyperlink r:id="rId84">
+        <w:r>
+          <w:rPr>
+            <w:color w:val="2F5597"/>
+            <w:u w:val="single"/>
+          </w:rPr>
+          <w:t>LargeST</w:t>
+        </w:r>
+      </w:hyperlink>
+      <w:r>
+        <w:t xml:space="preserve"> traffic forecasting, subject to licence confirmation. Optional fallback: </w:t>
+      </w:r>
+      <w:hyperlink r:id="rId85">
+        <w:r>
+          <w:rPr>
+            <w:color w:val="2F5597"/>
+            <w:u w:val="single"/>
+          </w:rPr>
+          <w:t>CTU-UHB cardiotocography</w:t>
+        </w:r>
+      </w:hyperlink>
+      <w:r>
+        <w:t>.</w:t>
+      </w:r>
+    </w:p>
+    <w:p>
+      <w:pPr>
+        <w:spacing w:before="0" w:after="100" w:line="254" w:lineRule="auto"/>
+      </w:pPr>
+      <w:r>
+        <w:rPr>
+          <w:b/>
+          <w:color w:val="25313C"/>
+        </w:rPr>
+        <w:t xml:space="preserve">Methods and starting code. </w:t>
+      </w:r>
+      <w:r>
+        <w:t xml:space="preserve">Port the classical </w:t>
+      </w:r>
+      <w:hyperlink r:id="rId86">
+        <w:r>
+          <w:rPr>
+            <w:color w:val="2F5597"/>
+            <w:u w:val="single"/>
+          </w:rPr>
+          <w:t>MVMD MATLAB implementation</w:t>
+        </w:r>
+      </w:hyperlink>
+      <w:r>
+        <w:t xml:space="preserve">, validate against </w:t>
+      </w:r>
+      <w:hyperlink r:id="rId82">
+        <w:r>
+          <w:rPr>
+            <w:color w:val="2F5597"/>
+            <w:u w:val="single"/>
+          </w:rPr>
+          <w:t>vmdpy</w:t>
+        </w:r>
+      </w:hyperlink>
+      <w:r>
+        <w:t xml:space="preserve">, and extend the anchor paper's </w:t>
+      </w:r>
+      <w:hyperlink r:id="rId87">
+        <w:r>
+          <w:rPr>
+            <w:color w:val="2F5597"/>
+            <w:u w:val="single"/>
+          </w:rPr>
+          <w:t>UVMD code</w:t>
+        </w:r>
+      </w:hyperlink>
+      <w:r>
+        <w:t xml:space="preserve"> with a genuine cross-channel coupling step and learnable channel weights.</w:t>
+      </w:r>
+    </w:p>
+    <w:p>
+      <w:pPr>
+        <w:spacing w:before="0" w:after="100" w:line="254" w:lineRule="auto"/>
+      </w:pPr>
+      <w:r>
+        <w:rPr>
+          <w:b/>
+          <w:color w:val="25313C"/>
+        </w:rPr>
+        <w:t xml:space="preserve">Required baselines. </w:t>
+      </w:r>
+      <w:r>
+        <w:t>Classical MVMD to convergence; independent classical VMD; independent UVMD; the proposed jointly unrolled MVMD; and an equal-weight coupling ablation.</w:t>
+      </w:r>
+    </w:p>
+    <w:p>
+      <w:pPr>
+        <w:spacing w:before="0" w:after="100" w:line="254" w:lineRule="auto"/>
+      </w:pPr>
+      <w:r>
+        <w:rPr>
+          <w:b/>
+          <w:color w:val="25313C"/>
+        </w:rPr>
+        <w:t xml:space="preserve">Evaluation. </w:t>
+      </w:r>
+      <w:r>
+        <w:t>Synthetic data: per-mode reconstruction error, centre-frequency error versus channel count and SNR, layers needed to match converged MVMD, and wall-clock time. Applied data: MAE, RMSE and MAPE at horizons 1–12, decomposition time and parameter count. Use at least three seeds for learned methods.</w:t>
+      </w:r>
+    </w:p>
+    <w:p>
+      <w:pPr>
+        <w:spacing w:before="80" w:after="100" w:line="254" w:lineRule="auto"/>
+      </w:pPr>
+      <w:r>
+        <w:rPr>
+          <w:b/>
+          <w:color w:val="25313C"/>
+        </w:rPr>
+        <w:t xml:space="preserve">Bachelor scope. </w:t>
+      </w:r>
+      <w:r>
+        <w:t>Port and validate classical MVMD, implement a fixed-weight unrolled coupling step, and compare it with independent UVMD and classical MVMD on the synthetic benchmark only.</w:t>
+      </w:r>
+    </w:p>
+    <w:p>
+      <w:pPr>
+        <w:spacing w:before="80" w:after="100" w:line="254" w:lineRule="auto"/>
+      </w:pPr>
+      <w:r>
+        <w:rPr>
+          <w:b/>
+          <w:color w:val="25313C"/>
+        </w:rPr>
+        <w:t xml:space="preserve">Master research question and contribution. </w:t>
+      </w:r>
+      <w:r>
+        <w:t xml:space="preserve">Research question: </w:t>
+      </w:r>
+      <w:r>
+        <w:rPr>
+          <w:b/>
+        </w:rPr>
+        <w:t>Does a jointly unrolled, learnably weighted MVMD recover shared oscillatory structure more accurately and robustly to per-channel noise than classical MVMD or independent UVMD, and does that advantage survive downstream forecasting?</w:t>
+      </w:r>
+      <w:r>
+        <w:t xml:space="preserve"> The contribution must include a leakage-safe coupled update, equal-weight ablation and both synthetic and applied evaluation. Reproducing independent UVMD alone is not an MSc contribution.</w:t>
+      </w:r>
+    </w:p>
+    <w:p>
+      <w:pPr>
+        <w:spacing w:before="0" w:after="100" w:line="254" w:lineRule="auto"/>
+      </w:pPr>
+      <w:r>
+        <w:rPr>
+          <w:b/>
+          <w:color w:val="25313C"/>
+        </w:rPr>
+        <w:t xml:space="preserve">Practical notes. </w:t>
+      </w:r>
+      <w:r>
+        <w:t>Validate every unrolled layer against the classical fixed-point update. Add a test that would fail if the method silently reduced to independent per-channel UVMD. Confirm LargeST licence before allocation; the synthetic benchmark plus CTU-UHB is a sufficient fallback.</w:t>
       </w:r>
     </w:p>
     <w:p>
@@ -11386,7 +9160,7 @@
               <w:spacing w:after="0"/>
             </w:pPr>
             <w:r>
-              <w:t>1.1 C-MAPSS, 1.4 MovieLens, 2.2 UCI-HAR, 3.2 GRACE reproduction, 4.1 EuroSAT RGB</w:t>
+              <w:t>1.1 C-MAPSS, 1.4 MovieLens, 2.2 UCI-HAR, 3.1 EuroSAT RGB</w:t>
             </w:r>
           </w:p>
         </w:tc>
@@ -11437,7 +9211,7 @@
               <w:spacing w:after="0"/>
             </w:pPr>
             <w:r>
-              <w:t>3.1 inductive STAEformer, 3.3 structure-aware GraphCL, 1.2 dynamic traffic graph, 3.4 GraphGPS routing</w:t>
+              <w:t>1.2 dynamic traffic graph, 2.4 decomposition-aware forecasting, 3.1 vision adapter, 4.1 deep-unfolded VMD</w:t>
             </w:r>
           </w:p>
         </w:tc>
@@ -11488,7 +9262,7 @@
               <w:spacing w:after="0"/>
             </w:pPr>
             <w:r>
-              <w:t>2.1 Tetra Pak regime-aware SSL, 2.3 lead-aware latent prediction, 2.4 decomposition-aware forecasting, 2.6 physics-grounded vibration graphs</w:t>
+              <w:t>2.1 Tetra Pak regime-aware SSL, 2.3 lead-aware latent prediction, 2.6 physics-grounded vibration graphs, 4.1 coupled deep-unfolded VMD</w:t>
             </w:r>
           </w:p>
         </w:tc>
@@ -11539,7 +9313,7 @@
               <w:spacing w:after="0"/>
             </w:pPr>
             <w:r>
-              <w:t>2.1 Tetra Pak after the partner-data profile and agreement; 2.5 HEAPO after a licence and data check; 3.5 G-Retriever for students prepared for substantial retrieval engineering</w:t>
+              <w:t>2.1 Tetra Pak after the partner-data profile and agreement; 2.5 HEAPO after a licence and data check; 4.1 LargeST licence before allocation</w:t>
             </w:r>
           </w:p>
         </w:tc>
@@ -11755,7 +9529,7 @@
         <w:color w:val="5F6B76"/>
         <w:sz w:val="16"/>
       </w:rPr>
-      <w:t>Student Project Portfolio   |   Graphs, time series and vision</w:t>
+      <w:t>Student Project Portfolio   |   Graphs, time series, vision and signal processing</w:t>
     </w:r>
   </w:p>
 </w:hdr>

</xml_diff>

<commit_message>
Align download category introductions
</commit_message>
<xml_diff>
--- a/downloads/student-project-portfolio.docx
+++ b/downloads/student-project-portfolio.docx
@@ -2763,47 +2763,133 @@
         <w:spacing w:before="0" w:after="100" w:line="254" w:lineRule="auto"/>
       </w:pPr>
       <w:r>
-        <w:t>These projects begin with a practical decision: estimate remaining life, forecast traffic, detect illicit activity, recommend an item or screen a molecule. The student must explain what the nodes and edges mean and test whether the graph adds value beyond a non-graph model.</w:t>
+        <w:t xml:space="preserve">A </w:t>
+      </w:r>
+      <w:r>
+        <w:rPr>
+          <w:b/>
+        </w:rPr>
+        <w:t>graph</w:t>
+      </w:r>
+      <w:r>
+        <w:t xml:space="preserve"> represents entities and the relationships between them. The entities are </w:t>
+      </w:r>
+      <w:r>
+        <w:rPr>
+          <w:b/>
+        </w:rPr>
+        <w:t>nodes</w:t>
+      </w:r>
+      <w:r>
+        <w:t xml:space="preserve"> and their relationships are </w:t>
+      </w:r>
+      <w:r>
+        <w:rPr>
+          <w:b/>
+        </w:rPr>
+        <w:t>edges</w:t>
+      </w:r>
+      <w:r>
+        <w:t>. Both may carry information: a customer node might contain age or location, a product node might contain category and price, and an edge might record that a customer bought or rated a product. Road sensors connected by roads, transactions linked by payments and atoms connected by chemical bonds are other examples.</w:t>
       </w:r>
     </w:p>
     <w:p>
       <w:pPr>
-        <w:pStyle w:val="Heading3"/>
-      </w:pPr>
-      <w:r>
-        <w:t>Application project requirements</w:t>
+        <w:spacing w:before="0" w:after="100" w:line="254" w:lineRule="auto"/>
+      </w:pPr>
+      <w:r>
+        <w:t xml:space="preserve">A </w:t>
+      </w:r>
+      <w:r>
+        <w:rPr>
+          <w:b/>
+        </w:rPr>
+        <w:t>graph neural network (GNN)</w:t>
+      </w:r>
+      <w:r>
+        <w:t xml:space="preserve"> learns numerical representations, or embeddings, by combining a node's own features with information from its neighbours. In a customer-product graph, the model can use previous purchases, product properties and patterns from nearby customers to score a new customer-product link. The same principle supports </w:t>
+      </w:r>
+      <w:r>
+        <w:rPr>
+          <w:b/>
+        </w:rPr>
+        <w:t>node classification</w:t>
+      </w:r>
+      <w:r>
+        <w:t xml:space="preserve">, </w:t>
+      </w:r>
+      <w:r>
+        <w:rPr>
+          <w:b/>
+        </w:rPr>
+        <w:t>link prediction</w:t>
+      </w:r>
+      <w:r>
+        <w:t xml:space="preserve"> and </w:t>
+      </w:r>
+      <w:r>
+        <w:rPr>
+          <w:b/>
+        </w:rPr>
+        <w:t>graph-level prediction</w:t>
+      </w:r>
+      <w:r>
+        <w:t>.</w:t>
       </w:r>
     </w:p>
     <w:p>
       <w:pPr>
-        <w:spacing w:before="0" w:after="80" w:line="254" w:lineRule="auto"/>
-      </w:pPr>
-      <w:r>
-        <w:t>Specify a public dataset, graph construction, task type, primary metric, non-graph baseline and graph baseline. Include an edge-removal, edge-randomisation or alternative-graph experiment, and discuss leakage and limitations.</w:t>
+        <w:spacing w:before="0" w:after="100" w:line="254" w:lineRule="auto"/>
+      </w:pPr>
+      <w:r>
+        <w:t>Each project below asks a specific question about when and why the graph helps, not simply whether a GNN can be trained. Students define what the nodes and edges mean, fix a split and a primary metric, and include a control that tests whether the graph contributes.</w:t>
       </w:r>
     </w:p>
     <w:p>
       <w:pPr>
-        <w:spacing w:before="0" w:after="80" w:line="254" w:lineRule="auto"/>
-      </w:pPr>
-      <w:r>
-        <w:t>The evaluation should show whether sensor dependence, transaction flow, road connectivity, user–item structure or molecular bonding changes the prediction.</w:t>
+        <w:pStyle w:val="Heading3"/>
+      </w:pPr>
+      <w:r>
+        <w:t>Application project requirements</w:t>
       </w:r>
     </w:p>
     <w:p>
       <w:pPr>
-        <w:pStyle w:val="Heading2"/>
-      </w:pPr>
-      <w:r>
-        <w:t>Learn first and find ideas</w:t>
+        <w:spacing w:before="0" w:after="80" w:line="254" w:lineRule="auto"/>
+      </w:pPr>
+      <w:r>
+        <w:t>Specify a defensible graph construction, a fixed split and primary metric, a non-graph baseline and at least one GNN. Include an edge-removal, edge-randomisation or alternative-graph experiment to test whether the graph contributes.</w:t>
       </w:r>
     </w:p>
     <w:p>
       <w:pPr>
+        <w:pStyle w:val="Heading2"/>
+      </w:pPr>
+      <w:r>
+        <w:t>Learn first and find ideas</w:t>
+      </w:r>
+    </w:p>
+    <w:p>
+      <w:pPr>
         <w:pStyle w:val="ListBullet"/>
         <w:spacing w:before="0" w:after="40" w:line="254" w:lineRule="auto"/>
       </w:pPr>
+      <w:r>
+        <w:t xml:space="preserve">Begin with </w:t>
+      </w:r>
       <w:hyperlink r:id="rId13">
+        <w:r>
+          <w:rPr>
+            <w:color w:val="2F5597"/>
+            <w:u w:val="single"/>
+          </w:rPr>
+          <w:t>A Gentle Introduction to Graph Neural Networks</w:t>
+        </w:r>
+      </w:hyperlink>
+      <w:r>
+        <w:t xml:space="preserve">, then use the </w:t>
+      </w:r>
+      <w:hyperlink r:id="rId14">
         <w:r>
           <w:rPr>
             <w:color w:val="2F5597"/>
@@ -2815,13 +2901,13 @@
       <w:r>
         <w:t xml:space="preserve"> and the </w:t>
       </w:r>
-      <w:hyperlink r:id="rId14">
+      <w:hyperlink r:id="rId15">
         <w:r>
           <w:rPr>
             <w:color w:val="2F5597"/>
             <w:u w:val="single"/>
           </w:rPr>
-          <w:t>CS224W student-project archive</w:t>
+          <w:t>CS224W project archive</w:t>
         </w:r>
       </w:hyperlink>
       <w:r>
@@ -2833,7 +2919,7 @@
         <w:pStyle w:val="ListBullet"/>
         <w:spacing w:before="0" w:after="40" w:line="254" w:lineRule="auto"/>
       </w:pPr>
-      <w:hyperlink r:id="rId15">
+      <w:hyperlink r:id="rId16">
         <w:r>
           <w:rPr>
             <w:color w:val="2F5597"/>
@@ -2845,7 +2931,7 @@
       <w:r>
         <w:t xml:space="preserve">, </w:t>
       </w:r>
-      <w:hyperlink r:id="rId16">
+      <w:hyperlink r:id="rId17">
         <w:r>
           <w:rPr>
             <w:color w:val="2F5597"/>
@@ -2857,7 +2943,7 @@
       <w:r>
         <w:t xml:space="preserve">, </w:t>
       </w:r>
-      <w:hyperlink r:id="rId17">
+      <w:hyperlink r:id="rId18">
         <w:r>
           <w:rPr>
             <w:color w:val="2F5597"/>
@@ -2869,7 +2955,7 @@
       <w:r>
         <w:t xml:space="preserve"> and the </w:t>
       </w:r>
-      <w:hyperlink r:id="rId18">
+      <w:hyperlink r:id="rId19">
         <w:r>
           <w:rPr>
             <w:color w:val="2F5597"/>
@@ -2890,7 +2976,7 @@
       <w:r>
         <w:t xml:space="preserve">Stanford examples: </w:t>
       </w:r>
-      <w:hyperlink r:id="rId19">
+      <w:hyperlink r:id="rId20">
         <w:r>
           <w:rPr>
             <w:color w:val="2F5597"/>
@@ -2902,7 +2988,7 @@
       <w:r>
         <w:t xml:space="preserve">, </w:t>
       </w:r>
-      <w:hyperlink r:id="rId20">
+      <w:hyperlink r:id="rId21">
         <w:r>
           <w:rPr>
             <w:color w:val="2F5597"/>
@@ -2914,7 +3000,7 @@
       <w:r>
         <w:t xml:space="preserve">, </w:t>
       </w:r>
-      <w:hyperlink r:id="rId21">
+      <w:hyperlink r:id="rId22">
         <w:r>
           <w:rPr>
             <w:color w:val="2F5597"/>
@@ -2926,7 +3012,7 @@
       <w:r>
         <w:t xml:space="preserve"> and </w:t>
       </w:r>
-      <w:hyperlink r:id="rId22">
+      <w:hyperlink r:id="rId23">
         <w:r>
           <w:rPr>
             <w:color w:val="2F5597"/>
@@ -3170,7 +3256,7 @@
             <w:pPr>
               <w:spacing w:after="0"/>
             </w:pPr>
-            <w:hyperlink r:id="rId23">
+            <w:hyperlink r:id="rId24">
               <w:r>
                 <w:rPr>
                   <w:color w:val="2F5597"/>
@@ -3233,7 +3319,7 @@
             <w:r>
               <w:t xml:space="preserve">Huang, He and Sick, </w:t>
             </w:r>
-            <w:hyperlink r:id="rId24">
+            <w:hyperlink r:id="rId25">
               <w:r>
                 <w:rPr>
                   <w:color w:val="2F5597"/>
@@ -3307,7 +3393,7 @@
       <w:r>
         <w:t xml:space="preserve">Use a GRU or TCN as the graph-free baseline and a compact GCN–GRU or GAT–GRU as the graph model. The </w:t>
       </w:r>
-      <w:hyperlink r:id="rId25">
+      <w:hyperlink r:id="rId26">
         <w:r>
           <w:rPr>
             <w:color w:val="2F5597"/>
@@ -3319,7 +3405,7 @@
       <w:r>
         <w:t xml:space="preserve"> is a useful reference; a small </w:t>
       </w:r>
-      <w:hyperlink r:id="rId26">
+      <w:hyperlink r:id="rId27">
         <w:r>
           <w:rPr>
             <w:color w:val="2F5597"/>
@@ -3674,7 +3760,7 @@
             <w:pPr>
               <w:spacing w:after="0"/>
             </w:pPr>
-            <w:hyperlink r:id="rId27">
+            <w:hyperlink r:id="rId28">
               <w:r>
                 <w:rPr>
                   <w:color w:val="2F5597"/>
@@ -3737,7 +3823,7 @@
             <w:r>
               <w:t xml:space="preserve">Wu et al., </w:t>
             </w:r>
-            <w:hyperlink r:id="rId28">
+            <w:hyperlink r:id="rId29">
               <w:r>
                 <w:rPr>
                   <w:color w:val="2F5597"/>
@@ -3802,7 +3888,7 @@
       <w:r>
         <w:t xml:space="preserve">Compare historical average and a graph-free GRU with </w:t>
       </w:r>
-      <w:hyperlink r:id="rId29">
+      <w:hyperlink r:id="rId30">
         <w:r>
           <w:rPr>
             <w:color w:val="2F5597"/>
@@ -4157,7 +4243,7 @@
             <w:pPr>
               <w:spacing w:after="0"/>
             </w:pPr>
-            <w:hyperlink r:id="rId30">
+            <w:hyperlink r:id="rId31">
               <w:r>
                 <w:rPr>
                   <w:color w:val="2F5597"/>
@@ -4220,7 +4306,7 @@
             <w:r>
               <w:t xml:space="preserve">Weber et al., </w:t>
             </w:r>
-            <w:hyperlink r:id="rId31">
+            <w:hyperlink r:id="rId32">
               <w:r>
                 <w:rPr>
                   <w:color w:val="2F5597"/>
@@ -4294,7 +4380,7 @@
       <w:r>
         <w:t xml:space="preserve">Compare logistic regression or random forest with GCN and GraphSAGE in </w:t>
       </w:r>
-      <w:hyperlink r:id="rId26">
+      <w:hyperlink r:id="rId27">
         <w:r>
           <w:rPr>
             <w:color w:val="2F5597"/>
@@ -4649,7 +4735,7 @@
             <w:pPr>
               <w:spacing w:after="0"/>
             </w:pPr>
-            <w:hyperlink r:id="rId32">
+            <w:hyperlink r:id="rId33">
               <w:r>
                 <w:rPr>
                   <w:color w:val="2F5597"/>
@@ -4712,7 +4798,7 @@
             <w:r>
               <w:t xml:space="preserve">He et al., </w:t>
             </w:r>
-            <w:hyperlink r:id="rId33">
+            <w:hyperlink r:id="rId34">
               <w:r>
                 <w:rPr>
                   <w:color w:val="2F5597"/>
@@ -4777,7 +4863,7 @@
       <w:r>
         <w:t xml:space="preserve">Compare popularity, BPR matrix factorisation and LightGCN. A direct </w:t>
       </w:r>
-      <w:hyperlink r:id="rId26">
+      <w:hyperlink r:id="rId27">
         <w:r>
           <w:rPr>
             <w:color w:val="2F5597"/>
@@ -4789,7 +4875,7 @@
       <w:r>
         <w:t xml:space="preserve"> implementation is simpler than adapting the </w:t>
       </w:r>
-      <w:hyperlink r:id="rId34">
+      <w:hyperlink r:id="rId35">
         <w:r>
           <w:rPr>
             <w:color w:val="2F5597"/>
@@ -5099,7 +5185,7 @@
             <w:pPr>
               <w:spacing w:after="0"/>
             </w:pPr>
-            <w:hyperlink r:id="rId35">
+            <w:hyperlink r:id="rId36">
               <w:r>
                 <w:rPr>
                   <w:color w:val="2F5597"/>
@@ -5162,7 +5248,7 @@
             <w:r>
               <w:t xml:space="preserve">Hu et al., </w:t>
             </w:r>
-            <w:hyperlink r:id="rId36">
+            <w:hyperlink r:id="rId37">
               <w:r>
                 <w:rPr>
                   <w:color w:val="2F5597"/>
@@ -5212,7 +5298,7 @@
       <w:r>
         <w:t xml:space="preserve">The </w:t>
       </w:r>
-      <w:hyperlink r:id="rId16">
+      <w:hyperlink r:id="rId17">
         <w:r>
           <w:rPr>
             <w:color w:val="2F5597"/>
@@ -5239,7 +5325,7 @@
       <w:r>
         <w:t xml:space="preserve">Compare Morgan fingerprints with logistic regression or random forest via </w:t>
       </w:r>
-      <w:hyperlink r:id="rId37">
+      <w:hyperlink r:id="rId38">
         <w:r>
           <w:rPr>
             <w:color w:val="2F5597"/>
@@ -5251,7 +5337,7 @@
       <w:r>
         <w:t xml:space="preserve"> against GCN and edge-aware GINE models. OGB and </w:t>
       </w:r>
-      <w:hyperlink r:id="rId26">
+      <w:hyperlink r:id="rId27">
         <w:r>
           <w:rPr>
             <w:color w:val="2F5597"/>
@@ -5393,74 +5479,73 @@
         <w:spacing w:before="0" w:after="100" w:line="254" w:lineRule="auto"/>
       </w:pPr>
       <w:r>
-        <w:t>Industrial and healthcare time series are abundant, but labels often require a technician, clinician or field inspection. Self-supervised learning creates a training signal from the recordings themselves, then tests whether a small downstream head can solve a labelled task with less supervision.</w:t>
-      </w:r>
-    </w:p>
-    <w:p>
-      <w:pPr>
-        <w:pStyle w:val="Heading3"/>
-      </w:pPr>
-      <w:r>
-        <w:t>Three ideas to understand</w:t>
-      </w:r>
-    </w:p>
-    <w:p>
-      <w:pPr>
-        <w:spacing w:before="0" w:after="80" w:line="254" w:lineRule="auto"/>
-      </w:pPr>
+        <w:t xml:space="preserve">A </w:t>
+      </w:r>
       <w:r>
         <w:rPr>
           <w:b/>
         </w:rPr>
-        <w:t>Contrastive learning</w:t>
-      </w:r>
-      <w:r>
-        <w:t xml:space="preserve"> makes representations of two valid views of the same recording similar. </w:t>
-      </w:r>
+        <w:t>time series</w:t>
+      </w:r>
+      <w:r>
+        <w:t xml:space="preserve"> is an ordered sequence of measurements. A wearable device may record acceleration every fraction of a second, an ECG contains voltage measurements from several leads, and an industrial plant records pressure, flow, temperature and energy over time. These signals contain repeated patterns, trends and operating phases, but useful labels may require expert work and are often scarce.</w:t>
+      </w:r>
+    </w:p>
+    <w:p>
+      <w:pPr>
+        <w:spacing w:before="0" w:after="100" w:line="254" w:lineRule="auto"/>
+      </w:pPr>
       <w:r>
         <w:rPr>
           <w:b/>
         </w:rPr>
-        <w:t>Masked modelling</w:t>
-      </w:r>
-      <w:r>
-        <w:t xml:space="preserve"> reconstructs hidden samples or patches. </w:t>
-      </w:r>
-      <w:r>
-        <w:rPr>
-          <w:b/>
-        </w:rPr>
-        <w:t>Latent prediction or JEPA-style learning</w:t>
-      </w:r>
-      <w:r>
-        <w:t xml:space="preserve"> predicts hidden representations rather than raw values and therefore needs explicit collapse monitoring.</w:t>
+        <w:t>Self-supervised learning (SSL)</w:t>
+      </w:r>
+      <w:r>
+        <w:t xml:space="preserve"> learns from the unlabelled recordings by creating its own training task. A model might make two valid views of the same signal agree, hide part of a sequence and predict it, or predict the representation of a future segment. The resulting encoder converts a recording or window into a compact numerical representation. A small classification or regression head is then trained for a downstream task.</w:t>
       </w:r>
     </w:p>
     <w:p>
       <w:pPr>
-        <w:spacing w:before="0" w:after="80" w:line="254" w:lineRule="auto"/>
-      </w:pPr>
-      <w:r>
-        <w:t>Possible MSc contributions include physically valid view or mask construction: rotating inertial axes consistently, hiding related ECG leads, aligning energy windows by seasonal phase, matching smart-meter views by outdoor temperature or constructing vibration graphs from bearing kinematics.</w:t>
+        <w:spacing w:before="0" w:after="100" w:line="254" w:lineRule="auto"/>
+      </w:pPr>
+      <w:r>
+        <w:t>Evaluation focuses on whether the representation reduces the amount of labelled data needed and transfers to new people, machines or operating conditions. Each project compares SSL with a fully supervised model and a randomly initialised encoder on leakage-safe splits.</w:t>
       </w:r>
     </w:p>
     <w:p>
       <w:pPr>
-        <w:pStyle w:val="Heading2"/>
-      </w:pPr>
-      <w:r>
-        <w:t>Learn first and find data</w:t>
+        <w:pStyle w:val="Heading3"/>
+      </w:pPr>
+      <w:r>
+        <w:t>Three ideas to understand</w:t>
       </w:r>
     </w:p>
     <w:p>
       <w:pPr>
+        <w:spacing w:before="0" w:after="80" w:line="254" w:lineRule="auto"/>
+      </w:pPr>
+      <w:r>
+        <w:t>Contrastive learning aligns valid views of the same recording. Masked modelling reconstructs hidden samples or patches. Latent prediction estimates hidden representations instead of raw values and requires explicit collapse monitoring. Possible MSc contributions include view or mask designs based on the physics or physiology of the signal.</w:t>
+      </w:r>
+    </w:p>
+    <w:p>
+      <w:pPr>
+        <w:pStyle w:val="Heading2"/>
+      </w:pPr>
+      <w:r>
+        <w:t>Learn first and find ideas</w:t>
+      </w:r>
+    </w:p>
+    <w:p>
+      <w:pPr>
         <w:pStyle w:val="ListBullet"/>
         <w:spacing w:before="0" w:after="40" w:line="254" w:lineRule="auto"/>
       </w:pPr>
       <w:r>
-        <w:t xml:space="preserve">Introductory methods with code: </w:t>
-      </w:r>
-      <w:hyperlink r:id="rId38">
+        <w:t xml:space="preserve">Methods with code: </w:t>
+      </w:r>
+      <w:hyperlink r:id="rId39">
         <w:r>
           <w:rPr>
             <w:color w:val="2F5597"/>
@@ -5472,7 +5557,7 @@
       <w:r>
         <w:t xml:space="preserve">, </w:t>
       </w:r>
-      <w:hyperlink r:id="rId39">
+      <w:hyperlink r:id="rId40">
         <w:r>
           <w:rPr>
             <w:color w:val="2F5597"/>
@@ -5484,7 +5569,7 @@
       <w:r>
         <w:t xml:space="preserve">, </w:t>
       </w:r>
-      <w:hyperlink r:id="rId40">
+      <w:hyperlink r:id="rId41">
         <w:r>
           <w:rPr>
             <w:color w:val="2F5597"/>
@@ -5496,7 +5581,7 @@
       <w:r>
         <w:t xml:space="preserve"> and </w:t>
       </w:r>
-      <w:hyperlink r:id="rId41">
+      <w:hyperlink r:id="rId42">
         <w:r>
           <w:rPr>
             <w:color w:val="2F5597"/>
@@ -5515,9 +5600,9 @@
         <w:spacing w:before="0" w:after="40" w:line="254" w:lineRule="auto"/>
       </w:pPr>
       <w:r>
-        <w:t xml:space="preserve">Dataset sources: </w:t>
-      </w:r>
-      <w:hyperlink r:id="rId42">
+        <w:t xml:space="preserve">Data sources: </w:t>
+      </w:r>
+      <w:hyperlink r:id="rId43">
         <w:r>
           <w:rPr>
             <w:color w:val="2F5597"/>
@@ -5529,7 +5614,7 @@
       <w:r>
         <w:t xml:space="preserve">, </w:t>
       </w:r>
-      <w:hyperlink r:id="rId43">
+      <w:hyperlink r:id="rId44">
         <w:r>
           <w:rPr>
             <w:color w:val="2F5597"/>
@@ -5541,19 +5626,19 @@
       <w:r>
         <w:t xml:space="preserve">, </w:t>
       </w:r>
-      <w:hyperlink r:id="rId44">
+      <w:hyperlink r:id="rId45">
         <w:r>
           <w:rPr>
             <w:color w:val="2F5597"/>
             <w:u w:val="single"/>
           </w:rPr>
-          <w:t>UCR/UEA time-series archive</w:t>
+          <w:t>UCR/UEA archive</w:t>
         </w:r>
       </w:hyperlink>
       <w:r>
         <w:t xml:space="preserve">, </w:t>
       </w:r>
-      <w:hyperlink r:id="rId45">
+      <w:hyperlink r:id="rId46">
         <w:r>
           <w:rPr>
             <w:color w:val="2F5597"/>
@@ -5565,7 +5650,7 @@
       <w:r>
         <w:t xml:space="preserve"> and </w:t>
       </w:r>
-      <w:hyperlink r:id="rId46">
+      <w:hyperlink r:id="rId47">
         <w:r>
           <w:rPr>
             <w:color w:val="2F5597"/>
@@ -5584,23 +5669,7 @@
         <w:spacing w:before="0" w:after="40" w:line="254" w:lineRule="auto"/>
       </w:pPr>
       <w:r>
-        <w:t>Stanford CS224W is graph-focused, so its project archive is most directly useful for Categories 1 and 3. For this category, use the method repositories above and the shared evaluation protocol in this document.</w:t>
-      </w:r>
-    </w:p>
-    <w:p>
-      <w:pPr>
-        <w:pStyle w:val="Heading3"/>
-      </w:pPr>
-      <w:r>
-        <w:t>Collapse warning</w:t>
-      </w:r>
-    </w:p>
-    <w:p>
-      <w:pPr>
-        <w:spacing w:before="0" w:after="80" w:line="254" w:lineRule="auto"/>
-      </w:pPr>
-      <w:r>
-        <w:t>A latent-predictive model can minimise its objective with nearly constant embeddings. Monitor per-dimension variance, covariance or off-diagonal correlation and downstream random-control performance from the first epoch. A smooth pretraining loss does not establish that the representation is useful.</w:t>
+        <w:t>Monitor embedding variance and covariance from the first epoch in latent-predictive work. A smooth pretraining loss does not establish that the representation is useful.</w:t>
       </w:r>
     </w:p>
     <w:p>
@@ -5888,7 +5957,7 @@
             <w:r>
               <w:t xml:space="preserve">Yue et al., </w:t>
             </w:r>
-            <w:hyperlink r:id="rId47">
+            <w:hyperlink r:id="rId48">
               <w:r>
                 <w:rPr>
                   <w:color w:val="2F5597"/>
@@ -5953,7 +6022,7 @@
       <w:r>
         <w:t xml:space="preserve">Use </w:t>
       </w:r>
-      <w:hyperlink r:id="rId39">
+      <w:hyperlink r:id="rId40">
         <w:r>
           <w:rPr>
             <w:color w:val="2F5597"/>
@@ -5965,7 +6034,7 @@
       <w:r>
         <w:t xml:space="preserve">, </w:t>
       </w:r>
-      <w:hyperlink r:id="rId38">
+      <w:hyperlink r:id="rId39">
         <w:r>
           <w:rPr>
             <w:color w:val="2F5597"/>
@@ -5977,7 +6046,7 @@
       <w:r>
         <w:t xml:space="preserve"> or </w:t>
       </w:r>
-      <w:hyperlink r:id="rId41">
+      <w:hyperlink r:id="rId42">
         <w:r>
           <w:rPr>
             <w:color w:val="2F5597"/>
@@ -6282,7 +6351,7 @@
             <w:pPr>
               <w:spacing w:after="0"/>
             </w:pPr>
-            <w:hyperlink r:id="rId48">
+            <w:hyperlink r:id="rId49">
               <w:r>
                 <w:rPr>
                   <w:color w:val="2F5597"/>
@@ -6345,7 +6414,7 @@
             <w:r>
               <w:t xml:space="preserve">Eldele et al., </w:t>
             </w:r>
-            <w:hyperlink r:id="rId49">
+            <w:hyperlink r:id="rId50">
               <w:r>
                 <w:rPr>
                   <w:color w:val="2F5597"/>
@@ -6407,7 +6476,7 @@
         </w:rPr>
         <w:t xml:space="preserve">Methods and code. </w:t>
       </w:r>
-      <w:hyperlink r:id="rId38">
+      <w:hyperlink r:id="rId39">
         <w:r>
           <w:rPr>
             <w:color w:val="2F5597"/>
@@ -6419,7 +6488,7 @@
       <w:r>
         <w:t xml:space="preserve"> or </w:t>
       </w:r>
-      <w:hyperlink r:id="rId39">
+      <w:hyperlink r:id="rId40">
         <w:r>
           <w:rPr>
             <w:color w:val="2F5597"/>
@@ -6723,7 +6792,7 @@
             <w:pPr>
               <w:spacing w:after="0"/>
             </w:pPr>
-            <w:hyperlink r:id="rId50">
+            <w:hyperlink r:id="rId51">
               <w:r>
                 <w:rPr>
                   <w:color w:val="2F5597"/>
@@ -6786,7 +6855,7 @@
             <w:r>
               <w:t xml:space="preserve">Dong et al., </w:t>
             </w:r>
-            <w:hyperlink r:id="rId51">
+            <w:hyperlink r:id="rId52">
               <w:r>
                 <w:rPr>
                   <w:color w:val="2F5597"/>
@@ -6851,7 +6920,7 @@
       <w:r>
         <w:t xml:space="preserve">Start with </w:t>
       </w:r>
-      <w:hyperlink r:id="rId41">
+      <w:hyperlink r:id="rId42">
         <w:r>
           <w:rPr>
             <w:color w:val="2F5597"/>
@@ -6863,7 +6932,7 @@
       <w:r>
         <w:t xml:space="preserve"> or </w:t>
       </w:r>
-      <w:hyperlink r:id="rId39">
+      <w:hyperlink r:id="rId40">
         <w:r>
           <w:rPr>
             <w:color w:val="2F5597"/>
@@ -6875,7 +6944,7 @@
       <w:r>
         <w:t xml:space="preserve"> and a 1-D ResNet or compact Transformer. The </w:t>
       </w:r>
-      <w:hyperlink r:id="rId52">
+      <w:hyperlink r:id="rId53">
         <w:r>
           <w:rPr>
             <w:color w:val="2F5597"/>
@@ -7196,7 +7265,7 @@
             <w:pPr>
               <w:spacing w:after="0"/>
             </w:pPr>
-            <w:hyperlink r:id="rId53">
+            <w:hyperlink r:id="rId54">
               <w:r>
                 <w:rPr>
                   <w:color w:val="2F5597"/>
@@ -7259,7 +7328,7 @@
             <w:r>
               <w:t xml:space="preserve">Woo et al., </w:t>
             </w:r>
-            <w:hyperlink r:id="rId54">
+            <w:hyperlink r:id="rId55">
               <w:r>
                 <w:rPr>
                   <w:color w:val="2F5597"/>
@@ -7321,7 +7390,7 @@
         </w:rPr>
         <w:t xml:space="preserve">Methods and code. </w:t>
       </w:r>
-      <w:hyperlink r:id="rId55">
+      <w:hyperlink r:id="rId56">
         <w:r>
           <w:rPr>
             <w:color w:val="2F5597"/>
@@ -7333,7 +7402,7 @@
       <w:r>
         <w:t xml:space="preserve">, </w:t>
       </w:r>
-      <w:hyperlink r:id="rId39">
+      <w:hyperlink r:id="rId40">
         <w:r>
           <w:rPr>
             <w:color w:val="2F5597"/>
@@ -7345,7 +7414,7 @@
       <w:r>
         <w:t xml:space="preserve"> or </w:t>
       </w:r>
-      <w:hyperlink r:id="rId41">
+      <w:hyperlink r:id="rId42">
         <w:r>
           <w:rPr>
             <w:color w:val="2F5597"/>
@@ -7357,7 +7426,7 @@
       <w:r>
         <w:t xml:space="preserve"> for pretraining. </w:t>
       </w:r>
-      <w:hyperlink r:id="rId56">
+      <w:hyperlink r:id="rId57">
         <w:r>
           <w:rPr>
             <w:color w:val="2F5597"/>
@@ -7369,7 +7438,7 @@
       <w:r>
         <w:t xml:space="preserve"> is the required supervised reference; </w:t>
       </w:r>
-      <w:hyperlink r:id="rId57">
+      <w:hyperlink r:id="rId58">
         <w:r>
           <w:rPr>
             <w:color w:val="2F5597"/>
@@ -7709,7 +7778,7 @@
             <w:pPr>
               <w:spacing w:after="0"/>
             </w:pPr>
-            <w:hyperlink r:id="rId58">
+            <w:hyperlink r:id="rId59">
               <w:r>
                 <w:rPr>
                   <w:color w:val="2F5597"/>
@@ -7772,7 +7841,7 @@
             <w:r>
               <w:t xml:space="preserve">Brudermueller et al., </w:t>
             </w:r>
-            <w:hyperlink r:id="rId59">
+            <w:hyperlink r:id="rId60">
               <w:r>
                 <w:rPr>
                   <w:color w:val="2F5597"/>
@@ -7822,7 +7891,7 @@
       <w:r>
         <w:t xml:space="preserve">The 458 MB public download contains 1,408 households; 214 have both smart-meter data and inspection information. Use the </w:t>
       </w:r>
-      <w:hyperlink r:id="rId60">
+      <w:hyperlink r:id="rId61">
         <w:r>
           <w:rPr>
             <w:color w:val="2F5597"/>
@@ -7849,7 +7918,7 @@
       <w:r>
         <w:t xml:space="preserve">Use </w:t>
       </w:r>
-      <w:hyperlink r:id="rId39">
+      <w:hyperlink r:id="rId40">
         <w:r>
           <w:rPr>
             <w:color w:val="2F5597"/>
@@ -7861,7 +7930,7 @@
       <w:r>
         <w:t xml:space="preserve"> or </w:t>
       </w:r>
-      <w:hyperlink r:id="rId41">
+      <w:hyperlink r:id="rId42">
         <w:r>
           <w:rPr>
             <w:color w:val="2F5597"/>
@@ -8187,7 +8256,7 @@
             <w:pPr>
               <w:spacing w:after="0"/>
             </w:pPr>
-            <w:hyperlink r:id="rId61">
+            <w:hyperlink r:id="rId62">
               <w:r>
                 <w:rPr>
                   <w:color w:val="2F5597"/>
@@ -8250,7 +8319,7 @@
             <w:r>
               <w:t xml:space="preserve">Hou et al., </w:t>
             </w:r>
-            <w:hyperlink r:id="rId62">
+            <w:hyperlink r:id="rId63">
               <w:r>
                 <w:rPr>
                   <w:color w:val="2F5597"/>
@@ -8262,7 +8331,7 @@
             <w:r>
               <w:t xml:space="preserve">, KDD 2022 — </w:t>
             </w:r>
-            <w:hyperlink r:id="rId63">
+            <w:hyperlink r:id="rId64">
               <w:r>
                 <w:rPr>
                   <w:color w:val="2F5597"/>
@@ -8324,7 +8393,7 @@
       <w:r>
         <w:t xml:space="preserve">Paderborn provides 64 kHz vibration, speed, torque and radial load for 32 physical bearings under four operating conditions. Download it from the </w:t>
       </w:r>
-      <w:hyperlink r:id="rId64">
+      <w:hyperlink r:id="rId65">
         <w:r>
           <w:rPr>
             <w:color w:val="2F5597"/>
@@ -8351,7 +8420,7 @@
       <w:r>
         <w:t xml:space="preserve">Use a GIN encoder with </w:t>
       </w:r>
-      <w:hyperlink r:id="rId63">
+      <w:hyperlink r:id="rId64">
         <w:r>
           <w:rPr>
             <w:color w:val="2F5597"/>
@@ -8494,7 +8563,7 @@
       <w:r>
         <w:t xml:space="preserve">Core reading: </w:t>
       </w:r>
-      <w:hyperlink r:id="rId65">
+      <w:hyperlink r:id="rId66">
         <w:r>
           <w:rPr>
             <w:color w:val="2F5597"/>
@@ -8506,7 +8575,7 @@
       <w:r>
         <w:t xml:space="preserve">, </w:t>
       </w:r>
-      <w:hyperlink r:id="rId66">
+      <w:hyperlink r:id="rId67">
         <w:r>
           <w:rPr>
             <w:color w:val="2F5597"/>
@@ -8518,7 +8587,7 @@
       <w:r>
         <w:t xml:space="preserve">, the </w:t>
       </w:r>
-      <w:hyperlink r:id="rId67">
+      <w:hyperlink r:id="rId68">
         <w:r>
           <w:rPr>
             <w:color w:val="2F5597"/>
@@ -8530,7 +8599,7 @@
       <w:r>
         <w:t xml:space="preserve">, and </w:t>
       </w:r>
-      <w:hyperlink r:id="rId68">
+      <w:hyperlink r:id="rId69">
         <w:r>
           <w:rPr>
             <w:color w:val="2F5597"/>
@@ -8542,7 +8611,7 @@
       <w:r>
         <w:t xml:space="preserve"> with its </w:t>
       </w:r>
-      <w:hyperlink r:id="rId69">
+      <w:hyperlink r:id="rId70">
         <w:r>
           <w:rPr>
             <w:color w:val="2F5597"/>
@@ -8563,7 +8632,7 @@
       <w:r>
         <w:t xml:space="preserve">Parameter-efficient adaptation: </w:t>
       </w:r>
-      <w:hyperlink r:id="rId70">
+      <w:hyperlink r:id="rId71">
         <w:r>
           <w:rPr>
             <w:color w:val="2F5597"/>
@@ -8575,7 +8644,7 @@
       <w:r>
         <w:t xml:space="preserve"> and the </w:t>
       </w:r>
-      <w:hyperlink r:id="rId71">
+      <w:hyperlink r:id="rId72">
         <w:r>
           <w:rPr>
             <w:color w:val="2F5597"/>
@@ -8596,7 +8665,7 @@
       <w:r>
         <w:t xml:space="preserve">Normal-only objectives: </w:t>
       </w:r>
-      <w:hyperlink r:id="rId65">
+      <w:hyperlink r:id="rId66">
         <w:r>
           <w:rPr>
             <w:color w:val="2F5597"/>
@@ -8608,7 +8677,7 @@
       <w:r>
         <w:t xml:space="preserve"> and </w:t>
       </w:r>
-      <w:hyperlink r:id="rId72">
+      <w:hyperlink r:id="rId73">
         <w:r>
           <w:rPr>
             <w:color w:val="2F5597"/>
@@ -8629,7 +8698,7 @@
       <w:r>
         <w:t xml:space="preserve">Data and model hubs: </w:t>
       </w:r>
-      <w:hyperlink r:id="rId73">
+      <w:hyperlink r:id="rId74">
         <w:r>
           <w:rPr>
             <w:color w:val="2F5597"/>
@@ -8641,7 +8710,7 @@
       <w:r>
         <w:t xml:space="preserve">, </w:t>
       </w:r>
-      <w:hyperlink r:id="rId74">
+      <w:hyperlink r:id="rId75">
         <w:r>
           <w:rPr>
             <w:color w:val="2F5597"/>
@@ -8653,7 +8722,7 @@
       <w:r>
         <w:t xml:space="preserve"> and </w:t>
       </w:r>
-      <w:hyperlink r:id="rId75">
+      <w:hyperlink r:id="rId76">
         <w:r>
           <w:rPr>
             <w:color w:val="2F5597"/>
@@ -8906,7 +8975,7 @@
             <w:pPr>
               <w:spacing w:after="0"/>
             </w:pPr>
-            <w:hyperlink r:id="rId73">
+            <w:hyperlink r:id="rId74">
               <w:r>
                 <w:rPr>
                   <w:color w:val="2F5597"/>
@@ -8969,7 +9038,7 @@
             <w:r>
               <w:t xml:space="preserve">Oquab et al., </w:t>
             </w:r>
-            <w:hyperlink r:id="rId66">
+            <w:hyperlink r:id="rId67">
               <w:r>
                 <w:rPr>
                   <w:color w:val="2F5597"/>
@@ -9016,7 +9085,7 @@
         </w:rPr>
         <w:t xml:space="preserve">Data. </w:t>
       </w:r>
-      <w:hyperlink r:id="rId73">
+      <w:hyperlink r:id="rId74">
         <w:r>
           <w:rPr>
             <w:color w:val="2F5597"/>
@@ -9028,7 +9097,7 @@
       <w:r>
         <w:t xml:space="preserve"> contains 5,354 images in 15 categories, with defect-free training images and labelled normal and defective test images. </w:t>
       </w:r>
-      <w:hyperlink r:id="rId76">
+      <w:hyperlink r:id="rId77">
         <w:r>
           <w:rPr>
             <w:color w:val="2F5597"/>
@@ -9064,7 +9133,7 @@
       <w:r>
         <w:t xml:space="preserve"> from the </w:t>
       </w:r>
-      <w:hyperlink r:id="rId67">
+      <w:hyperlink r:id="rId68">
         <w:r>
           <w:rPr>
             <w:color w:val="2F5597"/>
@@ -9076,7 +9145,7 @@
       <w:r>
         <w:t xml:space="preserve">. The frozen route follows </w:t>
       </w:r>
-      <w:hyperlink r:id="rId69">
+      <w:hyperlink r:id="rId70">
         <w:r>
           <w:rPr>
             <w:color w:val="2F5597"/>
@@ -9088,7 +9157,7 @@
       <w:r>
         <w:t xml:space="preserve">: store normal patch features and score each test patch by its distance to the memory bank. For the MSc route, keep a frozen DINOv2 teacher and train LoRA or adapters in a student model with </w:t>
       </w:r>
-      <w:hyperlink r:id="rId71">
+      <w:hyperlink r:id="rId72">
         <w:r>
           <w:rPr>
             <w:color w:val="2F5597"/>
@@ -9115,7 +9184,7 @@
       <w:r>
         <w:t xml:space="preserve">Compare frozen AnomalyDINO with </w:t>
       </w:r>
-      <w:hyperlink r:id="rId77">
+      <w:hyperlink r:id="rId78">
         <w:r>
           <w:rPr>
             <w:color w:val="2F5597"/>
@@ -9279,7 +9348,7 @@
       <w:r>
         <w:t xml:space="preserve">General unrolling: Gregor and LeCun, </w:t>
       </w:r>
-      <w:hyperlink r:id="rId78">
+      <w:hyperlink r:id="rId79">
         <w:r>
           <w:rPr>
             <w:color w:val="2F5597"/>
@@ -9291,7 +9360,7 @@
       <w:r>
         <w:t xml:space="preserve">, ICML 2010; Monga, Li and Eldar, </w:t>
       </w:r>
-      <w:hyperlink r:id="rId79">
+      <w:hyperlink r:id="rId80">
         <w:r>
           <w:rPr>
             <w:color w:val="2F5597"/>
@@ -9303,7 +9372,7 @@
       <w:r>
         <w:t xml:space="preserve">, IEEE SPM 2021; and Yang et al., </w:t>
       </w:r>
-      <w:hyperlink r:id="rId80">
+      <w:hyperlink r:id="rId81">
         <w:r>
           <w:rPr>
             <w:color w:val="2F5597"/>
@@ -9324,7 +9393,7 @@
       <w:r>
         <w:t xml:space="preserve">Signal decomposition: Dragomiretskiy and Zosso, </w:t>
       </w:r>
-      <w:hyperlink r:id="rId81">
+      <w:hyperlink r:id="rId82">
         <w:r>
           <w:rPr>
             <w:color w:val="2F5597"/>
@@ -9336,7 +9405,7 @@
       <w:r>
         <w:t xml:space="preserve">, with </w:t>
       </w:r>
-      <w:hyperlink r:id="rId82">
+      <w:hyperlink r:id="rId83">
         <w:r>
           <w:rPr>
             <w:color w:val="2F5597"/>
@@ -9348,7 +9417,7 @@
       <w:r>
         <w:t xml:space="preserve">, and Rehman and Aftab, </w:t>
       </w:r>
-      <w:hyperlink r:id="rId83">
+      <w:hyperlink r:id="rId84">
         <w:r>
           <w:rPr>
             <w:color w:val="2F5597"/>
@@ -9369,7 +9438,7 @@
       <w:r>
         <w:t xml:space="preserve">Ahmad et al., </w:t>
       </w:r>
-      <w:hyperlink r:id="rId84">
+      <w:hyperlink r:id="rId85">
         <w:r>
           <w:rPr>
             <w:color w:val="2F5597"/>
@@ -9381,7 +9450,7 @@
       <w:r>
         <w:t xml:space="preserve">, 2025 preprint, with the </w:t>
       </w:r>
-      <w:hyperlink r:id="rId85">
+      <w:hyperlink r:id="rId86">
         <w:r>
           <w:rPr>
             <w:color w:val="2F5597"/>
@@ -9628,7 +9697,7 @@
             <w:r>
               <w:t xml:space="preserve">Synthetic multichannel signals plus </w:t>
             </w:r>
-            <w:hyperlink r:id="rId86">
+            <w:hyperlink r:id="rId87">
               <w:r>
                 <w:rPr>
                   <w:color w:val="2F5597"/>
@@ -9691,7 +9760,7 @@
             <w:r>
               <w:t xml:space="preserve">Ahmad, Wesemann, Waschkowski &amp; Khalid, </w:t>
             </w:r>
-            <w:hyperlink r:id="rId84">
+            <w:hyperlink r:id="rId85">
               <w:r>
                 <w:rPr>
                   <w:color w:val="2F5597"/>
@@ -9765,7 +9834,7 @@
       <w:r>
         <w:t xml:space="preserve"> of </w:t>
       </w:r>
-      <w:hyperlink r:id="rId86">
+      <w:hyperlink r:id="rId87">
         <w:r>
           <w:rPr>
             <w:color w:val="2F5597"/>
@@ -9792,7 +9861,7 @@
       <w:r>
         <w:t xml:space="preserve">Validate classical MVMD using the </w:t>
       </w:r>
-      <w:hyperlink r:id="rId87">
+      <w:hyperlink r:id="rId88">
         <w:r>
           <w:rPr>
             <w:color w:val="2F5597"/>
@@ -9804,7 +9873,7 @@
       <w:r>
         <w:t xml:space="preserve"> and an </w:t>
       </w:r>
-      <w:hyperlink r:id="rId88">
+      <w:hyperlink r:id="rId89">
         <w:r>
           <w:rPr>
             <w:color w:val="2F5597"/>
@@ -9816,7 +9885,7 @@
       <w:r>
         <w:t xml:space="preserve">. Reimplement the UVMD equations from the </w:t>
       </w:r>
-      <w:hyperlink r:id="rId84">
+      <w:hyperlink r:id="rId85">
         <w:r>
           <w:rPr>
             <w:color w:val="2F5597"/>

</xml_diff>

<commit_message>
Add industrial collaboration project category
</commit_message>
<xml_diff>
--- a/downloads/student-project-portfolio.docx
+++ b/downloads/student-project-portfolio.docx
@@ -32,7 +32,7 @@
           <w:color w:val="000000"/>
           <w:sz w:val="32"/>
         </w:rPr>
-        <w:t>Graph applications, self-supervised time series, vision models and signal processing</w:t>
+        <w:t>Graph applications, self-supervised time series, vision models, signal processing and industrial collaboration</w:t>
       </w:r>
     </w:p>
     <w:p>
@@ -48,7 +48,7 @@
         <w:spacing w:before="0" w:after="80" w:line="254" w:lineRule="auto"/>
       </w:pPr>
       <w:r>
-        <w:t>The portfolio contains thirteen projects in four categories. Each entry states the task, data source and access conditions, starting papers and code, required baselines, evaluation protocol, Bachelor scope and possible Master contribution.</w:t>
+        <w:t>The portfolio contains fifteen projects in five categories. Each entry states the task, data source and access conditions, starting papers and code, required baselines, evaluation protocol, Bachelor scope and possible Master contribution.</w:t>
       </w:r>
     </w:p>
     <w:p>
@@ -1054,7 +1054,7 @@
               <w:spacing w:after="0" w:line="240" w:lineRule="auto"/>
             </w:pPr>
             <w:r>
-              <w:t>Tetra Pak industrial collaboration: Regime-aware self-supervised learning for non-stationary filtration cycles</w:t>
+              <w:t>Contrastive learning for wearable activity recognition</w:t>
             </w:r>
           </w:p>
         </w:tc>
@@ -1074,7 +1074,177 @@
               <w:spacing w:after="0" w:line="240" w:lineRule="auto"/>
             </w:pPr>
             <w:r>
-              <w:t>MSc only</w:t>
+              <w:t>BSc only</w:t>
+            </w:r>
+          </w:p>
+        </w:tc>
+        <w:tc>
+          <w:tcPr>
+            <w:tcW w:type="dxa" w:w="2438"/>
+            <w:shd w:fill="F4F6F8"/>
+            <w:tcMar>
+              <w:top w:w="70" w:type="dxa"/>
+              <w:start w:w="110" w:type="dxa"/>
+              <w:bottom w:w="70" w:type="dxa"/>
+              <w:end w:w="110" w:type="dxa"/>
+            </w:tcMar>
+          </w:tcPr>
+          <w:p>
+            <w:pPr>
+              <w:spacing w:after="0" w:line="240" w:lineRule="auto"/>
+            </w:pPr>
+            <w:r>
+              <w:t>Light</w:t>
+            </w:r>
+          </w:p>
+        </w:tc>
+      </w:tr>
+      <w:tr>
+        <w:trPr>
+          <w:cantSplit/>
+        </w:trPr>
+        <w:tc>
+          <w:tcPr>
+            <w:tcW w:type="dxa" w:w="2438"/>
+            <w:shd w:fill="FFFFFF"/>
+            <w:tcMar>
+              <w:top w:w="70" w:type="dxa"/>
+              <w:start w:w="110" w:type="dxa"/>
+              <w:bottom w:w="70" w:type="dxa"/>
+              <w:end w:w="110" w:type="dxa"/>
+            </w:tcMar>
+          </w:tcPr>
+          <w:p>
+            <w:pPr>
+              <w:spacing w:after="0" w:line="240" w:lineRule="auto"/>
+            </w:pPr>
+            <w:r>
+              <w:t>2.2</w:t>
+            </w:r>
+          </w:p>
+        </w:tc>
+        <w:tc>
+          <w:tcPr>
+            <w:tcW w:type="dxa" w:w="2438"/>
+            <w:shd w:fill="FFFFFF"/>
+            <w:tcMar>
+              <w:top w:w="70" w:type="dxa"/>
+              <w:start w:w="110" w:type="dxa"/>
+              <w:bottom w:w="70" w:type="dxa"/>
+              <w:end w:w="110" w:type="dxa"/>
+            </w:tcMar>
+          </w:tcPr>
+          <w:p>
+            <w:pPr>
+              <w:spacing w:after="0" w:line="240" w:lineRule="auto"/>
+            </w:pPr>
+            <w:r>
+              <w:t>Lead-aware masked learning for 12-lead ECG</w:t>
+            </w:r>
+          </w:p>
+        </w:tc>
+        <w:tc>
+          <w:tcPr>
+            <w:tcW w:type="dxa" w:w="2438"/>
+            <w:shd w:fill="FFFFFF"/>
+            <w:tcMar>
+              <w:top w:w="70" w:type="dxa"/>
+              <w:start w:w="110" w:type="dxa"/>
+              <w:bottom w:w="70" w:type="dxa"/>
+              <w:end w:w="110" w:type="dxa"/>
+            </w:tcMar>
+          </w:tcPr>
+          <w:p>
+            <w:pPr>
+              <w:spacing w:after="0" w:line="240" w:lineRule="auto"/>
+            </w:pPr>
+            <w:r>
+              <w:t>MSc preferred</w:t>
+            </w:r>
+          </w:p>
+        </w:tc>
+        <w:tc>
+          <w:tcPr>
+            <w:tcW w:type="dxa" w:w="2438"/>
+            <w:shd w:fill="FFFFFF"/>
+            <w:tcMar>
+              <w:top w:w="70" w:type="dxa"/>
+              <w:start w:w="110" w:type="dxa"/>
+              <w:bottom w:w="70" w:type="dxa"/>
+              <w:end w:w="110" w:type="dxa"/>
+            </w:tcMar>
+          </w:tcPr>
+          <w:p>
+            <w:pPr>
+              <w:spacing w:after="0" w:line="240" w:lineRule="auto"/>
+            </w:pPr>
+            <w:r>
+              <w:t>Moderate</w:t>
+            </w:r>
+          </w:p>
+        </w:tc>
+      </w:tr>
+      <w:tr>
+        <w:trPr>
+          <w:cantSplit/>
+        </w:trPr>
+        <w:tc>
+          <w:tcPr>
+            <w:tcW w:type="dxa" w:w="2438"/>
+            <w:shd w:fill="F4F6F8"/>
+            <w:tcMar>
+              <w:top w:w="70" w:type="dxa"/>
+              <w:start w:w="110" w:type="dxa"/>
+              <w:bottom w:w="70" w:type="dxa"/>
+              <w:end w:w="110" w:type="dxa"/>
+            </w:tcMar>
+          </w:tcPr>
+          <w:p>
+            <w:pPr>
+              <w:spacing w:after="0" w:line="240" w:lineRule="auto"/>
+            </w:pPr>
+            <w:r>
+              <w:t>2.3</w:t>
+            </w:r>
+          </w:p>
+        </w:tc>
+        <w:tc>
+          <w:tcPr>
+            <w:tcW w:type="dxa" w:w="2438"/>
+            <w:shd w:fill="F4F6F8"/>
+            <w:tcMar>
+              <w:top w:w="70" w:type="dxa"/>
+              <w:start w:w="110" w:type="dxa"/>
+              <w:bottom w:w="70" w:type="dxa"/>
+              <w:end w:w="110" w:type="dxa"/>
+            </w:tcMar>
+          </w:tcPr>
+          <w:p>
+            <w:pPr>
+              <w:spacing w:after="0" w:line="240" w:lineRule="auto"/>
+            </w:pPr>
+            <w:r>
+              <w:t>Self-supervised forecasting representations for energy series</w:t>
+            </w:r>
+          </w:p>
+        </w:tc>
+        <w:tc>
+          <w:tcPr>
+            <w:tcW w:type="dxa" w:w="2438"/>
+            <w:shd w:fill="F4F6F8"/>
+            <w:tcMar>
+              <w:top w:w="70" w:type="dxa"/>
+              <w:start w:w="110" w:type="dxa"/>
+              <w:bottom w:w="70" w:type="dxa"/>
+              <w:end w:w="110" w:type="dxa"/>
+            </w:tcMar>
+          </w:tcPr>
+          <w:p>
+            <w:pPr>
+              <w:spacing w:after="0" w:line="240" w:lineRule="auto"/>
+            </w:pPr>
+            <w:r>
+              <w:t>BSc or MSc</w:t>
             </w:r>
           </w:p>
         </w:tc>
@@ -1119,7 +1289,7 @@
               <w:spacing w:after="0" w:line="240" w:lineRule="auto"/>
             </w:pPr>
             <w:r>
-              <w:t>2.2</w:t>
+              <w:t>2.4</w:t>
             </w:r>
           </w:p>
         </w:tc>
@@ -1139,7 +1309,7 @@
               <w:spacing w:after="0" w:line="240" w:lineRule="auto"/>
             </w:pPr>
             <w:r>
-              <w:t>Contrastive learning for wearable activity recognition</w:t>
+              <w:t>Self-supervised learning on heat-pump smart-meter data</w:t>
             </w:r>
           </w:p>
         </w:tc>
@@ -1159,7 +1329,7 @@
               <w:spacing w:after="0" w:line="240" w:lineRule="auto"/>
             </w:pPr>
             <w:r>
-              <w:t>BSc only</w:t>
+              <w:t>MSc preferred</w:t>
             </w:r>
           </w:p>
         </w:tc>
@@ -1179,7 +1349,7 @@
               <w:spacing w:after="0" w:line="240" w:lineRule="auto"/>
             </w:pPr>
             <w:r>
-              <w:t>Light</w:t>
+              <w:t>Light to moderate after preprocessing</w:t>
             </w:r>
           </w:p>
         </w:tc>
@@ -1204,7 +1374,7 @@
               <w:spacing w:after="0" w:line="240" w:lineRule="auto"/>
             </w:pPr>
             <w:r>
-              <w:t>2.3</w:t>
+              <w:t>2.5</w:t>
             </w:r>
           </w:p>
         </w:tc>
@@ -1224,7 +1394,7 @@
               <w:spacing w:after="0" w:line="240" w:lineRule="auto"/>
             </w:pPr>
             <w:r>
-              <w:t>Lead-aware masked learning for 12-lead ECG</w:t>
+              <w:t>Graph self-supervised learning from vibration signals</w:t>
             </w:r>
           </w:p>
         </w:tc>
@@ -1244,7 +1414,7 @@
               <w:spacing w:after="0" w:line="240" w:lineRule="auto"/>
             </w:pPr>
             <w:r>
-              <w:t>MSc preferred</w:t>
+              <w:t>MSc only</w:t>
             </w:r>
           </w:p>
         </w:tc>
@@ -1264,7 +1434,7 @@
               <w:spacing w:after="0" w:line="240" w:lineRule="auto"/>
             </w:pPr>
             <w:r>
-              <w:t>Moderate</w:t>
+              <w:t>Moderate preprocessing</w:t>
             </w:r>
           </w:p>
         </w:tc>
@@ -1289,7 +1459,7 @@
               <w:spacing w:after="0" w:line="240" w:lineRule="auto"/>
             </w:pPr>
             <w:r>
-              <w:t>2.4</w:t>
+              <w:t>3.1</w:t>
             </w:r>
           </w:p>
         </w:tc>
@@ -1309,7 +1479,7 @@
               <w:spacing w:after="0" w:line="240" w:lineRule="auto"/>
             </w:pPr>
             <w:r>
-              <w:t>Self-supervised forecasting representations for energy series</w:t>
+              <w:t>Adapting DINO backbones for industrial anomaly detection</w:t>
             </w:r>
           </w:p>
         </w:tc>
@@ -1330,6 +1500,176 @@
             </w:pPr>
             <w:r>
               <w:t>BSc or MSc</w:t>
+            </w:r>
+          </w:p>
+        </w:tc>
+        <w:tc>
+          <w:tcPr>
+            <w:tcW w:type="dxa" w:w="2438"/>
+            <w:shd w:fill="FFFFFF"/>
+            <w:tcMar>
+              <w:top w:w="70" w:type="dxa"/>
+              <w:start w:w="110" w:type="dxa"/>
+              <w:bottom w:w="70" w:type="dxa"/>
+              <w:end w:w="110" w:type="dxa"/>
+            </w:tcMar>
+          </w:tcPr>
+          <w:p>
+            <w:pPr>
+              <w:spacing w:after="0" w:line="240" w:lineRule="auto"/>
+            </w:pPr>
+            <w:r>
+              <w:t>Light for frozen features</w:t>
+            </w:r>
+          </w:p>
+        </w:tc>
+      </w:tr>
+      <w:tr>
+        <w:trPr>
+          <w:cantSplit/>
+        </w:trPr>
+        <w:tc>
+          <w:tcPr>
+            <w:tcW w:type="dxa" w:w="2438"/>
+            <w:shd w:fill="F4F6F8"/>
+            <w:tcMar>
+              <w:top w:w="70" w:type="dxa"/>
+              <w:start w:w="110" w:type="dxa"/>
+              <w:bottom w:w="70" w:type="dxa"/>
+              <w:end w:w="110" w:type="dxa"/>
+            </w:tcMar>
+          </w:tcPr>
+          <w:p>
+            <w:pPr>
+              <w:spacing w:after="0" w:line="240" w:lineRule="auto"/>
+            </w:pPr>
+            <w:r>
+              <w:t>4.1</w:t>
+            </w:r>
+          </w:p>
+        </w:tc>
+        <w:tc>
+          <w:tcPr>
+            <w:tcW w:type="dxa" w:w="2438"/>
+            <w:shd w:fill="F4F6F8"/>
+            <w:tcMar>
+              <w:top w:w="70" w:type="dxa"/>
+              <w:start w:w="110" w:type="dxa"/>
+              <w:bottom w:w="70" w:type="dxa"/>
+              <w:end w:w="110" w:type="dxa"/>
+            </w:tcMar>
+          </w:tcPr>
+          <w:p>
+            <w:pPr>
+              <w:spacing w:after="0" w:line="240" w:lineRule="auto"/>
+            </w:pPr>
+            <w:r>
+              <w:t>Deep-unfolded multivariate VMD for correlated multichannel signals</w:t>
+            </w:r>
+          </w:p>
+        </w:tc>
+        <w:tc>
+          <w:tcPr>
+            <w:tcW w:type="dxa" w:w="2438"/>
+            <w:shd w:fill="F4F6F8"/>
+            <w:tcMar>
+              <w:top w:w="70" w:type="dxa"/>
+              <w:start w:w="110" w:type="dxa"/>
+              <w:bottom w:w="70" w:type="dxa"/>
+              <w:end w:w="110" w:type="dxa"/>
+            </w:tcMar>
+          </w:tcPr>
+          <w:p>
+            <w:pPr>
+              <w:spacing w:after="0" w:line="240" w:lineRule="auto"/>
+            </w:pPr>
+            <w:r>
+              <w:t>MSc only</w:t>
+            </w:r>
+          </w:p>
+        </w:tc>
+        <w:tc>
+          <w:tcPr>
+            <w:tcW w:type="dxa" w:w="2438"/>
+            <w:shd w:fill="F4F6F8"/>
+            <w:tcMar>
+              <w:top w:w="70" w:type="dxa"/>
+              <w:start w:w="110" w:type="dxa"/>
+              <w:bottom w:w="70" w:type="dxa"/>
+              <w:end w:w="110" w:type="dxa"/>
+            </w:tcMar>
+          </w:tcPr>
+          <w:p>
+            <w:pPr>
+              <w:spacing w:after="0" w:line="240" w:lineRule="auto"/>
+            </w:pPr>
+            <w:r>
+              <w:t>Light for synthetic tests</w:t>
+            </w:r>
+          </w:p>
+        </w:tc>
+      </w:tr>
+      <w:tr>
+        <w:trPr>
+          <w:cantSplit/>
+        </w:trPr>
+        <w:tc>
+          <w:tcPr>
+            <w:tcW w:type="dxa" w:w="2438"/>
+            <w:shd w:fill="FFFFFF"/>
+            <w:tcMar>
+              <w:top w:w="70" w:type="dxa"/>
+              <w:start w:w="110" w:type="dxa"/>
+              <w:bottom w:w="70" w:type="dxa"/>
+              <w:end w:w="110" w:type="dxa"/>
+            </w:tcMar>
+          </w:tcPr>
+          <w:p>
+            <w:pPr>
+              <w:spacing w:after="0" w:line="240" w:lineRule="auto"/>
+            </w:pPr>
+            <w:r>
+              <w:t>5.1</w:t>
+            </w:r>
+          </w:p>
+        </w:tc>
+        <w:tc>
+          <w:tcPr>
+            <w:tcW w:type="dxa" w:w="2438"/>
+            <w:shd w:fill="FFFFFF"/>
+            <w:tcMar>
+              <w:top w:w="70" w:type="dxa"/>
+              <w:start w:w="110" w:type="dxa"/>
+              <w:bottom w:w="70" w:type="dxa"/>
+              <w:end w:w="110" w:type="dxa"/>
+            </w:tcMar>
+          </w:tcPr>
+          <w:p>
+            <w:pPr>
+              <w:spacing w:after="0" w:line="240" w:lineRule="auto"/>
+            </w:pPr>
+            <w:r>
+              <w:t>Siemens Gamesa: Data-driven operational state identification for wind turbine condition monitoring</w:t>
+            </w:r>
+          </w:p>
+        </w:tc>
+        <w:tc>
+          <w:tcPr>
+            <w:tcW w:type="dxa" w:w="2438"/>
+            <w:shd w:fill="FFFFFF"/>
+            <w:tcMar>
+              <w:top w:w="70" w:type="dxa"/>
+              <w:start w:w="110" w:type="dxa"/>
+              <w:bottom w:w="70" w:type="dxa"/>
+              <w:end w:w="110" w:type="dxa"/>
+            </w:tcMar>
+          </w:tcPr>
+          <w:p>
+            <w:pPr>
+              <w:spacing w:after="0" w:line="240" w:lineRule="auto"/>
+            </w:pPr>
+            <w:r>
+              <w:t>MSc preferred</w:t>
             </w:r>
           </w:p>
         </w:tc>
@@ -1374,7 +1714,7 @@
               <w:spacing w:after="0" w:line="240" w:lineRule="auto"/>
             </w:pPr>
             <w:r>
-              <w:t>2.5</w:t>
+              <w:t>5.2</w:t>
             </w:r>
           </w:p>
         </w:tc>
@@ -1394,7 +1734,7 @@
               <w:spacing w:after="0" w:line="240" w:lineRule="auto"/>
             </w:pPr>
             <w:r>
-              <w:t>Self-supervised learning on heat-pump smart-meter data</w:t>
+              <w:t>Siemens Gamesa: Inferring drivetrain configuration and kinematics from vibration signals</w:t>
             </w:r>
           </w:p>
         </w:tc>
@@ -1434,7 +1774,7 @@
               <w:spacing w:after="0" w:line="240" w:lineRule="auto"/>
             </w:pPr>
             <w:r>
-              <w:t>Light to moderate after preprocessing</w:t>
+              <w:t>Light to moderate</w:t>
             </w:r>
           </w:p>
         </w:tc>
@@ -1459,7 +1799,7 @@
               <w:spacing w:after="0" w:line="240" w:lineRule="auto"/>
             </w:pPr>
             <w:r>
-              <w:t>2.6</w:t>
+              <w:t>5.3</w:t>
             </w:r>
           </w:p>
         </w:tc>
@@ -1479,7 +1819,7 @@
               <w:spacing w:after="0" w:line="240" w:lineRule="auto"/>
             </w:pPr>
             <w:r>
-              <w:t>Graph self-supervised learning from vibration signals</w:t>
+              <w:t>Tetra Pak: Regime-aware self-supervised learning for non-stationary filtration cycles</w:t>
             </w:r>
           </w:p>
         </w:tc>
@@ -1519,177 +1859,7 @@
               <w:spacing w:after="0" w:line="240" w:lineRule="auto"/>
             </w:pPr>
             <w:r>
-              <w:t>Moderate preprocessing</w:t>
-            </w:r>
-          </w:p>
-        </w:tc>
-      </w:tr>
-      <w:tr>
-        <w:trPr>
-          <w:cantSplit/>
-        </w:trPr>
-        <w:tc>
-          <w:tcPr>
-            <w:tcW w:type="dxa" w:w="2438"/>
-            <w:shd w:fill="F4F6F8"/>
-            <w:tcMar>
-              <w:top w:w="70" w:type="dxa"/>
-              <w:start w:w="110" w:type="dxa"/>
-              <w:bottom w:w="70" w:type="dxa"/>
-              <w:end w:w="110" w:type="dxa"/>
-            </w:tcMar>
-          </w:tcPr>
-          <w:p>
-            <w:pPr>
-              <w:spacing w:after="0" w:line="240" w:lineRule="auto"/>
-            </w:pPr>
-            <w:r>
-              <w:t>3.1</w:t>
-            </w:r>
-          </w:p>
-        </w:tc>
-        <w:tc>
-          <w:tcPr>
-            <w:tcW w:type="dxa" w:w="2438"/>
-            <w:shd w:fill="F4F6F8"/>
-            <w:tcMar>
-              <w:top w:w="70" w:type="dxa"/>
-              <w:start w:w="110" w:type="dxa"/>
-              <w:bottom w:w="70" w:type="dxa"/>
-              <w:end w:w="110" w:type="dxa"/>
-            </w:tcMar>
-          </w:tcPr>
-          <w:p>
-            <w:pPr>
-              <w:spacing w:after="0" w:line="240" w:lineRule="auto"/>
-            </w:pPr>
-            <w:r>
-              <w:t>Adapting DINO backbones for industrial anomaly detection</w:t>
-            </w:r>
-          </w:p>
-        </w:tc>
-        <w:tc>
-          <w:tcPr>
-            <w:tcW w:type="dxa" w:w="2438"/>
-            <w:shd w:fill="F4F6F8"/>
-            <w:tcMar>
-              <w:top w:w="70" w:type="dxa"/>
-              <w:start w:w="110" w:type="dxa"/>
-              <w:bottom w:w="70" w:type="dxa"/>
-              <w:end w:w="110" w:type="dxa"/>
-            </w:tcMar>
-          </w:tcPr>
-          <w:p>
-            <w:pPr>
-              <w:spacing w:after="0" w:line="240" w:lineRule="auto"/>
-            </w:pPr>
-            <w:r>
-              <w:t>BSc or MSc</w:t>
-            </w:r>
-          </w:p>
-        </w:tc>
-        <w:tc>
-          <w:tcPr>
-            <w:tcW w:type="dxa" w:w="2438"/>
-            <w:shd w:fill="F4F6F8"/>
-            <w:tcMar>
-              <w:top w:w="70" w:type="dxa"/>
-              <w:start w:w="110" w:type="dxa"/>
-              <w:bottom w:w="70" w:type="dxa"/>
-              <w:end w:w="110" w:type="dxa"/>
-            </w:tcMar>
-          </w:tcPr>
-          <w:p>
-            <w:pPr>
-              <w:spacing w:after="0" w:line="240" w:lineRule="auto"/>
-            </w:pPr>
-            <w:r>
-              <w:t>Light for frozen features</w:t>
-            </w:r>
-          </w:p>
-        </w:tc>
-      </w:tr>
-      <w:tr>
-        <w:trPr>
-          <w:cantSplit/>
-        </w:trPr>
-        <w:tc>
-          <w:tcPr>
-            <w:tcW w:type="dxa" w:w="2438"/>
-            <w:shd w:fill="FFFFFF"/>
-            <w:tcMar>
-              <w:top w:w="70" w:type="dxa"/>
-              <w:start w:w="110" w:type="dxa"/>
-              <w:bottom w:w="70" w:type="dxa"/>
-              <w:end w:w="110" w:type="dxa"/>
-            </w:tcMar>
-          </w:tcPr>
-          <w:p>
-            <w:pPr>
-              <w:spacing w:after="0" w:line="240" w:lineRule="auto"/>
-            </w:pPr>
-            <w:r>
-              <w:t>4.1</w:t>
-            </w:r>
-          </w:p>
-        </w:tc>
-        <w:tc>
-          <w:tcPr>
-            <w:tcW w:type="dxa" w:w="2438"/>
-            <w:shd w:fill="FFFFFF"/>
-            <w:tcMar>
-              <w:top w:w="70" w:type="dxa"/>
-              <w:start w:w="110" w:type="dxa"/>
-              <w:bottom w:w="70" w:type="dxa"/>
-              <w:end w:w="110" w:type="dxa"/>
-            </w:tcMar>
-          </w:tcPr>
-          <w:p>
-            <w:pPr>
-              <w:spacing w:after="0" w:line="240" w:lineRule="auto"/>
-            </w:pPr>
-            <w:r>
-              <w:t>Deep-unfolded multivariate VMD for correlated multichannel signals</w:t>
-            </w:r>
-          </w:p>
-        </w:tc>
-        <w:tc>
-          <w:tcPr>
-            <w:tcW w:type="dxa" w:w="2438"/>
-            <w:shd w:fill="FFFFFF"/>
-            <w:tcMar>
-              <w:top w:w="70" w:type="dxa"/>
-              <w:start w:w="110" w:type="dxa"/>
-              <w:bottom w:w="70" w:type="dxa"/>
-              <w:end w:w="110" w:type="dxa"/>
-            </w:tcMar>
-          </w:tcPr>
-          <w:p>
-            <w:pPr>
-              <w:spacing w:after="0" w:line="240" w:lineRule="auto"/>
-            </w:pPr>
-            <w:r>
-              <w:t>MSc only</w:t>
-            </w:r>
-          </w:p>
-        </w:tc>
-        <w:tc>
-          <w:tcPr>
-            <w:tcW w:type="dxa" w:w="2438"/>
-            <w:shd w:fill="FFFFFF"/>
-            <w:tcMar>
-              <w:top w:w="70" w:type="dxa"/>
-              <w:start w:w="110" w:type="dxa"/>
-              <w:bottom w:w="70" w:type="dxa"/>
-              <w:end w:w="110" w:type="dxa"/>
-            </w:tcMar>
-          </w:tcPr>
-          <w:p>
-            <w:pPr>
-              <w:spacing w:after="0" w:line="240" w:lineRule="auto"/>
-            </w:pPr>
-            <w:r>
-              <w:t>Light for synthetic tests</w:t>
+              <w:t>Light to moderate</w:t>
             </w:r>
           </w:p>
         </w:tc>
@@ -2744,6 +2914,71 @@
           </w:p>
         </w:tc>
       </w:tr>
+      <w:tr>
+        <w:trPr>
+          <w:cantSplit/>
+        </w:trPr>
+        <w:tc>
+          <w:tcPr>
+            <w:tcW w:type="dxa" w:w="3251"/>
+            <w:shd w:fill="FFFFFF"/>
+            <w:tcMar>
+              <w:top w:w="90" w:type="dxa"/>
+              <w:start w:w="110" w:type="dxa"/>
+              <w:bottom w:w="90" w:type="dxa"/>
+              <w:end w:w="110" w:type="dxa"/>
+            </w:tcMar>
+          </w:tcPr>
+          <w:p>
+            <w:pPr>
+              <w:spacing w:after="0"/>
+            </w:pPr>
+            <w:r>
+              <w:t>Siemens Gamesa fleet data</w:t>
+            </w:r>
+          </w:p>
+        </w:tc>
+        <w:tc>
+          <w:tcPr>
+            <w:tcW w:type="dxa" w:w="3251"/>
+            <w:shd w:fill="FFFFFF"/>
+            <w:tcMar>
+              <w:top w:w="90" w:type="dxa"/>
+              <w:start w:w="110" w:type="dxa"/>
+              <w:bottom w:w="90" w:type="dxa"/>
+              <w:end w:w="110" w:type="dxa"/>
+            </w:tcMar>
+          </w:tcPr>
+          <w:p>
+            <w:pPr>
+              <w:spacing w:after="0"/>
+            </w:pPr>
+            <w:r>
+              <w:t>Partner-supplied; subject to the project data agreement</w:t>
+            </w:r>
+          </w:p>
+        </w:tc>
+        <w:tc>
+          <w:tcPr>
+            <w:tcW w:type="dxa" w:w="3251"/>
+            <w:shd w:fill="FFFFFF"/>
+            <w:tcMar>
+              <w:top w:w="90" w:type="dxa"/>
+              <w:start w:w="110" w:type="dxa"/>
+              <w:bottom w:w="90" w:type="dxa"/>
+              <w:end w:w="110" w:type="dxa"/>
+            </w:tcMar>
+          </w:tcPr>
+          <w:p>
+            <w:pPr>
+              <w:spacing w:after="0"/>
+            </w:pPr>
+            <w:r>
+              <w:t>Restricted access; confirm scope and secure environment before allocation</w:t>
+            </w:r>
+          </w:p>
+        </w:tc>
+      </w:tr>
     </w:tbl>
     <w:p>
       <w:r>
@@ -5683,455 +5918,7 @@
         <w:spacing w:after="140"/>
       </w:pPr>
       <w:r>
-        <w:t>Project 2.1  Tetra Pak industrial collaboration: Regime-aware self-supervised learning for non-stationary filtration cycles</w:t>
-      </w:r>
-    </w:p>
-    <w:tbl>
-      <w:tblPr>
-        <w:tblW w:type="auto" w:w="0"/>
-        <w:jc w:val="center"/>
-        <w:tblLayout w:type="fixed"/>
-        <w:tblLook w:firstColumn="1" w:firstRow="1" w:lastColumn="0" w:lastRow="0" w:noHBand="0" w:noVBand="1" w:val="04A0"/>
-        <w:tblBorders>
-          <w:top w:val="single" w:sz="5" w:space="0" w:color="D9E0E6"/>
-          <w:left w:val="single" w:sz="5" w:space="0" w:color="D9E0E6"/>
-          <w:bottom w:val="single" w:sz="5" w:space="0" w:color="D9E0E6"/>
-          <w:right w:val="single" w:sz="5" w:space="0" w:color="D9E0E6"/>
-          <w:insideH w:val="single" w:sz="5" w:space="0" w:color="D9E0E6"/>
-          <w:insideV w:val="single" w:sz="5" w:space="0" w:color="D9E0E6"/>
-        </w:tblBorders>
-      </w:tblPr>
-      <w:tblGrid>
-        <w:gridCol w:w="1944"/>
-        <w:gridCol w:w="7704"/>
-      </w:tblGrid>
-      <w:tr>
-        <w:trPr>
-          <w:cantSplit/>
-        </w:trPr>
-        <w:tc>
-          <w:tcPr>
-            <w:tcW w:type="dxa" w:w="1944"/>
-            <w:shd w:fill="EAF2F8"/>
-            <w:tcMar>
-              <w:top w:w="90" w:type="dxa"/>
-              <w:start w:w="110" w:type="dxa"/>
-              <w:bottom w:w="90" w:type="dxa"/>
-              <w:end w:w="110" w:type="dxa"/>
-            </w:tcMar>
-            <w:vAlign w:val="center"/>
-          </w:tcPr>
-          <w:p>
-            <w:pPr>
-              <w:spacing w:after="0"/>
-            </w:pPr>
-            <w:r>
-              <w:rPr>
-                <w:b/>
-                <w:color w:val="17365D"/>
-              </w:rPr>
-              <w:t>Task</w:t>
-            </w:r>
-          </w:p>
-        </w:tc>
-        <w:tc>
-          <w:tcPr>
-            <w:tcW w:type="dxa" w:w="7704"/>
-            <w:shd w:fill="FFFFFF"/>
-            <w:tcMar>
-              <w:top w:w="90" w:type="dxa"/>
-              <w:start w:w="110" w:type="dxa"/>
-              <w:bottom w:w="90" w:type="dxa"/>
-              <w:end w:w="110" w:type="dxa"/>
-            </w:tcMar>
-            <w:vAlign w:val="center"/>
-          </w:tcPr>
-          <w:p>
-            <w:pPr>
-              <w:spacing w:after="0"/>
-            </w:pPr>
-            <w:r>
-              <w:t>Self-supervised multivariate time-series learning, then cycle-level regression or anomaly detection</w:t>
-            </w:r>
-          </w:p>
-        </w:tc>
-      </w:tr>
-      <w:tr>
-        <w:trPr>
-          <w:cantSplit/>
-        </w:trPr>
-        <w:tc>
-          <w:tcPr>
-            <w:tcW w:type="dxa" w:w="1944"/>
-            <w:shd w:fill="EAF2F8"/>
-            <w:tcMar>
-              <w:top w:w="90" w:type="dxa"/>
-              <w:start w:w="110" w:type="dxa"/>
-              <w:bottom w:w="90" w:type="dxa"/>
-              <w:end w:w="110" w:type="dxa"/>
-            </w:tcMar>
-            <w:vAlign w:val="center"/>
-          </w:tcPr>
-          <w:p>
-            <w:pPr>
-              <w:spacing w:after="0"/>
-            </w:pPr>
-            <w:r>
-              <w:rPr>
-                <w:b/>
-                <w:color w:val="17365D"/>
-              </w:rPr>
-              <w:t>Recommended level</w:t>
-            </w:r>
-          </w:p>
-        </w:tc>
-        <w:tc>
-          <w:tcPr>
-            <w:tcW w:type="dxa" w:w="7704"/>
-            <w:shd w:fill="F4F6F8"/>
-            <w:tcMar>
-              <w:top w:w="90" w:type="dxa"/>
-              <w:start w:w="110" w:type="dxa"/>
-              <w:bottom w:w="90" w:type="dxa"/>
-              <w:end w:w="110" w:type="dxa"/>
-            </w:tcMar>
-            <w:vAlign w:val="center"/>
-          </w:tcPr>
-          <w:p>
-            <w:pPr>
-              <w:spacing w:after="0"/>
-            </w:pPr>
-            <w:r>
-              <w:t>MSc only</w:t>
-            </w:r>
-          </w:p>
-        </w:tc>
-      </w:tr>
-      <w:tr>
-        <w:trPr>
-          <w:cantSplit/>
-        </w:trPr>
-        <w:tc>
-          <w:tcPr>
-            <w:tcW w:type="dxa" w:w="1944"/>
-            <w:shd w:fill="EAF2F8"/>
-            <w:tcMar>
-              <w:top w:w="90" w:type="dxa"/>
-              <w:start w:w="110" w:type="dxa"/>
-              <w:bottom w:w="90" w:type="dxa"/>
-              <w:end w:w="110" w:type="dxa"/>
-            </w:tcMar>
-            <w:vAlign w:val="center"/>
-          </w:tcPr>
-          <w:p>
-            <w:pPr>
-              <w:spacing w:after="0"/>
-            </w:pPr>
-            <w:r>
-              <w:rPr>
-                <w:b/>
-                <w:color w:val="17365D"/>
-              </w:rPr>
-              <w:t>Compute</w:t>
-            </w:r>
-          </w:p>
-        </w:tc>
-        <w:tc>
-          <w:tcPr>
-            <w:tcW w:type="dxa" w:w="7704"/>
-            <w:shd w:fill="FFFFFF"/>
-            <w:tcMar>
-              <w:top w:w="90" w:type="dxa"/>
-              <w:start w:w="110" w:type="dxa"/>
-              <w:bottom w:w="90" w:type="dxa"/>
-              <w:end w:w="110" w:type="dxa"/>
-            </w:tcMar>
-            <w:vAlign w:val="center"/>
-          </w:tcPr>
-          <w:p>
-            <w:pPr>
-              <w:spacing w:after="0"/>
-            </w:pPr>
-            <w:r>
-              <w:t>Light to moderate; compact models on a 4–8 GB GPU</w:t>
-            </w:r>
-          </w:p>
-        </w:tc>
-      </w:tr>
-      <w:tr>
-        <w:trPr>
-          <w:cantSplit/>
-        </w:trPr>
-        <w:tc>
-          <w:tcPr>
-            <w:tcW w:type="dxa" w:w="1944"/>
-            <w:shd w:fill="EAF2F8"/>
-            <w:tcMar>
-              <w:top w:w="90" w:type="dxa"/>
-              <w:start w:w="110" w:type="dxa"/>
-              <w:bottom w:w="90" w:type="dxa"/>
-              <w:end w:w="110" w:type="dxa"/>
-            </w:tcMar>
-            <w:vAlign w:val="center"/>
-          </w:tcPr>
-          <w:p>
-            <w:pPr>
-              <w:spacing w:after="0"/>
-            </w:pPr>
-            <w:r>
-              <w:rPr>
-                <w:b/>
-                <w:color w:val="17365D"/>
-              </w:rPr>
-              <w:t>Data</w:t>
-            </w:r>
-          </w:p>
-        </w:tc>
-        <w:tc>
-          <w:tcPr>
-            <w:tcW w:type="dxa" w:w="7704"/>
-            <w:shd w:fill="F4F6F8"/>
-            <w:tcMar>
-              <w:top w:w="90" w:type="dxa"/>
-              <w:start w:w="110" w:type="dxa"/>
-              <w:bottom w:w="90" w:type="dxa"/>
-              <w:end w:w="110" w:type="dxa"/>
-            </w:tcMar>
-            <w:vAlign w:val="center"/>
-          </w:tcPr>
-          <w:p>
-            <w:pPr>
-              <w:spacing w:after="0"/>
-            </w:pPr>
-            <w:r>
-              <w:t>Partner-supplied by Tetra Pak under an approved agreement; not public</w:t>
-            </w:r>
-          </w:p>
-        </w:tc>
-      </w:tr>
-      <w:tr>
-        <w:trPr>
-          <w:cantSplit/>
-        </w:trPr>
-        <w:tc>
-          <w:tcPr>
-            <w:tcW w:type="dxa" w:w="1944"/>
-            <w:shd w:fill="EAF2F8"/>
-            <w:tcMar>
-              <w:top w:w="90" w:type="dxa"/>
-              <w:start w:w="110" w:type="dxa"/>
-              <w:bottom w:w="90" w:type="dxa"/>
-              <w:end w:w="110" w:type="dxa"/>
-            </w:tcMar>
-            <w:vAlign w:val="center"/>
-          </w:tcPr>
-          <w:p>
-            <w:pPr>
-              <w:spacing w:after="0"/>
-            </w:pPr>
-            <w:r>
-              <w:rPr>
-                <w:b/>
-                <w:color w:val="17365D"/>
-              </w:rPr>
-              <w:t>Starting paper</w:t>
-            </w:r>
-          </w:p>
-        </w:tc>
-        <w:tc>
-          <w:tcPr>
-            <w:tcW w:type="dxa" w:w="7704"/>
-            <w:shd w:fill="FFFFFF"/>
-            <w:tcMar>
-              <w:top w:w="90" w:type="dxa"/>
-              <w:start w:w="110" w:type="dxa"/>
-              <w:bottom w:w="90" w:type="dxa"/>
-              <w:end w:w="110" w:type="dxa"/>
-            </w:tcMar>
-            <w:vAlign w:val="center"/>
-          </w:tcPr>
-          <w:p>
-            <w:pPr>
-              <w:spacing w:after="0"/>
-            </w:pPr>
-            <w:r>
-              <w:t xml:space="preserve">Yue et al., </w:t>
-            </w:r>
-            <w:hyperlink r:id="rId48">
-              <w:r>
-                <w:rPr>
-                  <w:color w:val="2F5597"/>
-                  <w:u w:val="single"/>
-                </w:rPr>
-                <w:t>TS2Vec</w:t>
-              </w:r>
-            </w:hyperlink>
-            <w:r>
-              <w:t>, AAAI 2022</w:t>
-            </w:r>
-          </w:p>
-        </w:tc>
-      </w:tr>
-    </w:tbl>
-    <w:p>
-      <w:pPr>
-        <w:spacing w:after="0"/>
-      </w:pPr>
-    </w:p>
-    <w:p>
-      <w:pPr>
-        <w:spacing w:before="80" w:after="100" w:line="254" w:lineRule="auto"/>
-      </w:pPr>
-      <w:r>
-        <w:rPr>
-          <w:b/>
-          <w:color w:val="25313C"/>
-        </w:rPr>
-        <w:t xml:space="preserve">What you will do. </w:t>
-      </w:r>
-      <w:r>
-        <w:t>Membrane-filtration plants generate repeated production and cleaning cycles containing flow, pressure, temperature and energy measurements. Cycle-to-cycle differences are large. You will learn representations that account for the plant's operating regimes, then test whether they predict an operational target better than representations that ignore regime.</w:t>
-      </w:r>
-    </w:p>
-    <w:p>
-      <w:pPr>
-        <w:spacing w:before="0" w:after="100" w:line="254" w:lineRule="auto"/>
-      </w:pPr>
-      <w:r>
-        <w:rPr>
-          <w:b/>
-          <w:color w:val="25313C"/>
-        </w:rPr>
-        <w:t xml:space="preserve">Data. </w:t>
-      </w:r>
-      <w:r>
-        <w:t>Tetra Pak will provide anonymised process data or a secure environment; the data are not public. Required fields include cycle boundaries, flow, pressure, temperature, power or energy, setpoints and operating-regime information. Data volume, sampling rate and the downstream target must be confirmed before allocation. Split by complete cycle and preserve time order.</w:t>
-      </w:r>
-    </w:p>
-    <w:p>
-      <w:pPr>
-        <w:spacing w:before="0" w:after="100" w:line="254" w:lineRule="auto"/>
-      </w:pPr>
-      <w:r>
-        <w:rPr>
-          <w:b/>
-          <w:color w:val="25313C"/>
-        </w:rPr>
-        <w:t xml:space="preserve">Methods and code. </w:t>
-      </w:r>
-      <w:r>
-        <w:t xml:space="preserve">Use </w:t>
-      </w:r>
-      <w:hyperlink r:id="rId40">
-        <w:r>
-          <w:rPr>
-            <w:color w:val="2F5597"/>
-            <w:u w:val="single"/>
-          </w:rPr>
-          <w:t>TS2Vec</w:t>
-        </w:r>
-      </w:hyperlink>
-      <w:r>
-        <w:t xml:space="preserve">, </w:t>
-      </w:r>
-      <w:hyperlink r:id="rId39">
-        <w:r>
-          <w:rPr>
-            <w:color w:val="2F5597"/>
-            <w:u w:val="single"/>
-          </w:rPr>
-          <w:t>TS-TCC</w:t>
-        </w:r>
-      </w:hyperlink>
-      <w:r>
-        <w:t xml:space="preserve"> or </w:t>
-      </w:r>
-      <w:hyperlink r:id="rId42">
-        <w:r>
-          <w:rPr>
-            <w:color w:val="2F5597"/>
-            <w:u w:val="single"/>
-          </w:rPr>
-          <w:t>SimMTM</w:t>
-        </w:r>
-      </w:hyperlink>
-      <w:r>
-        <w:t xml:space="preserve"> with a compact 1-D CNN, TCN or GRU. Use change-point detection and clustering to identify regimes before pretraining.</w:t>
-      </w:r>
-    </w:p>
-    <w:p>
-      <w:pPr>
-        <w:spacing w:before="0" w:after="100" w:line="254" w:lineRule="auto"/>
-      </w:pPr>
-      <w:r>
-        <w:rPr>
-          <w:b/>
-          <w:color w:val="25313C"/>
-        </w:rPr>
-        <w:t xml:space="preserve">Baselines and evaluation. </w:t>
-      </w:r>
-      <w:r>
-        <w:t>Compare a statistical baseline, supervised TCN/GRU, generic SSL and a regime-aware encoder. Include random-frozen and frozen-probe controls. Use MAE for early prediction of final specific energy, or AUPRC for an agreed anomaly label. Report label-efficiency results and three seeds when the number of independent cycles permits.</w:t>
-      </w:r>
-    </w:p>
-    <w:p>
-      <w:pPr>
-        <w:spacing w:before="0" w:after="100" w:line="254" w:lineRule="auto"/>
-      </w:pPr>
-      <w:r>
-        <w:rPr>
-          <w:b/>
-          <w:color w:val="25313C"/>
-        </w:rPr>
-        <w:t xml:space="preserve">Practical notes. </w:t>
-      </w:r>
-      <w:r>
-        <w:t>Confirm the independent-cycle count and one measurable target before allocation. Data and trained artefacts remain subject to the AU–Tetra Pak agreement.</w:t>
-      </w:r>
-    </w:p>
-    <w:p>
-      <w:pPr>
-        <w:pStyle w:val="Heading3"/>
-      </w:pPr>
-      <w:r>
-        <w:t>Master scope</w:t>
-      </w:r>
-    </w:p>
-    <w:p>
-      <w:pPr>
-        <w:spacing w:before="0" w:after="100" w:line="254" w:lineRule="auto"/>
-      </w:pPr>
-      <w:r>
-        <w:rPr>
-          <w:b/>
-        </w:rPr>
-        <w:t>Master research question.</w:t>
-      </w:r>
-      <w:r>
-        <w:t xml:space="preserve"> </w:t>
-      </w:r>
-      <w:r>
-        <w:rPr>
-          <w:b/>
-        </w:rPr>
-        <w:t>Can cycle-phase- and operating-regime-aware self-supervised views separate legitimate process variation from energy inefficiency or abnormal behaviour better than generic augmentations?</w:t>
-      </w:r>
-      <w:r>
-        <w:t xml:space="preserve"> The contribution is the process-aware view or masking design plus a matched-budget comparison against generic augmentation, including transfer to a held-out regime, line or product. Rerunning an unchanged TS2Vec or TS-TCC is a reproduction, not the contribution.</w:t>
-      </w:r>
-    </w:p>
-    <w:p>
-      <w:r>
-        <w:br w:type="page"/>
-      </w:r>
-    </w:p>
-    <w:p>
-      <w:pPr>
-        <w:pStyle w:val="Heading2"/>
-        <w:spacing w:after="140"/>
-      </w:pPr>
-      <w:r>
-        <w:t>Project 2.2  Contrastive learning for wearable activity recognition</w:t>
+        <w:t>Project 2.1  Contrastive learning for wearable activity recognition</w:t>
       </w:r>
     </w:p>
     <w:tbl>
@@ -6351,7 +6138,7 @@
             <w:pPr>
               <w:spacing w:after="0"/>
             </w:pPr>
-            <w:hyperlink r:id="rId49">
+            <w:hyperlink r:id="rId48">
               <w:r>
                 <w:rPr>
                   <w:color w:val="2F5597"/>
@@ -6414,7 +6201,7 @@
             <w:r>
               <w:t xml:space="preserve">Eldele et al., </w:t>
             </w:r>
-            <w:hyperlink r:id="rId50">
+            <w:hyperlink r:id="rId49">
               <w:r>
                 <w:rPr>
                   <w:color w:val="2F5597"/>
@@ -6572,7 +6359,7 @@
         <w:spacing w:after="140"/>
       </w:pPr>
       <w:r>
-        <w:t>Project 2.3  Lead-aware masked learning for 12-lead ECG</w:t>
+        <w:t>Project 2.2  Lead-aware masked learning for 12-lead ECG</w:t>
       </w:r>
     </w:p>
     <w:tbl>
@@ -6792,7 +6579,7 @@
             <w:pPr>
               <w:spacing w:after="0"/>
             </w:pPr>
-            <w:hyperlink r:id="rId51">
+            <w:hyperlink r:id="rId50">
               <w:r>
                 <w:rPr>
                   <w:color w:val="2F5597"/>
@@ -6855,7 +6642,7 @@
             <w:r>
               <w:t xml:space="preserve">Dong et al., </w:t>
             </w:r>
-            <w:hyperlink r:id="rId52">
+            <w:hyperlink r:id="rId51">
               <w:r>
                 <w:rPr>
                   <w:color w:val="2F5597"/>
@@ -6944,7 +6731,7 @@
       <w:r>
         <w:t xml:space="preserve"> and a 1-D ResNet or compact Transformer. The </w:t>
       </w:r>
-      <w:hyperlink r:id="rId53">
+      <w:hyperlink r:id="rId52">
         <w:r>
           <w:rPr>
             <w:color w:val="2F5597"/>
@@ -7045,7 +6832,7 @@
         <w:spacing w:after="140"/>
       </w:pPr>
       <w:r>
-        <w:t>Project 2.4  Self-supervised forecasting representations for energy series</w:t>
+        <w:t>Project 2.3  Self-supervised forecasting representations for energy series</w:t>
       </w:r>
     </w:p>
     <w:tbl>
@@ -7265,7 +7052,7 @@
             <w:pPr>
               <w:spacing w:after="0"/>
             </w:pPr>
-            <w:hyperlink r:id="rId54">
+            <w:hyperlink r:id="rId53">
               <w:r>
                 <w:rPr>
                   <w:color w:val="2F5597"/>
@@ -7328,7 +7115,7 @@
             <w:r>
               <w:t xml:space="preserve">Woo et al., </w:t>
             </w:r>
-            <w:hyperlink r:id="rId55">
+            <w:hyperlink r:id="rId54">
               <w:r>
                 <w:rPr>
                   <w:color w:val="2F5597"/>
@@ -7390,7 +7177,7 @@
         </w:rPr>
         <w:t xml:space="preserve">Methods and code. </w:t>
       </w:r>
-      <w:hyperlink r:id="rId56">
+      <w:hyperlink r:id="rId55">
         <w:r>
           <w:rPr>
             <w:color w:val="2F5597"/>
@@ -7426,7 +7213,7 @@
       <w:r>
         <w:t xml:space="preserve"> for pretraining. </w:t>
       </w:r>
-      <w:hyperlink r:id="rId57">
+      <w:hyperlink r:id="rId56">
         <w:r>
           <w:rPr>
             <w:color w:val="2F5597"/>
@@ -7438,7 +7225,7 @@
       <w:r>
         <w:t xml:space="preserve"> is the required supervised reference; </w:t>
       </w:r>
-      <w:hyperlink r:id="rId58">
+      <w:hyperlink r:id="rId57">
         <w:r>
           <w:rPr>
             <w:color w:val="2F5597"/>
@@ -7558,7 +7345,7 @@
         <w:spacing w:after="140"/>
       </w:pPr>
       <w:r>
-        <w:t>Project 2.5  Self-supervised learning on heat-pump smart-meter data</w:t>
+        <w:t>Project 2.4  Self-supervised learning on heat-pump smart-meter data</w:t>
       </w:r>
     </w:p>
     <w:tbl>
@@ -7778,7 +7565,7 @@
             <w:pPr>
               <w:spacing w:after="0"/>
             </w:pPr>
-            <w:hyperlink r:id="rId59">
+            <w:hyperlink r:id="rId58">
               <w:r>
                 <w:rPr>
                   <w:color w:val="2F5597"/>
@@ -7841,7 +7628,7 @@
             <w:r>
               <w:t xml:space="preserve">Brudermueller et al., </w:t>
             </w:r>
-            <w:hyperlink r:id="rId60">
+            <w:hyperlink r:id="rId59">
               <w:r>
                 <w:rPr>
                   <w:color w:val="2F5597"/>
@@ -7891,7 +7678,7 @@
       <w:r>
         <w:t xml:space="preserve">The 458 MB public download contains 1,408 households; 214 have both smart-meter data and inspection information. Use the </w:t>
       </w:r>
-      <w:hyperlink r:id="rId61">
+      <w:hyperlink r:id="rId60">
         <w:r>
           <w:rPr>
             <w:color w:val="2F5597"/>
@@ -8036,7 +7823,7 @@
         <w:spacing w:after="140"/>
       </w:pPr>
       <w:r>
-        <w:t>Project 2.6  Graph self-supervised learning from vibration signals</w:t>
+        <w:t>Project 2.5  Graph self-supervised learning from vibration signals</w:t>
       </w:r>
     </w:p>
     <w:tbl>
@@ -8256,7 +8043,7 @@
             <w:pPr>
               <w:spacing w:after="0"/>
             </w:pPr>
-            <w:hyperlink r:id="rId62">
+            <w:hyperlink r:id="rId61">
               <w:r>
                 <w:rPr>
                   <w:color w:val="2F5597"/>
@@ -8319,7 +8106,7 @@
             <w:r>
               <w:t xml:space="preserve">Hou et al., </w:t>
             </w:r>
-            <w:hyperlink r:id="rId63">
+            <w:hyperlink r:id="rId62">
               <w:r>
                 <w:rPr>
                   <w:color w:val="2F5597"/>
@@ -8331,7 +8118,7 @@
             <w:r>
               <w:t xml:space="preserve">, KDD 2022 — </w:t>
             </w:r>
-            <w:hyperlink r:id="rId64">
+            <w:hyperlink r:id="rId63">
               <w:r>
                 <w:rPr>
                   <w:color w:val="2F5597"/>
@@ -8393,7 +8180,7 @@
       <w:r>
         <w:t xml:space="preserve">Paderborn provides 64 kHz vibration, speed, torque and radial load for 32 physical bearings under four operating conditions. Download it from the </w:t>
       </w:r>
-      <w:hyperlink r:id="rId65">
+      <w:hyperlink r:id="rId64">
         <w:r>
           <w:rPr>
             <w:color w:val="2F5597"/>
@@ -8420,7 +8207,7 @@
       <w:r>
         <w:t xml:space="preserve">Use a GIN encoder with </w:t>
       </w:r>
-      <w:hyperlink r:id="rId64">
+      <w:hyperlink r:id="rId63">
         <w:r>
           <w:rPr>
             <w:color w:val="2F5597"/>
@@ -8563,7 +8350,7 @@
       <w:r>
         <w:t xml:space="preserve">Core reading: </w:t>
       </w:r>
-      <w:hyperlink r:id="rId66">
+      <w:hyperlink r:id="rId65">
         <w:r>
           <w:rPr>
             <w:color w:val="2F5597"/>
@@ -8575,7 +8362,7 @@
       <w:r>
         <w:t xml:space="preserve">, </w:t>
       </w:r>
-      <w:hyperlink r:id="rId67">
+      <w:hyperlink r:id="rId66">
         <w:r>
           <w:rPr>
             <w:color w:val="2F5597"/>
@@ -8587,7 +8374,7 @@
       <w:r>
         <w:t xml:space="preserve">, the </w:t>
       </w:r>
-      <w:hyperlink r:id="rId68">
+      <w:hyperlink r:id="rId67">
         <w:r>
           <w:rPr>
             <w:color w:val="2F5597"/>
@@ -8599,7 +8386,7 @@
       <w:r>
         <w:t xml:space="preserve">, and </w:t>
       </w:r>
-      <w:hyperlink r:id="rId69">
+      <w:hyperlink r:id="rId68">
         <w:r>
           <w:rPr>
             <w:color w:val="2F5597"/>
@@ -8611,7 +8398,7 @@
       <w:r>
         <w:t xml:space="preserve"> with its </w:t>
       </w:r>
-      <w:hyperlink r:id="rId70">
+      <w:hyperlink r:id="rId69">
         <w:r>
           <w:rPr>
             <w:color w:val="2F5597"/>
@@ -8632,7 +8419,7 @@
       <w:r>
         <w:t xml:space="preserve">Parameter-efficient adaptation: </w:t>
       </w:r>
-      <w:hyperlink r:id="rId71">
+      <w:hyperlink r:id="rId70">
         <w:r>
           <w:rPr>
             <w:color w:val="2F5597"/>
@@ -8644,7 +8431,7 @@
       <w:r>
         <w:t xml:space="preserve"> and the </w:t>
       </w:r>
-      <w:hyperlink r:id="rId72">
+      <w:hyperlink r:id="rId71">
         <w:r>
           <w:rPr>
             <w:color w:val="2F5597"/>
@@ -8665,7 +8452,7 @@
       <w:r>
         <w:t xml:space="preserve">Normal-only objectives: </w:t>
       </w:r>
-      <w:hyperlink r:id="rId66">
+      <w:hyperlink r:id="rId65">
         <w:r>
           <w:rPr>
             <w:color w:val="2F5597"/>
@@ -8677,7 +8464,7 @@
       <w:r>
         <w:t xml:space="preserve"> and </w:t>
       </w:r>
-      <w:hyperlink r:id="rId73">
+      <w:hyperlink r:id="rId72">
         <w:r>
           <w:rPr>
             <w:color w:val="2F5597"/>
@@ -8698,7 +8485,7 @@
       <w:r>
         <w:t xml:space="preserve">Data and model hubs: </w:t>
       </w:r>
-      <w:hyperlink r:id="rId74">
+      <w:hyperlink r:id="rId73">
         <w:r>
           <w:rPr>
             <w:color w:val="2F5597"/>
@@ -8710,7 +8497,7 @@
       <w:r>
         <w:t xml:space="preserve">, </w:t>
       </w:r>
-      <w:hyperlink r:id="rId75">
+      <w:hyperlink r:id="rId74">
         <w:r>
           <w:rPr>
             <w:color w:val="2F5597"/>
@@ -8722,7 +8509,7 @@
       <w:r>
         <w:t xml:space="preserve"> and </w:t>
       </w:r>
-      <w:hyperlink r:id="rId76">
+      <w:hyperlink r:id="rId75">
         <w:r>
           <w:rPr>
             <w:color w:val="2F5597"/>
@@ -8975,7 +8762,7 @@
             <w:pPr>
               <w:spacing w:after="0"/>
             </w:pPr>
-            <w:hyperlink r:id="rId74">
+            <w:hyperlink r:id="rId73">
               <w:r>
                 <w:rPr>
                   <w:color w:val="2F5597"/>
@@ -9038,7 +8825,7 @@
             <w:r>
               <w:t xml:space="preserve">Oquab et al., </w:t>
             </w:r>
-            <w:hyperlink r:id="rId67">
+            <w:hyperlink r:id="rId66">
               <w:r>
                 <w:rPr>
                   <w:color w:val="2F5597"/>
@@ -9085,7 +8872,7 @@
         </w:rPr>
         <w:t xml:space="preserve">Data. </w:t>
       </w:r>
-      <w:hyperlink r:id="rId74">
+      <w:hyperlink r:id="rId73">
         <w:r>
           <w:rPr>
             <w:color w:val="2F5597"/>
@@ -9097,7 +8884,7 @@
       <w:r>
         <w:t xml:space="preserve"> contains 5,354 images in 15 categories, with defect-free training images and labelled normal and defective test images. </w:t>
       </w:r>
-      <w:hyperlink r:id="rId77">
+      <w:hyperlink r:id="rId76">
         <w:r>
           <w:rPr>
             <w:color w:val="2F5597"/>
@@ -9133,7 +8920,7 @@
       <w:r>
         <w:t xml:space="preserve"> from the </w:t>
       </w:r>
-      <w:hyperlink r:id="rId68">
+      <w:hyperlink r:id="rId67">
         <w:r>
           <w:rPr>
             <w:color w:val="2F5597"/>
@@ -9145,7 +8932,7 @@
       <w:r>
         <w:t xml:space="preserve">. The frozen route follows </w:t>
       </w:r>
-      <w:hyperlink r:id="rId70">
+      <w:hyperlink r:id="rId69">
         <w:r>
           <w:rPr>
             <w:color w:val="2F5597"/>
@@ -9157,7 +8944,7 @@
       <w:r>
         <w:t xml:space="preserve">: store normal patch features and score each test patch by its distance to the memory bank. For the MSc route, keep a frozen DINOv2 teacher and train LoRA or adapters in a student model with </w:t>
       </w:r>
-      <w:hyperlink r:id="rId72">
+      <w:hyperlink r:id="rId71">
         <w:r>
           <w:rPr>
             <w:color w:val="2F5597"/>
@@ -9184,7 +8971,7 @@
       <w:r>
         <w:t xml:space="preserve">Compare frozen AnomalyDINO with </w:t>
       </w:r>
-      <w:hyperlink r:id="rId78">
+      <w:hyperlink r:id="rId77">
         <w:r>
           <w:rPr>
             <w:color w:val="2F5597"/>
@@ -9348,7 +9135,7 @@
       <w:r>
         <w:t xml:space="preserve">General unrolling: Gregor and LeCun, </w:t>
       </w:r>
-      <w:hyperlink r:id="rId79">
+      <w:hyperlink r:id="rId78">
         <w:r>
           <w:rPr>
             <w:color w:val="2F5597"/>
@@ -9360,7 +9147,7 @@
       <w:r>
         <w:t xml:space="preserve">, ICML 2010; Monga, Li and Eldar, </w:t>
       </w:r>
-      <w:hyperlink r:id="rId80">
+      <w:hyperlink r:id="rId79">
         <w:r>
           <w:rPr>
             <w:color w:val="2F5597"/>
@@ -9372,7 +9159,7 @@
       <w:r>
         <w:t xml:space="preserve">, IEEE SPM 2021; and Yang et al., </w:t>
       </w:r>
-      <w:hyperlink r:id="rId81">
+      <w:hyperlink r:id="rId80">
         <w:r>
           <w:rPr>
             <w:color w:val="2F5597"/>
@@ -9393,7 +9180,7 @@
       <w:r>
         <w:t xml:space="preserve">Signal decomposition: Dragomiretskiy and Zosso, </w:t>
       </w:r>
-      <w:hyperlink r:id="rId82">
+      <w:hyperlink r:id="rId81">
         <w:r>
           <w:rPr>
             <w:color w:val="2F5597"/>
@@ -9405,7 +9192,7 @@
       <w:r>
         <w:t xml:space="preserve">, with </w:t>
       </w:r>
-      <w:hyperlink r:id="rId83">
+      <w:hyperlink r:id="rId82">
         <w:r>
           <w:rPr>
             <w:color w:val="2F5597"/>
@@ -9417,7 +9204,7 @@
       <w:r>
         <w:t xml:space="preserve">, and Rehman and Aftab, </w:t>
       </w:r>
-      <w:hyperlink r:id="rId84">
+      <w:hyperlink r:id="rId83">
         <w:r>
           <w:rPr>
             <w:color w:val="2F5597"/>
@@ -9438,7 +9225,7 @@
       <w:r>
         <w:t xml:space="preserve">Ahmad et al., </w:t>
       </w:r>
-      <w:hyperlink r:id="rId85">
+      <w:hyperlink r:id="rId84">
         <w:r>
           <w:rPr>
             <w:color w:val="2F5597"/>
@@ -9450,7 +9237,7 @@
       <w:r>
         <w:t xml:space="preserve">, 2025 preprint, with the </w:t>
       </w:r>
-      <w:hyperlink r:id="rId86">
+      <w:hyperlink r:id="rId85">
         <w:r>
           <w:rPr>
             <w:color w:val="2F5597"/>
@@ -9697,7 +9484,7 @@
             <w:r>
               <w:t xml:space="preserve">Synthetic multichannel signals plus </w:t>
             </w:r>
-            <w:hyperlink r:id="rId87">
+            <w:hyperlink r:id="rId86">
               <w:r>
                 <w:rPr>
                   <w:color w:val="2F5597"/>
@@ -9760,7 +9547,7 @@
             <w:r>
               <w:t xml:space="preserve">Ahmad, Wesemann, Waschkowski &amp; Khalid, </w:t>
             </w:r>
-            <w:hyperlink r:id="rId85">
+            <w:hyperlink r:id="rId84">
               <w:r>
                 <w:rPr>
                   <w:color w:val="2F5597"/>
@@ -9834,7 +9621,7 @@
       <w:r>
         <w:t xml:space="preserve"> of </w:t>
       </w:r>
-      <w:hyperlink r:id="rId87">
+      <w:hyperlink r:id="rId86">
         <w:r>
           <w:rPr>
             <w:color w:val="2F5597"/>
@@ -9861,7 +9648,7 @@
       <w:r>
         <w:t xml:space="preserve">Validate classical MVMD using the </w:t>
       </w:r>
-      <w:hyperlink r:id="rId88">
+      <w:hyperlink r:id="rId87">
         <w:r>
           <w:rPr>
             <w:color w:val="2F5597"/>
@@ -9873,7 +9660,7 @@
       <w:r>
         <w:t xml:space="preserve"> and an </w:t>
       </w:r>
-      <w:hyperlink r:id="rId89">
+      <w:hyperlink r:id="rId88">
         <w:r>
           <w:rPr>
             <w:color w:val="2F5597"/>
@@ -9885,7 +9672,7 @@
       <w:r>
         <w:t xml:space="preserve">. Reimplement the UVMD equations from the </w:t>
       </w:r>
-      <w:hyperlink r:id="rId85">
+      <w:hyperlink r:id="rId84">
         <w:r>
           <w:rPr>
             <w:color w:val="2F5597"/>
@@ -9974,15 +9761,15 @@
         <w:pStyle w:val="Heading1"/>
       </w:pPr>
       <w:r>
-        <w:t>Selection guidance</w:t>
+        <w:t>Category 5  Industrial collaboration projects</w:t>
       </w:r>
     </w:p>
     <w:p>
       <w:pPr>
-        <w:pStyle w:val="Heading2"/>
-      </w:pPr>
-      <w:r>
-        <w:t>Levels</w:t>
+        <w:spacing w:before="0" w:after="100" w:line="254" w:lineRule="auto"/>
+      </w:pPr>
+      <w:r>
+        <w:t>These projects address operational questions defined with Siemens Gamesa and Tetra Pak. The companies supply the data, so the projects begin with a data profile and a precise definition of the available signals, independent units, labels and permitted outputs. Data, trained artefacts and reported results remain subject to the applicable project agreement.</w:t>
       </w:r>
     </w:p>
     <w:p>
@@ -9990,34 +9777,1672 @@
         <w:spacing w:before="0" w:after="100" w:line="254" w:lineRule="auto"/>
       </w:pPr>
       <w:r>
-        <w:t xml:space="preserve">Eight projects are available at Bachelor level: </w:t>
-      </w:r>
+        <w:t>The current descriptions state the research direction without assuming that every suggested variable or label is available. The final task, split and primary metric are fixed with the partner after access is confirmed. This first phase is part of the project, not a preliminary result.</w:t>
+      </w:r>
+    </w:p>
+    <w:p>
+      <w:pPr>
+        <w:pStyle w:val="Heading3"/>
+      </w:pPr>
+      <w:r>
+        <w:t>Master level preferred</w:t>
+      </w:r>
+    </w:p>
+    <w:p>
+      <w:pPr>
+        <w:spacing w:before="0" w:after="80" w:line="254" w:lineRule="auto"/>
+      </w:pPr>
+      <w:r>
+        <w:t>All three projects are intended primarily for Master students. Projects 5.1 and 5.2 can be reduced to Bachelor level only when a prepared analysis table and a fixed target are supplied. Project 5.3 remains Master-only because cycle non-stationarity is central to the research question.</w:t>
+      </w:r>
+    </w:p>
+    <w:p>
+      <w:pPr>
+        <w:pStyle w:val="Heading3"/>
+      </w:pPr>
+      <w:r>
+        <w:t>Split by physical unit</w:t>
+      </w:r>
+    </w:p>
+    <w:p>
+      <w:pPr>
+        <w:spacing w:before="0" w:after="80" w:line="254" w:lineRule="auto"/>
+      </w:pPr>
+      <w:r>
+        <w:t>Windows from one turbine, machine, filtration cycle or production unit must not cross training and test sets. A held-out site, line or turbine type is an additional transfer test only when the available sample count supports it.</w:t>
+      </w:r>
+    </w:p>
+    <w:p>
+      <w:pPr>
+        <w:pStyle w:val="Heading2"/>
+      </w:pPr>
+      <w:r>
+        <w:t>Before allocation</w:t>
+      </w:r>
+    </w:p>
+    <w:p>
+      <w:pPr>
+        <w:spacing w:before="0" w:after="100" w:line="254" w:lineRule="auto"/>
+      </w:pPr>
+      <w:r>
+        <w:t>Confirm the data agreement, available variables, sampling and synchronization, number of independent units, label source, downstream target and what may appear in the thesis. If the available data cannot support the proposed comparison, narrow or reformulate the task before allocation.</w:t>
+      </w:r>
+    </w:p>
+    <w:p>
+      <w:pPr>
+        <w:pStyle w:val="Heading2"/>
+      </w:pPr>
+      <w:r>
+        <w:t>Learn first and find ideas</w:t>
+      </w:r>
+    </w:p>
+    <w:p>
+      <w:pPr>
+        <w:pStyle w:val="ListBullet"/>
+        <w:spacing w:before="0" w:after="40" w:line="254" w:lineRule="auto"/>
+      </w:pPr>
+      <w:r>
+        <w:t xml:space="preserve">Operational-state discovery: </w:t>
+      </w:r>
+      <w:hyperlink r:id="rId89">
+        <w:r>
+          <w:rPr>
+            <w:color w:val="2F5597"/>
+            <w:u w:val="single"/>
+          </w:rPr>
+          <w:t>TS2Vec</w:t>
+        </w:r>
+      </w:hyperlink>
+      <w:r>
+        <w:t xml:space="preserve">, clustering with </w:t>
+      </w:r>
+      <w:hyperlink r:id="rId90">
+        <w:r>
+          <w:rPr>
+            <w:color w:val="2F5597"/>
+            <w:u w:val="single"/>
+          </w:rPr>
+          <w:t>scikit-learn</w:t>
+        </w:r>
+      </w:hyperlink>
+      <w:r>
+        <w:t xml:space="preserve">, and the </w:t>
+      </w:r>
+      <w:hyperlink r:id="rId91">
+        <w:r>
+          <w:rPr>
+            <w:color w:val="2F5597"/>
+            <w:u w:val="single"/>
+          </w:rPr>
+          <w:t>UMAP documentation</w:t>
+        </w:r>
+      </w:hyperlink>
+      <w:r>
+        <w:t xml:space="preserve"> for visualisation.</w:t>
+      </w:r>
+    </w:p>
+    <w:p>
+      <w:pPr>
+        <w:pStyle w:val="ListBullet"/>
+        <w:spacing w:before="0" w:after="40" w:line="254" w:lineRule="auto"/>
+      </w:pPr>
+      <w:r>
+        <w:t xml:space="preserve">Time-series classification: </w:t>
+      </w:r>
+      <w:hyperlink r:id="rId92">
+        <w:r>
+          <w:rPr>
+            <w:color w:val="2F5597"/>
+            <w:u w:val="single"/>
+          </w:rPr>
+          <w:t>MiniRocket</w:t>
+        </w:r>
+      </w:hyperlink>
+      <w:r>
+        <w:t xml:space="preserve">, </w:t>
+      </w:r>
+      <w:hyperlink r:id="rId93">
+        <w:r>
+          <w:rPr>
+            <w:color w:val="2F5597"/>
+            <w:u w:val="single"/>
+          </w:rPr>
+          <w:t>InceptionTime</w:t>
+        </w:r>
+      </w:hyperlink>
+      <w:r>
+        <w:t xml:space="preserve"> and the </w:t>
+      </w:r>
+      <w:hyperlink r:id="rId94">
+        <w:r>
+          <w:rPr>
+            <w:color w:val="2F5597"/>
+            <w:u w:val="single"/>
+          </w:rPr>
+          <w:t>sktime toolkit</w:t>
+        </w:r>
+      </w:hyperlink>
+      <w:r>
+        <w:t>.</w:t>
+      </w:r>
+    </w:p>
+    <w:p>
+      <w:pPr>
+        <w:pStyle w:val="ListBullet"/>
+        <w:spacing w:before="0" w:after="40" w:line="254" w:lineRule="auto"/>
+      </w:pPr>
+      <w:r>
+        <w:t xml:space="preserve">Representation learning and non-stationarity: </w:t>
+      </w:r>
+      <w:hyperlink r:id="rId40">
+        <w:r>
+          <w:rPr>
+            <w:color w:val="2F5597"/>
+            <w:u w:val="single"/>
+          </w:rPr>
+          <w:t>TS2Vec</w:t>
+        </w:r>
+      </w:hyperlink>
+      <w:r>
+        <w:t xml:space="preserve">, </w:t>
+      </w:r>
+      <w:hyperlink r:id="rId39">
+        <w:r>
+          <w:rPr>
+            <w:color w:val="2F5597"/>
+            <w:u w:val="single"/>
+          </w:rPr>
+          <w:t>TS-TCC</w:t>
+        </w:r>
+      </w:hyperlink>
+      <w:r>
+        <w:t xml:space="preserve"> and </w:t>
+      </w:r>
+      <w:hyperlink r:id="rId42">
+        <w:r>
+          <w:rPr>
+            <w:color w:val="2F5597"/>
+            <w:u w:val="single"/>
+          </w:rPr>
+          <w:t>SimMTM</w:t>
+        </w:r>
+      </w:hyperlink>
+      <w:r>
+        <w:t>.</w:t>
+      </w:r>
+    </w:p>
+    <w:p>
+      <w:r>
+        <w:br w:type="page"/>
+      </w:r>
+    </w:p>
+    <w:p>
+      <w:pPr>
+        <w:pStyle w:val="Heading2"/>
+        <w:spacing w:after="140"/>
+      </w:pPr>
+      <w:r>
+        <w:t>Project 5.1  Siemens Gamesa: Data-driven operational state identification for wind turbine condition monitoring</w:t>
+      </w:r>
+    </w:p>
+    <w:tbl>
+      <w:tblPr>
+        <w:tblW w:type="auto" w:w="0"/>
+        <w:jc w:val="center"/>
+        <w:tblLayout w:type="fixed"/>
+        <w:tblLook w:firstColumn="1" w:firstRow="1" w:lastColumn="0" w:lastRow="0" w:noHBand="0" w:noVBand="1" w:val="04A0"/>
+        <w:tblBorders>
+          <w:top w:val="single" w:sz="5" w:space="0" w:color="D9E0E6"/>
+          <w:left w:val="single" w:sz="5" w:space="0" w:color="D9E0E6"/>
+          <w:bottom w:val="single" w:sz="5" w:space="0" w:color="D9E0E6"/>
+          <w:right w:val="single" w:sz="5" w:space="0" w:color="D9E0E6"/>
+          <w:insideH w:val="single" w:sz="5" w:space="0" w:color="D9E0E6"/>
+          <w:insideV w:val="single" w:sz="5" w:space="0" w:color="D9E0E6"/>
+        </w:tblBorders>
+      </w:tblPr>
+      <w:tblGrid>
+        <w:gridCol w:w="1944"/>
+        <w:gridCol w:w="7704"/>
+      </w:tblGrid>
+      <w:tr>
+        <w:trPr>
+          <w:cantSplit/>
+        </w:trPr>
+        <w:tc>
+          <w:tcPr>
+            <w:tcW w:type="dxa" w:w="1944"/>
+            <w:shd w:fill="EAF2F8"/>
+            <w:tcMar>
+              <w:top w:w="90" w:type="dxa"/>
+              <w:start w:w="110" w:type="dxa"/>
+              <w:bottom w:w="90" w:type="dxa"/>
+              <w:end w:w="110" w:type="dxa"/>
+            </w:tcMar>
+            <w:vAlign w:val="center"/>
+          </w:tcPr>
+          <w:p>
+            <w:pPr>
+              <w:spacing w:after="0"/>
+            </w:pPr>
+            <w:r>
+              <w:rPr>
+                <w:b/>
+                <w:color w:val="17365D"/>
+              </w:rPr>
+              <w:t>Task</w:t>
+            </w:r>
+          </w:p>
+        </w:tc>
+        <w:tc>
+          <w:tcPr>
+            <w:tcW w:type="dxa" w:w="7704"/>
+            <w:shd w:fill="FFFFFF"/>
+            <w:tcMar>
+              <w:top w:w="90" w:type="dxa"/>
+              <w:start w:w="110" w:type="dxa"/>
+              <w:bottom w:w="90" w:type="dxa"/>
+              <w:end w:w="110" w:type="dxa"/>
+            </w:tcMar>
+            <w:vAlign w:val="center"/>
+          </w:tcPr>
+          <w:p>
+            <w:pPr>
+              <w:spacing w:after="0"/>
+            </w:pPr>
+            <w:r>
+              <w:t>Unsupervised operating-state discovery followed by condition-monitoring evaluation</w:t>
+            </w:r>
+          </w:p>
+        </w:tc>
+      </w:tr>
+      <w:tr>
+        <w:trPr>
+          <w:cantSplit/>
+        </w:trPr>
+        <w:tc>
+          <w:tcPr>
+            <w:tcW w:type="dxa" w:w="1944"/>
+            <w:shd w:fill="EAF2F8"/>
+            <w:tcMar>
+              <w:top w:w="90" w:type="dxa"/>
+              <w:start w:w="110" w:type="dxa"/>
+              <w:bottom w:w="90" w:type="dxa"/>
+              <w:end w:w="110" w:type="dxa"/>
+            </w:tcMar>
+            <w:vAlign w:val="center"/>
+          </w:tcPr>
+          <w:p>
+            <w:pPr>
+              <w:spacing w:after="0"/>
+            </w:pPr>
+            <w:r>
+              <w:rPr>
+                <w:b/>
+                <w:color w:val="17365D"/>
+              </w:rPr>
+              <w:t>Recommended level</w:t>
+            </w:r>
+          </w:p>
+        </w:tc>
+        <w:tc>
+          <w:tcPr>
+            <w:tcW w:type="dxa" w:w="7704"/>
+            <w:shd w:fill="F4F6F8"/>
+            <w:tcMar>
+              <w:top w:w="90" w:type="dxa"/>
+              <w:start w:w="110" w:type="dxa"/>
+              <w:bottom w:w="90" w:type="dxa"/>
+              <w:end w:w="110" w:type="dxa"/>
+            </w:tcMar>
+            <w:vAlign w:val="center"/>
+          </w:tcPr>
+          <w:p>
+            <w:pPr>
+              <w:spacing w:after="0"/>
+            </w:pPr>
+            <w:r>
+              <w:t>MSc preferred; reduced BSc version possible</w:t>
+            </w:r>
+          </w:p>
+        </w:tc>
+      </w:tr>
+      <w:tr>
+        <w:trPr>
+          <w:cantSplit/>
+        </w:trPr>
+        <w:tc>
+          <w:tcPr>
+            <w:tcW w:type="dxa" w:w="1944"/>
+            <w:shd w:fill="EAF2F8"/>
+            <w:tcMar>
+              <w:top w:w="90" w:type="dxa"/>
+              <w:start w:w="110" w:type="dxa"/>
+              <w:bottom w:w="90" w:type="dxa"/>
+              <w:end w:w="110" w:type="dxa"/>
+            </w:tcMar>
+            <w:vAlign w:val="center"/>
+          </w:tcPr>
+          <w:p>
+            <w:pPr>
+              <w:spacing w:after="0"/>
+            </w:pPr>
+            <w:r>
+              <w:rPr>
+                <w:b/>
+                <w:color w:val="17365D"/>
+              </w:rPr>
+              <w:t>Compute</w:t>
+            </w:r>
+          </w:p>
+        </w:tc>
+        <w:tc>
+          <w:tcPr>
+            <w:tcW w:type="dxa" w:w="7704"/>
+            <w:shd w:fill="FFFFFF"/>
+            <w:tcMar>
+              <w:top w:w="90" w:type="dxa"/>
+              <w:start w:w="110" w:type="dxa"/>
+              <w:bottom w:w="90" w:type="dxa"/>
+              <w:end w:w="110" w:type="dxa"/>
+            </w:tcMar>
+            <w:vAlign w:val="center"/>
+          </w:tcPr>
+          <w:p>
+            <w:pPr>
+              <w:spacing w:after="0"/>
+            </w:pPr>
+            <w:r>
+              <w:t>Light to moderate; compact models on a 4–8 GB GPU</w:t>
+            </w:r>
+          </w:p>
+        </w:tc>
+      </w:tr>
+      <w:tr>
+        <w:trPr>
+          <w:cantSplit/>
+        </w:trPr>
+        <w:tc>
+          <w:tcPr>
+            <w:tcW w:type="dxa" w:w="1944"/>
+            <w:shd w:fill="EAF2F8"/>
+            <w:tcMar>
+              <w:top w:w="90" w:type="dxa"/>
+              <w:start w:w="110" w:type="dxa"/>
+              <w:bottom w:w="90" w:type="dxa"/>
+              <w:end w:w="110" w:type="dxa"/>
+            </w:tcMar>
+            <w:vAlign w:val="center"/>
+          </w:tcPr>
+          <w:p>
+            <w:pPr>
+              <w:spacing w:after="0"/>
+            </w:pPr>
+            <w:r>
+              <w:rPr>
+                <w:b/>
+                <w:color w:val="17365D"/>
+              </w:rPr>
+              <w:t>Data</w:t>
+            </w:r>
+          </w:p>
+        </w:tc>
+        <w:tc>
+          <w:tcPr>
+            <w:tcW w:type="dxa" w:w="7704"/>
+            <w:shd w:fill="F4F6F8"/>
+            <w:tcMar>
+              <w:top w:w="90" w:type="dxa"/>
+              <w:start w:w="110" w:type="dxa"/>
+              <w:bottom w:w="90" w:type="dxa"/>
+              <w:end w:w="110" w:type="dxa"/>
+            </w:tcMar>
+            <w:vAlign w:val="center"/>
+          </w:tcPr>
+          <w:p>
+            <w:pPr>
+              <w:spacing w:after="0"/>
+            </w:pPr>
+            <w:r>
+              <w:t>Partner-supplied Siemens Gamesa vibration and operational data; not public</w:t>
+            </w:r>
+          </w:p>
+        </w:tc>
+      </w:tr>
+      <w:tr>
+        <w:trPr>
+          <w:cantSplit/>
+        </w:trPr>
+        <w:tc>
+          <w:tcPr>
+            <w:tcW w:type="dxa" w:w="1944"/>
+            <w:shd w:fill="EAF2F8"/>
+            <w:tcMar>
+              <w:top w:w="90" w:type="dxa"/>
+              <w:start w:w="110" w:type="dxa"/>
+              <w:bottom w:w="90" w:type="dxa"/>
+              <w:end w:w="110" w:type="dxa"/>
+            </w:tcMar>
+            <w:vAlign w:val="center"/>
+          </w:tcPr>
+          <w:p>
+            <w:pPr>
+              <w:spacing w:after="0"/>
+            </w:pPr>
+            <w:r>
+              <w:rPr>
+                <w:b/>
+                <w:color w:val="17365D"/>
+              </w:rPr>
+              <w:t>Starting paper</w:t>
+            </w:r>
+          </w:p>
+        </w:tc>
+        <w:tc>
+          <w:tcPr>
+            <w:tcW w:type="dxa" w:w="7704"/>
+            <w:shd w:fill="FFFFFF"/>
+            <w:tcMar>
+              <w:top w:w="90" w:type="dxa"/>
+              <w:start w:w="110" w:type="dxa"/>
+              <w:bottom w:w="90" w:type="dxa"/>
+              <w:end w:w="110" w:type="dxa"/>
+            </w:tcMar>
+            <w:vAlign w:val="center"/>
+          </w:tcPr>
+          <w:p>
+            <w:pPr>
+              <w:spacing w:after="0"/>
+            </w:pPr>
+            <w:r>
+              <w:t xml:space="preserve">Yue et al., </w:t>
+            </w:r>
+            <w:hyperlink r:id="rId89">
+              <w:r>
+                <w:rPr>
+                  <w:color w:val="2F5597"/>
+                  <w:u w:val="single"/>
+                </w:rPr>
+                <w:t>TS2Vec</w:t>
+              </w:r>
+            </w:hyperlink>
+            <w:r>
+              <w:t>, AAAI 2022</w:t>
+            </w:r>
+          </w:p>
+        </w:tc>
+      </w:tr>
+    </w:tbl>
+    <w:p>
+      <w:pPr>
+        <w:spacing w:after="0"/>
+      </w:pPr>
+    </w:p>
+    <w:p>
+      <w:pPr>
+        <w:spacing w:before="80" w:after="100" w:line="254" w:lineRule="auto"/>
+      </w:pPr>
+      <w:r>
+        <w:rPr>
+          <w:b/>
+          <w:color w:val="25313C"/>
+        </w:rPr>
+        <w:t xml:space="preserve">What you will do. </w:t>
+      </w:r>
+      <w:r>
+        <w:t>Wind-turbine monitoring systems often group vibration measurements by power output. However, turbines producing the same power can show different vibration behaviour. You will test whether operating states learned from vibration and operational measurements describe the turbine more consistently than power bins.</w:t>
+      </w:r>
+    </w:p>
+    <w:p>
+      <w:pPr>
+        <w:spacing w:before="0" w:after="100" w:line="254" w:lineRule="auto"/>
+      </w:pPr>
+      <w:r>
+        <w:rPr>
+          <w:b/>
+          <w:color w:val="25313C"/>
+        </w:rPr>
+        <w:t xml:space="preserve">Project goal. </w:t>
+      </w:r>
+      <w:r>
+        <w:t>Discover recurring operating states and determine whether using those states improves a downstream condition-monitoring model. The project should answer whether the learned states contain useful information beyond turbine power.</w:t>
+      </w:r>
+    </w:p>
+    <w:p>
+      <w:pPr>
+        <w:spacing w:before="0" w:after="100" w:line="254" w:lineRule="auto"/>
+      </w:pPr>
+      <w:r>
+        <w:rPr>
+          <w:b/>
+          <w:color w:val="25313C"/>
+        </w:rPr>
+        <w:t xml:space="preserve">Data. </w:t>
+      </w:r>
+      <w:r>
+        <w:t>Siemens Gamesa will provide anonymised turbine data under an agreed access arrangement. The data may include vibration features or spectra together with variables such as power, rotor or generator speed, pitch angle, torque, wind conditions and controller information. The exact channels, number of turbines, time period and sampling format must be confirmed before allocation.</w:t>
+      </w:r>
+    </w:p>
+    <w:p>
+      <w:pPr>
+        <w:spacing w:before="0" w:after="100" w:line="254" w:lineRule="auto"/>
+      </w:pPr>
+      <w:r>
+        <w:rPr>
+          <w:b/>
+          <w:color w:val="25313C"/>
+        </w:rPr>
+        <w:t xml:space="preserve">Methods and code. </w:t>
+      </w:r>
+      <w:r>
+        <w:t xml:space="preserve">Start with power binning, PCA and one clustering method such as k-means or a Gaussian mixture. Then test one representation-learning approach, such as </w:t>
+      </w:r>
+      <w:hyperlink r:id="rId40">
+        <w:r>
+          <w:rPr>
+            <w:color w:val="2F5597"/>
+            <w:u w:val="single"/>
+          </w:rPr>
+          <w:t>TS2Vec</w:t>
+        </w:r>
+      </w:hyperlink>
+      <w:r>
+        <w:t>, followed by clustering. Use UMAP only for visualisation, not as evidence that the states are valid.</w:t>
+      </w:r>
+    </w:p>
+    <w:p>
+      <w:pPr>
+        <w:spacing w:before="0" w:after="100" w:line="254" w:lineRule="auto"/>
+      </w:pPr>
+      <w:r>
+        <w:rPr>
+          <w:b/>
+          <w:color w:val="25313C"/>
+        </w:rPr>
+        <w:t xml:space="preserve">Baselines and evaluation. </w:t>
+      </w:r>
+      <w:r>
+        <w:t>Compare power bins, clustering on standardised operational variables, and clustering on the learned representation. Evaluate whether states are stable across held-out turbines or time periods and whether they have a clear operational interpretation. The main downstream comparison uses the same condition-monitoring or anomaly model with power-bin conditioning and learned-state conditioning. Report residual variation and, if suitable event or alarm labels are available, detection performance and false-alarm rate.</w:t>
+      </w:r>
+    </w:p>
+    <w:p>
+      <w:pPr>
+        <w:spacing w:before="0" w:after="100" w:line="254" w:lineRule="auto"/>
+      </w:pPr>
+      <w:r>
+        <w:rPr>
+          <w:b/>
+          <w:color w:val="25313C"/>
+        </w:rPr>
+        <w:t xml:space="preserve">Practical notes. </w:t>
+      </w:r>
+      <w:r>
+        <w:t>Unsupervised clusters are not automatically physical operating states. Do not judge the result only by silhouette score or a two-dimensional plot. A useful state should be repeatable and should improve an agreed downstream measure.</w:t>
+      </w:r>
+    </w:p>
+    <w:p>
+      <w:pPr>
+        <w:pStyle w:val="Heading3"/>
+      </w:pPr>
+      <w:r>
+        <w:t>Bachelor scope</w:t>
+      </w:r>
+    </w:p>
+    <w:p>
+      <w:pPr>
+        <w:spacing w:before="0" w:after="100" w:line="254" w:lineRule="auto"/>
+      </w:pPr>
       <w:r>
         <w:rPr>
           <w:b/>
         </w:rPr>
-        <w:t>1.1</w:t>
-      </w:r>
-      <w:r>
-        <w:t xml:space="preserve"> (C-MAPSS), </w:t>
-      </w:r>
+        <w:t>Bachelor version.</w:t>
+      </w:r>
+      <w:r>
+        <w:t xml:space="preserve"> Using a prepared feature table, compare power binning with one clustering method. Describe the resulting states using the available operational variables and measure how much within-state vibration variation each grouping removes. Representation learning is not required.</w:t>
+      </w:r>
+    </w:p>
+    <w:p>
+      <w:pPr>
+        <w:pStyle w:val="Heading3"/>
+      </w:pPr>
+      <w:r>
+        <w:t>Master scope</w:t>
+      </w:r>
+    </w:p>
+    <w:p>
+      <w:pPr>
+        <w:spacing w:before="0" w:after="100" w:line="254" w:lineRule="auto"/>
+      </w:pPr>
       <w:r>
         <w:rPr>
           <w:b/>
         </w:rPr>
-        <w:t>1.2</w:t>
-      </w:r>
-      <w:r>
-        <w:t xml:space="preserve"> (METR-LA), </w:t>
+        <w:t>Master research question.</w:t>
+      </w:r>
+      <w:r>
+        <w:t xml:space="preserve"> </w:t>
       </w:r>
       <w:r>
         <w:rPr>
           <w:b/>
         </w:rPr>
-        <w:t>1.3</w:t>
-      </w:r>
-      <w:r>
-        <w:t xml:space="preserve"> (Elliptic), </w:t>
+        <w:t>Do data-driven operating states describe wind-turbine vibration more consistently than power bins, and do they improve downstream condition monitoring?</w:t>
+      </w:r>
+      <w:r>
+        <w:t xml:space="preserve"> The contribution is the state representation and a controlled comparison showing when it improves—or does not improve—the downstream model. Include stability analysis and one ablation of the input variables or representation method.</w:t>
+      </w:r>
+    </w:p>
+    <w:p>
+      <w:r>
+        <w:br w:type="page"/>
+      </w:r>
+    </w:p>
+    <w:p>
+      <w:pPr>
+        <w:pStyle w:val="Heading2"/>
+        <w:spacing w:after="140"/>
+      </w:pPr>
+      <w:r>
+        <w:t>Project 5.2  Siemens Gamesa: Inferring drivetrain configuration and kinematics from vibration signals</w:t>
+      </w:r>
+    </w:p>
+    <w:tbl>
+      <w:tblPr>
+        <w:tblW w:type="auto" w:w="0"/>
+        <w:jc w:val="center"/>
+        <w:tblLayout w:type="fixed"/>
+        <w:tblLook w:firstColumn="1" w:firstRow="1" w:lastColumn="0" w:lastRow="0" w:noHBand="0" w:noVBand="1" w:val="04A0"/>
+        <w:tblBorders>
+          <w:top w:val="single" w:sz="5" w:space="0" w:color="D9E0E6"/>
+          <w:left w:val="single" w:sz="5" w:space="0" w:color="D9E0E6"/>
+          <w:bottom w:val="single" w:sz="5" w:space="0" w:color="D9E0E6"/>
+          <w:right w:val="single" w:sz="5" w:space="0" w:color="D9E0E6"/>
+          <w:insideH w:val="single" w:sz="5" w:space="0" w:color="D9E0E6"/>
+          <w:insideV w:val="single" w:sz="5" w:space="0" w:color="D9E0E6"/>
+        </w:tblBorders>
+      </w:tblPr>
+      <w:tblGrid>
+        <w:gridCol w:w="1944"/>
+        <w:gridCol w:w="7704"/>
+      </w:tblGrid>
+      <w:tr>
+        <w:trPr>
+          <w:cantSplit/>
+        </w:trPr>
+        <w:tc>
+          <w:tcPr>
+            <w:tcW w:type="dxa" w:w="1944"/>
+            <w:shd w:fill="EAF2F8"/>
+            <w:tcMar>
+              <w:top w:w="90" w:type="dxa"/>
+              <w:start w:w="110" w:type="dxa"/>
+              <w:bottom w:w="90" w:type="dxa"/>
+              <w:end w:w="110" w:type="dxa"/>
+            </w:tcMar>
+            <w:vAlign w:val="center"/>
+          </w:tcPr>
+          <w:p>
+            <w:pPr>
+              <w:spacing w:after="0"/>
+            </w:pPr>
+            <w:r>
+              <w:rPr>
+                <w:b/>
+                <w:color w:val="17365D"/>
+              </w:rPr>
+              <w:t>Task</w:t>
+            </w:r>
+          </w:p>
+        </w:tc>
+        <w:tc>
+          <w:tcPr>
+            <w:tcW w:type="dxa" w:w="7704"/>
+            <w:shd w:fill="FFFFFF"/>
+            <w:tcMar>
+              <w:top w:w="90" w:type="dxa"/>
+              <w:start w:w="110" w:type="dxa"/>
+              <w:bottom w:w="90" w:type="dxa"/>
+              <w:end w:w="110" w:type="dxa"/>
+            </w:tcMar>
+            <w:vAlign w:val="center"/>
+          </w:tcPr>
+          <w:p>
+            <w:pPr>
+              <w:spacing w:after="0"/>
+            </w:pPr>
+            <w:r>
+              <w:t>Turbine-level classification of drivetrain configurations from vibration and operational measurements</w:t>
+            </w:r>
+          </w:p>
+        </w:tc>
+      </w:tr>
+      <w:tr>
+        <w:trPr>
+          <w:cantSplit/>
+        </w:trPr>
+        <w:tc>
+          <w:tcPr>
+            <w:tcW w:type="dxa" w:w="1944"/>
+            <w:shd w:fill="EAF2F8"/>
+            <w:tcMar>
+              <w:top w:w="90" w:type="dxa"/>
+              <w:start w:w="110" w:type="dxa"/>
+              <w:bottom w:w="90" w:type="dxa"/>
+              <w:end w:w="110" w:type="dxa"/>
+            </w:tcMar>
+            <w:vAlign w:val="center"/>
+          </w:tcPr>
+          <w:p>
+            <w:pPr>
+              <w:spacing w:after="0"/>
+            </w:pPr>
+            <w:r>
+              <w:rPr>
+                <w:b/>
+                <w:color w:val="17365D"/>
+              </w:rPr>
+              <w:t>Recommended level</w:t>
+            </w:r>
+          </w:p>
+        </w:tc>
+        <w:tc>
+          <w:tcPr>
+            <w:tcW w:type="dxa" w:w="7704"/>
+            <w:shd w:fill="F4F6F8"/>
+            <w:tcMar>
+              <w:top w:w="90" w:type="dxa"/>
+              <w:start w:w="110" w:type="dxa"/>
+              <w:bottom w:w="90" w:type="dxa"/>
+              <w:end w:w="110" w:type="dxa"/>
+            </w:tcMar>
+            <w:vAlign w:val="center"/>
+          </w:tcPr>
+          <w:p>
+            <w:pPr>
+              <w:spacing w:after="0"/>
+            </w:pPr>
+            <w:r>
+              <w:t>MSc preferred; reduced BSc version possible</w:t>
+            </w:r>
+          </w:p>
+        </w:tc>
+      </w:tr>
+      <w:tr>
+        <w:trPr>
+          <w:cantSplit/>
+        </w:trPr>
+        <w:tc>
+          <w:tcPr>
+            <w:tcW w:type="dxa" w:w="1944"/>
+            <w:shd w:fill="EAF2F8"/>
+            <w:tcMar>
+              <w:top w:w="90" w:type="dxa"/>
+              <w:start w:w="110" w:type="dxa"/>
+              <w:bottom w:w="90" w:type="dxa"/>
+              <w:end w:w="110" w:type="dxa"/>
+            </w:tcMar>
+            <w:vAlign w:val="center"/>
+          </w:tcPr>
+          <w:p>
+            <w:pPr>
+              <w:spacing w:after="0"/>
+            </w:pPr>
+            <w:r>
+              <w:rPr>
+                <w:b/>
+                <w:color w:val="17365D"/>
+              </w:rPr>
+              <w:t>Compute</w:t>
+            </w:r>
+          </w:p>
+        </w:tc>
+        <w:tc>
+          <w:tcPr>
+            <w:tcW w:type="dxa" w:w="7704"/>
+            <w:shd w:fill="FFFFFF"/>
+            <w:tcMar>
+              <w:top w:w="90" w:type="dxa"/>
+              <w:start w:w="110" w:type="dxa"/>
+              <w:bottom w:w="90" w:type="dxa"/>
+              <w:end w:w="110" w:type="dxa"/>
+            </w:tcMar>
+            <w:vAlign w:val="center"/>
+          </w:tcPr>
+          <w:p>
+            <w:pPr>
+              <w:spacing w:after="0"/>
+            </w:pPr>
+            <w:r>
+              <w:t>Light to moderate; compact models on a 4–8 GB GPU</w:t>
+            </w:r>
+          </w:p>
+        </w:tc>
+      </w:tr>
+      <w:tr>
+        <w:trPr>
+          <w:cantSplit/>
+        </w:trPr>
+        <w:tc>
+          <w:tcPr>
+            <w:tcW w:type="dxa" w:w="1944"/>
+            <w:shd w:fill="EAF2F8"/>
+            <w:tcMar>
+              <w:top w:w="90" w:type="dxa"/>
+              <w:start w:w="110" w:type="dxa"/>
+              <w:bottom w:w="90" w:type="dxa"/>
+              <w:end w:w="110" w:type="dxa"/>
+            </w:tcMar>
+            <w:vAlign w:val="center"/>
+          </w:tcPr>
+          <w:p>
+            <w:pPr>
+              <w:spacing w:after="0"/>
+            </w:pPr>
+            <w:r>
+              <w:rPr>
+                <w:b/>
+                <w:color w:val="17365D"/>
+              </w:rPr>
+              <w:t>Data</w:t>
+            </w:r>
+          </w:p>
+        </w:tc>
+        <w:tc>
+          <w:tcPr>
+            <w:tcW w:type="dxa" w:w="7704"/>
+            <w:shd w:fill="F4F6F8"/>
+            <w:tcMar>
+              <w:top w:w="90" w:type="dxa"/>
+              <w:start w:w="110" w:type="dxa"/>
+              <w:bottom w:w="90" w:type="dxa"/>
+              <w:end w:w="110" w:type="dxa"/>
+            </w:tcMar>
+            <w:vAlign w:val="center"/>
+          </w:tcPr>
+          <w:p>
+            <w:pPr>
+              <w:spacing w:after="0"/>
+            </w:pPr>
+            <w:r>
+              <w:t>Partner-supplied Siemens Gamesa data with configuration information for a subset of turbines; not public</w:t>
+            </w:r>
+          </w:p>
+        </w:tc>
+      </w:tr>
+      <w:tr>
+        <w:trPr>
+          <w:cantSplit/>
+        </w:trPr>
+        <w:tc>
+          <w:tcPr>
+            <w:tcW w:type="dxa" w:w="1944"/>
+            <w:shd w:fill="EAF2F8"/>
+            <w:tcMar>
+              <w:top w:w="90" w:type="dxa"/>
+              <w:start w:w="110" w:type="dxa"/>
+              <w:bottom w:w="90" w:type="dxa"/>
+              <w:end w:w="110" w:type="dxa"/>
+            </w:tcMar>
+            <w:vAlign w:val="center"/>
+          </w:tcPr>
+          <w:p>
+            <w:pPr>
+              <w:spacing w:after="0"/>
+            </w:pPr>
+            <w:r>
+              <w:rPr>
+                <w:b/>
+                <w:color w:val="17365D"/>
+              </w:rPr>
+              <w:t>Starting paper</w:t>
+            </w:r>
+          </w:p>
+        </w:tc>
+        <w:tc>
+          <w:tcPr>
+            <w:tcW w:type="dxa" w:w="7704"/>
+            <w:shd w:fill="FFFFFF"/>
+            <w:tcMar>
+              <w:top w:w="90" w:type="dxa"/>
+              <w:start w:w="110" w:type="dxa"/>
+              <w:bottom w:w="90" w:type="dxa"/>
+              <w:end w:w="110" w:type="dxa"/>
+            </w:tcMar>
+            <w:vAlign w:val="center"/>
+          </w:tcPr>
+          <w:p>
+            <w:pPr>
+              <w:spacing w:after="0"/>
+            </w:pPr>
+            <w:r>
+              <w:t xml:space="preserve">Dempster, Petitjean and Webb, </w:t>
+            </w:r>
+            <w:hyperlink r:id="rId95">
+              <w:r>
+                <w:rPr>
+                  <w:color w:val="2F5597"/>
+                  <w:u w:val="single"/>
+                </w:rPr>
+                <w:t>ROCKET</w:t>
+              </w:r>
+            </w:hyperlink>
+            <w:r>
+              <w:t>, DMKD 2020</w:t>
+            </w:r>
+          </w:p>
+        </w:tc>
+      </w:tr>
+    </w:tbl>
+    <w:p>
+      <w:pPr>
+        <w:spacing w:after="0"/>
+      </w:pPr>
+    </w:p>
+    <w:p>
+      <w:pPr>
+        <w:spacing w:before="80" w:after="100" w:line="254" w:lineRule="auto"/>
+      </w:pPr>
+      <w:r>
+        <w:rPr>
+          <w:b/>
+          <w:color w:val="25313C"/>
+        </w:rPr>
+        <w:t xml:space="preserve">What you will do. </w:t>
+      </w:r>
+      <w:r>
+        <w:t>A wind-turbine fleet can contain several bearing, gearbox or drivetrain variants, and the monitoring system may not always know which configuration is installed. Because component geometry affects the vibration spectrum, you will test whether the configuration can be inferred from measured vibration and operational data.</w:t>
+      </w:r>
+    </w:p>
+    <w:p>
+      <w:pPr>
+        <w:spacing w:before="0" w:after="100" w:line="254" w:lineRule="auto"/>
+      </w:pPr>
+      <w:r>
+        <w:rPr>
+          <w:b/>
+          <w:color w:val="25313C"/>
+        </w:rPr>
+        <w:t xml:space="preserve">Project goal. </w:t>
+      </w:r>
+      <w:r>
+        <w:t>Predict the drivetrain configuration for a turbine and estimate confidence over the possible configurations. The study should also identify which signal characteristics carry useful configuration information.</w:t>
+      </w:r>
+    </w:p>
+    <w:p>
+      <w:pPr>
+        <w:spacing w:before="0" w:after="100" w:line="254" w:lineRule="auto"/>
+      </w:pPr>
+      <w:r>
+        <w:rPr>
+          <w:b/>
+          <w:color w:val="25313C"/>
+        </w:rPr>
+        <w:t xml:space="preserve">Data. </w:t>
+      </w:r>
+      <w:r>
+        <w:t>Siemens Gamesa will provide anonymised vibration and operational measurements, potentially with verified configuration information for a subset of turbines. Before allocation, confirm the number of turbines and configuration classes, how the configuration labels were obtained, the measurement positions, sampling format, and whether raw waveforms, spectra or extracted features are available. The classification study requires enough independent turbines in each class.</w:t>
+      </w:r>
+    </w:p>
+    <w:p>
+      <w:pPr>
+        <w:spacing w:before="0" w:after="100" w:line="254" w:lineRule="auto"/>
+      </w:pPr>
+      <w:r>
+        <w:rPr>
+          <w:b/>
+          <w:color w:val="25313C"/>
+        </w:rPr>
+        <w:t xml:space="preserve">Methods and code. </w:t>
+      </w:r>
+      <w:r>
+        <w:t xml:space="preserve">Begin with a simple classifier such as logistic regression, random forest or gradient boosting on the supplied spectral and operational features. If sequences or spectra are available, compare </w:t>
+      </w:r>
+      <w:hyperlink r:id="rId96">
+        <w:r>
+          <w:rPr>
+            <w:color w:val="2F5597"/>
+            <w:u w:val="single"/>
+          </w:rPr>
+          <w:t>MiniRocket</w:t>
+        </w:r>
+      </w:hyperlink>
+      <w:r>
+        <w:t xml:space="preserve">, </w:t>
+      </w:r>
+      <w:hyperlink r:id="rId97">
+        <w:r>
+          <w:rPr>
+            <w:color w:val="2F5597"/>
+            <w:u w:val="single"/>
+          </w:rPr>
+          <w:t>InceptionTime</w:t>
+        </w:r>
+      </w:hyperlink>
+      <w:r>
+        <w:t xml:space="preserve"> or a compact 1-D CNN. If speed and component geometry are available, add order-domain or characteristic-frequency features as a physics-informed extension.</w:t>
+      </w:r>
+    </w:p>
+    <w:p>
+      <w:pPr>
+        <w:spacing w:before="0" w:after="100" w:line="254" w:lineRule="auto"/>
+      </w:pPr>
+      <w:r>
+        <w:rPr>
+          <w:b/>
+          <w:color w:val="25313C"/>
+        </w:rPr>
+        <w:t xml:space="preserve">Baselines and evaluation. </w:t>
+      </w:r>
+      <w:r>
+        <w:t>Compare majority-class and operational-metadata baselines with feature-based and learned vibration models. Split by turbine; use a site-grouped test only if the data contain enough sites and classes. Report balanced accuracy and macro-F1. For probabilistic predictions, also report calibration and coverage: how often can the system make an automatic decision above a chosen confidence threshold, and how often is that decision correct?</w:t>
+      </w:r>
+    </w:p>
+    <w:p>
+      <w:pPr>
+        <w:spacing w:before="0" w:after="100" w:line="254" w:lineRule="auto"/>
+      </w:pPr>
+      <w:r>
+        <w:rPr>
+          <w:b/>
+          <w:color w:val="25313C"/>
+        </w:rPr>
+        <w:t xml:space="preserve">Practical notes. </w:t>
+      </w:r>
+      <w:r>
+        <w:t>This project is feasible only if enough turbines have reliable configuration labels. Configuration may also correlate with site, turbine age or rating, so these variables must be examined before attributing performance to vibration signatures.</w:t>
+      </w:r>
+    </w:p>
+    <w:p>
+      <w:pPr>
+        <w:pStyle w:val="Heading3"/>
+      </w:pPr>
+      <w:r>
+        <w:t>Bachelor scope</w:t>
+      </w:r>
+    </w:p>
+    <w:p>
+      <w:pPr>
+        <w:spacing w:before="0" w:after="100" w:line="254" w:lineRule="auto"/>
+      </w:pPr>
+      <w:r>
+        <w:rPr>
+          <w:b/>
+        </w:rPr>
+        <w:t>Bachelor version.</w:t>
+      </w:r>
+      <w:r>
+        <w:t xml:space="preserve"> Using a prepared feature table and fixed configuration labels, compare one conventional classifier with the metadata-only baseline on turbine-grouped splits. Identify the most informative spectral or operational features.</w:t>
+      </w:r>
+    </w:p>
+    <w:p>
+      <w:pPr>
+        <w:pStyle w:val="Heading3"/>
+      </w:pPr>
+      <w:r>
+        <w:t>Master scope</w:t>
+      </w:r>
+    </w:p>
+    <w:p>
+      <w:pPr>
+        <w:spacing w:before="0" w:after="100" w:line="254" w:lineRule="auto"/>
+      </w:pPr>
+      <w:r>
+        <w:rPr>
+          <w:b/>
+        </w:rPr>
+        <w:t>Master research question.</w:t>
+      </w:r>
+      <w:r>
+        <w:t xml:space="preserve"> </w:t>
+      </w:r>
+      <w:r>
+        <w:rPr>
+          <w:b/>
+        </w:rPr>
+        <w:t>Can drivetrain configuration be inferred from vibration signals beyond what operational metadata already reveals, and can the model provide reliable confidence estimates?</w:t>
+      </w:r>
+      <w:r>
+        <w:t xml:space="preserve"> The contribution may be a physics-informed feature set, a hybrid model or a calibrated decision rule. Include a metadata-only control and analyse performance across operating conditions.</w:t>
+      </w:r>
+    </w:p>
+    <w:p>
+      <w:r>
+        <w:br w:type="page"/>
+      </w:r>
+    </w:p>
+    <w:p>
+      <w:pPr>
+        <w:pStyle w:val="Heading2"/>
+        <w:spacing w:after="140"/>
+      </w:pPr>
+      <w:r>
+        <w:t>Project 5.3  Tetra Pak: Regime-aware self-supervised learning for non-stationary filtration cycles</w:t>
+      </w:r>
+    </w:p>
+    <w:tbl>
+      <w:tblPr>
+        <w:tblW w:type="auto" w:w="0"/>
+        <w:jc w:val="center"/>
+        <w:tblLayout w:type="fixed"/>
+        <w:tblLook w:firstColumn="1" w:firstRow="1" w:lastColumn="0" w:lastRow="0" w:noHBand="0" w:noVBand="1" w:val="04A0"/>
+        <w:tblBorders>
+          <w:top w:val="single" w:sz="5" w:space="0" w:color="D9E0E6"/>
+          <w:left w:val="single" w:sz="5" w:space="0" w:color="D9E0E6"/>
+          <w:bottom w:val="single" w:sz="5" w:space="0" w:color="D9E0E6"/>
+          <w:right w:val="single" w:sz="5" w:space="0" w:color="D9E0E6"/>
+          <w:insideH w:val="single" w:sz="5" w:space="0" w:color="D9E0E6"/>
+          <w:insideV w:val="single" w:sz="5" w:space="0" w:color="D9E0E6"/>
+        </w:tblBorders>
+      </w:tblPr>
+      <w:tblGrid>
+        <w:gridCol w:w="1944"/>
+        <w:gridCol w:w="7704"/>
+      </w:tblGrid>
+      <w:tr>
+        <w:trPr>
+          <w:cantSplit/>
+        </w:trPr>
+        <w:tc>
+          <w:tcPr>
+            <w:tcW w:type="dxa" w:w="1944"/>
+            <w:shd w:fill="EAF2F8"/>
+            <w:tcMar>
+              <w:top w:w="90" w:type="dxa"/>
+              <w:start w:w="110" w:type="dxa"/>
+              <w:bottom w:w="90" w:type="dxa"/>
+              <w:end w:w="110" w:type="dxa"/>
+            </w:tcMar>
+            <w:vAlign w:val="center"/>
+          </w:tcPr>
+          <w:p>
+            <w:pPr>
+              <w:spacing w:after="0"/>
+            </w:pPr>
+            <w:r>
+              <w:rPr>
+                <w:b/>
+                <w:color w:val="17365D"/>
+              </w:rPr>
+              <w:t>Task</w:t>
+            </w:r>
+          </w:p>
+        </w:tc>
+        <w:tc>
+          <w:tcPr>
+            <w:tcW w:type="dxa" w:w="7704"/>
+            <w:shd w:fill="FFFFFF"/>
+            <w:tcMar>
+              <w:top w:w="90" w:type="dxa"/>
+              <w:start w:w="110" w:type="dxa"/>
+              <w:bottom w:w="90" w:type="dxa"/>
+              <w:end w:w="110" w:type="dxa"/>
+            </w:tcMar>
+            <w:vAlign w:val="center"/>
+          </w:tcPr>
+          <w:p>
+            <w:pPr>
+              <w:spacing w:after="0"/>
+            </w:pPr>
+            <w:r>
+              <w:t>Self-supervised multivariate time-series learning followed by cycle-level regression or anomaly detection</w:t>
+            </w:r>
+          </w:p>
+        </w:tc>
+      </w:tr>
+      <w:tr>
+        <w:trPr>
+          <w:cantSplit/>
+        </w:trPr>
+        <w:tc>
+          <w:tcPr>
+            <w:tcW w:type="dxa" w:w="1944"/>
+            <w:shd w:fill="EAF2F8"/>
+            <w:tcMar>
+              <w:top w:w="90" w:type="dxa"/>
+              <w:start w:w="110" w:type="dxa"/>
+              <w:bottom w:w="90" w:type="dxa"/>
+              <w:end w:w="110" w:type="dxa"/>
+            </w:tcMar>
+            <w:vAlign w:val="center"/>
+          </w:tcPr>
+          <w:p>
+            <w:pPr>
+              <w:spacing w:after="0"/>
+            </w:pPr>
+            <w:r>
+              <w:rPr>
+                <w:b/>
+                <w:color w:val="17365D"/>
+              </w:rPr>
+              <w:t>Recommended level</w:t>
+            </w:r>
+          </w:p>
+        </w:tc>
+        <w:tc>
+          <w:tcPr>
+            <w:tcW w:type="dxa" w:w="7704"/>
+            <w:shd w:fill="F4F6F8"/>
+            <w:tcMar>
+              <w:top w:w="90" w:type="dxa"/>
+              <w:start w:w="110" w:type="dxa"/>
+              <w:bottom w:w="90" w:type="dxa"/>
+              <w:end w:w="110" w:type="dxa"/>
+            </w:tcMar>
+            <w:vAlign w:val="center"/>
+          </w:tcPr>
+          <w:p>
+            <w:pPr>
+              <w:spacing w:after="0"/>
+            </w:pPr>
+            <w:r>
+              <w:t>MSc only</w:t>
+            </w:r>
+          </w:p>
+        </w:tc>
+      </w:tr>
+      <w:tr>
+        <w:trPr>
+          <w:cantSplit/>
+        </w:trPr>
+        <w:tc>
+          <w:tcPr>
+            <w:tcW w:type="dxa" w:w="1944"/>
+            <w:shd w:fill="EAF2F8"/>
+            <w:tcMar>
+              <w:top w:w="90" w:type="dxa"/>
+              <w:start w:w="110" w:type="dxa"/>
+              <w:bottom w:w="90" w:type="dxa"/>
+              <w:end w:w="110" w:type="dxa"/>
+            </w:tcMar>
+            <w:vAlign w:val="center"/>
+          </w:tcPr>
+          <w:p>
+            <w:pPr>
+              <w:spacing w:after="0"/>
+            </w:pPr>
+            <w:r>
+              <w:rPr>
+                <w:b/>
+                <w:color w:val="17365D"/>
+              </w:rPr>
+              <w:t>Compute</w:t>
+            </w:r>
+          </w:p>
+        </w:tc>
+        <w:tc>
+          <w:tcPr>
+            <w:tcW w:type="dxa" w:w="7704"/>
+            <w:shd w:fill="FFFFFF"/>
+            <w:tcMar>
+              <w:top w:w="90" w:type="dxa"/>
+              <w:start w:w="110" w:type="dxa"/>
+              <w:bottom w:w="90" w:type="dxa"/>
+              <w:end w:w="110" w:type="dxa"/>
+            </w:tcMar>
+            <w:vAlign w:val="center"/>
+          </w:tcPr>
+          <w:p>
+            <w:pPr>
+              <w:spacing w:after="0"/>
+            </w:pPr>
+            <w:r>
+              <w:t>Light to moderate; compact models on a 4–8 GB GPU</w:t>
+            </w:r>
+          </w:p>
+        </w:tc>
+      </w:tr>
+      <w:tr>
+        <w:trPr>
+          <w:cantSplit/>
+        </w:trPr>
+        <w:tc>
+          <w:tcPr>
+            <w:tcW w:type="dxa" w:w="1944"/>
+            <w:shd w:fill="EAF2F8"/>
+            <w:tcMar>
+              <w:top w:w="90" w:type="dxa"/>
+              <w:start w:w="110" w:type="dxa"/>
+              <w:bottom w:w="90" w:type="dxa"/>
+              <w:end w:w="110" w:type="dxa"/>
+            </w:tcMar>
+            <w:vAlign w:val="center"/>
+          </w:tcPr>
+          <w:p>
+            <w:pPr>
+              <w:spacing w:after="0"/>
+            </w:pPr>
+            <w:r>
+              <w:rPr>
+                <w:b/>
+                <w:color w:val="17365D"/>
+              </w:rPr>
+              <w:t>Data</w:t>
+            </w:r>
+          </w:p>
+        </w:tc>
+        <w:tc>
+          <w:tcPr>
+            <w:tcW w:type="dxa" w:w="7704"/>
+            <w:shd w:fill="F4F6F8"/>
+            <w:tcMar>
+              <w:top w:w="90" w:type="dxa"/>
+              <w:start w:w="110" w:type="dxa"/>
+              <w:bottom w:w="90" w:type="dxa"/>
+              <w:end w:w="110" w:type="dxa"/>
+            </w:tcMar>
+            <w:vAlign w:val="center"/>
+          </w:tcPr>
+          <w:p>
+            <w:pPr>
+              <w:spacing w:after="0"/>
+            </w:pPr>
+            <w:r>
+              <w:t>Partner-supplied Tetra Pak filtration-process data; not public</w:t>
+            </w:r>
+          </w:p>
+        </w:tc>
+      </w:tr>
+      <w:tr>
+        <w:trPr>
+          <w:cantSplit/>
+        </w:trPr>
+        <w:tc>
+          <w:tcPr>
+            <w:tcW w:type="dxa" w:w="1944"/>
+            <w:shd w:fill="EAF2F8"/>
+            <w:tcMar>
+              <w:top w:w="90" w:type="dxa"/>
+              <w:start w:w="110" w:type="dxa"/>
+              <w:bottom w:w="90" w:type="dxa"/>
+              <w:end w:w="110" w:type="dxa"/>
+            </w:tcMar>
+            <w:vAlign w:val="center"/>
+          </w:tcPr>
+          <w:p>
+            <w:pPr>
+              <w:spacing w:after="0"/>
+            </w:pPr>
+            <w:r>
+              <w:rPr>
+                <w:b/>
+                <w:color w:val="17365D"/>
+              </w:rPr>
+              <w:t>Starting paper</w:t>
+            </w:r>
+          </w:p>
+        </w:tc>
+        <w:tc>
+          <w:tcPr>
+            <w:tcW w:type="dxa" w:w="7704"/>
+            <w:shd w:fill="FFFFFF"/>
+            <w:tcMar>
+              <w:top w:w="90" w:type="dxa"/>
+              <w:start w:w="110" w:type="dxa"/>
+              <w:bottom w:w="90" w:type="dxa"/>
+              <w:end w:w="110" w:type="dxa"/>
+            </w:tcMar>
+            <w:vAlign w:val="center"/>
+          </w:tcPr>
+          <w:p>
+            <w:pPr>
+              <w:spacing w:after="0"/>
+            </w:pPr>
+            <w:r>
+              <w:t xml:space="preserve">Yue et al., </w:t>
+            </w:r>
+            <w:hyperlink r:id="rId89">
+              <w:r>
+                <w:rPr>
+                  <w:color w:val="2F5597"/>
+                  <w:u w:val="single"/>
+                </w:rPr>
+                <w:t>TS2Vec</w:t>
+              </w:r>
+            </w:hyperlink>
+            <w:r>
+              <w:t>, AAAI 2022</w:t>
+            </w:r>
+          </w:p>
+        </w:tc>
+      </w:tr>
+    </w:tbl>
+    <w:p>
+      <w:pPr>
+        <w:spacing w:after="0"/>
+      </w:pPr>
+    </w:p>
+    <w:p>
+      <w:pPr>
+        <w:spacing w:before="80" w:after="100" w:line="254" w:lineRule="auto"/>
+      </w:pPr>
+      <w:r>
+        <w:rPr>
+          <w:b/>
+          <w:color w:val="25313C"/>
+        </w:rPr>
+        <w:t xml:space="preserve">What you will do. </w:t>
+      </w:r>
+      <w:r>
+        <w:t>Membrane-filtration plants generate repeated production and cleaning cycles containing flow, pressure, temperature and energy measurements. Because operating conditions differ between cycles, you will learn representations that account for this variation and test them on one agreed prediction or anomaly-detection task.</w:t>
+      </w:r>
+    </w:p>
+    <w:p>
+      <w:pPr>
+        <w:spacing w:before="0" w:after="100" w:line="254" w:lineRule="auto"/>
+      </w:pPr>
+      <w:r>
+        <w:rPr>
+          <w:b/>
+          <w:color w:val="25313C"/>
+        </w:rPr>
+        <w:t xml:space="preserve">Project goal. </w:t>
+      </w:r>
+      <w:r>
+        <w:t>Determine whether cycle-phase- and operating-regime-aware self-supervised learning separates normal process variation from inefficient or abnormal behaviour better than a generic time-series representation.</w:t>
+      </w:r>
+    </w:p>
+    <w:p>
+      <w:pPr>
+        <w:spacing w:before="0" w:after="100" w:line="254" w:lineRule="auto"/>
+      </w:pPr>
+      <w:r>
+        <w:rPr>
+          <w:b/>
+          <w:color w:val="25313C"/>
+        </w:rPr>
+        <w:t xml:space="preserve">Data. </w:t>
+      </w:r>
+      <w:r>
+        <w:t>Tetra Pak will provide anonymised process data or access through a secure environment. Possible variables include cycle boundaries, flow, pressure, temperature, power or energy, setpoints and operating conditions. The number of independent cycles, sampling rate, available plants or lines, and downstream target must be confirmed before allocation. Split by complete cycle and preserve time order.</w:t>
+      </w:r>
+    </w:p>
+    <w:p>
+      <w:pPr>
+        <w:spacing w:before="0" w:after="100" w:line="254" w:lineRule="auto"/>
+      </w:pPr>
+      <w:r>
+        <w:rPr>
+          <w:b/>
+          <w:color w:val="25313C"/>
+        </w:rPr>
+        <w:t xml:space="preserve">Methods and code. </w:t>
+      </w:r>
+      <w:r>
+        <w:t>Use one established method—</w:t>
+      </w:r>
+      <w:hyperlink r:id="rId40">
+        <w:r>
+          <w:rPr>
+            <w:color w:val="2F5597"/>
+            <w:u w:val="single"/>
+          </w:rPr>
+          <w:t>TS2Vec</w:t>
+        </w:r>
+      </w:hyperlink>
+      <w:r>
+        <w:t xml:space="preserve">, </w:t>
+      </w:r>
+      <w:hyperlink r:id="rId39">
+        <w:r>
+          <w:rPr>
+            <w:color w:val="2F5597"/>
+            <w:u w:val="single"/>
+          </w:rPr>
+          <w:t>TS-TCC</w:t>
+        </w:r>
+      </w:hyperlink>
+      <w:r>
+        <w:t xml:space="preserve"> or </w:t>
+      </w:r>
+      <w:hyperlink r:id="rId42">
+        <w:r>
+          <w:rPr>
+            <w:color w:val="2F5597"/>
+            <w:u w:val="single"/>
+          </w:rPr>
+          <w:t>SimMTM</w:t>
+        </w:r>
+      </w:hyperlink>
+      <w:r>
+        <w:t>—with a compact 1-D CNN, TCN or GRU encoder. Compare generic augmentations with a cycle-phase- or regime-aware view or masking design. Change-point detection or clustering may be used to describe operating regimes.</w:t>
+      </w:r>
+    </w:p>
+    <w:p>
+      <w:pPr>
+        <w:spacing w:before="0" w:after="100" w:line="254" w:lineRule="auto"/>
+      </w:pPr>
+      <w:r>
+        <w:rPr>
+          <w:b/>
+          <w:color w:val="25313C"/>
+        </w:rPr>
+        <w:t xml:space="preserve">Baselines and evaluation. </w:t>
+      </w:r>
+      <w:r>
+        <w:t>Compare a statistical baseline, a supervised TCN or GRU, generic self-supervised learning and the proposed regime-aware version. Include random-frozen and frozen-probe controls. Use MAE for early prediction of final specific energy, or AUPRC for an agreed anomaly label. Report a label-efficiency curve and use several seeds when the number of independent cycles permits.</w:t>
+      </w:r>
+    </w:p>
+    <w:p>
+      <w:pPr>
+        <w:spacing w:before="0" w:after="100" w:line="254" w:lineRule="auto"/>
+      </w:pPr>
+      <w:r>
+        <w:rPr>
+          <w:b/>
+          <w:color w:val="25313C"/>
+        </w:rPr>
+        <w:t xml:space="preserve">Practical notes. </w:t>
+      </w:r>
+      <w:r>
+        <w:t xml:space="preserve">Confirm the independent-cycle count and one measurable downstream target before allocation. Rerunning an unchanged self-supervised method is a baseline, not the Master contribution. Follow the </w:t>
+      </w:r>
+      <w:hyperlink r:id="rId98">
+        <w:r>
+          <w:rPr>
+            <w:color w:val="2F5597"/>
+            <w:u w:val="single"/>
+          </w:rPr>
+          <w:t>shared protocol for self-supervised projects</w:t>
+        </w:r>
+      </w:hyperlink>
+      <w:r>
+        <w:t>.</w:t>
+      </w:r>
+    </w:p>
+    <w:p>
+      <w:pPr>
+        <w:pStyle w:val="Heading3"/>
+      </w:pPr>
+      <w:r>
+        <w:t>Master scope</w:t>
+      </w:r>
+    </w:p>
+    <w:p>
+      <w:pPr>
+        <w:spacing w:before="0" w:after="100" w:line="254" w:lineRule="auto"/>
+      </w:pPr>
+      <w:r>
+        <w:rPr>
+          <w:b/>
+        </w:rPr>
+        <w:t>Master research question.</w:t>
+      </w:r>
+      <w:r>
+        <w:t xml:space="preserve"> </w:t>
+      </w:r>
+      <w:r>
+        <w:rPr>
+          <w:b/>
+        </w:rPr>
+        <w:t>Can cycle-phase- and operating-regime-aware self-supervised views improve prediction or anomaly detection across non-stationary filtration cycles?</w:t>
+      </w:r>
+      <w:r>
+        <w:t xml:space="preserve"> The contribution is the process-aware view or masking design and its matched comparison with generic augmentations, including transfer to a held-out regime, line or product when the data support it.</w:t>
+      </w:r>
+    </w:p>
+    <w:p>
+      <w:r>
+        <w:br w:type="page"/>
+      </w:r>
+    </w:p>
+    <w:p>
+      <w:pPr>
+        <w:pStyle w:val="Heading1"/>
+      </w:pPr>
+      <w:r>
+        <w:t>Selection guidance</w:t>
+      </w:r>
+    </w:p>
+    <w:p>
+      <w:pPr>
+        <w:pStyle w:val="Heading2"/>
+      </w:pPr>
+      <w:r>
+        <w:t>Levels</w:t>
+      </w:r>
+    </w:p>
+    <w:p>
+      <w:pPr>
+        <w:spacing w:before="0" w:after="100" w:line="254" w:lineRule="auto"/>
+      </w:pPr>
+      <w:r>
+        <w:t xml:space="preserve">The standard Bachelor options are </w:t>
+      </w:r>
+      <w:r>
+        <w:rPr>
+          <w:b/>
+        </w:rPr>
+        <w:t>1.1–1.5</w:t>
+      </w:r>
+      <w:r>
+        <w:t xml:space="preserve">, </w:t>
+      </w:r>
+      <w:r>
+        <w:rPr>
+          <w:b/>
+        </w:rPr>
+        <w:t>2.1</w:t>
+      </w:r>
+      <w:r>
+        <w:t xml:space="preserve"> (UCI-HAR), </w:t>
+      </w:r>
+      <w:r>
+        <w:rPr>
+          <w:b/>
+        </w:rPr>
+        <w:t>2.3</w:t>
+      </w:r>
+      <w:r>
+        <w:t xml:space="preserve"> (ETT) and </w:t>
+      </w:r>
+      <w:r>
+        <w:rPr>
+          <w:b/>
+        </w:rPr>
+        <w:t>3.1</w:t>
+      </w:r>
+      <w:r>
+        <w:t xml:space="preserve"> (MVTec AD). Of these, </w:t>
       </w:r>
       <w:r>
         <w:rPr>
@@ -10026,16 +11451,24 @@
         <w:t>1.4</w:t>
       </w:r>
       <w:r>
-        <w:t xml:space="preserve"> (MovieLens), </w:t>
+        <w:t xml:space="preserve"> (MovieLens) and </w:t>
       </w:r>
       <w:r>
         <w:rPr>
           <w:b/>
         </w:rPr>
-        <w:t>1.5</w:t>
-      </w:r>
-      <w:r>
-        <w:t xml:space="preserve"> (ogbg-molhiv), </w:t>
+        <w:t>2.1</w:t>
+      </w:r>
+      <w:r>
+        <w:t xml:space="preserve"> are Bachelor-only; the others also support a Master scope.</w:t>
+      </w:r>
+    </w:p>
+    <w:p>
+      <w:pPr>
+        <w:spacing w:before="0" w:after="100" w:line="254" w:lineRule="auto"/>
+      </w:pPr>
+      <w:r>
+        <w:t xml:space="preserve">Projects </w:t>
       </w:r>
       <w:r>
         <w:rPr>
@@ -10044,7 +11477,7 @@
         <w:t>2.2</w:t>
       </w:r>
       <w:r>
-        <w:t xml:space="preserve"> (UCI-HAR), </w:t>
+        <w:t xml:space="preserve">, </w:t>
       </w:r>
       <w:r>
         <w:rPr>
@@ -10053,25 +11486,34 @@
         <w:t>2.4</w:t>
       </w:r>
       <w:r>
-        <w:t xml:space="preserve"> (ETT) and </w:t>
+        <w:t xml:space="preserve">, </w:t>
       </w:r>
       <w:r>
         <w:rPr>
           <w:b/>
         </w:rPr>
-        <w:t>3.1</w:t>
-      </w:r>
-      <w:r>
-        <w:t xml:space="preserve"> (MVTec AD). Of these, </w:t>
+        <w:t>2.5</w:t>
+      </w:r>
+      <w:r>
+        <w:t xml:space="preserve">, </w:t>
       </w:r>
       <w:r>
         <w:rPr>
           <w:b/>
         </w:rPr>
-        <w:t>1.4</w:t>
+        <w:t>4.1</w:t>
       </w:r>
       <w:r>
         <w:t xml:space="preserve"> and </w:t>
+      </w:r>
+      <w:r>
+        <w:rPr>
+          <w:b/>
+        </w:rPr>
+        <w:t>5.3</w:t>
+      </w:r>
+      <w:r>
+        <w:t xml:space="preserve"> are intended primarily for Master students. Projects </w:t>
       </w:r>
       <w:r>
         <w:rPr>
@@ -10080,75 +11522,51 @@
         <w:t>2.2</w:t>
       </w:r>
       <w:r>
-        <w:t xml:space="preserve"> are Bachelor-only; the rest also support a Master scope.</w:t>
-      </w:r>
-    </w:p>
-    <w:p>
-      <w:pPr>
-        <w:spacing w:before="0" w:after="100" w:line="254" w:lineRule="auto"/>
-      </w:pPr>
+        <w:t xml:space="preserve"> and </w:t>
+      </w:r>
       <w:r>
         <w:rPr>
           <w:b/>
         </w:rPr>
-        <w:t>2.1</w:t>
-      </w:r>
-      <w:r>
-        <w:t xml:space="preserve">, </w:t>
+        <w:t>2.4</w:t>
+      </w:r>
+      <w:r>
+        <w:t xml:space="preserve"> list reduced Bachelor versions.</w:t>
+      </w:r>
+    </w:p>
+    <w:p>
+      <w:pPr>
+        <w:spacing w:before="0" w:after="100" w:line="254" w:lineRule="auto"/>
+      </w:pPr>
+      <w:r>
+        <w:t xml:space="preserve">All Category 5 projects are Master-preferred because the data are partner-supplied and the research task must be finalized after data access. Projects </w:t>
       </w:r>
       <w:r>
         <w:rPr>
           <w:b/>
         </w:rPr>
-        <w:t>2.3</w:t>
-      </w:r>
-      <w:r>
-        <w:t xml:space="preserve">, </w:t>
+        <w:t>5.1</w:t>
+      </w:r>
+      <w:r>
+        <w:t xml:space="preserve"> and </w:t>
       </w:r>
       <w:r>
         <w:rPr>
           <w:b/>
         </w:rPr>
-        <w:t>2.5</w:t>
-      </w:r>
-      <w:r>
-        <w:t xml:space="preserve">, </w:t>
+        <w:t>5.2</w:t>
+      </w:r>
+      <w:r>
+        <w:t xml:space="preserve"> can be offered at Bachelor level only with a prepared analysis table and a fixed target. Project </w:t>
       </w:r>
       <w:r>
         <w:rPr>
           <w:b/>
         </w:rPr>
-        <w:t>2.6</w:t>
-      </w:r>
-      <w:r>
-        <w:t xml:space="preserve"> and </w:t>
-      </w:r>
-      <w:r>
-        <w:rPr>
-          <w:b/>
-        </w:rPr>
-        <w:t>4.1</w:t>
-      </w:r>
-      <w:r>
-        <w:t xml:space="preserve"> are Master-only. </w:t>
-      </w:r>
-      <w:r>
-        <w:rPr>
-          <w:b/>
-        </w:rPr>
-        <w:t>2.3</w:t>
-      </w:r>
-      <w:r>
-        <w:t xml:space="preserve"> and </w:t>
-      </w:r>
-      <w:r>
-        <w:rPr>
-          <w:b/>
-        </w:rPr>
-        <w:t>2.5</w:t>
-      </w:r>
-      <w:r>
-        <w:t xml:space="preserve"> list a reduced Bachelor version.</w:t>
+        <w:t>5.3</w:t>
+      </w:r>
+      <w:r>
+        <w:t xml:space="preserve"> is Master-only.</w:t>
       </w:r>
     </w:p>
     <w:p>
@@ -10315,7 +11733,7 @@
         <w:spacing w:before="0" w:after="100" w:line="254" w:lineRule="auto"/>
       </w:pPr>
       <w:r>
-        <w:t>The Tetra Pak project is included as Project 2.1. A Siemens Gamesa project may be offered separately when its scope and data access are confirmed.</w:t>
+        <w:t>Partner-supplied projects are grouped in Category 5. Allocation follows confirmation of data access, sample count, labels or target definition, and the permitted form of thesis reporting.</w:t>
       </w:r>
     </w:p>
     <w:sectPr>
@@ -10382,7 +11800,7 @@
         <w:color w:val="5F6B76"/>
         <w:sz w:val="16"/>
       </w:rPr>
-      <w:t>Student Project Portfolio   |   Graphs, time series, vision and signal processing</w:t>
+      <w:t>Student Project Portfolio   |   Five project categories</w:t>
     </w:r>
   </w:p>
 </w:hdr>

</xml_diff>

<commit_message>
Condense industrial category introduction
</commit_message>
<xml_diff>
--- a/downloads/student-project-portfolio.docx
+++ b/downloads/student-project-portfolio.docx
@@ -2998,7 +2998,7 @@
         <w:spacing w:before="0" w:after="100" w:line="254" w:lineRule="auto"/>
       </w:pPr>
       <w:r>
-        <w:t>These projects address operational questions defined with Siemens Gamesa and Tetra Pak. The companies supply the data, so the projects begin with a data profile and a precise definition of the available signals, independent units, labels and permitted outputs. Data, trained artefacts and reported results remain subject to the applicable project agreement.</w:t>
+        <w:t>These projects are developed with Siemens Gamesa and Tetra Pak using non-public operational data. At the start of each project, the student, supervisor and partner will confirm the available data, downstream task and permitted outputs.</w:t>
       </w:r>
     </w:p>
     <w:p>
@@ -3006,55 +3006,21 @@
         <w:spacing w:before="0" w:after="100" w:line="254" w:lineRule="auto"/>
       </w:pPr>
       <w:r>
-        <w:t>The descriptions state the research direction without assuming that every suggested variable or label is available. The final task, split and primary metric are fixed with the partner after access is confirmed. This first phase is part of the project.</w:t>
+        <w:t>All three are primarily Master projects. A reduced Bachelor version can be offered when a prepared dataset and fixed task are available. The Bachelor project implements and compares established methods; the Master project adds a new representation, feature design or evaluation question.</w:t>
       </w:r>
     </w:p>
     <w:p>
       <w:pPr>
-        <w:pStyle w:val="Heading3"/>
-      </w:pPr>
-      <w:r>
-        <w:t>Master level preferred</w:t>
-      </w:r>
-    </w:p>
-    <w:p>
-      <w:pPr>
-        <w:spacing w:before="0" w:after="80" w:line="254" w:lineRule="auto"/>
-      </w:pPr>
-      <w:r>
-        <w:t>All three projects are intended primarily for Master students. Each can be reduced to Bachelor level when the partner supplies a prepared dataset and a fixed task. The Bachelor version focuses on implementing and comparing established methods; the Master version adds a new representation, feature design or evaluation question.</w:t>
-      </w:r>
-    </w:p>
-    <w:p>
-      <w:pPr>
-        <w:pStyle w:val="Heading3"/>
-      </w:pPr>
-      <w:r>
-        <w:t>Split by physical unit</w:t>
-      </w:r>
-    </w:p>
-    <w:p>
-      <w:pPr>
-        <w:spacing w:before="0" w:after="80" w:line="254" w:lineRule="auto"/>
-      </w:pPr>
-      <w:r>
-        <w:t>Windows from one turbine, machine, filtration cycle or production unit must not cross training and test sets. A held-out site, line or turbine type is an additional transfer test only when the available sample count supports it.</w:t>
-      </w:r>
-    </w:p>
-    <w:p>
-      <w:pPr>
-        <w:pStyle w:val="Heading2"/>
-      </w:pPr>
-      <w:r>
-        <w:t>Before allocation</w:t>
-      </w:r>
-    </w:p>
-    <w:p>
-      <w:pPr>
         <w:spacing w:before="0" w:after="100" w:line="254" w:lineRule="auto"/>
       </w:pPr>
       <w:r>
-        <w:t>Confirm the data agreement, available variables, sampling and synchronization, number of independent units, label source, downstream target and what may appear in the thesis. If the available data cannot support the proposed comparison, narrow or reformulate the task before allocation.</w:t>
+        <w:rPr>
+          <w:b/>
+        </w:rPr>
+        <w:t>Evaluation split.</w:t>
+      </w:r>
+      <w:r>
+        <w:t xml:space="preserve"> Keep all measurements from one turbine or filtration cycle in the same split. A held-out site or production line can be used as an additional Master-level transfer test when enough data are available.</w:t>
       </w:r>
     </w:p>
     <w:p>

</xml_diff>

<commit_message>
Refine Siemens Gamesa project descriptions
</commit_message>
<xml_diff>
--- a/downloads/student-project-portfolio.docx
+++ b/downloads/student-project-portfolio.docx
@@ -714,7 +714,7 @@
               <w:spacing w:after="0" w:line="240" w:lineRule="auto"/>
             </w:pPr>
             <w:r>
-              <w:t>Siemens Gamesa: Inferring drivetrain configuration and kinematics from vibration signals</w:t>
+              <w:t>Siemens Gamesa: Probabilistic drivetrain configuration and kinematics identification from vibration signals</w:t>
             </w:r>
           </w:p>
         </w:tc>
@@ -1714,6 +1714,176 @@
               <w:spacing w:after="0" w:line="240" w:lineRule="auto"/>
             </w:pPr>
             <w:r>
+              <w:t>3.6</w:t>
+            </w:r>
+          </w:p>
+        </w:tc>
+        <w:tc>
+          <w:tcPr>
+            <w:tcW w:type="dxa" w:w="2438"/>
+            <w:shd w:fill="F4F6F8"/>
+            <w:tcMar>
+              <w:top w:w="70" w:type="dxa"/>
+              <w:start w:w="110" w:type="dxa"/>
+              <w:bottom w:w="70" w:type="dxa"/>
+              <w:end w:w="110" w:type="dxa"/>
+            </w:tcMar>
+          </w:tcPr>
+          <w:p>
+            <w:pPr>
+              <w:spacing w:after="0" w:line="240" w:lineRule="auto"/>
+            </w:pPr>
+            <w:r>
+              <w:t>Time–frequency contrastive Mamba for cross-condition bearing diagnosis</w:t>
+            </w:r>
+          </w:p>
+        </w:tc>
+        <w:tc>
+          <w:tcPr>
+            <w:tcW w:type="dxa" w:w="2438"/>
+            <w:shd w:fill="F4F6F8"/>
+            <w:tcMar>
+              <w:top w:w="70" w:type="dxa"/>
+              <w:start w:w="110" w:type="dxa"/>
+              <w:bottom w:w="70" w:type="dxa"/>
+              <w:end w:w="110" w:type="dxa"/>
+            </w:tcMar>
+          </w:tcPr>
+          <w:p>
+            <w:pPr>
+              <w:spacing w:after="0" w:line="240" w:lineRule="auto"/>
+            </w:pPr>
+            <w:r>
+              <w:t>MSc preferred</w:t>
+            </w:r>
+          </w:p>
+        </w:tc>
+        <w:tc>
+          <w:tcPr>
+            <w:tcW w:type="dxa" w:w="2438"/>
+            <w:shd w:fill="F4F6F8"/>
+            <w:tcMar>
+              <w:top w:w="70" w:type="dxa"/>
+              <w:start w:w="110" w:type="dxa"/>
+              <w:bottom w:w="70" w:type="dxa"/>
+              <w:end w:w="110" w:type="dxa"/>
+            </w:tcMar>
+          </w:tcPr>
+          <w:p>
+            <w:pPr>
+              <w:spacing w:after="0" w:line="240" w:lineRule="auto"/>
+            </w:pPr>
+            <w:r>
+              <w:t>Light to moderate</w:t>
+            </w:r>
+          </w:p>
+        </w:tc>
+      </w:tr>
+      <w:tr>
+        <w:trPr>
+          <w:cantSplit/>
+        </w:trPr>
+        <w:tc>
+          <w:tcPr>
+            <w:tcW w:type="dxa" w:w="2438"/>
+            <w:shd w:fill="FFFFFF"/>
+            <w:tcMar>
+              <w:top w:w="70" w:type="dxa"/>
+              <w:start w:w="110" w:type="dxa"/>
+              <w:bottom w:w="70" w:type="dxa"/>
+              <w:end w:w="110" w:type="dxa"/>
+            </w:tcMar>
+          </w:tcPr>
+          <w:p>
+            <w:pPr>
+              <w:spacing w:after="0" w:line="240" w:lineRule="auto"/>
+            </w:pPr>
+            <w:r>
+              <w:t>3.7</w:t>
+            </w:r>
+          </w:p>
+        </w:tc>
+        <w:tc>
+          <w:tcPr>
+            <w:tcW w:type="dxa" w:w="2438"/>
+            <w:shd w:fill="FFFFFF"/>
+            <w:tcMar>
+              <w:top w:w="70" w:type="dxa"/>
+              <w:start w:w="110" w:type="dxa"/>
+              <w:bottom w:w="70" w:type="dxa"/>
+              <w:end w:w="110" w:type="dxa"/>
+            </w:tcMar>
+          </w:tcPr>
+          <w:p>
+            <w:pPr>
+              <w:spacing w:after="0" w:line="240" w:lineRule="auto"/>
+            </w:pPr>
+            <w:r>
+              <w:t>Correlation-graph Mamba for order-robust multivariate forecasting</w:t>
+            </w:r>
+          </w:p>
+        </w:tc>
+        <w:tc>
+          <w:tcPr>
+            <w:tcW w:type="dxa" w:w="2438"/>
+            <w:shd w:fill="FFFFFF"/>
+            <w:tcMar>
+              <w:top w:w="70" w:type="dxa"/>
+              <w:start w:w="110" w:type="dxa"/>
+              <w:bottom w:w="70" w:type="dxa"/>
+              <w:end w:w="110" w:type="dxa"/>
+            </w:tcMar>
+          </w:tcPr>
+          <w:p>
+            <w:pPr>
+              <w:spacing w:after="0" w:line="240" w:lineRule="auto"/>
+            </w:pPr>
+            <w:r>
+              <w:t>MSc preferred</w:t>
+            </w:r>
+          </w:p>
+        </w:tc>
+        <w:tc>
+          <w:tcPr>
+            <w:tcW w:type="dxa" w:w="2438"/>
+            <w:shd w:fill="FFFFFF"/>
+            <w:tcMar>
+              <w:top w:w="70" w:type="dxa"/>
+              <w:start w:w="110" w:type="dxa"/>
+              <w:bottom w:w="70" w:type="dxa"/>
+              <w:end w:w="110" w:type="dxa"/>
+            </w:tcMar>
+          </w:tcPr>
+          <w:p>
+            <w:pPr>
+              <w:spacing w:after="0" w:line="240" w:lineRule="auto"/>
+            </w:pPr>
+            <w:r>
+              <w:t>Light to moderate on Weather</w:t>
+            </w:r>
+          </w:p>
+        </w:tc>
+      </w:tr>
+      <w:tr>
+        <w:trPr>
+          <w:cantSplit/>
+        </w:trPr>
+        <w:tc>
+          <w:tcPr>
+            <w:tcW w:type="dxa" w:w="2438"/>
+            <w:shd w:fill="F4F6F8"/>
+            <w:tcMar>
+              <w:top w:w="70" w:type="dxa"/>
+              <w:start w:w="110" w:type="dxa"/>
+              <w:bottom w:w="70" w:type="dxa"/>
+              <w:end w:w="110" w:type="dxa"/>
+            </w:tcMar>
+          </w:tcPr>
+          <w:p>
+            <w:pPr>
+              <w:spacing w:after="0" w:line="240" w:lineRule="auto"/>
+            </w:pPr>
+            <w:r>
               <w:t>4.1</w:t>
             </w:r>
           </w:p>
@@ -1775,6 +1945,176 @@
             </w:pPr>
             <w:r>
               <w:t>Light for frozen features</w:t>
+            </w:r>
+          </w:p>
+        </w:tc>
+      </w:tr>
+      <w:tr>
+        <w:trPr>
+          <w:cantSplit/>
+        </w:trPr>
+        <w:tc>
+          <w:tcPr>
+            <w:tcW w:type="dxa" w:w="2438"/>
+            <w:shd w:fill="FFFFFF"/>
+            <w:tcMar>
+              <w:top w:w="70" w:type="dxa"/>
+              <w:start w:w="110" w:type="dxa"/>
+              <w:bottom w:w="70" w:type="dxa"/>
+              <w:end w:w="110" w:type="dxa"/>
+            </w:tcMar>
+          </w:tcPr>
+          <w:p>
+            <w:pPr>
+              <w:spacing w:after="0" w:line="240" w:lineRule="auto"/>
+            </w:pPr>
+            <w:r>
+              <w:t>4.2</w:t>
+            </w:r>
+          </w:p>
+        </w:tc>
+        <w:tc>
+          <w:tcPr>
+            <w:tcW w:type="dxa" w:w="2438"/>
+            <w:shd w:fill="FFFFFF"/>
+            <w:tcMar>
+              <w:top w:w="70" w:type="dxa"/>
+              <w:start w:w="110" w:type="dxa"/>
+              <w:bottom w:w="70" w:type="dxa"/>
+              <w:end w:w="110" w:type="dxa"/>
+            </w:tcMar>
+          </w:tcPr>
+          <w:p>
+            <w:pPr>
+              <w:spacing w:after="0" w:line="240" w:lineRule="auto"/>
+            </w:pPr>
+            <w:r>
+              <w:t>Adapting DINOv3 for robust abdominal CT segmentation</w:t>
+            </w:r>
+          </w:p>
+        </w:tc>
+        <w:tc>
+          <w:tcPr>
+            <w:tcW w:type="dxa" w:w="2438"/>
+            <w:shd w:fill="FFFFFF"/>
+            <w:tcMar>
+              <w:top w:w="70" w:type="dxa"/>
+              <w:start w:w="110" w:type="dxa"/>
+              <w:bottom w:w="70" w:type="dxa"/>
+              <w:end w:w="110" w:type="dxa"/>
+            </w:tcMar>
+          </w:tcPr>
+          <w:p>
+            <w:pPr>
+              <w:spacing w:after="0" w:line="240" w:lineRule="auto"/>
+            </w:pPr>
+            <w:r>
+              <w:t>BSc or MSc</w:t>
+            </w:r>
+          </w:p>
+        </w:tc>
+        <w:tc>
+          <w:tcPr>
+            <w:tcW w:type="dxa" w:w="2438"/>
+            <w:shd w:fill="FFFFFF"/>
+            <w:tcMar>
+              <w:top w:w="70" w:type="dxa"/>
+              <w:start w:w="110" w:type="dxa"/>
+              <w:bottom w:w="70" w:type="dxa"/>
+              <w:end w:w="110" w:type="dxa"/>
+            </w:tcMar>
+          </w:tcPr>
+          <w:p>
+            <w:pPr>
+              <w:spacing w:after="0" w:line="240" w:lineRule="auto"/>
+            </w:pPr>
+            <w:r>
+              <w:t>Moderate for BSc and moderate to high for MSc</w:t>
+            </w:r>
+          </w:p>
+        </w:tc>
+      </w:tr>
+      <w:tr>
+        <w:trPr>
+          <w:cantSplit/>
+        </w:trPr>
+        <w:tc>
+          <w:tcPr>
+            <w:tcW w:type="dxa" w:w="2438"/>
+            <w:shd w:fill="F4F6F8"/>
+            <w:tcMar>
+              <w:top w:w="70" w:type="dxa"/>
+              <w:start w:w="110" w:type="dxa"/>
+              <w:bottom w:w="70" w:type="dxa"/>
+              <w:end w:w="110" w:type="dxa"/>
+            </w:tcMar>
+          </w:tcPr>
+          <w:p>
+            <w:pPr>
+              <w:spacing w:after="0" w:line="240" w:lineRule="auto"/>
+            </w:pPr>
+            <w:r>
+              <w:t>4.3</w:t>
+            </w:r>
+          </w:p>
+        </w:tc>
+        <w:tc>
+          <w:tcPr>
+            <w:tcW w:type="dxa" w:w="2438"/>
+            <w:shd w:fill="F4F6F8"/>
+            <w:tcMar>
+              <w:top w:w="70" w:type="dxa"/>
+              <w:start w:w="110" w:type="dxa"/>
+              <w:bottom w:w="70" w:type="dxa"/>
+              <w:end w:w="110" w:type="dxa"/>
+            </w:tcMar>
+          </w:tcPr>
+          <w:p>
+            <w:pPr>
+              <w:spacing w:after="0" w:line="240" w:lineRule="auto"/>
+            </w:pPr>
+            <w:r>
+              <w:t>Federated knowledge distillation for medical image denoising</w:t>
+            </w:r>
+          </w:p>
+        </w:tc>
+        <w:tc>
+          <w:tcPr>
+            <w:tcW w:type="dxa" w:w="2438"/>
+            <w:shd w:fill="F4F6F8"/>
+            <w:tcMar>
+              <w:top w:w="70" w:type="dxa"/>
+              <w:start w:w="110" w:type="dxa"/>
+              <w:bottom w:w="70" w:type="dxa"/>
+              <w:end w:w="110" w:type="dxa"/>
+            </w:tcMar>
+          </w:tcPr>
+          <w:p>
+            <w:pPr>
+              <w:spacing w:after="0" w:line="240" w:lineRule="auto"/>
+            </w:pPr>
+            <w:r>
+              <w:t>MSc only</w:t>
+            </w:r>
+          </w:p>
+        </w:tc>
+        <w:tc>
+          <w:tcPr>
+            <w:tcW w:type="dxa" w:w="2438"/>
+            <w:shd w:fill="F4F6F8"/>
+            <w:tcMar>
+              <w:top w:w="70" w:type="dxa"/>
+              <w:start w:w="110" w:type="dxa"/>
+              <w:bottom w:w="70" w:type="dxa"/>
+              <w:end w:w="110" w:type="dxa"/>
+            </w:tcMar>
+          </w:tcPr>
+          <w:p>
+            <w:pPr>
+              <w:spacing w:after="0" w:line="240" w:lineRule="auto"/>
+            </w:pPr>
+            <w:r>
+              <w:t>Moderate</w:t>
             </w:r>
           </w:p>
         </w:tc>
@@ -3571,7 +3911,7 @@
         <w:t xml:space="preserve">Practical notes. </w:t>
       </w:r>
       <w:r>
-        <w:t>Unsupervised clusters are not automatically physical operating states. Do not judge the result only by silhouette score or a two-dimensional plot. A useful state should be repeatable and should improve an agreed downstream measure.</w:t>
+        <w:t>Unsupervised clusters are not automatically physical operating states. Where possible, the discovered operating states should be interpreted in relation to known turbine operating regimes, controller actions, or structural and aerodynamic phenomena. Do not judge the result only by silhouette score or a two-dimensional plot. A useful state should be repeatable and should improve an agreed downstream measure.</w:t>
       </w:r>
     </w:p>
     <w:p>
@@ -3638,7 +3978,7 @@
         <w:spacing w:after="140"/>
       </w:pPr>
       <w:r>
-        <w:t>Project 1.2  Siemens Gamesa: Inferring drivetrain configuration and kinematics from vibration signals</w:t>
+        <w:t>Project 1.2  Siemens Gamesa: Probabilistic drivetrain configuration and kinematics identification from vibration signals</w:t>
       </w:r>
     </w:p>
     <w:tbl>
@@ -3706,7 +4046,7 @@
               <w:spacing w:after="0"/>
             </w:pPr>
             <w:r>
-              <w:t>Turbine-level classification of drivetrain configurations from vibration and operational measurements</w:t>
+              <w:t>Probabilistic ranking of candidate drivetrain configurations from vibration and operational measurements</w:t>
             </w:r>
           </w:p>
         </w:tc>
@@ -3945,7 +4285,7 @@
         <w:t xml:space="preserve">What you will do. </w:t>
       </w:r>
       <w:r>
-        <w:t>A wind-turbine fleet can contain several bearing, gearbox or drivetrain variants, and the monitoring system may not always know which configuration is installed. Because component geometry affects the vibration spectrum, you will test whether the configuration can be inferred from measured vibration and operational data.</w:t>
+        <w:t>A wind-turbine fleet can contain several bearing, gearbox or drivetrain variants, and the monitoring system may not always know which configuration is installed. Because component geometry affects the vibration spectrum, you will test whether measured vibration and operational data can narrow the set of plausible configurations and provide probabilities or confidence estimates for the candidates, rather than requiring a single fixed assignment.</w:t>
       </w:r>
     </w:p>
     <w:p>
@@ -3960,7 +4300,7 @@
         <w:t xml:space="preserve">Project goal. </w:t>
       </w:r>
       <w:r>
-        <w:t>Predict the drivetrain configuration for a turbine and estimate confidence over the possible configurations. The study should also identify which signal characteristics carry useful configuration information.</w:t>
+        <w:t>A practically useful outcome may be narrowing the set of plausible configurations and providing calibrated confidence estimates, rather than always identifying a single configuration with certainty. From an industrial perspective, reducing uncertainty can already provide significant value, even if perfect identification is not possible. The study should also identify which signal characteristics carry useful configuration information.</w:t>
       </w:r>
     </w:p>
     <w:p>
@@ -3975,7 +4315,7 @@
         <w:t xml:space="preserve">Data. </w:t>
       </w:r>
       <w:r>
-        <w:t>Siemens Gamesa will provide anonymised vibration and operational measurements, potentially with verified configuration information for a subset of turbines. Before allocation, confirm the number of turbines and configuration classes, how the configuration labels were obtained, the measurement positions, sampling format, and whether raw waveforms, spectra or extracted features are available. The classification study requires enough independent turbines in each class.</w:t>
+        <w:t>Siemens Gamesa will provide anonymised vibration and operational measurements, potentially with verified configuration information for a subset of turbines. Before allocation, confirm the number of turbines and configuration classes, how the configuration labels were obtained, the measurement positions, sampling format, and whether raw waveforms, spectra or extracted features are available. The probabilistic ranking study requires enough independent turbines for each candidate configuration.</w:t>
       </w:r>
     </w:p>
     <w:p>
@@ -3990,7 +4330,7 @@
         <w:t xml:space="preserve">Methods and code. </w:t>
       </w:r>
       <w:r>
-        <w:t xml:space="preserve">Begin with a simple classifier such as logistic regression, random forest or gradient boosting on the supplied spectral and operational features. If sequences or spectra are available, compare </w:t>
+        <w:t xml:space="preserve">Begin with a probabilistic baseline such as multinomial logistic regression, or a random-forest or gradient-boosting model that outputs candidate probabilities, using the supplied spectral and operational features. If sequences or spectra are available, compare </w:t>
       </w:r>
       <w:hyperlink r:id="rId23">
         <w:r>
@@ -4014,7 +4354,7 @@
         </w:r>
       </w:hyperlink>
       <w:r>
-        <w:t xml:space="preserve"> or a compact 1-D CNN. If speed and component geometry are available, add order-domain or characteristic-frequency features as a physics-informed extension.</w:t>
+        <w:t xml:space="preserve"> or a compact 1-D CNN, followed by probability calibration when needed. If speed and component geometry are available, add order-domain or characteristic-frequency features as a physics-informed extension. An advanced extension can condition the model on known kinematic parameters so that it learns how vibration patterns relate to machine properties rather than merely memorising component identities.</w:t>
       </w:r>
     </w:p>
     <w:p>
@@ -4029,7 +4369,7 @@
         <w:t xml:space="preserve">Baselines and evaluation. </w:t>
       </w:r>
       <w:r>
-        <w:t>Compare majority-class and operational-metadata baselines with feature-based and learned vibration models. Split by turbine; use a site-grouped test only if the data contain enough sites and classes. Report balanced accuracy and macro-F1. For probabilistic predictions, also report calibration and coverage: how often can the system make an automatic decision above a chosen confidence threshold, and how often is that decision correct?</w:t>
+        <w:t>Compare prior-probability and operational-metadata baselines with feature-based and learned vibration models. Treat the output as a ranked probability distribution over candidate configurations rather than only a fixed assignment. Split by turbine; use a site-grouped test only if the data contain enough sites and classes. Report balanced accuracy and macro-F1 for the highest-ranked candidate, top-k candidate recall, and a probabilistic score such as log loss or the Brier score. Also report calibration and coverage: how often can the system make an automatic decision above a chosen confidence threshold, and how often is that decision correct?</w:t>
       </w:r>
     </w:p>
     <w:p>
@@ -4044,7 +4384,7 @@
         <w:t xml:space="preserve">Practical notes. </w:t>
       </w:r>
       <w:r>
-        <w:t>This project is feasible only if enough turbines have reliable configuration labels. Configuration may also correlate with site, turbine age or rating, so these variables must be examined before attributing performance to vibration signatures.</w:t>
+        <w:t>This project is feasible only if enough turbines have reliable configuration labels for training and validation. Configuration may also correlate with site, turbine age or rating, so these variables must be examined before attributing performance to vibration signatures. A physics-informed transfer study from well-labelled components to complex components with limited labels is a valuable MSc extension, but it depends on having both known kinematic parameters and a credible target-component test set.</w:t>
       </w:r>
     </w:p>
     <w:p>
@@ -4066,7 +4406,7 @@
         <w:t>Bachelor version.</w:t>
       </w:r>
       <w:r>
-        <w:t xml:space="preserve"> Using a prepared feature table and fixed configuration labels, compare one conventional classifier with the metadata-only baseline on turbine-grouped splits. Identify the most informative spectral or operational features.</w:t>
+        <w:t xml:space="preserve"> Using a prepared feature table and verified configuration labels, compare one probabilistic classifier with the metadata-only baseline on turbine-grouped splits. Report both the highest-ranked classification result and whether the true configuration appears among the top candidate configurations. Identify the most informative spectral or operational features.</w:t>
       </w:r>
     </w:p>
     <w:p>
@@ -4094,10 +4434,10 @@
         <w:rPr>
           <w:b/>
         </w:rPr>
-        <w:t>Can drivetrain configuration be inferred from vibration signals beyond what operational metadata already reveals, and can the model provide reliable confidence estimates?</w:t>
-      </w:r>
-      <w:r>
-        <w:t xml:space="preserve"> The contribution may be a physics-informed feature set, a hybrid model or a calibrated decision rule. Include a metadata-only control and analyse performance across operating conditions.</w:t>
+        <w:t>Can vibration and operational measurements narrow the set of plausible drivetrain configurations and provide calibrated confidence estimates beyond what operational metadata already reveals?</w:t>
+      </w:r>
+      <w:r>
+        <w:t xml:space="preserve"> The contribution may be a calibrated candidate-ranking method, a physics-informed feature set or a model conditioned on kinematic information. Include a metadata-only control and analyse performance across operating conditions.</w:t>
       </w:r>
     </w:p>
     <w:p>
@@ -9905,18 +10245,336 @@
     </w:p>
     <w:p>
       <w:pPr>
-        <w:pStyle w:val="Heading1"/>
-      </w:pPr>
-      <w:r>
-        <w:t>Category 4  Deep-learning vision models and applications</w:t>
-      </w:r>
+        <w:pStyle w:val="Heading2"/>
+        <w:spacing w:after="140"/>
+      </w:pPr>
+      <w:r>
+        <w:t>Project 3.6  Time–frequency contrastive Mamba for cross-condition bearing diagnosis</w:t>
+      </w:r>
+    </w:p>
+    <w:tbl>
+      <w:tblPr>
+        <w:tblW w:type="auto" w:w="0"/>
+        <w:jc w:val="center"/>
+        <w:tblLayout w:type="fixed"/>
+        <w:tblLook w:firstColumn="1" w:firstRow="1" w:lastColumn="0" w:lastRow="0" w:noHBand="0" w:noVBand="1" w:val="04A0"/>
+        <w:tblBorders>
+          <w:top w:val="single" w:sz="5" w:space="0" w:color="D9E0E6"/>
+          <w:left w:val="single" w:sz="5" w:space="0" w:color="D9E0E6"/>
+          <w:bottom w:val="single" w:sz="5" w:space="0" w:color="D9E0E6"/>
+          <w:right w:val="single" w:sz="5" w:space="0" w:color="D9E0E6"/>
+          <w:insideH w:val="single" w:sz="5" w:space="0" w:color="D9E0E6"/>
+          <w:insideV w:val="single" w:sz="5" w:space="0" w:color="D9E0E6"/>
+        </w:tblBorders>
+      </w:tblPr>
+      <w:tblGrid>
+        <w:gridCol w:w="1944"/>
+        <w:gridCol w:w="7704"/>
+      </w:tblGrid>
+      <w:tr>
+        <w:trPr>
+          <w:cantSplit/>
+        </w:trPr>
+        <w:tc>
+          <w:tcPr>
+            <w:tcW w:type="dxa" w:w="1944"/>
+            <w:shd w:fill="EAF2F8"/>
+            <w:tcMar>
+              <w:top w:w="90" w:type="dxa"/>
+              <w:start w:w="110" w:type="dxa"/>
+              <w:bottom w:w="90" w:type="dxa"/>
+              <w:end w:w="110" w:type="dxa"/>
+            </w:tcMar>
+            <w:vAlign w:val="center"/>
+          </w:tcPr>
+          <w:p>
+            <w:pPr>
+              <w:spacing w:after="0"/>
+            </w:pPr>
+            <w:r>
+              <w:rPr>
+                <w:b/>
+                <w:color w:val="17365D"/>
+              </w:rPr>
+              <w:t>Task</w:t>
+            </w:r>
+          </w:p>
+        </w:tc>
+        <w:tc>
+          <w:tcPr>
+            <w:tcW w:type="dxa" w:w="7704"/>
+            <w:shd w:fill="FFFFFF"/>
+            <w:tcMar>
+              <w:top w:w="90" w:type="dxa"/>
+              <w:start w:w="110" w:type="dxa"/>
+              <w:bottom w:w="90" w:type="dxa"/>
+              <w:end w:w="110" w:type="dxa"/>
+            </w:tcMar>
+            <w:vAlign w:val="center"/>
+          </w:tcPr>
+          <w:p>
+            <w:pPr>
+              <w:spacing w:after="0"/>
+            </w:pPr>
+            <w:r>
+              <w:t>Self-supervised time-series representation learning, then fault classification</w:t>
+            </w:r>
+          </w:p>
+        </w:tc>
+      </w:tr>
+      <w:tr>
+        <w:trPr>
+          <w:cantSplit/>
+        </w:trPr>
+        <w:tc>
+          <w:tcPr>
+            <w:tcW w:type="dxa" w:w="1944"/>
+            <w:shd w:fill="EAF2F8"/>
+            <w:tcMar>
+              <w:top w:w="90" w:type="dxa"/>
+              <w:start w:w="110" w:type="dxa"/>
+              <w:bottom w:w="90" w:type="dxa"/>
+              <w:end w:w="110" w:type="dxa"/>
+            </w:tcMar>
+            <w:vAlign w:val="center"/>
+          </w:tcPr>
+          <w:p>
+            <w:pPr>
+              <w:spacing w:after="0"/>
+            </w:pPr>
+            <w:r>
+              <w:rPr>
+                <w:b/>
+                <w:color w:val="17365D"/>
+              </w:rPr>
+              <w:t>Recommended level</w:t>
+            </w:r>
+          </w:p>
+        </w:tc>
+        <w:tc>
+          <w:tcPr>
+            <w:tcW w:type="dxa" w:w="7704"/>
+            <w:shd w:fill="F4F6F8"/>
+            <w:tcMar>
+              <w:top w:w="90" w:type="dxa"/>
+              <w:start w:w="110" w:type="dxa"/>
+              <w:bottom w:w="90" w:type="dxa"/>
+              <w:end w:w="110" w:type="dxa"/>
+            </w:tcMar>
+            <w:vAlign w:val="center"/>
+          </w:tcPr>
+          <w:p>
+            <w:pPr>
+              <w:spacing w:after="0"/>
+            </w:pPr>
+            <w:r>
+              <w:t>MSc preferred; BSc with the processed dataset and a fixed comparison</w:t>
+            </w:r>
+          </w:p>
+        </w:tc>
+      </w:tr>
+      <w:tr>
+        <w:trPr>
+          <w:cantSplit/>
+        </w:trPr>
+        <w:tc>
+          <w:tcPr>
+            <w:tcW w:type="dxa" w:w="1944"/>
+            <w:shd w:fill="EAF2F8"/>
+            <w:tcMar>
+              <w:top w:w="90" w:type="dxa"/>
+              <w:start w:w="110" w:type="dxa"/>
+              <w:bottom w:w="90" w:type="dxa"/>
+              <w:end w:w="110" w:type="dxa"/>
+            </w:tcMar>
+            <w:vAlign w:val="center"/>
+          </w:tcPr>
+          <w:p>
+            <w:pPr>
+              <w:spacing w:after="0"/>
+            </w:pPr>
+            <w:r>
+              <w:rPr>
+                <w:b/>
+                <w:color w:val="17365D"/>
+              </w:rPr>
+              <w:t>Compute</w:t>
+            </w:r>
+          </w:p>
+        </w:tc>
+        <w:tc>
+          <w:tcPr>
+            <w:tcW w:type="dxa" w:w="7704"/>
+            <w:shd w:fill="FFFFFF"/>
+            <w:tcMar>
+              <w:top w:w="90" w:type="dxa"/>
+              <w:start w:w="110" w:type="dxa"/>
+              <w:bottom w:w="90" w:type="dxa"/>
+              <w:end w:w="110" w:type="dxa"/>
+            </w:tcMar>
+            <w:vAlign w:val="center"/>
+          </w:tcPr>
+          <w:p>
+            <w:pPr>
+              <w:spacing w:after="0"/>
+            </w:pPr>
+            <w:r>
+              <w:t>Light to moderate; 4–8 GB GPU</w:t>
+            </w:r>
+          </w:p>
+        </w:tc>
+      </w:tr>
+      <w:tr>
+        <w:trPr>
+          <w:cantSplit/>
+        </w:trPr>
+        <w:tc>
+          <w:tcPr>
+            <w:tcW w:type="dxa" w:w="1944"/>
+            <w:shd w:fill="EAF2F8"/>
+            <w:tcMar>
+              <w:top w:w="90" w:type="dxa"/>
+              <w:start w:w="110" w:type="dxa"/>
+              <w:bottom w:w="90" w:type="dxa"/>
+              <w:end w:w="110" w:type="dxa"/>
+            </w:tcMar>
+            <w:vAlign w:val="center"/>
+          </w:tcPr>
+          <w:p>
+            <w:pPr>
+              <w:spacing w:after="0"/>
+            </w:pPr>
+            <w:r>
+              <w:rPr>
+                <w:b/>
+                <w:color w:val="17365D"/>
+              </w:rPr>
+              <w:t>Data</w:t>
+            </w:r>
+          </w:p>
+        </w:tc>
+        <w:tc>
+          <w:tcPr>
+            <w:tcW w:type="dxa" w:w="7704"/>
+            <w:shd w:fill="F4F6F8"/>
+            <w:tcMar>
+              <w:top w:w="90" w:type="dxa"/>
+              <w:start w:w="110" w:type="dxa"/>
+              <w:bottom w:w="90" w:type="dxa"/>
+              <w:end w:w="110" w:type="dxa"/>
+            </w:tcMar>
+            <w:vAlign w:val="center"/>
+          </w:tcPr>
+          <w:p>
+            <w:pPr>
+              <w:spacing w:after="0"/>
+            </w:pPr>
+            <w:hyperlink r:id="rId71">
+              <w:r>
+                <w:rPr>
+                  <w:color w:val="2F5597"/>
+                  <w:u w:val="single"/>
+                </w:rPr>
+                <w:t>Paderborn KAt</w:t>
+              </w:r>
+            </w:hyperlink>
+            <w:r>
+              <w:t xml:space="preserve"> — 32 bearings, four operating conditions, 64 kHz vibration, CC BY-NC 4.0</w:t>
+            </w:r>
+          </w:p>
+        </w:tc>
+      </w:tr>
+      <w:tr>
+        <w:trPr>
+          <w:cantSplit/>
+        </w:trPr>
+        <w:tc>
+          <w:tcPr>
+            <w:tcW w:type="dxa" w:w="1944"/>
+            <w:shd w:fill="EAF2F8"/>
+            <w:tcMar>
+              <w:top w:w="90" w:type="dxa"/>
+              <w:start w:w="110" w:type="dxa"/>
+              <w:bottom w:w="90" w:type="dxa"/>
+              <w:end w:w="110" w:type="dxa"/>
+            </w:tcMar>
+            <w:vAlign w:val="center"/>
+          </w:tcPr>
+          <w:p>
+            <w:pPr>
+              <w:spacing w:after="0"/>
+            </w:pPr>
+            <w:r>
+              <w:rPr>
+                <w:b/>
+                <w:color w:val="17365D"/>
+              </w:rPr>
+              <w:t>Starting paper</w:t>
+            </w:r>
+          </w:p>
+        </w:tc>
+        <w:tc>
+          <w:tcPr>
+            <w:tcW w:type="dxa" w:w="7704"/>
+            <w:shd w:fill="FFFFFF"/>
+            <w:tcMar>
+              <w:top w:w="90" w:type="dxa"/>
+              <w:start w:w="110" w:type="dxa"/>
+              <w:bottom w:w="90" w:type="dxa"/>
+              <w:end w:w="110" w:type="dxa"/>
+            </w:tcMar>
+            <w:vAlign w:val="center"/>
+          </w:tcPr>
+          <w:p>
+            <w:pPr>
+              <w:spacing w:after="0"/>
+            </w:pPr>
+            <w:r>
+              <w:t xml:space="preserve">Zhang et al., </w:t>
+            </w:r>
+            <w:hyperlink r:id="rId75">
+              <w:r>
+                <w:rPr>
+                  <w:color w:val="2F5597"/>
+                  <w:u w:val="single"/>
+                </w:rPr>
+                <w:t>TF-C</w:t>
+              </w:r>
+            </w:hyperlink>
+            <w:r>
+              <w:t xml:space="preserve">, NeurIPS 2022 — </w:t>
+            </w:r>
+            <w:hyperlink r:id="rId52">
+              <w:r>
+                <w:rPr>
+                  <w:color w:val="2F5597"/>
+                  <w:u w:val="single"/>
+                </w:rPr>
+                <w:t>official code</w:t>
+              </w:r>
+            </w:hyperlink>
+          </w:p>
+        </w:tc>
+      </w:tr>
+    </w:tbl>
+    <w:p>
+      <w:pPr>
+        <w:spacing w:after="0"/>
+      </w:pPr>
     </w:p>
     <w:p>
       <w:pPr>
-        <w:spacing w:before="0" w:after="100" w:line="254" w:lineRule="auto"/>
-      </w:pPr>
-      <w:r>
-        <w:t>A vision foundation model is an image encoder pretrained on a large image collection and reused for later tasks. Vision Transformers divide an image into patches and learn a feature vector for each patch. Self-supervised models such as DINO learn these features without class labels.</w:t>
+        <w:spacing w:before="80" w:after="100" w:line="254" w:lineRule="auto"/>
+      </w:pPr>
+      <w:r>
+        <w:rPr>
+          <w:b/>
+          <w:color w:val="25313C"/>
+        </w:rPr>
+        <w:t xml:space="preserve">What you will do. </w:t>
+      </w:r>
+      <w:r>
+        <w:t>Use Mamba as the temporal encoder in TF-C, which learns jointly from time- and frequency-domain views. Test whether the resulting representation transfers between bearing operating conditions when only a small labelled set is available.</w:t>
       </w:r>
     </w:p>
     <w:p>
@@ -9924,7 +10582,14 @@
         <w:spacing w:before="0" w:after="100" w:line="254" w:lineRule="auto"/>
       </w:pPr>
       <w:r>
-        <w:t>Students do not train a foundation model from scratch. In industrial anomaly detection, a frozen encoder can compare a test image with known normal images and identify unusual patches. An adapter can instead tune the encoder to the appearance of the normal training images without using defect examples.</w:t>
+        <w:rPr>
+          <w:b/>
+          <w:color w:val="25313C"/>
+        </w:rPr>
+        <w:t xml:space="preserve">Data. </w:t>
+      </w:r>
+      <w:r>
+        <w:t>The official Paderborn archive contains vibration, motor current, speed, torque and radial load for six healthy, twelve artificially damaged and fourteen naturally damaged bearings. Begin with the processed FD-A and FD-B subsets provided through the TF-C repository. For the final evaluation, group the split by physical bearing or recording so overlapping windows cannot occur in both training and test sets.</w:t>
       </w:r>
     </w:p>
     <w:p>
@@ -9932,42 +10597,735 @@
         <w:spacing w:before="0" w:after="100" w:line="254" w:lineRule="auto"/>
       </w:pPr>
       <w:r>
-        <w:t>MVTec training sets contain normal images only; real test defects cannot be used to train or tune the model. Frozen features, parameter-efficient adaptation and full fine-tuning are comparable only when they use the same training information and objective.</w:t>
+        <w:rPr>
+          <w:b/>
+          <w:color w:val="25313C"/>
+        </w:rPr>
+        <w:t xml:space="preserve">Methods and code. </w:t>
+      </w:r>
+      <w:r>
+        <w:t xml:space="preserve">Start from the </w:t>
+      </w:r>
+      <w:hyperlink r:id="rId52">
+        <w:r>
+          <w:rPr>
+            <w:color w:val="2F5597"/>
+            <w:u w:val="single"/>
+          </w:rPr>
+          <w:t>TF-C implementation</w:t>
+        </w:r>
+      </w:hyperlink>
+      <w:r>
+        <w:t xml:space="preserve"> and replace its time-domain CNN or Transformer with a compact </w:t>
+      </w:r>
+      <w:hyperlink r:id="rId76">
+        <w:r>
+          <w:rPr>
+            <w:color w:val="2F5597"/>
+            <w:u w:val="single"/>
+          </w:rPr>
+          <w:t>Mamba</w:t>
+        </w:r>
+      </w:hyperlink>
+      <w:r>
+        <w:t xml:space="preserve"> encoder. Retain the time–frequency contrastive objective and use a linear or small multilayer classification head.</w:t>
       </w:r>
     </w:p>
     <w:p>
       <w:pPr>
-        <w:pStyle w:val="Heading3"/>
-      </w:pPr>
-      <w:r>
-        <w:t>Three ways to adapt a pretrained backbone</w:t>
+        <w:spacing w:before="0" w:after="100" w:line="254" w:lineRule="auto"/>
+      </w:pPr>
+      <w:r>
+        <w:rPr>
+          <w:b/>
+          <w:color w:val="25313C"/>
+        </w:rPr>
+        <w:t xml:space="preserve">Baselines and evaluation. </w:t>
+      </w:r>
+      <w:r>
+        <w:t>Compare the original TF-C encoder, supervised 1-D CNN, supervised Mamba, random-frozen Mamba, frozen TF-C–Mamba and fine-tuned TF-C–Mamba. Report macro-F1, balanced accuracy, per-class recall and at least three seeds. The primary test is transfer to a different operating condition; report several labelled-example budgets and separate results for previously observed and unseen bearings where the data permit.</w:t>
       </w:r>
     </w:p>
     <w:p>
       <w:pPr>
-        <w:spacing w:before="0" w:after="80" w:line="254" w:lineRule="auto"/>
-      </w:pPr>
-      <w:r>
-        <w:t>Freeze it and score distances from normal reference patches. Adapt it efficiently by training small LoRA or adapter modules. Fine-tune it by updating the complete encoder. In this project, adaptation uses a self-supervised consistency objective on normal images only.</w:t>
+        <w:spacing w:before="0" w:after="100" w:line="254" w:lineRule="auto"/>
+      </w:pPr>
+      <w:r>
+        <w:rPr>
+          <w:b/>
+          <w:color w:val="25313C"/>
+        </w:rPr>
+        <w:t xml:space="preserve">Practical notes. </w:t>
+      </w:r>
+      <w:r>
+        <w:t>The public code and processed data provide a complete starting pipeline, but the older TF-C dependencies may need updating. Test the Mamba environment during the first project week. The raw data are several gigabytes and are needed only for the MSc signal-processing extensions.</w:t>
       </w:r>
     </w:p>
     <w:p>
       <w:pPr>
-        <w:pStyle w:val="Heading2"/>
-      </w:pPr>
-      <w:r>
-        <w:t>Learn first and find data</w:t>
+        <w:pStyle w:val="Heading3"/>
+      </w:pPr>
+      <w:r>
+        <w:t>Bachelor scope</w:t>
       </w:r>
     </w:p>
     <w:p>
       <w:pPr>
+        <w:spacing w:before="0" w:after="100" w:line="254" w:lineRule="auto"/>
+      </w:pPr>
+      <w:r>
+        <w:rPr>
+          <w:b/>
+        </w:rPr>
+        <w:t>Bachelor research question.</w:t>
+      </w:r>
+      <w:r>
+        <w:t xml:space="preserve"> </w:t>
+      </w:r>
+      <w:r>
+        <w:rPr>
+          <w:b/>
+        </w:rPr>
+        <w:t>Under the same TF-C objective, does a compact Mamba encoder improve cross-condition classification or computational efficiency over the existing encoder?</w:t>
+      </w:r>
+      <w:r>
+        <w:t xml:space="preserve"> Use the processed FD-A and FD-B data, fixed augmentations and identical splits. Compare accuracy, macro-F1, training time and memory without proposing a new pretraining objective.</w:t>
+      </w:r>
+    </w:p>
+    <w:p>
+      <w:pPr>
+        <w:pStyle w:val="Heading3"/>
+      </w:pPr>
+      <w:r>
+        <w:t>Master scope</w:t>
+      </w:r>
+    </w:p>
+    <w:p>
+      <w:pPr>
+        <w:spacing w:before="0" w:after="100" w:line="254" w:lineRule="auto"/>
+      </w:pPr>
+      <w:r>
+        <w:rPr>
+          <w:b/>
+        </w:rPr>
+        <w:t>Master research question.</w:t>
+      </w:r>
+      <w:r>
+        <w:t xml:space="preserve"> </w:t>
+      </w:r>
+      <w:r>
+        <w:rPr>
+          <w:b/>
+        </w:rPr>
+        <w:t>Can bearing-specific time–frequency views improve the transfer of Mamba representations across operating conditions and unseen bearings?</w:t>
+      </w:r>
+      <w:r>
+        <w:t xml:space="preserve"> Develop one process-informed view, such as an envelope-spectrum view centred on bearing fault frequencies, an order-normalised view or a positive pair drawn from the same bearing under different conditions. Compare it with the original TF-C augmentations and ablate the view construction.</w:t>
+      </w:r>
+    </w:p>
+    <w:p>
+      <w:r>
+        <w:br w:type="page"/>
+      </w:r>
+    </w:p>
+    <w:p>
+      <w:pPr>
+        <w:pStyle w:val="Heading2"/>
+        <w:spacing w:after="140"/>
+      </w:pPr>
+      <w:r>
+        <w:t>Project 3.7  Correlation-graph Mamba for order-robust multivariate forecasting</w:t>
+      </w:r>
+    </w:p>
+    <w:tbl>
+      <w:tblPr>
+        <w:tblW w:type="auto" w:w="0"/>
+        <w:jc w:val="center"/>
+        <w:tblLayout w:type="fixed"/>
+        <w:tblLook w:firstColumn="1" w:firstRow="1" w:lastColumn="0" w:lastRow="0" w:noHBand="0" w:noVBand="1" w:val="04A0"/>
+        <w:tblBorders>
+          <w:top w:val="single" w:sz="5" w:space="0" w:color="D9E0E6"/>
+          <w:left w:val="single" w:sz="5" w:space="0" w:color="D9E0E6"/>
+          <w:bottom w:val="single" w:sz="5" w:space="0" w:color="D9E0E6"/>
+          <w:right w:val="single" w:sz="5" w:space="0" w:color="D9E0E6"/>
+          <w:insideH w:val="single" w:sz="5" w:space="0" w:color="D9E0E6"/>
+          <w:insideV w:val="single" w:sz="5" w:space="0" w:color="D9E0E6"/>
+        </w:tblBorders>
+      </w:tblPr>
+      <w:tblGrid>
+        <w:gridCol w:w="1944"/>
+        <w:gridCol w:w="7704"/>
+      </w:tblGrid>
+      <w:tr>
+        <w:trPr>
+          <w:cantSplit/>
+        </w:trPr>
+        <w:tc>
+          <w:tcPr>
+            <w:tcW w:type="dxa" w:w="1944"/>
+            <w:shd w:fill="EAF2F8"/>
+            <w:tcMar>
+              <w:top w:w="90" w:type="dxa"/>
+              <w:start w:w="110" w:type="dxa"/>
+              <w:bottom w:w="90" w:type="dxa"/>
+              <w:end w:w="110" w:type="dxa"/>
+            </w:tcMar>
+            <w:vAlign w:val="center"/>
+          </w:tcPr>
+          <w:p>
+            <w:pPr>
+              <w:spacing w:after="0"/>
+            </w:pPr>
+            <w:r>
+              <w:rPr>
+                <w:b/>
+                <w:color w:val="17365D"/>
+              </w:rPr>
+              <w:t>Task</w:t>
+            </w:r>
+          </w:p>
+        </w:tc>
+        <w:tc>
+          <w:tcPr>
+            <w:tcW w:type="dxa" w:w="7704"/>
+            <w:shd w:fill="FFFFFF"/>
+            <w:tcMar>
+              <w:top w:w="90" w:type="dxa"/>
+              <w:start w:w="110" w:type="dxa"/>
+              <w:bottom w:w="90" w:type="dxa"/>
+              <w:end w:w="110" w:type="dxa"/>
+            </w:tcMar>
+            <w:vAlign w:val="center"/>
+          </w:tcPr>
+          <w:p>
+            <w:pPr>
+              <w:spacing w:after="0"/>
+            </w:pPr>
+            <w:r>
+              <w:t>Multivariate time-series forecasting</w:t>
+            </w:r>
+          </w:p>
+        </w:tc>
+      </w:tr>
+      <w:tr>
+        <w:trPr>
+          <w:cantSplit/>
+        </w:trPr>
+        <w:tc>
+          <w:tcPr>
+            <w:tcW w:type="dxa" w:w="1944"/>
+            <w:shd w:fill="EAF2F8"/>
+            <w:tcMar>
+              <w:top w:w="90" w:type="dxa"/>
+              <w:start w:w="110" w:type="dxa"/>
+              <w:bottom w:w="90" w:type="dxa"/>
+              <w:end w:w="110" w:type="dxa"/>
+            </w:tcMar>
+            <w:vAlign w:val="center"/>
+          </w:tcPr>
+          <w:p>
+            <w:pPr>
+              <w:spacing w:after="0"/>
+            </w:pPr>
+            <w:r>
+              <w:rPr>
+                <w:b/>
+                <w:color w:val="17365D"/>
+              </w:rPr>
+              <w:t>Recommended level</w:t>
+            </w:r>
+          </w:p>
+        </w:tc>
+        <w:tc>
+          <w:tcPr>
+            <w:tcW w:type="dxa" w:w="7704"/>
+            <w:shd w:fill="F4F6F8"/>
+            <w:tcMar>
+              <w:top w:w="90" w:type="dxa"/>
+              <w:start w:w="110" w:type="dxa"/>
+              <w:bottom w:w="90" w:type="dxa"/>
+              <w:end w:w="110" w:type="dxa"/>
+            </w:tcMar>
+            <w:vAlign w:val="center"/>
+          </w:tcPr>
+          <w:p>
+            <w:pPr>
+              <w:spacing w:after="0"/>
+            </w:pPr>
+            <w:r>
+              <w:t>MSc preferred; BSc evaluation version</w:t>
+            </w:r>
+          </w:p>
+        </w:tc>
+      </w:tr>
+      <w:tr>
+        <w:trPr>
+          <w:cantSplit/>
+        </w:trPr>
+        <w:tc>
+          <w:tcPr>
+            <w:tcW w:type="dxa" w:w="1944"/>
+            <w:shd w:fill="EAF2F8"/>
+            <w:tcMar>
+              <w:top w:w="90" w:type="dxa"/>
+              <w:start w:w="110" w:type="dxa"/>
+              <w:bottom w:w="90" w:type="dxa"/>
+              <w:end w:w="110" w:type="dxa"/>
+            </w:tcMar>
+            <w:vAlign w:val="center"/>
+          </w:tcPr>
+          <w:p>
+            <w:pPr>
+              <w:spacing w:after="0"/>
+            </w:pPr>
+            <w:r>
+              <w:rPr>
+                <w:b/>
+                <w:color w:val="17365D"/>
+              </w:rPr>
+              <w:t>Compute</w:t>
+            </w:r>
+          </w:p>
+        </w:tc>
+        <w:tc>
+          <w:tcPr>
+            <w:tcW w:type="dxa" w:w="7704"/>
+            <w:shd w:fill="FFFFFF"/>
+            <w:tcMar>
+              <w:top w:w="90" w:type="dxa"/>
+              <w:start w:w="110" w:type="dxa"/>
+              <w:bottom w:w="90" w:type="dxa"/>
+              <w:end w:w="110" w:type="dxa"/>
+            </w:tcMar>
+            <w:vAlign w:val="center"/>
+          </w:tcPr>
+          <w:p>
+            <w:pPr>
+              <w:spacing w:after="0"/>
+            </w:pPr>
+            <w:r>
+              <w:t>Light to moderate on Weather; moderate on Electricity</w:t>
+            </w:r>
+          </w:p>
+        </w:tc>
+      </w:tr>
+      <w:tr>
+        <w:trPr>
+          <w:cantSplit/>
+        </w:trPr>
+        <w:tc>
+          <w:tcPr>
+            <w:tcW w:type="dxa" w:w="1944"/>
+            <w:shd w:fill="EAF2F8"/>
+            <w:tcMar>
+              <w:top w:w="90" w:type="dxa"/>
+              <w:start w:w="110" w:type="dxa"/>
+              <w:bottom w:w="90" w:type="dxa"/>
+              <w:end w:w="110" w:type="dxa"/>
+            </w:tcMar>
+            <w:vAlign w:val="center"/>
+          </w:tcPr>
+          <w:p>
+            <w:pPr>
+              <w:spacing w:after="0"/>
+            </w:pPr>
+            <w:r>
+              <w:rPr>
+                <w:b/>
+                <w:color w:val="17365D"/>
+              </w:rPr>
+              <w:t>Data</w:t>
+            </w:r>
+          </w:p>
+        </w:tc>
+        <w:tc>
+          <w:tcPr>
+            <w:tcW w:type="dxa" w:w="7704"/>
+            <w:shd w:fill="F4F6F8"/>
+            <w:tcMar>
+              <w:top w:w="90" w:type="dxa"/>
+              <w:start w:w="110" w:type="dxa"/>
+              <w:bottom w:w="90" w:type="dxa"/>
+              <w:end w:w="110" w:type="dxa"/>
+            </w:tcMar>
+            <w:vAlign w:val="center"/>
+          </w:tcPr>
+          <w:p>
+            <w:pPr>
+              <w:spacing w:after="0"/>
+            </w:pPr>
+            <w:hyperlink r:id="rId77">
+              <w:r>
+                <w:rPr>
+                  <w:color w:val="2F5597"/>
+                  <w:u w:val="single"/>
+                </w:rPr>
+                <w:t>Weather and Electricity</w:t>
+              </w:r>
+            </w:hyperlink>
+            <w:r>
+              <w:t xml:space="preserve"> — public forecasting benchmarks with 21 and 321 channels</w:t>
+            </w:r>
+          </w:p>
+        </w:tc>
+      </w:tr>
+      <w:tr>
+        <w:trPr>
+          <w:cantSplit/>
+        </w:trPr>
+        <w:tc>
+          <w:tcPr>
+            <w:tcW w:type="dxa" w:w="1944"/>
+            <w:shd w:fill="EAF2F8"/>
+            <w:tcMar>
+              <w:top w:w="90" w:type="dxa"/>
+              <w:start w:w="110" w:type="dxa"/>
+              <w:bottom w:w="90" w:type="dxa"/>
+              <w:end w:w="110" w:type="dxa"/>
+            </w:tcMar>
+            <w:vAlign w:val="center"/>
+          </w:tcPr>
+          <w:p>
+            <w:pPr>
+              <w:spacing w:after="0"/>
+            </w:pPr>
+            <w:r>
+              <w:rPr>
+                <w:b/>
+                <w:color w:val="17365D"/>
+              </w:rPr>
+              <w:t>Starting paper</w:t>
+            </w:r>
+          </w:p>
+        </w:tc>
+        <w:tc>
+          <w:tcPr>
+            <w:tcW w:type="dxa" w:w="7704"/>
+            <w:shd w:fill="FFFFFF"/>
+            <w:tcMar>
+              <w:top w:w="90" w:type="dxa"/>
+              <w:start w:w="110" w:type="dxa"/>
+              <w:bottom w:w="90" w:type="dxa"/>
+              <w:end w:w="110" w:type="dxa"/>
+            </w:tcMar>
+            <w:vAlign w:val="center"/>
+          </w:tcPr>
+          <w:p>
+            <w:pPr>
+              <w:spacing w:after="0"/>
+            </w:pPr>
+            <w:r>
+              <w:t xml:space="preserve">Cai et al., </w:t>
+            </w:r>
+            <w:hyperlink r:id="rId78">
+              <w:r>
+                <w:rPr>
+                  <w:color w:val="2F5597"/>
+                  <w:u w:val="single"/>
+                </w:rPr>
+                <w:t>MambaTS</w:t>
+              </w:r>
+            </w:hyperlink>
+            <w:r>
+              <w:t xml:space="preserve"> — </w:t>
+            </w:r>
+            <w:hyperlink r:id="rId79">
+              <w:r>
+                <w:rPr>
+                  <w:color w:val="2F5597"/>
+                  <w:u w:val="single"/>
+                </w:rPr>
+                <w:t>MIT-licensed code</w:t>
+              </w:r>
+            </w:hyperlink>
+          </w:p>
+        </w:tc>
+      </w:tr>
+    </w:tbl>
+    <w:p>
+      <w:pPr>
+        <w:spacing w:after="0"/>
+      </w:pPr>
+    </w:p>
+    <w:p>
+      <w:pPr>
+        <w:spacing w:before="80" w:after="100" w:line="254" w:lineRule="auto"/>
+      </w:pPr>
+      <w:r>
+        <w:rPr>
+          <w:b/>
+          <w:color w:val="25313C"/>
+        </w:rPr>
+        <w:t xml:space="preserve">What you will do. </w:t>
+      </w:r>
+      <w:r>
+        <w:t>Represent each signal channel as a graph node, exchange information between correlated channels, and then use a shared Mamba encoder to model each node through time. Test whether explicit channel structure improves forecasting and reduces sensitivity to arbitrary channel order.</w:t>
+      </w:r>
+    </w:p>
+    <w:p>
+      <w:pPr>
+        <w:spacing w:before="0" w:after="100" w:line="254" w:lineRule="auto"/>
+      </w:pPr>
+      <w:r>
+        <w:rPr>
+          <w:b/>
+          <w:color w:val="25313C"/>
+        </w:rPr>
+        <w:t xml:space="preserve">Data. </w:t>
+      </w:r>
+      <w:r>
+        <w:t xml:space="preserve">Develop the method on Weather, which has 21 meteorological variables and 52,696 ten-minute observations. Confirm the result on Electricity, which contains 321 hourly electricity-demand series and 26,304 observations. Use chronological splits and fit scaling, correlations and graph thresholds on the training period only. The datasets and scripts are available through </w:t>
+      </w:r>
+      <w:hyperlink r:id="rId77">
+        <w:r>
+          <w:rPr>
+            <w:color w:val="2F5597"/>
+            <w:u w:val="single"/>
+          </w:rPr>
+          <w:t>Autoformer</w:t>
+        </w:r>
+      </w:hyperlink>
+      <w:r>
+        <w:t xml:space="preserve">; </w:t>
+      </w:r>
+      <w:hyperlink r:id="rId80">
+        <w:r>
+          <w:rPr>
+            <w:color w:val="2F5597"/>
+            <w:u w:val="single"/>
+          </w:rPr>
+          <w:t>OpenTS</w:t>
+        </w:r>
+      </w:hyperlink>
+      <w:r>
+        <w:t xml:space="preserve"> documents their dimensions and standard protocol.</w:t>
+      </w:r>
+    </w:p>
+    <w:p>
+      <w:pPr>
+        <w:spacing w:before="0" w:after="100" w:line="254" w:lineRule="auto"/>
+      </w:pPr>
+      <w:r>
+        <w:rPr>
+          <w:b/>
+          <w:color w:val="25313C"/>
+        </w:rPr>
+        <w:t xml:space="preserve">Methods and code. </w:t>
+      </w:r>
+      <w:r>
+        <w:t xml:space="preserve">Use </w:t>
+      </w:r>
+      <w:hyperlink r:id="rId79">
+        <w:r>
+          <w:rPr>
+            <w:color w:val="2F5597"/>
+            <w:u w:val="single"/>
+          </w:rPr>
+          <w:t>MambaTS</w:t>
+        </w:r>
+      </w:hyperlink>
+      <w:r>
+        <w:t xml:space="preserve"> as the main code base and </w:t>
+      </w:r>
+      <w:hyperlink r:id="rId81">
+        <w:r>
+          <w:rPr>
+            <w:color w:val="2F5597"/>
+            <w:u w:val="single"/>
+          </w:rPr>
+          <w:t>S-Mamba</w:t>
+        </w:r>
+      </w:hyperlink>
+      <w:r>
+        <w:t xml:space="preserve"> and </w:t>
+      </w:r>
+      <w:hyperlink r:id="rId82">
+        <w:r>
+          <w:rPr>
+            <w:color w:val="2F5597"/>
+            <w:u w:val="single"/>
+          </w:rPr>
+          <w:t>C-Mamba</w:t>
+        </w:r>
+      </w:hyperlink>
+      <w:r>
+        <w:t xml:space="preserve"> as channel-modelling references. Build a sparse top-*k* correlation graph from the training data. At each time step or patch, apply a shared GCN, GraphSAGE or GAT layer across channels; then apply the same temporal Mamba encoder to every node and a shared forecasting head.</w:t>
+      </w:r>
+    </w:p>
+    <w:p>
+      <w:pPr>
+        <w:spacing w:before="0" w:after="100" w:line="254" w:lineRule="auto"/>
+      </w:pPr>
+      <w:r>
+        <w:rPr>
+          <w:b/>
+          <w:color w:val="25313C"/>
+        </w:rPr>
+        <w:t xml:space="preserve">Baselines and evaluation. </w:t>
+      </w:r>
+      <w:r>
+        <w:t xml:space="preserve">Compare seasonal naive, </w:t>
+      </w:r>
+      <w:hyperlink r:id="rId66">
+        <w:r>
+          <w:rPr>
+            <w:color w:val="2F5597"/>
+            <w:u w:val="single"/>
+          </w:rPr>
+          <w:t>DLinear</w:t>
+        </w:r>
+      </w:hyperlink>
+      <w:r>
+        <w:t>, channel-independent Mamba, MambaTS and one existing channel-aware Mamba model. Graph controls must include identity, random and shuffled-correlation adjacency. Report MSE and MAE at standard horizons, three seeds, parameter count, training time and memory. Consistently permute the input channels, graph and outputs to measure order sensitivity, and mask channels at test time to measure robustness.</w:t>
+      </w:r>
+    </w:p>
+    <w:p>
+      <w:pPr>
+        <w:spacing w:before="0" w:after="100" w:line="254" w:lineRule="auto"/>
+      </w:pPr>
+      <w:r>
+        <w:rPr>
+          <w:b/>
+          <w:color w:val="25313C"/>
+        </w:rPr>
+        <w:t xml:space="preserve">Practical notes. </w:t>
+      </w:r>
+      <w:r>
+        <w:t>Use Weather for development and a sparse graph for Electricity. Correlation describes statistical association rather than a physical or causal link. A consistent relabelling of nodes, adjacency and outputs should not materially change a correctly implemented shared graph–Mamba model.</w:t>
+      </w:r>
+    </w:p>
+    <w:p>
+      <w:pPr>
+        <w:pStyle w:val="Heading3"/>
+      </w:pPr>
+      <w:r>
+        <w:t>Bachelor scope</w:t>
+      </w:r>
+    </w:p>
+    <w:p>
+      <w:pPr>
+        <w:spacing w:before="0" w:after="100" w:line="254" w:lineRule="auto"/>
+      </w:pPr>
+      <w:r>
+        <w:rPr>
+          <w:b/>
+        </w:rPr>
+        <w:t>Bachelor research question.</w:t>
+      </w:r>
+      <w:r>
+        <w:t xml:space="preserve"> </w:t>
+      </w:r>
+      <w:r>
+        <w:rPr>
+          <w:b/>
+        </w:rPr>
+        <w:t>How sensitive are existing Mamba forecasters to channel order, and do their channel-interaction mechanisms improve over channel-independent Mamba?</w:t>
+      </w:r>
+      <w:r>
+        <w:t xml:space="preserve"> Reproduce MambaTS or S-Mamba on Weather and compare channel-independent and channel-aware variants under channel permutations and missing-channel tests. A new graph architecture is not required.</w:t>
+      </w:r>
+    </w:p>
+    <w:p>
+      <w:pPr>
+        <w:pStyle w:val="Heading3"/>
+      </w:pPr>
+      <w:r>
+        <w:t>Master scope</w:t>
+      </w:r>
+    </w:p>
+    <w:p>
+      <w:pPr>
+        <w:spacing w:before="0" w:after="100" w:line="254" w:lineRule="auto"/>
+      </w:pPr>
+      <w:r>
+        <w:rPr>
+          <w:b/>
+        </w:rPr>
+        <w:t>Master research question.</w:t>
+      </w:r>
+      <w:r>
+        <w:t xml:space="preserve"> </w:t>
+      </w:r>
+      <w:r>
+        <w:rPr>
+          <w:b/>
+        </w:rPr>
+        <w:t>Can a sparse correlation-graph channel mixer improve forecasting and reduce sensitivity to arbitrary variable ordering compared with existing Mamba channel-mixing methods?</w:t>
+      </w:r>
+      <w:r>
+        <w:t xml:space="preserve"> Implement the graph module, match model capacity, and ablate graph type, sign handling, sparsity and message-passing depth on Weather and Electricity. A window-dependent graph is an optional extension after the fixed-graph study.</w:t>
+      </w:r>
+    </w:p>
+    <w:p>
+      <w:r>
+        <w:br w:type="page"/>
+      </w:r>
+    </w:p>
+    <w:p>
+      <w:pPr>
+        <w:pStyle w:val="Heading1"/>
+      </w:pPr>
+      <w:r>
+        <w:t>Category 4  Deep-learning vision models and applications</w:t>
+      </w:r>
+    </w:p>
+    <w:p>
+      <w:pPr>
+        <w:spacing w:before="0" w:after="100" w:line="254" w:lineRule="auto"/>
+      </w:pPr>
+      <w:r>
+        <w:t>A vision foundation model is an image encoder pretrained on a large image collection and reused for later tasks. Vision Transformers divide an image into patches and learn a feature vector for each patch. Self-supervised models such as DINO learn these features without class labels.</w:t>
+      </w:r>
+    </w:p>
+    <w:p>
+      <w:pPr>
+        <w:spacing w:before="0" w:after="100" w:line="254" w:lineRule="auto"/>
+      </w:pPr>
+      <w:r>
+        <w:t>Students do not train a foundation model from scratch. In industrial anomaly detection, a frozen encoder can compare a test image with known normal images and identify unusual patches. An adapter can instead tune the encoder to the appearance of the normal training images without using defect examples.</w:t>
+      </w:r>
+    </w:p>
+    <w:p>
+      <w:pPr>
+        <w:spacing w:before="0" w:after="100" w:line="254" w:lineRule="auto"/>
+      </w:pPr>
+      <w:r>
+        <w:t>MVTec training sets contain normal images only; real test defects cannot be used to train or tune the model. Frozen features, parameter-efficient adaptation and full fine-tuning are comparable only when they use the same training information and objective.</w:t>
+      </w:r>
+    </w:p>
+    <w:p>
+      <w:pPr>
+        <w:pStyle w:val="Heading3"/>
+      </w:pPr>
+      <w:r>
+        <w:t>Three ways to adapt a pretrained backbone</w:t>
+      </w:r>
+    </w:p>
+    <w:p>
+      <w:pPr>
+        <w:spacing w:before="0" w:after="80" w:line="254" w:lineRule="auto"/>
+      </w:pPr>
+      <w:r>
+        <w:t>Freeze it and score distances from normal reference patches. Adapt it efficiently by training small LoRA or adapter modules. Fine-tune it by updating the complete encoder. In this project, adaptation uses a self-supervised consistency objective on normal images only.</w:t>
+      </w:r>
+    </w:p>
+    <w:p>
+      <w:pPr>
+        <w:pStyle w:val="Heading2"/>
+      </w:pPr>
+      <w:r>
+        <w:t>Learn first and find data</w:t>
+      </w:r>
+    </w:p>
+    <w:p>
+      <w:pPr>
         <w:pStyle w:val="ListBullet"/>
         <w:spacing w:before="0" w:after="40" w:line="254" w:lineRule="auto"/>
       </w:pPr>
       <w:r>
         <w:t xml:space="preserve">Core reading: </w:t>
       </w:r>
-      <w:hyperlink r:id="rId75">
+      <w:hyperlink r:id="rId83">
         <w:r>
           <w:rPr>
             <w:color w:val="2F5597"/>
@@ -9979,7 +11337,7 @@
       <w:r>
         <w:t xml:space="preserve">, </w:t>
       </w:r>
-      <w:hyperlink r:id="rId76">
+      <w:hyperlink r:id="rId84">
         <w:r>
           <w:rPr>
             <w:color w:val="2F5597"/>
@@ -9991,7 +11349,7 @@
       <w:r>
         <w:t xml:space="preserve">, the </w:t>
       </w:r>
-      <w:hyperlink r:id="rId77">
+      <w:hyperlink r:id="rId85">
         <w:r>
           <w:rPr>
             <w:color w:val="2F5597"/>
@@ -10003,7 +11361,7 @@
       <w:r>
         <w:t xml:space="preserve">, and </w:t>
       </w:r>
-      <w:hyperlink r:id="rId78">
+      <w:hyperlink r:id="rId86">
         <w:r>
           <w:rPr>
             <w:color w:val="2F5597"/>
@@ -10015,7 +11373,7 @@
       <w:r>
         <w:t xml:space="preserve"> with its </w:t>
       </w:r>
-      <w:hyperlink r:id="rId79">
+      <w:hyperlink r:id="rId87">
         <w:r>
           <w:rPr>
             <w:color w:val="2F5597"/>
@@ -10036,7 +11394,7 @@
       <w:r>
         <w:t xml:space="preserve">Parameter-efficient adaptation: </w:t>
       </w:r>
-      <w:hyperlink r:id="rId80">
+      <w:hyperlink r:id="rId88">
         <w:r>
           <w:rPr>
             <w:color w:val="2F5597"/>
@@ -10048,7 +11406,7 @@
       <w:r>
         <w:t xml:space="preserve"> and the </w:t>
       </w:r>
-      <w:hyperlink r:id="rId81">
+      <w:hyperlink r:id="rId89">
         <w:r>
           <w:rPr>
             <w:color w:val="2F5597"/>
@@ -10069,7 +11427,7 @@
       <w:r>
         <w:t xml:space="preserve">Normal-only objectives: </w:t>
       </w:r>
-      <w:hyperlink r:id="rId75">
+      <w:hyperlink r:id="rId83">
         <w:r>
           <w:rPr>
             <w:color w:val="2F5597"/>
@@ -10081,7 +11439,7 @@
       <w:r>
         <w:t xml:space="preserve"> and </w:t>
       </w:r>
-      <w:hyperlink r:id="rId82">
+      <w:hyperlink r:id="rId90">
         <w:r>
           <w:rPr>
             <w:color w:val="2F5597"/>
@@ -10102,7 +11460,7 @@
       <w:r>
         <w:t xml:space="preserve">Data and model hubs: </w:t>
       </w:r>
-      <w:hyperlink r:id="rId83">
+      <w:hyperlink r:id="rId91">
         <w:r>
           <w:rPr>
             <w:color w:val="2F5597"/>
@@ -10114,7 +11472,7 @@
       <w:r>
         <w:t xml:space="preserve">, </w:t>
       </w:r>
-      <w:hyperlink r:id="rId84">
+      <w:hyperlink r:id="rId92">
         <w:r>
           <w:rPr>
             <w:color w:val="2F5597"/>
@@ -10126,7 +11484,7 @@
       <w:r>
         <w:t xml:space="preserve"> and </w:t>
       </w:r>
-      <w:hyperlink r:id="rId85">
+      <w:hyperlink r:id="rId93">
         <w:r>
           <w:rPr>
             <w:color w:val="2F5597"/>
@@ -10379,7 +11737,7 @@
             <w:pPr>
               <w:spacing w:after="0"/>
             </w:pPr>
-            <w:hyperlink r:id="rId83">
+            <w:hyperlink r:id="rId91">
               <w:r>
                 <w:rPr>
                   <w:color w:val="2F5597"/>
@@ -10442,7 +11800,7 @@
             <w:r>
               <w:t xml:space="preserve">Oquab et al., </w:t>
             </w:r>
-            <w:hyperlink r:id="rId76">
+            <w:hyperlink r:id="rId84">
               <w:r>
                 <w:rPr>
                   <w:color w:val="2F5597"/>
@@ -10489,7 +11847,7 @@
         </w:rPr>
         <w:t xml:space="preserve">Data. </w:t>
       </w:r>
-      <w:hyperlink r:id="rId83">
+      <w:hyperlink r:id="rId91">
         <w:r>
           <w:rPr>
             <w:color w:val="2F5597"/>
@@ -10501,7 +11859,7 @@
       <w:r>
         <w:t xml:space="preserve"> contains 5,354 images in 15 categories, with defect-free training images and labelled normal and defective test images. </w:t>
       </w:r>
-      <w:hyperlink r:id="rId86">
+      <w:hyperlink r:id="rId94">
         <w:r>
           <w:rPr>
             <w:color w:val="2F5597"/>
@@ -10537,7 +11895,7 @@
       <w:r>
         <w:t xml:space="preserve"> from the </w:t>
       </w:r>
-      <w:hyperlink r:id="rId77">
+      <w:hyperlink r:id="rId85">
         <w:r>
           <w:rPr>
             <w:color w:val="2F5597"/>
@@ -10549,7 +11907,7 @@
       <w:r>
         <w:t xml:space="preserve">. The frozen route follows </w:t>
       </w:r>
-      <w:hyperlink r:id="rId79">
+      <w:hyperlink r:id="rId87">
         <w:r>
           <w:rPr>
             <w:color w:val="2F5597"/>
@@ -10561,7 +11919,7 @@
       <w:r>
         <w:t xml:space="preserve">: store normal patch features and score each test patch by its distance to the memory bank. For the MSc route, keep a frozen DINOv2 teacher and train LoRA or adapters in a student model with </w:t>
       </w:r>
-      <w:hyperlink r:id="rId81">
+      <w:hyperlink r:id="rId89">
         <w:r>
           <w:rPr>
             <w:color w:val="2F5597"/>
@@ -10588,7 +11946,7 @@
       <w:r>
         <w:t xml:space="preserve">Compare frozen AnomalyDINO with </w:t>
       </w:r>
-      <w:hyperlink r:id="rId87">
+      <w:hyperlink r:id="rId95">
         <w:r>
           <w:rPr>
             <w:color w:val="2F5597"/>
@@ -10698,18 +12056,312 @@
     </w:p>
     <w:p>
       <w:pPr>
-        <w:pStyle w:val="Heading1"/>
-      </w:pPr>
-      <w:r>
-        <w:t>Category 5  Signal processing and deep-unfolded models</w:t>
-      </w:r>
+        <w:pStyle w:val="Heading2"/>
+        <w:spacing w:after="140"/>
+      </w:pPr>
+      <w:r>
+        <w:t>Project 4.2  Adapting DINOv3 for robust abdominal CT segmentation</w:t>
+      </w:r>
+    </w:p>
+    <w:tbl>
+      <w:tblPr>
+        <w:tblW w:type="auto" w:w="0"/>
+        <w:jc w:val="center"/>
+        <w:tblLayout w:type="fixed"/>
+        <w:tblLook w:firstColumn="1" w:firstRow="1" w:lastColumn="0" w:lastRow="0" w:noHBand="0" w:noVBand="1" w:val="04A0"/>
+        <w:tblBorders>
+          <w:top w:val="single" w:sz="5" w:space="0" w:color="D9E0E6"/>
+          <w:left w:val="single" w:sz="5" w:space="0" w:color="D9E0E6"/>
+          <w:bottom w:val="single" w:sz="5" w:space="0" w:color="D9E0E6"/>
+          <w:right w:val="single" w:sz="5" w:space="0" w:color="D9E0E6"/>
+          <w:insideH w:val="single" w:sz="5" w:space="0" w:color="D9E0E6"/>
+          <w:insideV w:val="single" w:sz="5" w:space="0" w:color="D9E0E6"/>
+        </w:tblBorders>
+      </w:tblPr>
+      <w:tblGrid>
+        <w:gridCol w:w="1944"/>
+        <w:gridCol w:w="7704"/>
+      </w:tblGrid>
+      <w:tr>
+        <w:trPr>
+          <w:cantSplit/>
+        </w:trPr>
+        <w:tc>
+          <w:tcPr>
+            <w:tcW w:type="dxa" w:w="1944"/>
+            <w:shd w:fill="EAF2F8"/>
+            <w:tcMar>
+              <w:top w:w="90" w:type="dxa"/>
+              <w:start w:w="110" w:type="dxa"/>
+              <w:bottom w:w="90" w:type="dxa"/>
+              <w:end w:w="110" w:type="dxa"/>
+            </w:tcMar>
+            <w:vAlign w:val="center"/>
+          </w:tcPr>
+          <w:p>
+            <w:pPr>
+              <w:spacing w:after="0"/>
+            </w:pPr>
+            <w:r>
+              <w:rPr>
+                <w:b/>
+                <w:color w:val="17365D"/>
+              </w:rPr>
+              <w:t>Task</w:t>
+            </w:r>
+          </w:p>
+        </w:tc>
+        <w:tc>
+          <w:tcPr>
+            <w:tcW w:type="dxa" w:w="7704"/>
+            <w:shd w:fill="FFFFFF"/>
+            <w:tcMar>
+              <w:top w:w="90" w:type="dxa"/>
+              <w:start w:w="110" w:type="dxa"/>
+              <w:bottom w:w="90" w:type="dxa"/>
+              <w:end w:w="110" w:type="dxa"/>
+            </w:tcMar>
+            <w:vAlign w:val="center"/>
+          </w:tcPr>
+          <w:p>
+            <w:pPr>
+              <w:spacing w:after="0"/>
+            </w:pPr>
+            <w:r>
+              <w:t>Abdominal-organ segmentation and robustness evaluation</w:t>
+            </w:r>
+          </w:p>
+        </w:tc>
+      </w:tr>
+      <w:tr>
+        <w:trPr>
+          <w:cantSplit/>
+        </w:trPr>
+        <w:tc>
+          <w:tcPr>
+            <w:tcW w:type="dxa" w:w="1944"/>
+            <w:shd w:fill="EAF2F8"/>
+            <w:tcMar>
+              <w:top w:w="90" w:type="dxa"/>
+              <w:start w:w="110" w:type="dxa"/>
+              <w:bottom w:w="90" w:type="dxa"/>
+              <w:end w:w="110" w:type="dxa"/>
+            </w:tcMar>
+            <w:vAlign w:val="center"/>
+          </w:tcPr>
+          <w:p>
+            <w:pPr>
+              <w:spacing w:after="0"/>
+            </w:pPr>
+            <w:r>
+              <w:rPr>
+                <w:b/>
+                <w:color w:val="17365D"/>
+              </w:rPr>
+              <w:t>Recommended level</w:t>
+            </w:r>
+          </w:p>
+        </w:tc>
+        <w:tc>
+          <w:tcPr>
+            <w:tcW w:type="dxa" w:w="7704"/>
+            <w:shd w:fill="F4F6F8"/>
+            <w:tcMar>
+              <w:top w:w="90" w:type="dxa"/>
+              <w:start w:w="110" w:type="dxa"/>
+              <w:bottom w:w="90" w:type="dxa"/>
+              <w:end w:w="110" w:type="dxa"/>
+            </w:tcMar>
+            <w:vAlign w:val="center"/>
+          </w:tcPr>
+          <w:p>
+            <w:pPr>
+              <w:spacing w:after="0"/>
+            </w:pPr>
+            <w:r>
+              <w:t>BSc or MSc</w:t>
+            </w:r>
+          </w:p>
+        </w:tc>
+      </w:tr>
+      <w:tr>
+        <w:trPr>
+          <w:cantSplit/>
+        </w:trPr>
+        <w:tc>
+          <w:tcPr>
+            <w:tcW w:type="dxa" w:w="1944"/>
+            <w:shd w:fill="EAF2F8"/>
+            <w:tcMar>
+              <w:top w:w="90" w:type="dxa"/>
+              <w:start w:w="110" w:type="dxa"/>
+              <w:bottom w:w="90" w:type="dxa"/>
+              <w:end w:w="110" w:type="dxa"/>
+            </w:tcMar>
+            <w:vAlign w:val="center"/>
+          </w:tcPr>
+          <w:p>
+            <w:pPr>
+              <w:spacing w:after="0"/>
+            </w:pPr>
+            <w:r>
+              <w:rPr>
+                <w:b/>
+                <w:color w:val="17365D"/>
+              </w:rPr>
+              <w:t>Compute</w:t>
+            </w:r>
+          </w:p>
+        </w:tc>
+        <w:tc>
+          <w:tcPr>
+            <w:tcW w:type="dxa" w:w="7704"/>
+            <w:shd w:fill="FFFFFF"/>
+            <w:tcMar>
+              <w:top w:w="90" w:type="dxa"/>
+              <w:start w:w="110" w:type="dxa"/>
+              <w:bottom w:w="90" w:type="dxa"/>
+              <w:end w:w="110" w:type="dxa"/>
+            </w:tcMar>
+            <w:vAlign w:val="center"/>
+          </w:tcPr>
+          <w:p>
+            <w:pPr>
+              <w:spacing w:after="0"/>
+            </w:pPr>
+            <w:r>
+              <w:t>Moderate for BSc and moderate to high for MSc; 16–40 GB GPU recommended</w:t>
+            </w:r>
+          </w:p>
+        </w:tc>
+      </w:tr>
+      <w:tr>
+        <w:trPr>
+          <w:cantSplit/>
+        </w:trPr>
+        <w:tc>
+          <w:tcPr>
+            <w:tcW w:type="dxa" w:w="1944"/>
+            <w:shd w:fill="EAF2F8"/>
+            <w:tcMar>
+              <w:top w:w="90" w:type="dxa"/>
+              <w:start w:w="110" w:type="dxa"/>
+              <w:bottom w:w="90" w:type="dxa"/>
+              <w:end w:w="110" w:type="dxa"/>
+            </w:tcMar>
+            <w:vAlign w:val="center"/>
+          </w:tcPr>
+          <w:p>
+            <w:pPr>
+              <w:spacing w:after="0"/>
+            </w:pPr>
+            <w:r>
+              <w:rPr>
+                <w:b/>
+                <w:color w:val="17365D"/>
+              </w:rPr>
+              <w:t>Data</w:t>
+            </w:r>
+          </w:p>
+        </w:tc>
+        <w:tc>
+          <w:tcPr>
+            <w:tcW w:type="dxa" w:w="7704"/>
+            <w:shd w:fill="F4F6F8"/>
+            <w:tcMar>
+              <w:top w:w="90" w:type="dxa"/>
+              <w:start w:w="110" w:type="dxa"/>
+              <w:bottom w:w="90" w:type="dxa"/>
+              <w:end w:w="110" w:type="dxa"/>
+            </w:tcMar>
+            <w:vAlign w:val="center"/>
+          </w:tcPr>
+          <w:p>
+            <w:pPr>
+              <w:spacing w:after="0"/>
+            </w:pPr>
+            <w:hyperlink r:id="rId96">
+              <w:r>
+                <w:rPr>
+                  <w:color w:val="2F5597"/>
+                  <w:u w:val="single"/>
+                </w:rPr>
+                <w:t>AMOS22</w:t>
+              </w:r>
+            </w:hyperlink>
+            <w:r>
+              <w:t xml:space="preserve"> — 500 abdominal CT volumes with voxel-level annotations of 15 organs</w:t>
+            </w:r>
+          </w:p>
+        </w:tc>
+      </w:tr>
+      <w:tr>
+        <w:trPr>
+          <w:cantSplit/>
+        </w:trPr>
+        <w:tc>
+          <w:tcPr>
+            <w:tcW w:type="dxa" w:w="1944"/>
+            <w:shd w:fill="EAF2F8"/>
+            <w:tcMar>
+              <w:top w:w="90" w:type="dxa"/>
+              <w:start w:w="110" w:type="dxa"/>
+              <w:bottom w:w="90" w:type="dxa"/>
+              <w:end w:w="110" w:type="dxa"/>
+            </w:tcMar>
+            <w:vAlign w:val="center"/>
+          </w:tcPr>
+          <w:p>
+            <w:pPr>
+              <w:spacing w:after="0"/>
+            </w:pPr>
+            <w:r>
+              <w:rPr>
+                <w:b/>
+                <w:color w:val="17365D"/>
+              </w:rPr>
+              <w:t>Starting paper</w:t>
+            </w:r>
+          </w:p>
+        </w:tc>
+        <w:tc>
+          <w:tcPr>
+            <w:tcW w:type="dxa" w:w="7704"/>
+            <w:shd w:fill="FFFFFF"/>
+            <w:tcMar>
+              <w:top w:w="90" w:type="dxa"/>
+              <w:start w:w="110" w:type="dxa"/>
+              <w:bottom w:w="90" w:type="dxa"/>
+              <w:end w:w="110" w:type="dxa"/>
+            </w:tcMar>
+            <w:vAlign w:val="center"/>
+          </w:tcPr>
+          <w:p>
+            <w:pPr>
+              <w:spacing w:after="0"/>
+            </w:pPr>
+          </w:p>
+        </w:tc>
+      </w:tr>
+    </w:tbl>
+    <w:p>
+      <w:pPr>
+        <w:spacing w:after="0"/>
+      </w:pPr>
     </w:p>
     <w:p>
       <w:pPr>
-        <w:spacing w:before="0" w:after="100" w:line="254" w:lineRule="auto"/>
-      </w:pPr>
-      <w:r>
-        <w:t>Many signal-processing methods repeat a fixed optimisation step until convergence. Algorithm unrolling, also called deep unfolding, turns a fixed number of those iterations into neural-network layers. The update equations determine the network structure, while selected algorithm parameters are learned from data.</w:t>
+        <w:spacing w:before="80" w:after="100" w:line="254" w:lineRule="auto"/>
+      </w:pPr>
+      <w:r>
+        <w:rPr>
+          <w:b/>
+          <w:color w:val="25313C"/>
+        </w:rPr>
+        <w:t xml:space="preserve">What you will do. </w:t>
+      </w:r>
+      <w:r>
+        <w:t>Use a pretrained DINOv3 vision model as the encoder of a medical-image segmentation system. The model will process axial slices from abdominal CT volumes, while a U-Net-style decoder will generate organ masks. You will compare frozen and adapted DINOv3 representations and determine how reliably they perform when image quality deteriorates.</w:t>
       </w:r>
     </w:p>
     <w:p>
@@ -10717,42 +12369,691 @@
         <w:spacing w:before="0" w:after="100" w:line="254" w:lineRule="auto"/>
       </w:pPr>
       <w:r>
-        <w:t>This differs from Category 3: the network is a truncated version of a known algorithm, not a general-purpose encoder. Evaluation must therefore test both numerical correctness and the downstream task. Faster execution alone is insufficient if the learned layers no longer perform the intended decomposition.</w:t>
+        <w:rPr>
+          <w:b/>
+          <w:color w:val="25313C"/>
+        </w:rPr>
+        <w:t xml:space="preserve">Project goal. </w:t>
+      </w:r>
+      <w:r>
+        <w:t>Determine whether features learned by DINOv3 from natural images can support abdominal-organ segmentation and whether parameter-efficient adaptation improves robustness to medical-image corruption without requiring full retraining of the foundation model.</w:t>
       </w:r>
     </w:p>
     <w:p>
       <w:pPr>
-        <w:pStyle w:val="Heading3"/>
-      </w:pPr>
-      <w:r>
-        <w:t>A Master-level category</w:t>
+        <w:spacing w:before="0" w:after="100" w:line="254" w:lineRule="auto"/>
+      </w:pPr>
+      <w:r>
+        <w:rPr>
+          <w:b/>
+          <w:color w:val="25313C"/>
+        </w:rPr>
+        <w:t xml:space="preserve">Data. </w:t>
+      </w:r>
+      <w:r>
+        <w:t>Use the CT portion of the AMOS22 dataset, which provides 3D abdominal scans with annotations for 15 organs. Convert each volume into axial slices or neighbouring-slice 2.5D inputs. All slices from one patient must remain in the same training, validation or test partition. Controlled test corruptions may include noise, blur, reduced resolution, contrast changes and intensity shifts.</w:t>
       </w:r>
     </w:p>
     <w:p>
       <w:pPr>
-        <w:spacing w:before="0" w:after="80" w:line="254" w:lineRule="auto"/>
-      </w:pPr>
-      <w:r>
-        <w:t>This category requires graduate-level optimisation and signal processing. The contribution is a justified change to the unrolled algorithm and a controlled comparison with the converged classical method.</w:t>
+        <w:spacing w:before="0" w:after="100" w:line="254" w:lineRule="auto"/>
+      </w:pPr>
+      <w:r>
+        <w:rPr>
+          <w:b/>
+          <w:color w:val="25313C"/>
+        </w:rPr>
+        <w:t xml:space="preserve">Methods and code. </w:t>
+      </w:r>
+      <w:r>
+        <w:t xml:space="preserve">Start with the pretrained DINOv3 ViT-S/16 backbone. Load the official weights through </w:t>
+      </w:r>
+      <w:hyperlink r:id="rId97">
+        <w:r>
+          <w:rPr>
+            <w:color w:val="2F5597"/>
+            <w:u w:val="single"/>
+          </w:rPr>
+          <w:t>Hugging Face</w:t>
+        </w:r>
+      </w:hyperlink>
+      <w:r>
+        <w:t xml:space="preserve"> or the official DINOv3 repository. Use a compact U-Net-style decoder that combines patch features from several transformer layers. Compare this model with a conventional 2D U-Net or nnU-Net baseline. The </w:t>
+      </w:r>
+      <w:hyperlink r:id="rId98">
+        <w:r>
+          <w:rPr>
+            <w:color w:val="2F5597"/>
+            <w:u w:val="single"/>
+          </w:rPr>
+          <w:t>MedDINOv3 repository</w:t>
+        </w:r>
+      </w:hyperlink>
+      <w:r>
+        <w:t xml:space="preserve"> provides an example of integrating DINOv3 with nnU-Net for medical segmentation.</w:t>
       </w:r>
     </w:p>
     <w:p>
       <w:pPr>
-        <w:pStyle w:val="Heading2"/>
-      </w:pPr>
-      <w:r>
-        <w:t>Learn first and find ideas</w:t>
+        <w:spacing w:before="0" w:after="100" w:line="254" w:lineRule="auto"/>
+      </w:pPr>
+      <w:r>
+        <w:rPr>
+          <w:b/>
+          <w:color w:val="25313C"/>
+        </w:rPr>
+        <w:t xml:space="preserve">Baselines and evaluation. </w:t>
+      </w:r>
+      <w:r>
+        <w:t>Compare a conventional U-Net, frozen DINOv3 with a trainable decoder, and the selected adaptation method. Use Dice as the primary metric and report HD95 as the boundary-error metric. Report performance separately for each organ and corruption type. Also report trainable parameters, GPU memory and training time. All models must use the same patient splits and corruption protocol.</w:t>
       </w:r>
     </w:p>
     <w:p>
       <w:pPr>
+        <w:spacing w:before="0" w:after="100" w:line="254" w:lineRule="auto"/>
+      </w:pPr>
+      <w:r>
+        <w:rPr>
+          <w:b/>
+          <w:color w:val="25313C"/>
+        </w:rPr>
+        <w:t xml:space="preserve">Practical notes. </w:t>
+      </w:r>
+      <w:r>
+        <w:t>DINOv3 is a 2D vision model, so this project uses slice-wise or 2.5D segmentation rather than direct 3D DINOv3 processing. Training DINOv3 from scratch is outside the project scope. Begin with ViT-S/16 and a frozen encoder before attempting LoRA or partial fine-tuning. Full end-to-end fine-tuning should be treated as an optional reference experiment only if sufficient GPU resources are available.</w:t>
+      </w:r>
+    </w:p>
+    <w:p>
+      <w:pPr>
+        <w:pStyle w:val="Heading3"/>
+      </w:pPr>
+      <w:r>
+        <w:t>Bachelor scope</w:t>
+      </w:r>
+    </w:p>
+    <w:p>
+      <w:pPr>
+        <w:spacing w:before="0" w:after="100" w:line="254" w:lineRule="auto"/>
+      </w:pPr>
+      <w:r>
+        <w:rPr>
+          <w:b/>
+        </w:rPr>
+        <w:t>Bachelor research question.</w:t>
+      </w:r>
+      <w:r>
+        <w:t xml:space="preserve"> </w:t>
+      </w:r>
+      <w:r>
+        <w:rPr>
+          <w:b/>
+        </w:rPr>
+        <w:t>How robust are frozen DINOv3 features for abdominal-organ segmentation when CT image quality deteriorates?</w:t>
+      </w:r>
+    </w:p>
+    <w:p>
+      <w:pPr>
+        <w:spacing w:before="0" w:after="100" w:line="254" w:lineRule="auto"/>
+      </w:pPr>
+      <w:r>
+        <w:t>Keep the DINOv3 encoder frozen and train only the segmentation decoder. Compare frozen DINOv3 with a conventional 2D U-Net on clean images and predefined corruption levels. Analyse which organs and image conditions cause the largest performance loss. No adaptation or full backbone fine-tuning is required.</w:t>
+      </w:r>
+    </w:p>
+    <w:p>
+      <w:pPr>
+        <w:pStyle w:val="Heading3"/>
+      </w:pPr>
+      <w:r>
+        <w:t>Master scope</w:t>
+      </w:r>
+    </w:p>
+    <w:p>
+      <w:pPr>
+        <w:spacing w:before="0" w:after="100" w:line="254" w:lineRule="auto"/>
+      </w:pPr>
+      <w:r>
+        <w:rPr>
+          <w:b/>
+        </w:rPr>
+        <w:t>Master research question.</w:t>
+      </w:r>
+      <w:r>
+        <w:t xml:space="preserve"> </w:t>
+      </w:r>
+      <w:r>
+        <w:rPr>
+          <w:b/>
+        </w:rPr>
+        <w:t>Can parameter-efficient adaptation improve the robustness of DINOv3 for abdominal-organ segmentation without losing performance on clean images?</w:t>
+      </w:r>
+    </w:p>
+    <w:p>
+      <w:pPr>
+        <w:spacing w:before="0" w:after="100" w:line="254" w:lineRule="auto"/>
+      </w:pPr>
+      <w:r>
+        <w:t>Compare a frozen DINOv3 encoder, LoRA or adapter-based adaptation, and partial fine-tuning of the final transformer blocks. Use the same decoder, training data and corruption protocol for every variant. Study at least one adaptation factor, such as adapter depth, LoRA rank or the number of unfrozen transformer blocks. Report several random seeds and analyse the trade-off between segmentation performance, robustness, trainable parameters and computational cost.</w:t>
+      </w:r>
+    </w:p>
+    <w:p>
+      <w:r>
+        <w:br w:type="page"/>
+      </w:r>
+    </w:p>
+    <w:p>
+      <w:pPr>
+        <w:pStyle w:val="Heading2"/>
+        <w:spacing w:after="140"/>
+      </w:pPr>
+      <w:r>
+        <w:t>Project 4.3  Federated knowledge distillation for medical image denoising</w:t>
+      </w:r>
+    </w:p>
+    <w:tbl>
+      <w:tblPr>
+        <w:tblW w:type="auto" w:w="0"/>
+        <w:jc w:val="center"/>
+        <w:tblLayout w:type="fixed"/>
+        <w:tblLook w:firstColumn="1" w:firstRow="1" w:lastColumn="0" w:lastRow="0" w:noHBand="0" w:noVBand="1" w:val="04A0"/>
+        <w:tblBorders>
+          <w:top w:val="single" w:sz="5" w:space="0" w:color="D9E0E6"/>
+          <w:left w:val="single" w:sz="5" w:space="0" w:color="D9E0E6"/>
+          <w:bottom w:val="single" w:sz="5" w:space="0" w:color="D9E0E6"/>
+          <w:right w:val="single" w:sz="5" w:space="0" w:color="D9E0E6"/>
+          <w:insideH w:val="single" w:sz="5" w:space="0" w:color="D9E0E6"/>
+          <w:insideV w:val="single" w:sz="5" w:space="0" w:color="D9E0E6"/>
+        </w:tblBorders>
+      </w:tblPr>
+      <w:tblGrid>
+        <w:gridCol w:w="1944"/>
+        <w:gridCol w:w="7704"/>
+      </w:tblGrid>
+      <w:tr>
+        <w:trPr>
+          <w:cantSplit/>
+        </w:trPr>
+        <w:tc>
+          <w:tcPr>
+            <w:tcW w:type="dxa" w:w="1944"/>
+            <w:shd w:fill="EAF2F8"/>
+            <w:tcMar>
+              <w:top w:w="90" w:type="dxa"/>
+              <w:start w:w="110" w:type="dxa"/>
+              <w:bottom w:w="90" w:type="dxa"/>
+              <w:end w:w="110" w:type="dxa"/>
+            </w:tcMar>
+            <w:vAlign w:val="center"/>
+          </w:tcPr>
+          <w:p>
+            <w:pPr>
+              <w:spacing w:after="0"/>
+            </w:pPr>
+            <w:r>
+              <w:rPr>
+                <w:b/>
+                <w:color w:val="17365D"/>
+              </w:rPr>
+              <w:t>Task</w:t>
+            </w:r>
+          </w:p>
+        </w:tc>
+        <w:tc>
+          <w:tcPr>
+            <w:tcW w:type="dxa" w:w="7704"/>
+            <w:shd w:fill="FFFFFF"/>
+            <w:tcMar>
+              <w:top w:w="90" w:type="dxa"/>
+              <w:start w:w="110" w:type="dxa"/>
+              <w:bottom w:w="90" w:type="dxa"/>
+              <w:end w:w="110" w:type="dxa"/>
+            </w:tcMar>
+            <w:vAlign w:val="center"/>
+          </w:tcPr>
+          <w:p>
+            <w:pPr>
+              <w:spacing w:after="0"/>
+            </w:pPr>
+            <w:r>
+              <w:t>Federated medical-image denoising with output-level knowledge distillation</w:t>
+            </w:r>
+          </w:p>
+        </w:tc>
+      </w:tr>
+      <w:tr>
+        <w:trPr>
+          <w:cantSplit/>
+        </w:trPr>
+        <w:tc>
+          <w:tcPr>
+            <w:tcW w:type="dxa" w:w="1944"/>
+            <w:shd w:fill="EAF2F8"/>
+            <w:tcMar>
+              <w:top w:w="90" w:type="dxa"/>
+              <w:start w:w="110" w:type="dxa"/>
+              <w:bottom w:w="90" w:type="dxa"/>
+              <w:end w:w="110" w:type="dxa"/>
+            </w:tcMar>
+            <w:vAlign w:val="center"/>
+          </w:tcPr>
+          <w:p>
+            <w:pPr>
+              <w:spacing w:after="0"/>
+            </w:pPr>
+            <w:r>
+              <w:rPr>
+                <w:b/>
+                <w:color w:val="17365D"/>
+              </w:rPr>
+              <w:t>Recommended level</w:t>
+            </w:r>
+          </w:p>
+        </w:tc>
+        <w:tc>
+          <w:tcPr>
+            <w:tcW w:type="dxa" w:w="7704"/>
+            <w:shd w:fill="F4F6F8"/>
+            <w:tcMar>
+              <w:top w:w="90" w:type="dxa"/>
+              <w:start w:w="110" w:type="dxa"/>
+              <w:bottom w:w="90" w:type="dxa"/>
+              <w:end w:w="110" w:type="dxa"/>
+            </w:tcMar>
+            <w:vAlign w:val="center"/>
+          </w:tcPr>
+          <w:p>
+            <w:pPr>
+              <w:spacing w:after="0"/>
+            </w:pPr>
+            <w:r>
+              <w:t>MSc only</w:t>
+            </w:r>
+          </w:p>
+        </w:tc>
+      </w:tr>
+      <w:tr>
+        <w:trPr>
+          <w:cantSplit/>
+        </w:trPr>
+        <w:tc>
+          <w:tcPr>
+            <w:tcW w:type="dxa" w:w="1944"/>
+            <w:shd w:fill="EAF2F8"/>
+            <w:tcMar>
+              <w:top w:w="90" w:type="dxa"/>
+              <w:start w:w="110" w:type="dxa"/>
+              <w:bottom w:w="90" w:type="dxa"/>
+              <w:end w:w="110" w:type="dxa"/>
+            </w:tcMar>
+            <w:vAlign w:val="center"/>
+          </w:tcPr>
+          <w:p>
+            <w:pPr>
+              <w:spacing w:after="0"/>
+            </w:pPr>
+            <w:r>
+              <w:rPr>
+                <w:b/>
+                <w:color w:val="17365D"/>
+              </w:rPr>
+              <w:t>Compute</w:t>
+            </w:r>
+          </w:p>
+        </w:tc>
+        <w:tc>
+          <w:tcPr>
+            <w:tcW w:type="dxa" w:w="7704"/>
+            <w:shd w:fill="FFFFFF"/>
+            <w:tcMar>
+              <w:top w:w="90" w:type="dxa"/>
+              <w:start w:w="110" w:type="dxa"/>
+              <w:bottom w:w="90" w:type="dxa"/>
+              <w:end w:w="110" w:type="dxa"/>
+            </w:tcMar>
+            <w:vAlign w:val="center"/>
+          </w:tcPr>
+          <w:p>
+            <w:pPr>
+              <w:spacing w:after="0"/>
+            </w:pPr>
+            <w:r>
+              <w:t>Moderate; one 12–24 GB GPU is sufficient for sequential client simulation</w:t>
+            </w:r>
+          </w:p>
+        </w:tc>
+      </w:tr>
+      <w:tr>
+        <w:trPr>
+          <w:cantSplit/>
+        </w:trPr>
+        <w:tc>
+          <w:tcPr>
+            <w:tcW w:type="dxa" w:w="1944"/>
+            <w:shd w:fill="EAF2F8"/>
+            <w:tcMar>
+              <w:top w:w="90" w:type="dxa"/>
+              <w:start w:w="110" w:type="dxa"/>
+              <w:bottom w:w="90" w:type="dxa"/>
+              <w:end w:w="110" w:type="dxa"/>
+            </w:tcMar>
+            <w:vAlign w:val="center"/>
+          </w:tcPr>
+          <w:p>
+            <w:pPr>
+              <w:spacing w:after="0"/>
+            </w:pPr>
+            <w:r>
+              <w:rPr>
+                <w:b/>
+                <w:color w:val="17365D"/>
+              </w:rPr>
+              <w:t>Data</w:t>
+            </w:r>
+          </w:p>
+        </w:tc>
+        <w:tc>
+          <w:tcPr>
+            <w:tcW w:type="dxa" w:w="7704"/>
+            <w:shd w:fill="F4F6F8"/>
+            <w:tcMar>
+              <w:top w:w="90" w:type="dxa"/>
+              <w:start w:w="110" w:type="dxa"/>
+              <w:bottom w:w="90" w:type="dxa"/>
+              <w:end w:w="110" w:type="dxa"/>
+            </w:tcMar>
+            <w:vAlign w:val="center"/>
+          </w:tcPr>
+          <w:p>
+            <w:pPr>
+              <w:spacing w:after="0"/>
+            </w:pPr>
+            <w:hyperlink r:id="rId99">
+              <w:r>
+                <w:rPr>
+                  <w:color w:val="2F5597"/>
+                  <w:u w:val="single"/>
+                </w:rPr>
+                <w:t>M&amp;Ms cardiac MRI</w:t>
+              </w:r>
+            </w:hyperlink>
+            <w:r>
+              <w:t xml:space="preserve"> partitioned by scanner vendor; </w:t>
+            </w:r>
+            <w:hyperlink r:id="rId100">
+              <w:r>
+                <w:rPr>
+                  <w:color w:val="2F5597"/>
+                  <w:u w:val="single"/>
+                </w:rPr>
+                <w:t>ACDC</w:t>
+              </w:r>
+            </w:hyperlink>
+            <w:r>
+              <w:t xml:space="preserve"> as the shared proxy set</w:t>
+            </w:r>
+          </w:p>
+        </w:tc>
+      </w:tr>
+      <w:tr>
+        <w:trPr>
+          <w:cantSplit/>
+        </w:trPr>
+        <w:tc>
+          <w:tcPr>
+            <w:tcW w:type="dxa" w:w="1944"/>
+            <w:shd w:fill="EAF2F8"/>
+            <w:tcMar>
+              <w:top w:w="90" w:type="dxa"/>
+              <w:start w:w="110" w:type="dxa"/>
+              <w:bottom w:w="90" w:type="dxa"/>
+              <w:end w:w="110" w:type="dxa"/>
+            </w:tcMar>
+            <w:vAlign w:val="center"/>
+          </w:tcPr>
+          <w:p>
+            <w:pPr>
+              <w:spacing w:after="0"/>
+            </w:pPr>
+            <w:r>
+              <w:rPr>
+                <w:b/>
+                <w:color w:val="17365D"/>
+              </w:rPr>
+              <w:t>Starting paper</w:t>
+            </w:r>
+          </w:p>
+        </w:tc>
+        <w:tc>
+          <w:tcPr>
+            <w:tcW w:type="dxa" w:w="7704"/>
+            <w:shd w:fill="FFFFFF"/>
+            <w:tcMar>
+              <w:top w:w="90" w:type="dxa"/>
+              <w:start w:w="110" w:type="dxa"/>
+              <w:bottom w:w="90" w:type="dxa"/>
+              <w:end w:w="110" w:type="dxa"/>
+            </w:tcMar>
+            <w:vAlign w:val="center"/>
+          </w:tcPr>
+          <w:p>
+            <w:pPr>
+              <w:spacing w:after="0"/>
+            </w:pPr>
+          </w:p>
+        </w:tc>
+      </w:tr>
+    </w:tbl>
+    <w:p>
+      <w:pPr>
+        <w:spacing w:after="0"/>
+      </w:pPr>
+    </w:p>
+    <w:p>
+      <w:pPr>
+        <w:spacing w:before="80" w:after="100" w:line="254" w:lineRule="auto"/>
+      </w:pPr>
+      <w:r>
+        <w:rPr>
+          <w:b/>
+          <w:color w:val="25313C"/>
+        </w:rPr>
+        <w:t xml:space="preserve">What you will do. </w:t>
+      </w:r>
+      <w:r>
+        <w:t>Simulate several hospitals that train medical-image denoising models without sharing their local scans. Each hospital trains a U-Net on its own cardiac MRI data. Instead of sending model weights to the central server, the hospitals apply their local models to the same public proxy images and send only the resulting denoised predictions. The server uses these predictions to train a global U-Net student through knowledge distillation.</w:t>
+      </w:r>
+    </w:p>
+    <w:p>
+      <w:pPr>
+        <w:spacing w:before="0" w:after="100" w:line="254" w:lineRule="auto"/>
+      </w:pPr>
+      <w:r>
+        <w:rPr>
+          <w:b/>
+          <w:color w:val="25313C"/>
+        </w:rPr>
+        <w:t xml:space="preserve">Project goal. </w:t>
+      </w:r>
+      <w:r>
+        <w:t>Determine whether prediction-based federated distillation can produce a denoising model that generalises across scanner vendors and noise conditions without transferring local images or local model weights to the central server.</w:t>
+      </w:r>
+    </w:p>
+    <w:p>
+      <w:pPr>
+        <w:spacing w:before="0" w:after="100" w:line="254" w:lineRule="auto"/>
+      </w:pPr>
+      <w:r>
+        <w:rPr>
+          <w:b/>
+          <w:color w:val="25313C"/>
+        </w:rPr>
+        <w:t xml:space="preserve">Data. </w:t>
+      </w:r>
+      <w:r>
+        <w:t>Treat scanner vendors in the M&amp;Ms cardiac MRI dataset as simulated federated clients. Use the original images as reference targets and generate controlled noisy inputs using predefined MRI-relevant corruptions, such as Rician noise and intensity non-uniformity. Use ACDC cardiac MRI images only as a shared public proxy set for communication between clients and the server. Split by patient or volume, never by image slice, and keep the final test patients separate from local training and proxy distillation.</w:t>
+      </w:r>
+    </w:p>
+    <w:p>
+      <w:pPr>
+        <w:spacing w:before="0" w:after="100" w:line="254" w:lineRule="auto"/>
+      </w:pPr>
+      <w:r>
+        <w:rPr>
+          <w:b/>
+          <w:color w:val="25313C"/>
+        </w:rPr>
+        <w:t xml:space="preserve">Methods and code. </w:t>
+      </w:r>
+      <w:r>
+        <w:t xml:space="preserve">Use the same compact 2D U-Net architecture for the local teachers and the global student in the core experiment. Each client trains its local U-Net to map a noisy slice to its reference image. The clients then denoise the same corrupted proxy images and transmit only their output images or predicted noise residuals. The server aggregates these predictions and trains the global student using a reconstruction loss to the aggregated teacher target. The clients' private images and model weights remain local. Use </w:t>
+      </w:r>
+      <w:hyperlink r:id="rId101">
+        <w:r>
+          <w:rPr>
+            <w:color w:val="2F5597"/>
+            <w:u w:val="single"/>
+          </w:rPr>
+          <w:t>Flower</w:t>
+        </w:r>
+      </w:hyperlink>
+      <w:r>
+        <w:t xml:space="preserve"> to organise the simulated clients and communication rounds; the denoising models can be implemented in PyTorch or </w:t>
+      </w:r>
+      <w:hyperlink r:id="rId102">
+        <w:r>
+          <w:rPr>
+            <w:color w:val="2F5597"/>
+            <w:u w:val="single"/>
+          </w:rPr>
+          <w:t>MONAI</w:t>
+        </w:r>
+      </w:hyperlink>
+      <w:r>
+        <w:t>.</w:t>
+      </w:r>
+    </w:p>
+    <w:p>
+      <w:pPr>
+        <w:spacing w:before="0" w:after="100" w:line="254" w:lineRule="auto"/>
+      </w:pPr>
+      <w:r>
+        <w:rPr>
+          <w:b/>
+          <w:color w:val="25313C"/>
+        </w:rPr>
+        <w:t xml:space="preserve">Baselines and evaluation. </w:t>
+      </w:r>
+      <w:r>
+        <w:t>Compare local-only U-Nets, centralized training as an experimental upper bound, standard FedAvg with weight sharing, and output-level federated distillation without weight sharing. Use SSIM as the primary image-quality metric and report PSNR and NMSE as secondary metrics. Report results separately for each scanner vendor and noise condition, together with communication volume and training time. Include an unseen-noise or held-out-vendor test to measure generalization.</w:t>
+      </w:r>
+    </w:p>
+    <w:p>
+      <w:pPr>
+        <w:spacing w:before="0" w:after="100" w:line="254" w:lineRule="auto"/>
+      </w:pPr>
+      <w:r>
+        <w:rPr>
+          <w:b/>
+          <w:color w:val="25313C"/>
+        </w:rPr>
+        <w:t xml:space="preserve">Practical notes. </w:t>
+      </w:r>
+      <w:r>
+        <w:t>The original MRI images are reference images, not perfect noise-free ground truth. Therefore, conclusions should concern removal of the controlled synthetic corruptions rather than clinical scanner-noise correction. Prediction sharing reduces direct exposure compared with transmitting model weights, but it does not provide a formal privacy guarantee; differential privacy or secure aggregation may be discussed as optional extensions rather than assumed properties.</w:t>
+      </w:r>
+    </w:p>
+    <w:p>
+      <w:pPr>
+        <w:pStyle w:val="Heading3"/>
+      </w:pPr>
+      <w:r>
+        <w:t>Master scope</w:t>
+      </w:r>
+    </w:p>
+    <w:p>
+      <w:pPr>
+        <w:spacing w:before="0" w:after="100" w:line="254" w:lineRule="auto"/>
+      </w:pPr>
+      <w:r>
+        <w:rPr>
+          <w:b/>
+        </w:rPr>
+        <w:t>Master research question.</w:t>
+      </w:r>
+      <w:r>
+        <w:t xml:space="preserve"> </w:t>
+      </w:r>
+      <w:r>
+        <w:rPr>
+          <w:b/>
+        </w:rPr>
+        <w:t>Can output-level federated distillation produce a generalizable medical-image denoising model without sharing local model weights, and how robust is it when clients have different scanner domains, noise distributions or model capacities?</w:t>
+      </w:r>
+      <w:r>
+        <w:t xml:space="preserve"> Compare local training, centralized training, FedAvg and federated distillation under matched data splits and noise conditions. Compare distillation of denoised images with distillation of predicted noise residuals, and study at least one additional factor such as proxy-set size, confidence-weighted teacher aggregation, heterogeneous U-Net widths or transfer to a held-out vendor. Use several seeds and report the performance–communication trade-off.</w:t>
+      </w:r>
+    </w:p>
+    <w:p>
+      <w:r>
+        <w:br w:type="page"/>
+      </w:r>
+    </w:p>
+    <w:p>
+      <w:pPr>
+        <w:pStyle w:val="Heading1"/>
+      </w:pPr>
+      <w:r>
+        <w:t>Category 5  Signal processing and deep-unfolded models</w:t>
+      </w:r>
+    </w:p>
+    <w:p>
+      <w:pPr>
+        <w:spacing w:before="0" w:after="100" w:line="254" w:lineRule="auto"/>
+      </w:pPr>
+      <w:r>
+        <w:t>Many signal-processing methods repeat a fixed optimisation step until convergence. Algorithm unrolling, also called deep unfolding, turns a fixed number of those iterations into neural-network layers. The update equations determine the network structure, while selected algorithm parameters are learned from data.</w:t>
+      </w:r>
+    </w:p>
+    <w:p>
+      <w:pPr>
+        <w:spacing w:before="0" w:after="100" w:line="254" w:lineRule="auto"/>
+      </w:pPr>
+      <w:r>
+        <w:t>This differs from Category 3: the network is a truncated version of a known algorithm, not a general-purpose encoder. Evaluation must therefore test both numerical correctness and the downstream task. Faster execution alone is insufficient if the learned layers no longer perform the intended decomposition.</w:t>
+      </w:r>
+    </w:p>
+    <w:p>
+      <w:pPr>
+        <w:pStyle w:val="Heading3"/>
+      </w:pPr>
+      <w:r>
+        <w:t>A Master-level category</w:t>
+      </w:r>
+    </w:p>
+    <w:p>
+      <w:pPr>
+        <w:spacing w:before="0" w:after="80" w:line="254" w:lineRule="auto"/>
+      </w:pPr>
+      <w:r>
+        <w:t>This category requires graduate-level optimisation and signal processing. The contribution is a justified change to the unrolled algorithm and a controlled comparison with the converged classical method.</w:t>
+      </w:r>
+    </w:p>
+    <w:p>
+      <w:pPr>
+        <w:pStyle w:val="Heading2"/>
+      </w:pPr>
+      <w:r>
+        <w:t>Learn first and find ideas</w:t>
+      </w:r>
+    </w:p>
+    <w:p>
+      <w:pPr>
         <w:pStyle w:val="ListBullet"/>
         <w:spacing w:before="0" w:after="40" w:line="254" w:lineRule="auto"/>
       </w:pPr>
       <w:r>
         <w:t xml:space="preserve">General unrolling: Gregor and LeCun, </w:t>
       </w:r>
-      <w:hyperlink r:id="rId88">
+      <w:hyperlink r:id="rId103">
         <w:r>
           <w:rPr>
             <w:color w:val="2F5597"/>
@@ -10764,7 +13065,7 @@
       <w:r>
         <w:t xml:space="preserve">, ICML 2010; Monga, Li and Eldar, </w:t>
       </w:r>
-      <w:hyperlink r:id="rId89">
+      <w:hyperlink r:id="rId104">
         <w:r>
           <w:rPr>
             <w:color w:val="2F5597"/>
@@ -10776,7 +13077,7 @@
       <w:r>
         <w:t xml:space="preserve">, IEEE SPM 2021; and Yang et al., </w:t>
       </w:r>
-      <w:hyperlink r:id="rId90">
+      <w:hyperlink r:id="rId105">
         <w:r>
           <w:rPr>
             <w:color w:val="2F5597"/>
@@ -10797,7 +13098,7 @@
       <w:r>
         <w:t xml:space="preserve">Signal decomposition: Dragomiretskiy and Zosso, </w:t>
       </w:r>
-      <w:hyperlink r:id="rId91">
+      <w:hyperlink r:id="rId106">
         <w:r>
           <w:rPr>
             <w:color w:val="2F5597"/>
@@ -10809,7 +13110,7 @@
       <w:r>
         <w:t xml:space="preserve">, with </w:t>
       </w:r>
-      <w:hyperlink r:id="rId92">
+      <w:hyperlink r:id="rId107">
         <w:r>
           <w:rPr>
             <w:color w:val="2F5597"/>
@@ -10821,7 +13122,7 @@
       <w:r>
         <w:t xml:space="preserve">, and Rehman and Aftab, </w:t>
       </w:r>
-      <w:hyperlink r:id="rId93">
+      <w:hyperlink r:id="rId108">
         <w:r>
           <w:rPr>
             <w:color w:val="2F5597"/>
@@ -10842,7 +13143,7 @@
       <w:r>
         <w:t xml:space="preserve">Ahmad et al., </w:t>
       </w:r>
-      <w:hyperlink r:id="rId94">
+      <w:hyperlink r:id="rId109">
         <w:r>
           <w:rPr>
             <w:color w:val="2F5597"/>
@@ -10854,7 +13155,7 @@
       <w:r>
         <w:t xml:space="preserve">, 2025 preprint, with the </w:t>
       </w:r>
-      <w:hyperlink r:id="rId95">
+      <w:hyperlink r:id="rId110">
         <w:r>
           <w:rPr>
             <w:color w:val="2F5597"/>
@@ -11101,7 +13402,7 @@
             <w:r>
               <w:t xml:space="preserve">Synthetic multichannel signals plus </w:t>
             </w:r>
-            <w:hyperlink r:id="rId96">
+            <w:hyperlink r:id="rId111">
               <w:r>
                 <w:rPr>
                   <w:color w:val="2F5597"/>
@@ -11164,7 +13465,7 @@
             <w:r>
               <w:t xml:space="preserve">Ahmad, Wesemann, Waschkowski &amp; Khalid, </w:t>
             </w:r>
-            <w:hyperlink r:id="rId94">
+            <w:hyperlink r:id="rId109">
               <w:r>
                 <w:rPr>
                   <w:color w:val="2F5597"/>
@@ -11238,7 +13539,7 @@
       <w:r>
         <w:t xml:space="preserve"> of </w:t>
       </w:r>
-      <w:hyperlink r:id="rId96">
+      <w:hyperlink r:id="rId111">
         <w:r>
           <w:rPr>
             <w:color w:val="2F5597"/>
@@ -11265,7 +13566,7 @@
       <w:r>
         <w:t xml:space="preserve">Validate classical MVMD using the </w:t>
       </w:r>
-      <w:hyperlink r:id="rId97">
+      <w:hyperlink r:id="rId112">
         <w:r>
           <w:rPr>
             <w:color w:val="2F5597"/>
@@ -11277,7 +13578,7 @@
       <w:r>
         <w:t xml:space="preserve"> and an </w:t>
       </w:r>
-      <w:hyperlink r:id="rId98">
+      <w:hyperlink r:id="rId113">
         <w:r>
           <w:rPr>
             <w:color w:val="2F5597"/>
@@ -11289,7 +13590,7 @@
       <w:r>
         <w:t xml:space="preserve">. Reimplement the UVMD equations from the </w:t>
       </w:r>
-      <w:hyperlink r:id="rId94">
+      <w:hyperlink r:id="rId109">
         <w:r>
           <w:rPr>
             <w:color w:val="2F5597"/>

</xml_diff>

<commit_message>
Clarify drivetrain project goal
</commit_message>
<xml_diff>
--- a/downloads/student-project-portfolio.docx
+++ b/downloads/student-project-portfolio.docx
@@ -3839,7 +3839,7 @@
         <w:t xml:space="preserve">Project goal. </w:t>
       </w:r>
       <w:r>
-        <w:t>Discover recurring operating states and determine whether using those states improves a downstream condition-monitoring model. The project should answer whether the learned states contain useful information beyond turbine power.</w:t>
+        <w:t>Discover recurring operating states and determine whether using those states improves a downstream condition-monitoring model. The project should answer whether the learned states contain useful information beyond turbine power. Where possible, the discovered operating states should be interpreted in relation to known turbine operating regimes, controller actions, or structural and aerodynamic phenomena.</w:t>
       </w:r>
     </w:p>
     <w:p>
@@ -3911,7 +3911,7 @@
         <w:t xml:space="preserve">Practical notes. </w:t>
       </w:r>
       <w:r>
-        <w:t>Unsupervised clusters are not automatically physical operating states. Where possible, the discovered operating states should be interpreted in relation to known turbine operating regimes, controller actions, or structural and aerodynamic phenomena. Do not judge the result only by silhouette score or a two-dimensional plot. A useful state should be repeatable and should improve an agreed downstream measure.</w:t>
+        <w:t>Unsupervised clusters are not automatically physical operating states. Do not judge the result only by silhouette score or a two-dimensional plot. A useful state should be repeatable, physically interpretable where possible, and should improve an agreed downstream measure.</w:t>
       </w:r>
     </w:p>
     <w:p>
@@ -4300,7 +4300,7 @@
         <w:t xml:space="preserve">Project goal. </w:t>
       </w:r>
       <w:r>
-        <w:t>A practically useful outcome may be narrowing the set of plausible configurations and providing calibrated confidence estimates, rather than always identifying a single configuration with certainty. From an industrial perspective, reducing uncertainty can already provide significant value, even if perfect identification is not possible. The study should also identify which signal characteristics carry useful configuration information.</w:t>
+        <w:t>Use vibration and operational measurements to determine whether fixed drivetrain hardware variants can be distinguished and, when candidate configurations are known, rank the most plausible configurations for each turbine. Verified configuration information for a subset of turbines or components will be used to validate and calibrate the rankings. As an optional physics-informed extension, condition the model on known bearing or drivetrain kinematics and test whether relationships learned from well-documented components can be transferred to more complex components with limited labels.</w:t>
       </w:r>
     </w:p>
     <w:p>

</xml_diff>

<commit_message>
Add concise methods references to drivetrain project
</commit_message>
<xml_diff>
--- a/downloads/student-project-portfolio.docx
+++ b/downloads/student-project-portfolio.docx
@@ -3824,7 +3824,7 @@
         <w:t xml:space="preserve">What you will do. </w:t>
       </w:r>
       <w:r>
-        <w:t>Wind-turbine monitoring systems often group vibration measurements by power output. However, turbines producing the same power can show different vibration behaviour. You will test whether operating states learned from vibration and operational measurements describe the turbine more consistently than power bins.</w:t>
+        <w:t>Wind-turbine monitoring systems often group vibration measurements by power output. However, turbines producing the same power can show different vibration behaviour. You will test whether operating states learned from vibration and operational measurements describe the turbine more consistently than those learned from power bins.</w:t>
       </w:r>
     </w:p>
     <w:p>
@@ -4285,7 +4285,7 @@
         <w:t xml:space="preserve">What you will do. </w:t>
       </w:r>
       <w:r>
-        <w:t>A wind-turbine fleet can contain several bearing, gearbox or drivetrain variants, and the monitoring system may not always know which configuration is installed. Because component geometry affects the vibration spectrum, you will test whether measured vibration and operational data can narrow the set of plausible configurations and provide probabilities or confidence estimates for the candidates, rather than requiring a single fixed assignment.</w:t>
+        <w:t>A wind-turbine fleet can contain several bearing, gearbox or drivetrain variants, and the monitoring system may not always know which configuration is installed. Because component geometry affects the vibration spectrum, you will test whether measured vibration and operational data can narrow the set of plausible configurations and provide probabilities or confidence estimates for the candidates.</w:t>
       </w:r>
     </w:p>
     <w:p>
@@ -4330,9 +4330,21 @@
         <w:t xml:space="preserve">Methods and code. </w:t>
       </w:r>
       <w:r>
-        <w:t xml:space="preserve">Begin with a probabilistic baseline such as multinomial logistic regression, or a random-forest or gradient-boosting model that outputs candidate probabilities, using the supplied spectral and operational features. If sequences or spectra are available, compare </w:t>
+        <w:t xml:space="preserve">Start with </w:t>
       </w:r>
       <w:hyperlink r:id="rId23">
+        <w:r>
+          <w:rPr>
+            <w:color w:val="2F5597"/>
+            <w:u w:val="single"/>
+          </w:rPr>
+          <w:t>multinomial logistic regression</w:t>
+        </w:r>
+      </w:hyperlink>
+      <w:r>
+        <w:t xml:space="preserve"> to rank the known candidate configurations using vibration and operational features. If raw spectra or time series are available, compare it with </w:t>
+      </w:r>
+      <w:hyperlink r:id="rId16">
         <w:r>
           <w:rPr>
             <w:color w:val="2F5597"/>
@@ -4342,7 +4354,7 @@
         </w:r>
       </w:hyperlink>
       <w:r>
-        <w:t xml:space="preserve">, </w:t>
+        <w:t xml:space="preserve">, for which </w:t>
       </w:r>
       <w:hyperlink r:id="rId24">
         <w:r>
@@ -4350,11 +4362,23 @@
             <w:color w:val="2F5597"/>
             <w:u w:val="single"/>
           </w:rPr>
-          <w:t>InceptionTime</w:t>
+          <w:t>open-source code</w:t>
         </w:r>
       </w:hyperlink>
       <w:r>
-        <w:t xml:space="preserve"> or a compact 1-D CNN, followed by probability calibration when needed. If speed and component geometry are available, add order-domain or characteristic-frequency features as a physics-informed extension. An advanced extension can condition the model on known kinematic parameters so that it learns how vibration patterns relate to machine properties rather than merely memorising component identities.</w:t>
+        <w:t xml:space="preserve"> is available. As an optional physics-informed extension, use shaft speed and component geometry to construct order-domain or characteristic-frequency features, following the general approach demonstrated by </w:t>
+      </w:r>
+      <w:hyperlink r:id="rId25">
+        <w:r>
+          <w:rPr>
+            <w:color w:val="2F5597"/>
+            <w:u w:val="single"/>
+          </w:rPr>
+          <w:t>Shen et al</w:t>
+        </w:r>
+      </w:hyperlink>
+      <w:r>
+        <w:t>.</w:t>
       </w:r>
     </w:p>
     <w:p>
@@ -4369,22 +4393,19 @@
         <w:t xml:space="preserve">Baselines and evaluation. </w:t>
       </w:r>
       <w:r>
-        <w:t>Compare prior-probability and operational-metadata baselines with feature-based and learned vibration models. Treat the output as a ranked probability distribution over candidate configurations rather than only a fixed assignment. Split by turbine; use a site-grouped test only if the data contain enough sites and classes. Report balanced accuracy and macro-F1 for the highest-ranked candidate, top-k candidate recall, and a probabilistic score such as log loss or the Brier score. Also report calibration and coverage: how often can the system make an automatic decision above a chosen confidence threshold, and how often is that decision correct?</w:t>
-      </w:r>
-    </w:p>
-    <w:p>
-      <w:pPr>
-        <w:spacing w:before="0" w:after="100" w:line="254" w:lineRule="auto"/>
-      </w:pPr>
-      <w:r>
-        <w:rPr>
-          <w:b/>
-          <w:color w:val="25313C"/>
-        </w:rPr>
-        <w:t xml:space="preserve">Practical notes. </w:t>
-      </w:r>
-      <w:r>
-        <w:t>This project is feasible only if enough turbines have reliable configuration labels for training and validation. Configuration may also correlate with site, turbine age or rating, so these variables must be examined before attributing performance to vibration signatures. A physics-informed transfer study from well-labelled components to complex components with limited labels is a valuable MSc extension, but it depends on having both known kinematic parameters and a credible target-component test set.</w:t>
+        <w:t xml:space="preserve">Compare three inputs: operational metadata only, vibration features only, and their combination. Split the data by turbine. Evaluate whether the correct configuration is ranked first or appears among the highest-ranked candidates, and use a </w:t>
+      </w:r>
+      <w:hyperlink r:id="rId26">
+        <w:r>
+          <w:rPr>
+            <w:color w:val="2F5597"/>
+            <w:u w:val="single"/>
+          </w:rPr>
+          <w:t>reliability diagram</w:t>
+        </w:r>
+      </w:hyperlink>
+      <w:r>
+        <w:t xml:space="preserve"> to check whether the reported confidence agrees with actual accuracy.</w:t>
       </w:r>
     </w:p>
     <w:p>
@@ -4871,7 +4892,7 @@
       <w:r>
         <w:t xml:space="preserve">Confirm the independent-cycle count and one measurable downstream target before allocation. Rerunning an unchanged self-supervised method is a baseline, not the Master contribution. Follow the </w:t>
       </w:r>
-      <w:hyperlink r:id="rId25">
+      <w:hyperlink r:id="rId27">
         <w:r>
           <w:rPr>
             <w:color w:val="2F5597"/>
@@ -5069,7 +5090,7 @@
       <w:r>
         <w:t xml:space="preserve">Begin with </w:t>
       </w:r>
-      <w:hyperlink r:id="rId26">
+      <w:hyperlink r:id="rId28">
         <w:r>
           <w:rPr>
             <w:color w:val="2F5597"/>
@@ -5081,7 +5102,7 @@
       <w:r>
         <w:t xml:space="preserve">, then use the </w:t>
       </w:r>
-      <w:hyperlink r:id="rId27">
+      <w:hyperlink r:id="rId29">
         <w:r>
           <w:rPr>
             <w:color w:val="2F5597"/>
@@ -5093,7 +5114,7 @@
       <w:r>
         <w:t xml:space="preserve"> and the </w:t>
       </w:r>
-      <w:hyperlink r:id="rId28">
+      <w:hyperlink r:id="rId30">
         <w:r>
           <w:rPr>
             <w:color w:val="2F5597"/>
@@ -5111,7 +5132,7 @@
         <w:pStyle w:val="ListBullet"/>
         <w:spacing w:before="0" w:after="40" w:line="254" w:lineRule="auto"/>
       </w:pPr>
-      <w:hyperlink r:id="rId29">
+      <w:hyperlink r:id="rId31">
         <w:r>
           <w:rPr>
             <w:color w:val="2F5597"/>
@@ -5123,7 +5144,7 @@
       <w:r>
         <w:t xml:space="preserve">, </w:t>
       </w:r>
-      <w:hyperlink r:id="rId30">
+      <w:hyperlink r:id="rId32">
         <w:r>
           <w:rPr>
             <w:color w:val="2F5597"/>
@@ -5135,7 +5156,7 @@
       <w:r>
         <w:t xml:space="preserve">, </w:t>
       </w:r>
-      <w:hyperlink r:id="rId31">
+      <w:hyperlink r:id="rId33">
         <w:r>
           <w:rPr>
             <w:color w:val="2F5597"/>
@@ -5147,7 +5168,7 @@
       <w:r>
         <w:t xml:space="preserve"> and the </w:t>
       </w:r>
-      <w:hyperlink r:id="rId32">
+      <w:hyperlink r:id="rId34">
         <w:r>
           <w:rPr>
             <w:color w:val="2F5597"/>
@@ -5168,7 +5189,7 @@
       <w:r>
         <w:t xml:space="preserve">Stanford examples: </w:t>
       </w:r>
-      <w:hyperlink r:id="rId33">
+      <w:hyperlink r:id="rId35">
         <w:r>
           <w:rPr>
             <w:color w:val="2F5597"/>
@@ -5180,7 +5201,7 @@
       <w:r>
         <w:t xml:space="preserve">, </w:t>
       </w:r>
-      <w:hyperlink r:id="rId34">
+      <w:hyperlink r:id="rId36">
         <w:r>
           <w:rPr>
             <w:color w:val="2F5597"/>
@@ -5192,7 +5213,7 @@
       <w:r>
         <w:t xml:space="preserve">, </w:t>
       </w:r>
-      <w:hyperlink r:id="rId35">
+      <w:hyperlink r:id="rId37">
         <w:r>
           <w:rPr>
             <w:color w:val="2F5597"/>
@@ -5204,7 +5225,7 @@
       <w:r>
         <w:t xml:space="preserve"> and </w:t>
       </w:r>
-      <w:hyperlink r:id="rId36">
+      <w:hyperlink r:id="rId38">
         <w:r>
           <w:rPr>
             <w:color w:val="2F5597"/>
@@ -5448,7 +5469,7 @@
             <w:pPr>
               <w:spacing w:after="0"/>
             </w:pPr>
-            <w:hyperlink r:id="rId37">
+            <w:hyperlink r:id="rId39">
               <w:r>
                 <w:rPr>
                   <w:color w:val="2F5597"/>
@@ -5511,7 +5532,7 @@
             <w:r>
               <w:t xml:space="preserve">Huang, He and Sick, </w:t>
             </w:r>
-            <w:hyperlink r:id="rId38">
+            <w:hyperlink r:id="rId40">
               <w:r>
                 <w:rPr>
                   <w:color w:val="2F5597"/>
@@ -5585,7 +5606,7 @@
       <w:r>
         <w:t xml:space="preserve">Use a GRU or TCN as the graph-free baseline and a compact GCN–GRU or GAT–GRU as the graph model. The </w:t>
       </w:r>
-      <w:hyperlink r:id="rId39">
+      <w:hyperlink r:id="rId41">
         <w:r>
           <w:rPr>
             <w:color w:val="2F5597"/>
@@ -5597,7 +5618,7 @@
       <w:r>
         <w:t xml:space="preserve"> is a useful reference; a small </w:t>
       </w:r>
-      <w:hyperlink r:id="rId40">
+      <w:hyperlink r:id="rId42">
         <w:r>
           <w:rPr>
             <w:color w:val="2F5597"/>
@@ -5952,7 +5973,7 @@
             <w:pPr>
               <w:spacing w:after="0"/>
             </w:pPr>
-            <w:hyperlink r:id="rId41">
+            <w:hyperlink r:id="rId43">
               <w:r>
                 <w:rPr>
                   <w:color w:val="2F5597"/>
@@ -6015,7 +6036,7 @@
             <w:r>
               <w:t xml:space="preserve">Wu et al., </w:t>
             </w:r>
-            <w:hyperlink r:id="rId42">
+            <w:hyperlink r:id="rId44">
               <w:r>
                 <w:rPr>
                   <w:color w:val="2F5597"/>
@@ -6080,7 +6101,7 @@
       <w:r>
         <w:t xml:space="preserve">Compare historical average and a graph-free GRU with </w:t>
       </w:r>
-      <w:hyperlink r:id="rId43">
+      <w:hyperlink r:id="rId45">
         <w:r>
           <w:rPr>
             <w:color w:val="2F5597"/>
@@ -6435,7 +6456,7 @@
             <w:pPr>
               <w:spacing w:after="0"/>
             </w:pPr>
-            <w:hyperlink r:id="rId44">
+            <w:hyperlink r:id="rId46">
               <w:r>
                 <w:rPr>
                   <w:color w:val="2F5597"/>
@@ -6498,7 +6519,7 @@
             <w:r>
               <w:t xml:space="preserve">Weber et al., </w:t>
             </w:r>
-            <w:hyperlink r:id="rId45">
+            <w:hyperlink r:id="rId47">
               <w:r>
                 <w:rPr>
                   <w:color w:val="2F5597"/>
@@ -6572,7 +6593,7 @@
       <w:r>
         <w:t xml:space="preserve">Compare logistic regression or random forest with GCN and GraphSAGE in </w:t>
       </w:r>
-      <w:hyperlink r:id="rId40">
+      <w:hyperlink r:id="rId42">
         <w:r>
           <w:rPr>
             <w:color w:val="2F5597"/>
@@ -6927,7 +6948,7 @@
             <w:pPr>
               <w:spacing w:after="0"/>
             </w:pPr>
-            <w:hyperlink r:id="rId46">
+            <w:hyperlink r:id="rId48">
               <w:r>
                 <w:rPr>
                   <w:color w:val="2F5597"/>
@@ -6990,7 +7011,7 @@
             <w:r>
               <w:t xml:space="preserve">He et al., </w:t>
             </w:r>
-            <w:hyperlink r:id="rId47">
+            <w:hyperlink r:id="rId49">
               <w:r>
                 <w:rPr>
                   <w:color w:val="2F5597"/>
@@ -7055,7 +7076,7 @@
       <w:r>
         <w:t xml:space="preserve">Compare popularity, BPR matrix factorisation and LightGCN. A direct </w:t>
       </w:r>
-      <w:hyperlink r:id="rId40">
+      <w:hyperlink r:id="rId42">
         <w:r>
           <w:rPr>
             <w:color w:val="2F5597"/>
@@ -7067,7 +7088,7 @@
       <w:r>
         <w:t xml:space="preserve"> implementation is simpler than adapting the </w:t>
       </w:r>
-      <w:hyperlink r:id="rId48">
+      <w:hyperlink r:id="rId50">
         <w:r>
           <w:rPr>
             <w:color w:val="2F5597"/>
@@ -7377,7 +7398,7 @@
             <w:pPr>
               <w:spacing w:after="0"/>
             </w:pPr>
-            <w:hyperlink r:id="rId49">
+            <w:hyperlink r:id="rId51">
               <w:r>
                 <w:rPr>
                   <w:color w:val="2F5597"/>
@@ -7440,7 +7461,7 @@
             <w:r>
               <w:t xml:space="preserve">Hu et al., </w:t>
             </w:r>
-            <w:hyperlink r:id="rId50">
+            <w:hyperlink r:id="rId52">
               <w:r>
                 <w:rPr>
                   <w:color w:val="2F5597"/>
@@ -7490,7 +7511,7 @@
       <w:r>
         <w:t xml:space="preserve">The </w:t>
       </w:r>
-      <w:hyperlink r:id="rId30">
+      <w:hyperlink r:id="rId32">
         <w:r>
           <w:rPr>
             <w:color w:val="2F5597"/>
@@ -7517,7 +7538,7 @@
       <w:r>
         <w:t xml:space="preserve">Compare Morgan fingerprints with logistic regression or random forest via </w:t>
       </w:r>
-      <w:hyperlink r:id="rId51">
+      <w:hyperlink r:id="rId53">
         <w:r>
           <w:rPr>
             <w:color w:val="2F5597"/>
@@ -7529,7 +7550,7 @@
       <w:r>
         <w:t xml:space="preserve"> against GCN and edge-aware GINE models. OGB and </w:t>
       </w:r>
-      <w:hyperlink r:id="rId40">
+      <w:hyperlink r:id="rId42">
         <w:r>
           <w:rPr>
             <w:color w:val="2F5597"/>
@@ -7761,7 +7782,7 @@
       <w:r>
         <w:t xml:space="preserve">, </w:t>
       </w:r>
-      <w:hyperlink r:id="rId52">
+      <w:hyperlink r:id="rId54">
         <w:r>
           <w:rPr>
             <w:color w:val="2F5597"/>
@@ -7794,7 +7815,7 @@
       <w:r>
         <w:t xml:space="preserve">Data sources: </w:t>
       </w:r>
-      <w:hyperlink r:id="rId53">
+      <w:hyperlink r:id="rId55">
         <w:r>
           <w:rPr>
             <w:color w:val="2F5597"/>
@@ -7806,7 +7827,7 @@
       <w:r>
         <w:t xml:space="preserve">, </w:t>
       </w:r>
-      <w:hyperlink r:id="rId54">
+      <w:hyperlink r:id="rId56">
         <w:r>
           <w:rPr>
             <w:color w:val="2F5597"/>
@@ -7818,7 +7839,7 @@
       <w:r>
         <w:t xml:space="preserve">, </w:t>
       </w:r>
-      <w:hyperlink r:id="rId55">
+      <w:hyperlink r:id="rId57">
         <w:r>
           <w:rPr>
             <w:color w:val="2F5597"/>
@@ -7830,7 +7851,7 @@
       <w:r>
         <w:t xml:space="preserve">, </w:t>
       </w:r>
-      <w:hyperlink r:id="rId56">
+      <w:hyperlink r:id="rId58">
         <w:r>
           <w:rPr>
             <w:color w:val="2F5597"/>
@@ -7842,7 +7863,7 @@
       <w:r>
         <w:t xml:space="preserve"> and </w:t>
       </w:r>
-      <w:hyperlink r:id="rId57">
+      <w:hyperlink r:id="rId59">
         <w:r>
           <w:rPr>
             <w:color w:val="2F5597"/>
@@ -8095,7 +8116,7 @@
             <w:pPr>
               <w:spacing w:after="0"/>
             </w:pPr>
-            <w:hyperlink r:id="rId58">
+            <w:hyperlink r:id="rId60">
               <w:r>
                 <w:rPr>
                   <w:color w:val="2F5597"/>
@@ -8158,7 +8179,7 @@
             <w:r>
               <w:t xml:space="preserve">Eldele et al., </w:t>
             </w:r>
-            <w:hyperlink r:id="rId59">
+            <w:hyperlink r:id="rId61">
               <w:r>
                 <w:rPr>
                   <w:color w:val="2F5597"/>
@@ -8536,7 +8557,7 @@
             <w:pPr>
               <w:spacing w:after="0"/>
             </w:pPr>
-            <w:hyperlink r:id="rId60">
+            <w:hyperlink r:id="rId62">
               <w:r>
                 <w:rPr>
                   <w:color w:val="2F5597"/>
@@ -8599,7 +8620,7 @@
             <w:r>
               <w:t xml:space="preserve">Dong et al., </w:t>
             </w:r>
-            <w:hyperlink r:id="rId61">
+            <w:hyperlink r:id="rId63">
               <w:r>
                 <w:rPr>
                   <w:color w:val="2F5597"/>
@@ -8688,7 +8709,7 @@
       <w:r>
         <w:t xml:space="preserve"> and a 1-D ResNet or compact Transformer. The </w:t>
       </w:r>
-      <w:hyperlink r:id="rId62">
+      <w:hyperlink r:id="rId64">
         <w:r>
           <w:rPr>
             <w:color w:val="2F5597"/>
@@ -9009,7 +9030,7 @@
             <w:pPr>
               <w:spacing w:after="0"/>
             </w:pPr>
-            <w:hyperlink r:id="rId63">
+            <w:hyperlink r:id="rId65">
               <w:r>
                 <w:rPr>
                   <w:color w:val="2F5597"/>
@@ -9072,7 +9093,7 @@
             <w:r>
               <w:t xml:space="preserve">Woo et al., </w:t>
             </w:r>
-            <w:hyperlink r:id="rId64">
+            <w:hyperlink r:id="rId66">
               <w:r>
                 <w:rPr>
                   <w:color w:val="2F5597"/>
@@ -9134,7 +9155,7 @@
         </w:rPr>
         <w:t xml:space="preserve">Methods and code. </w:t>
       </w:r>
-      <w:hyperlink r:id="rId65">
+      <w:hyperlink r:id="rId67">
         <w:r>
           <w:rPr>
             <w:color w:val="2F5597"/>
@@ -9170,7 +9191,7 @@
       <w:r>
         <w:t xml:space="preserve"> for pretraining. </w:t>
       </w:r>
-      <w:hyperlink r:id="rId66">
+      <w:hyperlink r:id="rId68">
         <w:r>
           <w:rPr>
             <w:color w:val="2F5597"/>
@@ -9182,7 +9203,7 @@
       <w:r>
         <w:t xml:space="preserve"> is the required supervised reference; </w:t>
       </w:r>
-      <w:hyperlink r:id="rId67">
+      <w:hyperlink r:id="rId69">
         <w:r>
           <w:rPr>
             <w:color w:val="2F5597"/>
@@ -9522,7 +9543,7 @@
             <w:pPr>
               <w:spacing w:after="0"/>
             </w:pPr>
-            <w:hyperlink r:id="rId68">
+            <w:hyperlink r:id="rId70">
               <w:r>
                 <w:rPr>
                   <w:color w:val="2F5597"/>
@@ -9585,7 +9606,7 @@
             <w:r>
               <w:t xml:space="preserve">Brudermueller et al., </w:t>
             </w:r>
-            <w:hyperlink r:id="rId69">
+            <w:hyperlink r:id="rId71">
               <w:r>
                 <w:rPr>
                   <w:color w:val="2F5597"/>
@@ -9635,7 +9656,7 @@
       <w:r>
         <w:t xml:space="preserve">The 458 MB public download contains 1,408 households; 214 have both smart-meter data and inspection information. Use the </w:t>
       </w:r>
-      <w:hyperlink r:id="rId70">
+      <w:hyperlink r:id="rId72">
         <w:r>
           <w:rPr>
             <w:color w:val="2F5597"/>
@@ -10000,7 +10021,7 @@
             <w:pPr>
               <w:spacing w:after="0"/>
             </w:pPr>
-            <w:hyperlink r:id="rId71">
+            <w:hyperlink r:id="rId73">
               <w:r>
                 <w:rPr>
                   <w:color w:val="2F5597"/>
@@ -10063,7 +10084,7 @@
             <w:r>
               <w:t xml:space="preserve">Hou et al., </w:t>
             </w:r>
-            <w:hyperlink r:id="rId72">
+            <w:hyperlink r:id="rId74">
               <w:r>
                 <w:rPr>
                   <w:color w:val="2F5597"/>
@@ -10075,7 +10096,7 @@
             <w:r>
               <w:t xml:space="preserve">, KDD 2022 — </w:t>
             </w:r>
-            <w:hyperlink r:id="rId73">
+            <w:hyperlink r:id="rId75">
               <w:r>
                 <w:rPr>
                   <w:color w:val="2F5597"/>
@@ -10137,7 +10158,7 @@
       <w:r>
         <w:t xml:space="preserve">Paderborn provides 64 kHz vibration, speed, torque and radial load for 32 physical bearings under four operating conditions. Download it from the </w:t>
       </w:r>
-      <w:hyperlink r:id="rId74">
+      <w:hyperlink r:id="rId76">
         <w:r>
           <w:rPr>
             <w:color w:val="2F5597"/>
@@ -10164,7 +10185,7 @@
       <w:r>
         <w:t xml:space="preserve">Use a GIN encoder with </w:t>
       </w:r>
-      <w:hyperlink r:id="rId73">
+      <w:hyperlink r:id="rId75">
         <w:r>
           <w:rPr>
             <w:color w:val="2F5597"/>
@@ -10469,7 +10490,7 @@
             <w:pPr>
               <w:spacing w:after="0"/>
             </w:pPr>
-            <w:hyperlink r:id="rId71">
+            <w:hyperlink r:id="rId73">
               <w:r>
                 <w:rPr>
                   <w:color w:val="2F5597"/>
@@ -10532,7 +10553,7 @@
             <w:r>
               <w:t xml:space="preserve">Zhang et al., </w:t>
             </w:r>
-            <w:hyperlink r:id="rId75">
+            <w:hyperlink r:id="rId77">
               <w:r>
                 <w:rPr>
                   <w:color w:val="2F5597"/>
@@ -10544,7 +10565,7 @@
             <w:r>
               <w:t xml:space="preserve">, NeurIPS 2022 — </w:t>
             </w:r>
-            <w:hyperlink r:id="rId52">
+            <w:hyperlink r:id="rId54">
               <w:r>
                 <w:rPr>
                   <w:color w:val="2F5597"/>
@@ -10606,7 +10627,7 @@
       <w:r>
         <w:t xml:space="preserve">Start from the </w:t>
       </w:r>
-      <w:hyperlink r:id="rId52">
+      <w:hyperlink r:id="rId54">
         <w:r>
           <w:rPr>
             <w:color w:val="2F5597"/>
@@ -10618,7 +10639,7 @@
       <w:r>
         <w:t xml:space="preserve"> and replace its time-domain CNN or Transformer with a compact </w:t>
       </w:r>
-      <w:hyperlink r:id="rId76">
+      <w:hyperlink r:id="rId78">
         <w:r>
           <w:rPr>
             <w:color w:val="2F5597"/>
@@ -10954,7 +10975,7 @@
             <w:pPr>
               <w:spacing w:after="0"/>
             </w:pPr>
-            <w:hyperlink r:id="rId77">
+            <w:hyperlink r:id="rId79">
               <w:r>
                 <w:rPr>
                   <w:color w:val="2F5597"/>
@@ -11017,7 +11038,7 @@
             <w:r>
               <w:t xml:space="preserve">Cai et al., </w:t>
             </w:r>
-            <w:hyperlink r:id="rId78">
+            <w:hyperlink r:id="rId80">
               <w:r>
                 <w:rPr>
                   <w:color w:val="2F5597"/>
@@ -11029,7 +11050,7 @@
             <w:r>
               <w:t xml:space="preserve"> — </w:t>
             </w:r>
-            <w:hyperlink r:id="rId79">
+            <w:hyperlink r:id="rId81">
               <w:r>
                 <w:rPr>
                   <w:color w:val="2F5597"/>
@@ -11076,7 +11097,7 @@
       <w:r>
         <w:t xml:space="preserve">Develop the method on Weather, which has 21 meteorological variables and 52,696 ten-minute observations. Confirm the result on Electricity, which contains 321 hourly electricity-demand series and 26,304 observations. Use chronological splits and fit scaling, correlations and graph thresholds on the training period only. The datasets and scripts are available through </w:t>
       </w:r>
-      <w:hyperlink r:id="rId77">
+      <w:hyperlink r:id="rId79">
         <w:r>
           <w:rPr>
             <w:color w:val="2F5597"/>
@@ -11088,7 +11109,7 @@
       <w:r>
         <w:t xml:space="preserve">; </w:t>
       </w:r>
-      <w:hyperlink r:id="rId80">
+      <w:hyperlink r:id="rId82">
         <w:r>
           <w:rPr>
             <w:color w:val="2F5597"/>
@@ -11115,7 +11136,7 @@
       <w:r>
         <w:t xml:space="preserve">Use </w:t>
       </w:r>
-      <w:hyperlink r:id="rId79">
+      <w:hyperlink r:id="rId81">
         <w:r>
           <w:rPr>
             <w:color w:val="2F5597"/>
@@ -11127,7 +11148,7 @@
       <w:r>
         <w:t xml:space="preserve"> as the main code base and </w:t>
       </w:r>
-      <w:hyperlink r:id="rId81">
+      <w:hyperlink r:id="rId83">
         <w:r>
           <w:rPr>
             <w:color w:val="2F5597"/>
@@ -11139,7 +11160,7 @@
       <w:r>
         <w:t xml:space="preserve"> and </w:t>
       </w:r>
-      <w:hyperlink r:id="rId82">
+      <w:hyperlink r:id="rId84">
         <w:r>
           <w:rPr>
             <w:color w:val="2F5597"/>
@@ -11166,7 +11187,7 @@
       <w:r>
         <w:t xml:space="preserve">Compare seasonal naive, </w:t>
       </w:r>
-      <w:hyperlink r:id="rId66">
+      <w:hyperlink r:id="rId68">
         <w:r>
           <w:rPr>
             <w:color w:val="2F5597"/>
@@ -11325,7 +11346,7 @@
       <w:r>
         <w:t xml:space="preserve">Core reading: </w:t>
       </w:r>
-      <w:hyperlink r:id="rId83">
+      <w:hyperlink r:id="rId85">
         <w:r>
           <w:rPr>
             <w:color w:val="2F5597"/>
@@ -11337,7 +11358,7 @@
       <w:r>
         <w:t xml:space="preserve">, </w:t>
       </w:r>
-      <w:hyperlink r:id="rId84">
+      <w:hyperlink r:id="rId86">
         <w:r>
           <w:rPr>
             <w:color w:val="2F5597"/>
@@ -11349,7 +11370,7 @@
       <w:r>
         <w:t xml:space="preserve">, the </w:t>
       </w:r>
-      <w:hyperlink r:id="rId85">
+      <w:hyperlink r:id="rId87">
         <w:r>
           <w:rPr>
             <w:color w:val="2F5597"/>
@@ -11361,7 +11382,7 @@
       <w:r>
         <w:t xml:space="preserve">, and </w:t>
       </w:r>
-      <w:hyperlink r:id="rId86">
+      <w:hyperlink r:id="rId88">
         <w:r>
           <w:rPr>
             <w:color w:val="2F5597"/>
@@ -11373,7 +11394,7 @@
       <w:r>
         <w:t xml:space="preserve"> with its </w:t>
       </w:r>
-      <w:hyperlink r:id="rId87">
+      <w:hyperlink r:id="rId89">
         <w:r>
           <w:rPr>
             <w:color w:val="2F5597"/>
@@ -11394,7 +11415,7 @@
       <w:r>
         <w:t xml:space="preserve">Parameter-efficient adaptation: </w:t>
       </w:r>
-      <w:hyperlink r:id="rId88">
+      <w:hyperlink r:id="rId90">
         <w:r>
           <w:rPr>
             <w:color w:val="2F5597"/>
@@ -11406,7 +11427,7 @@
       <w:r>
         <w:t xml:space="preserve"> and the </w:t>
       </w:r>
-      <w:hyperlink r:id="rId89">
+      <w:hyperlink r:id="rId91">
         <w:r>
           <w:rPr>
             <w:color w:val="2F5597"/>
@@ -11427,7 +11448,7 @@
       <w:r>
         <w:t xml:space="preserve">Normal-only objectives: </w:t>
       </w:r>
-      <w:hyperlink r:id="rId83">
+      <w:hyperlink r:id="rId85">
         <w:r>
           <w:rPr>
             <w:color w:val="2F5597"/>
@@ -11439,7 +11460,7 @@
       <w:r>
         <w:t xml:space="preserve"> and </w:t>
       </w:r>
-      <w:hyperlink r:id="rId90">
+      <w:hyperlink r:id="rId92">
         <w:r>
           <w:rPr>
             <w:color w:val="2F5597"/>
@@ -11460,7 +11481,7 @@
       <w:r>
         <w:t xml:space="preserve">Data and model hubs: </w:t>
       </w:r>
-      <w:hyperlink r:id="rId91">
+      <w:hyperlink r:id="rId93">
         <w:r>
           <w:rPr>
             <w:color w:val="2F5597"/>
@@ -11472,7 +11493,7 @@
       <w:r>
         <w:t xml:space="preserve">, </w:t>
       </w:r>
-      <w:hyperlink r:id="rId92">
+      <w:hyperlink r:id="rId94">
         <w:r>
           <w:rPr>
             <w:color w:val="2F5597"/>
@@ -11484,7 +11505,7 @@
       <w:r>
         <w:t xml:space="preserve"> and </w:t>
       </w:r>
-      <w:hyperlink r:id="rId93">
+      <w:hyperlink r:id="rId95">
         <w:r>
           <w:rPr>
             <w:color w:val="2F5597"/>
@@ -11737,7 +11758,7 @@
             <w:pPr>
               <w:spacing w:after="0"/>
             </w:pPr>
-            <w:hyperlink r:id="rId91">
+            <w:hyperlink r:id="rId93">
               <w:r>
                 <w:rPr>
                   <w:color w:val="2F5597"/>
@@ -11800,7 +11821,7 @@
             <w:r>
               <w:t xml:space="preserve">Oquab et al., </w:t>
             </w:r>
-            <w:hyperlink r:id="rId84">
+            <w:hyperlink r:id="rId86">
               <w:r>
                 <w:rPr>
                   <w:color w:val="2F5597"/>
@@ -11847,7 +11868,7 @@
         </w:rPr>
         <w:t xml:space="preserve">Data. </w:t>
       </w:r>
-      <w:hyperlink r:id="rId91">
+      <w:hyperlink r:id="rId93">
         <w:r>
           <w:rPr>
             <w:color w:val="2F5597"/>
@@ -11859,7 +11880,7 @@
       <w:r>
         <w:t xml:space="preserve"> contains 5,354 images in 15 categories, with defect-free training images and labelled normal and defective test images. </w:t>
       </w:r>
-      <w:hyperlink r:id="rId94">
+      <w:hyperlink r:id="rId96">
         <w:r>
           <w:rPr>
             <w:color w:val="2F5597"/>
@@ -11895,7 +11916,7 @@
       <w:r>
         <w:t xml:space="preserve"> from the </w:t>
       </w:r>
-      <w:hyperlink r:id="rId85">
+      <w:hyperlink r:id="rId87">
         <w:r>
           <w:rPr>
             <w:color w:val="2F5597"/>
@@ -11907,7 +11928,7 @@
       <w:r>
         <w:t xml:space="preserve">. The frozen route follows </w:t>
       </w:r>
-      <w:hyperlink r:id="rId87">
+      <w:hyperlink r:id="rId89">
         <w:r>
           <w:rPr>
             <w:color w:val="2F5597"/>
@@ -11919,7 +11940,7 @@
       <w:r>
         <w:t xml:space="preserve">: store normal patch features and score each test patch by its distance to the memory bank. For the MSc route, keep a frozen DINOv2 teacher and train LoRA or adapters in a student model with </w:t>
       </w:r>
-      <w:hyperlink r:id="rId89">
+      <w:hyperlink r:id="rId91">
         <w:r>
           <w:rPr>
             <w:color w:val="2F5597"/>
@@ -11946,7 +11967,7 @@
       <w:r>
         <w:t xml:space="preserve">Compare frozen AnomalyDINO with </w:t>
       </w:r>
-      <w:hyperlink r:id="rId95">
+      <w:hyperlink r:id="rId97">
         <w:r>
           <w:rPr>
             <w:color w:val="2F5597"/>
@@ -12280,7 +12301,7 @@
             <w:pPr>
               <w:spacing w:after="0"/>
             </w:pPr>
-            <w:hyperlink r:id="rId96">
+            <w:hyperlink r:id="rId98">
               <w:r>
                 <w:rPr>
                   <w:color w:val="2F5597"/>
@@ -12408,7 +12429,7 @@
       <w:r>
         <w:t xml:space="preserve">Start with the pretrained DINOv3 ViT-S/16 backbone. Load the official weights through </w:t>
       </w:r>
-      <w:hyperlink r:id="rId97">
+      <w:hyperlink r:id="rId99">
         <w:r>
           <w:rPr>
             <w:color w:val="2F5597"/>
@@ -12420,7 +12441,7 @@
       <w:r>
         <w:t xml:space="preserve"> or the official DINOv3 repository. Use a compact U-Net-style decoder that combines patch features from several transformer layers. Compare this model with a conventional 2D U-Net or nnU-Net baseline. The </w:t>
       </w:r>
-      <w:hyperlink r:id="rId98">
+      <w:hyperlink r:id="rId100">
         <w:r>
           <w:rPr>
             <w:color w:val="2F5597"/>
@@ -12766,7 +12787,7 @@
             <w:pPr>
               <w:spacing w:after="0"/>
             </w:pPr>
-            <w:hyperlink r:id="rId99">
+            <w:hyperlink r:id="rId101">
               <w:r>
                 <w:rPr>
                   <w:color w:val="2F5597"/>
@@ -12778,7 +12799,7 @@
             <w:r>
               <w:t xml:space="preserve"> partitioned by scanner vendor; </w:t>
             </w:r>
-            <w:hyperlink r:id="rId100">
+            <w:hyperlink r:id="rId102">
               <w:r>
                 <w:rPr>
                   <w:color w:val="2F5597"/>
@@ -12906,7 +12927,7 @@
       <w:r>
         <w:t xml:space="preserve">Use the same compact 2D U-Net architecture for the local teachers and the global student in the core experiment. Each client trains its local U-Net to map a noisy slice to its reference image. The clients then denoise the same corrupted proxy images and transmit only their output images or predicted noise residuals. The server aggregates these predictions and trains the global student using a reconstruction loss to the aggregated teacher target. The clients' private images and model weights remain local. Use </w:t>
       </w:r>
-      <w:hyperlink r:id="rId101">
+      <w:hyperlink r:id="rId103">
         <w:r>
           <w:rPr>
             <w:color w:val="2F5597"/>
@@ -12918,7 +12939,7 @@
       <w:r>
         <w:t xml:space="preserve"> to organise the simulated clients and communication rounds; the denoising models can be implemented in PyTorch or </w:t>
       </w:r>
-      <w:hyperlink r:id="rId102">
+      <w:hyperlink r:id="rId104">
         <w:r>
           <w:rPr>
             <w:color w:val="2F5597"/>
@@ -13053,7 +13074,7 @@
       <w:r>
         <w:t xml:space="preserve">General unrolling: Gregor and LeCun, </w:t>
       </w:r>
-      <w:hyperlink r:id="rId103">
+      <w:hyperlink r:id="rId105">
         <w:r>
           <w:rPr>
             <w:color w:val="2F5597"/>
@@ -13065,7 +13086,7 @@
       <w:r>
         <w:t xml:space="preserve">, ICML 2010; Monga, Li and Eldar, </w:t>
       </w:r>
-      <w:hyperlink r:id="rId104">
+      <w:hyperlink r:id="rId106">
         <w:r>
           <w:rPr>
             <w:color w:val="2F5597"/>
@@ -13077,7 +13098,7 @@
       <w:r>
         <w:t xml:space="preserve">, IEEE SPM 2021; and Yang et al., </w:t>
       </w:r>
-      <w:hyperlink r:id="rId105">
+      <w:hyperlink r:id="rId107">
         <w:r>
           <w:rPr>
             <w:color w:val="2F5597"/>
@@ -13098,7 +13119,7 @@
       <w:r>
         <w:t xml:space="preserve">Signal decomposition: Dragomiretskiy and Zosso, </w:t>
       </w:r>
-      <w:hyperlink r:id="rId106">
+      <w:hyperlink r:id="rId108">
         <w:r>
           <w:rPr>
             <w:color w:val="2F5597"/>
@@ -13110,7 +13131,7 @@
       <w:r>
         <w:t xml:space="preserve">, with </w:t>
       </w:r>
-      <w:hyperlink r:id="rId107">
+      <w:hyperlink r:id="rId109">
         <w:r>
           <w:rPr>
             <w:color w:val="2F5597"/>
@@ -13122,7 +13143,7 @@
       <w:r>
         <w:t xml:space="preserve">, and Rehman and Aftab, </w:t>
       </w:r>
-      <w:hyperlink r:id="rId108">
+      <w:hyperlink r:id="rId110">
         <w:r>
           <w:rPr>
             <w:color w:val="2F5597"/>
@@ -13143,7 +13164,7 @@
       <w:r>
         <w:t xml:space="preserve">Ahmad et al., </w:t>
       </w:r>
-      <w:hyperlink r:id="rId109">
+      <w:hyperlink r:id="rId111">
         <w:r>
           <w:rPr>
             <w:color w:val="2F5597"/>
@@ -13155,7 +13176,7 @@
       <w:r>
         <w:t xml:space="preserve">, 2025 preprint, with the </w:t>
       </w:r>
-      <w:hyperlink r:id="rId110">
+      <w:hyperlink r:id="rId112">
         <w:r>
           <w:rPr>
             <w:color w:val="2F5597"/>
@@ -13402,7 +13423,7 @@
             <w:r>
               <w:t xml:space="preserve">Synthetic multichannel signals plus </w:t>
             </w:r>
-            <w:hyperlink r:id="rId111">
+            <w:hyperlink r:id="rId113">
               <w:r>
                 <w:rPr>
                   <w:color w:val="2F5597"/>
@@ -13465,7 +13486,7 @@
             <w:r>
               <w:t xml:space="preserve">Ahmad, Wesemann, Waschkowski &amp; Khalid, </w:t>
             </w:r>
-            <w:hyperlink r:id="rId109">
+            <w:hyperlink r:id="rId111">
               <w:r>
                 <w:rPr>
                   <w:color w:val="2F5597"/>
@@ -13539,7 +13560,7 @@
       <w:r>
         <w:t xml:space="preserve"> of </w:t>
       </w:r>
-      <w:hyperlink r:id="rId111">
+      <w:hyperlink r:id="rId113">
         <w:r>
           <w:rPr>
             <w:color w:val="2F5597"/>
@@ -13566,7 +13587,7 @@
       <w:r>
         <w:t xml:space="preserve">Validate classical MVMD using the </w:t>
       </w:r>
-      <w:hyperlink r:id="rId112">
+      <w:hyperlink r:id="rId114">
         <w:r>
           <w:rPr>
             <w:color w:val="2F5597"/>
@@ -13578,7 +13599,7 @@
       <w:r>
         <w:t xml:space="preserve"> and an </w:t>
       </w:r>
-      <w:hyperlink r:id="rId113">
+      <w:hyperlink r:id="rId115">
         <w:r>
           <w:rPr>
             <w:color w:val="2F5597"/>
@@ -13590,7 +13611,7 @@
       <w:r>
         <w:t xml:space="preserve">. Reimplement the UVMD equations from the </w:t>
       </w:r>
-      <w:hyperlink r:id="rId109">
+      <w:hyperlink r:id="rId111">
         <w:r>
           <w:rPr>
             <w:color w:val="2F5597"/>

</xml_diff>

<commit_message>
Use partner wording for drivetrain kinematics
</commit_message>
<xml_diff>
--- a/downloads/student-project-portfolio.docx
+++ b/downloads/student-project-portfolio.docx
@@ -4366,19 +4366,7 @@
         </w:r>
       </w:hyperlink>
       <w:r>
-        <w:t xml:space="preserve"> is available. As an optional physics-informed extension, use shaft speed and component geometry to construct order-domain or characteristic-frequency features, following the general approach demonstrated by </w:t>
-      </w:r>
-      <w:hyperlink r:id="rId25">
-        <w:r>
-          <w:rPr>
-            <w:color w:val="2F5597"/>
-            <w:u w:val="single"/>
-          </w:rPr>
-          <w:t>Shen et al</w:t>
-        </w:r>
-      </w:hyperlink>
-      <w:r>
-        <w:t>.</w:t>
+        <w:t xml:space="preserve"> is available. Vibration signatures are strongly influenced by component kinematics and structural characteristics, suggesting that machine configuration information may already be encoded within measured signals.</w:t>
       </w:r>
     </w:p>
     <w:p>
@@ -4395,7 +4383,7 @@
       <w:r>
         <w:t xml:space="preserve">Compare three inputs: operational metadata only, vibration features only, and their combination. Split the data by turbine. Evaluate whether the correct configuration is ranked first or appears among the highest-ranked candidates, and use a </w:t>
       </w:r>
-      <w:hyperlink r:id="rId26">
+      <w:hyperlink r:id="rId25">
         <w:r>
           <w:rPr>
             <w:color w:val="2F5597"/>
@@ -4892,7 +4880,7 @@
       <w:r>
         <w:t xml:space="preserve">Confirm the independent-cycle count and one measurable downstream target before allocation. Rerunning an unchanged self-supervised method is a baseline, not the Master contribution. Follow the </w:t>
       </w:r>
-      <w:hyperlink r:id="rId27">
+      <w:hyperlink r:id="rId26">
         <w:r>
           <w:rPr>
             <w:color w:val="2F5597"/>
@@ -5090,7 +5078,7 @@
       <w:r>
         <w:t xml:space="preserve">Begin with </w:t>
       </w:r>
-      <w:hyperlink r:id="rId28">
+      <w:hyperlink r:id="rId27">
         <w:r>
           <w:rPr>
             <w:color w:val="2F5597"/>
@@ -5102,7 +5090,7 @@
       <w:r>
         <w:t xml:space="preserve">, then use the </w:t>
       </w:r>
-      <w:hyperlink r:id="rId29">
+      <w:hyperlink r:id="rId28">
         <w:r>
           <w:rPr>
             <w:color w:val="2F5597"/>
@@ -5114,7 +5102,7 @@
       <w:r>
         <w:t xml:space="preserve"> and the </w:t>
       </w:r>
-      <w:hyperlink r:id="rId30">
+      <w:hyperlink r:id="rId29">
         <w:r>
           <w:rPr>
             <w:color w:val="2F5597"/>
@@ -5132,7 +5120,7 @@
         <w:pStyle w:val="ListBullet"/>
         <w:spacing w:before="0" w:after="40" w:line="254" w:lineRule="auto"/>
       </w:pPr>
-      <w:hyperlink r:id="rId31">
+      <w:hyperlink r:id="rId30">
         <w:r>
           <w:rPr>
             <w:color w:val="2F5597"/>
@@ -5144,7 +5132,7 @@
       <w:r>
         <w:t xml:space="preserve">, </w:t>
       </w:r>
-      <w:hyperlink r:id="rId32">
+      <w:hyperlink r:id="rId31">
         <w:r>
           <w:rPr>
             <w:color w:val="2F5597"/>
@@ -5156,7 +5144,7 @@
       <w:r>
         <w:t xml:space="preserve">, </w:t>
       </w:r>
-      <w:hyperlink r:id="rId33">
+      <w:hyperlink r:id="rId32">
         <w:r>
           <w:rPr>
             <w:color w:val="2F5597"/>
@@ -5168,7 +5156,7 @@
       <w:r>
         <w:t xml:space="preserve"> and the </w:t>
       </w:r>
-      <w:hyperlink r:id="rId34">
+      <w:hyperlink r:id="rId33">
         <w:r>
           <w:rPr>
             <w:color w:val="2F5597"/>
@@ -5189,7 +5177,7 @@
       <w:r>
         <w:t xml:space="preserve">Stanford examples: </w:t>
       </w:r>
-      <w:hyperlink r:id="rId35">
+      <w:hyperlink r:id="rId34">
         <w:r>
           <w:rPr>
             <w:color w:val="2F5597"/>
@@ -5201,7 +5189,7 @@
       <w:r>
         <w:t xml:space="preserve">, </w:t>
       </w:r>
-      <w:hyperlink r:id="rId36">
+      <w:hyperlink r:id="rId35">
         <w:r>
           <w:rPr>
             <w:color w:val="2F5597"/>
@@ -5213,7 +5201,7 @@
       <w:r>
         <w:t xml:space="preserve">, </w:t>
       </w:r>
-      <w:hyperlink r:id="rId37">
+      <w:hyperlink r:id="rId36">
         <w:r>
           <w:rPr>
             <w:color w:val="2F5597"/>
@@ -5225,7 +5213,7 @@
       <w:r>
         <w:t xml:space="preserve"> and </w:t>
       </w:r>
-      <w:hyperlink r:id="rId38">
+      <w:hyperlink r:id="rId37">
         <w:r>
           <w:rPr>
             <w:color w:val="2F5597"/>
@@ -5469,7 +5457,7 @@
             <w:pPr>
               <w:spacing w:after="0"/>
             </w:pPr>
-            <w:hyperlink r:id="rId39">
+            <w:hyperlink r:id="rId38">
               <w:r>
                 <w:rPr>
                   <w:color w:val="2F5597"/>
@@ -5532,7 +5520,7 @@
             <w:r>
               <w:t xml:space="preserve">Huang, He and Sick, </w:t>
             </w:r>
-            <w:hyperlink r:id="rId40">
+            <w:hyperlink r:id="rId39">
               <w:r>
                 <w:rPr>
                   <w:color w:val="2F5597"/>
@@ -5606,7 +5594,7 @@
       <w:r>
         <w:t xml:space="preserve">Use a GRU or TCN as the graph-free baseline and a compact GCN–GRU or GAT–GRU as the graph model. The </w:t>
       </w:r>
-      <w:hyperlink r:id="rId41">
+      <w:hyperlink r:id="rId40">
         <w:r>
           <w:rPr>
             <w:color w:val="2F5597"/>
@@ -5618,7 +5606,7 @@
       <w:r>
         <w:t xml:space="preserve"> is a useful reference; a small </w:t>
       </w:r>
-      <w:hyperlink r:id="rId42">
+      <w:hyperlink r:id="rId41">
         <w:r>
           <w:rPr>
             <w:color w:val="2F5597"/>
@@ -5973,7 +5961,7 @@
             <w:pPr>
               <w:spacing w:after="0"/>
             </w:pPr>
-            <w:hyperlink r:id="rId43">
+            <w:hyperlink r:id="rId42">
               <w:r>
                 <w:rPr>
                   <w:color w:val="2F5597"/>
@@ -6036,7 +6024,7 @@
             <w:r>
               <w:t xml:space="preserve">Wu et al., </w:t>
             </w:r>
-            <w:hyperlink r:id="rId44">
+            <w:hyperlink r:id="rId43">
               <w:r>
                 <w:rPr>
                   <w:color w:val="2F5597"/>
@@ -6101,7 +6089,7 @@
       <w:r>
         <w:t xml:space="preserve">Compare historical average and a graph-free GRU with </w:t>
       </w:r>
-      <w:hyperlink r:id="rId45">
+      <w:hyperlink r:id="rId44">
         <w:r>
           <w:rPr>
             <w:color w:val="2F5597"/>
@@ -6456,7 +6444,7 @@
             <w:pPr>
               <w:spacing w:after="0"/>
             </w:pPr>
-            <w:hyperlink r:id="rId46">
+            <w:hyperlink r:id="rId45">
               <w:r>
                 <w:rPr>
                   <w:color w:val="2F5597"/>
@@ -6519,7 +6507,7 @@
             <w:r>
               <w:t xml:space="preserve">Weber et al., </w:t>
             </w:r>
-            <w:hyperlink r:id="rId47">
+            <w:hyperlink r:id="rId46">
               <w:r>
                 <w:rPr>
                   <w:color w:val="2F5597"/>
@@ -6593,7 +6581,7 @@
       <w:r>
         <w:t xml:space="preserve">Compare logistic regression or random forest with GCN and GraphSAGE in </w:t>
       </w:r>
-      <w:hyperlink r:id="rId42">
+      <w:hyperlink r:id="rId41">
         <w:r>
           <w:rPr>
             <w:color w:val="2F5597"/>
@@ -6948,7 +6936,7 @@
             <w:pPr>
               <w:spacing w:after="0"/>
             </w:pPr>
-            <w:hyperlink r:id="rId48">
+            <w:hyperlink r:id="rId47">
               <w:r>
                 <w:rPr>
                   <w:color w:val="2F5597"/>
@@ -7011,7 +6999,7 @@
             <w:r>
               <w:t xml:space="preserve">He et al., </w:t>
             </w:r>
-            <w:hyperlink r:id="rId49">
+            <w:hyperlink r:id="rId48">
               <w:r>
                 <w:rPr>
                   <w:color w:val="2F5597"/>
@@ -7076,7 +7064,7 @@
       <w:r>
         <w:t xml:space="preserve">Compare popularity, BPR matrix factorisation and LightGCN. A direct </w:t>
       </w:r>
-      <w:hyperlink r:id="rId42">
+      <w:hyperlink r:id="rId41">
         <w:r>
           <w:rPr>
             <w:color w:val="2F5597"/>
@@ -7088,7 +7076,7 @@
       <w:r>
         <w:t xml:space="preserve"> implementation is simpler than adapting the </w:t>
       </w:r>
-      <w:hyperlink r:id="rId50">
+      <w:hyperlink r:id="rId49">
         <w:r>
           <w:rPr>
             <w:color w:val="2F5597"/>
@@ -7398,7 +7386,7 @@
             <w:pPr>
               <w:spacing w:after="0"/>
             </w:pPr>
-            <w:hyperlink r:id="rId51">
+            <w:hyperlink r:id="rId50">
               <w:r>
                 <w:rPr>
                   <w:color w:val="2F5597"/>
@@ -7461,7 +7449,7 @@
             <w:r>
               <w:t xml:space="preserve">Hu et al., </w:t>
             </w:r>
-            <w:hyperlink r:id="rId52">
+            <w:hyperlink r:id="rId51">
               <w:r>
                 <w:rPr>
                   <w:color w:val="2F5597"/>
@@ -7511,7 +7499,7 @@
       <w:r>
         <w:t xml:space="preserve">The </w:t>
       </w:r>
-      <w:hyperlink r:id="rId32">
+      <w:hyperlink r:id="rId31">
         <w:r>
           <w:rPr>
             <w:color w:val="2F5597"/>
@@ -7538,7 +7526,7 @@
       <w:r>
         <w:t xml:space="preserve">Compare Morgan fingerprints with logistic regression or random forest via </w:t>
       </w:r>
-      <w:hyperlink r:id="rId53">
+      <w:hyperlink r:id="rId52">
         <w:r>
           <w:rPr>
             <w:color w:val="2F5597"/>
@@ -7550,7 +7538,7 @@
       <w:r>
         <w:t xml:space="preserve"> against GCN and edge-aware GINE models. OGB and </w:t>
       </w:r>
-      <w:hyperlink r:id="rId42">
+      <w:hyperlink r:id="rId41">
         <w:r>
           <w:rPr>
             <w:color w:val="2F5597"/>
@@ -7782,7 +7770,7 @@
       <w:r>
         <w:t xml:space="preserve">, </w:t>
       </w:r>
-      <w:hyperlink r:id="rId54">
+      <w:hyperlink r:id="rId53">
         <w:r>
           <w:rPr>
             <w:color w:val="2F5597"/>
@@ -7815,7 +7803,7 @@
       <w:r>
         <w:t xml:space="preserve">Data sources: </w:t>
       </w:r>
-      <w:hyperlink r:id="rId55">
+      <w:hyperlink r:id="rId54">
         <w:r>
           <w:rPr>
             <w:color w:val="2F5597"/>
@@ -7827,7 +7815,7 @@
       <w:r>
         <w:t xml:space="preserve">, </w:t>
       </w:r>
-      <w:hyperlink r:id="rId56">
+      <w:hyperlink r:id="rId55">
         <w:r>
           <w:rPr>
             <w:color w:val="2F5597"/>
@@ -7839,7 +7827,7 @@
       <w:r>
         <w:t xml:space="preserve">, </w:t>
       </w:r>
-      <w:hyperlink r:id="rId57">
+      <w:hyperlink r:id="rId56">
         <w:r>
           <w:rPr>
             <w:color w:val="2F5597"/>
@@ -7851,7 +7839,7 @@
       <w:r>
         <w:t xml:space="preserve">, </w:t>
       </w:r>
-      <w:hyperlink r:id="rId58">
+      <w:hyperlink r:id="rId57">
         <w:r>
           <w:rPr>
             <w:color w:val="2F5597"/>
@@ -7863,7 +7851,7 @@
       <w:r>
         <w:t xml:space="preserve"> and </w:t>
       </w:r>
-      <w:hyperlink r:id="rId59">
+      <w:hyperlink r:id="rId58">
         <w:r>
           <w:rPr>
             <w:color w:val="2F5597"/>
@@ -8116,7 +8104,7 @@
             <w:pPr>
               <w:spacing w:after="0"/>
             </w:pPr>
-            <w:hyperlink r:id="rId60">
+            <w:hyperlink r:id="rId59">
               <w:r>
                 <w:rPr>
                   <w:color w:val="2F5597"/>
@@ -8179,7 +8167,7 @@
             <w:r>
               <w:t xml:space="preserve">Eldele et al., </w:t>
             </w:r>
-            <w:hyperlink r:id="rId61">
+            <w:hyperlink r:id="rId60">
               <w:r>
                 <w:rPr>
                   <w:color w:val="2F5597"/>
@@ -8557,7 +8545,7 @@
             <w:pPr>
               <w:spacing w:after="0"/>
             </w:pPr>
-            <w:hyperlink r:id="rId62">
+            <w:hyperlink r:id="rId61">
               <w:r>
                 <w:rPr>
                   <w:color w:val="2F5597"/>
@@ -8620,7 +8608,7 @@
             <w:r>
               <w:t xml:space="preserve">Dong et al., </w:t>
             </w:r>
-            <w:hyperlink r:id="rId63">
+            <w:hyperlink r:id="rId62">
               <w:r>
                 <w:rPr>
                   <w:color w:val="2F5597"/>
@@ -8709,7 +8697,7 @@
       <w:r>
         <w:t xml:space="preserve"> and a 1-D ResNet or compact Transformer. The </w:t>
       </w:r>
-      <w:hyperlink r:id="rId64">
+      <w:hyperlink r:id="rId63">
         <w:r>
           <w:rPr>
             <w:color w:val="2F5597"/>
@@ -9030,7 +9018,7 @@
             <w:pPr>
               <w:spacing w:after="0"/>
             </w:pPr>
-            <w:hyperlink r:id="rId65">
+            <w:hyperlink r:id="rId64">
               <w:r>
                 <w:rPr>
                   <w:color w:val="2F5597"/>
@@ -9093,7 +9081,7 @@
             <w:r>
               <w:t xml:space="preserve">Woo et al., </w:t>
             </w:r>
-            <w:hyperlink r:id="rId66">
+            <w:hyperlink r:id="rId65">
               <w:r>
                 <w:rPr>
                   <w:color w:val="2F5597"/>
@@ -9155,7 +9143,7 @@
         </w:rPr>
         <w:t xml:space="preserve">Methods and code. </w:t>
       </w:r>
-      <w:hyperlink r:id="rId67">
+      <w:hyperlink r:id="rId66">
         <w:r>
           <w:rPr>
             <w:color w:val="2F5597"/>
@@ -9191,7 +9179,7 @@
       <w:r>
         <w:t xml:space="preserve"> for pretraining. </w:t>
       </w:r>
-      <w:hyperlink r:id="rId68">
+      <w:hyperlink r:id="rId67">
         <w:r>
           <w:rPr>
             <w:color w:val="2F5597"/>
@@ -9203,7 +9191,7 @@
       <w:r>
         <w:t xml:space="preserve"> is the required supervised reference; </w:t>
       </w:r>
-      <w:hyperlink r:id="rId69">
+      <w:hyperlink r:id="rId68">
         <w:r>
           <w:rPr>
             <w:color w:val="2F5597"/>
@@ -9543,7 +9531,7 @@
             <w:pPr>
               <w:spacing w:after="0"/>
             </w:pPr>
-            <w:hyperlink r:id="rId70">
+            <w:hyperlink r:id="rId69">
               <w:r>
                 <w:rPr>
                   <w:color w:val="2F5597"/>
@@ -9606,7 +9594,7 @@
             <w:r>
               <w:t xml:space="preserve">Brudermueller et al., </w:t>
             </w:r>
-            <w:hyperlink r:id="rId71">
+            <w:hyperlink r:id="rId70">
               <w:r>
                 <w:rPr>
                   <w:color w:val="2F5597"/>
@@ -9656,7 +9644,7 @@
       <w:r>
         <w:t xml:space="preserve">The 458 MB public download contains 1,408 households; 214 have both smart-meter data and inspection information. Use the </w:t>
       </w:r>
-      <w:hyperlink r:id="rId72">
+      <w:hyperlink r:id="rId71">
         <w:r>
           <w:rPr>
             <w:color w:val="2F5597"/>
@@ -10021,7 +10009,7 @@
             <w:pPr>
               <w:spacing w:after="0"/>
             </w:pPr>
-            <w:hyperlink r:id="rId73">
+            <w:hyperlink r:id="rId72">
               <w:r>
                 <w:rPr>
                   <w:color w:val="2F5597"/>
@@ -10084,7 +10072,7 @@
             <w:r>
               <w:t xml:space="preserve">Hou et al., </w:t>
             </w:r>
-            <w:hyperlink r:id="rId74">
+            <w:hyperlink r:id="rId73">
               <w:r>
                 <w:rPr>
                   <w:color w:val="2F5597"/>
@@ -10096,7 +10084,7 @@
             <w:r>
               <w:t xml:space="preserve">, KDD 2022 — </w:t>
             </w:r>
-            <w:hyperlink r:id="rId75">
+            <w:hyperlink r:id="rId74">
               <w:r>
                 <w:rPr>
                   <w:color w:val="2F5597"/>
@@ -10158,7 +10146,7 @@
       <w:r>
         <w:t xml:space="preserve">Paderborn provides 64 kHz vibration, speed, torque and radial load for 32 physical bearings under four operating conditions. Download it from the </w:t>
       </w:r>
-      <w:hyperlink r:id="rId76">
+      <w:hyperlink r:id="rId75">
         <w:r>
           <w:rPr>
             <w:color w:val="2F5597"/>
@@ -10185,7 +10173,7 @@
       <w:r>
         <w:t xml:space="preserve">Use a GIN encoder with </w:t>
       </w:r>
-      <w:hyperlink r:id="rId75">
+      <w:hyperlink r:id="rId74">
         <w:r>
           <w:rPr>
             <w:color w:val="2F5597"/>
@@ -10490,7 +10478,7 @@
             <w:pPr>
               <w:spacing w:after="0"/>
             </w:pPr>
-            <w:hyperlink r:id="rId73">
+            <w:hyperlink r:id="rId72">
               <w:r>
                 <w:rPr>
                   <w:color w:val="2F5597"/>
@@ -10553,7 +10541,7 @@
             <w:r>
               <w:t xml:space="preserve">Zhang et al., </w:t>
             </w:r>
-            <w:hyperlink r:id="rId77">
+            <w:hyperlink r:id="rId76">
               <w:r>
                 <w:rPr>
                   <w:color w:val="2F5597"/>
@@ -10565,7 +10553,7 @@
             <w:r>
               <w:t xml:space="preserve">, NeurIPS 2022 — </w:t>
             </w:r>
-            <w:hyperlink r:id="rId54">
+            <w:hyperlink r:id="rId53">
               <w:r>
                 <w:rPr>
                   <w:color w:val="2F5597"/>
@@ -10627,7 +10615,7 @@
       <w:r>
         <w:t xml:space="preserve">Start from the </w:t>
       </w:r>
-      <w:hyperlink r:id="rId54">
+      <w:hyperlink r:id="rId53">
         <w:r>
           <w:rPr>
             <w:color w:val="2F5597"/>
@@ -10639,7 +10627,7 @@
       <w:r>
         <w:t xml:space="preserve"> and replace its time-domain CNN or Transformer with a compact </w:t>
       </w:r>
-      <w:hyperlink r:id="rId78">
+      <w:hyperlink r:id="rId77">
         <w:r>
           <w:rPr>
             <w:color w:val="2F5597"/>
@@ -10975,7 +10963,7 @@
             <w:pPr>
               <w:spacing w:after="0"/>
             </w:pPr>
-            <w:hyperlink r:id="rId79">
+            <w:hyperlink r:id="rId78">
               <w:r>
                 <w:rPr>
                   <w:color w:val="2F5597"/>
@@ -11038,7 +11026,7 @@
             <w:r>
               <w:t xml:space="preserve">Cai et al., </w:t>
             </w:r>
-            <w:hyperlink r:id="rId80">
+            <w:hyperlink r:id="rId79">
               <w:r>
                 <w:rPr>
                   <w:color w:val="2F5597"/>
@@ -11050,7 +11038,7 @@
             <w:r>
               <w:t xml:space="preserve"> — </w:t>
             </w:r>
-            <w:hyperlink r:id="rId81">
+            <w:hyperlink r:id="rId80">
               <w:r>
                 <w:rPr>
                   <w:color w:val="2F5597"/>
@@ -11097,7 +11085,7 @@
       <w:r>
         <w:t xml:space="preserve">Develop the method on Weather, which has 21 meteorological variables and 52,696 ten-minute observations. Confirm the result on Electricity, which contains 321 hourly electricity-demand series and 26,304 observations. Use chronological splits and fit scaling, correlations and graph thresholds on the training period only. The datasets and scripts are available through </w:t>
       </w:r>
-      <w:hyperlink r:id="rId79">
+      <w:hyperlink r:id="rId78">
         <w:r>
           <w:rPr>
             <w:color w:val="2F5597"/>
@@ -11109,7 +11097,7 @@
       <w:r>
         <w:t xml:space="preserve">; </w:t>
       </w:r>
-      <w:hyperlink r:id="rId82">
+      <w:hyperlink r:id="rId81">
         <w:r>
           <w:rPr>
             <w:color w:val="2F5597"/>
@@ -11136,7 +11124,7 @@
       <w:r>
         <w:t xml:space="preserve">Use </w:t>
       </w:r>
-      <w:hyperlink r:id="rId81">
+      <w:hyperlink r:id="rId80">
         <w:r>
           <w:rPr>
             <w:color w:val="2F5597"/>
@@ -11148,7 +11136,7 @@
       <w:r>
         <w:t xml:space="preserve"> as the main code base and </w:t>
       </w:r>
-      <w:hyperlink r:id="rId83">
+      <w:hyperlink r:id="rId82">
         <w:r>
           <w:rPr>
             <w:color w:val="2F5597"/>
@@ -11160,7 +11148,7 @@
       <w:r>
         <w:t xml:space="preserve"> and </w:t>
       </w:r>
-      <w:hyperlink r:id="rId84">
+      <w:hyperlink r:id="rId83">
         <w:r>
           <w:rPr>
             <w:color w:val="2F5597"/>
@@ -11187,7 +11175,7 @@
       <w:r>
         <w:t xml:space="preserve">Compare seasonal naive, </w:t>
       </w:r>
-      <w:hyperlink r:id="rId68">
+      <w:hyperlink r:id="rId67">
         <w:r>
           <w:rPr>
             <w:color w:val="2F5597"/>
@@ -11346,7 +11334,7 @@
       <w:r>
         <w:t xml:space="preserve">Core reading: </w:t>
       </w:r>
-      <w:hyperlink r:id="rId85">
+      <w:hyperlink r:id="rId84">
         <w:r>
           <w:rPr>
             <w:color w:val="2F5597"/>
@@ -11358,7 +11346,7 @@
       <w:r>
         <w:t xml:space="preserve">, </w:t>
       </w:r>
-      <w:hyperlink r:id="rId86">
+      <w:hyperlink r:id="rId85">
         <w:r>
           <w:rPr>
             <w:color w:val="2F5597"/>
@@ -11370,7 +11358,7 @@
       <w:r>
         <w:t xml:space="preserve">, the </w:t>
       </w:r>
-      <w:hyperlink r:id="rId87">
+      <w:hyperlink r:id="rId86">
         <w:r>
           <w:rPr>
             <w:color w:val="2F5597"/>
@@ -11382,7 +11370,7 @@
       <w:r>
         <w:t xml:space="preserve">, and </w:t>
       </w:r>
-      <w:hyperlink r:id="rId88">
+      <w:hyperlink r:id="rId87">
         <w:r>
           <w:rPr>
             <w:color w:val="2F5597"/>
@@ -11394,7 +11382,7 @@
       <w:r>
         <w:t xml:space="preserve"> with its </w:t>
       </w:r>
-      <w:hyperlink r:id="rId89">
+      <w:hyperlink r:id="rId88">
         <w:r>
           <w:rPr>
             <w:color w:val="2F5597"/>
@@ -11415,7 +11403,7 @@
       <w:r>
         <w:t xml:space="preserve">Parameter-efficient adaptation: </w:t>
       </w:r>
-      <w:hyperlink r:id="rId90">
+      <w:hyperlink r:id="rId89">
         <w:r>
           <w:rPr>
             <w:color w:val="2F5597"/>
@@ -11427,7 +11415,7 @@
       <w:r>
         <w:t xml:space="preserve"> and the </w:t>
       </w:r>
-      <w:hyperlink r:id="rId91">
+      <w:hyperlink r:id="rId90">
         <w:r>
           <w:rPr>
             <w:color w:val="2F5597"/>
@@ -11448,7 +11436,7 @@
       <w:r>
         <w:t xml:space="preserve">Normal-only objectives: </w:t>
       </w:r>
-      <w:hyperlink r:id="rId85">
+      <w:hyperlink r:id="rId84">
         <w:r>
           <w:rPr>
             <w:color w:val="2F5597"/>
@@ -11460,7 +11448,7 @@
       <w:r>
         <w:t xml:space="preserve"> and </w:t>
       </w:r>
-      <w:hyperlink r:id="rId92">
+      <w:hyperlink r:id="rId91">
         <w:r>
           <w:rPr>
             <w:color w:val="2F5597"/>
@@ -11481,7 +11469,7 @@
       <w:r>
         <w:t xml:space="preserve">Data and model hubs: </w:t>
       </w:r>
-      <w:hyperlink r:id="rId93">
+      <w:hyperlink r:id="rId92">
         <w:r>
           <w:rPr>
             <w:color w:val="2F5597"/>
@@ -11493,7 +11481,7 @@
       <w:r>
         <w:t xml:space="preserve">, </w:t>
       </w:r>
-      <w:hyperlink r:id="rId94">
+      <w:hyperlink r:id="rId93">
         <w:r>
           <w:rPr>
             <w:color w:val="2F5597"/>
@@ -11505,7 +11493,7 @@
       <w:r>
         <w:t xml:space="preserve"> and </w:t>
       </w:r>
-      <w:hyperlink r:id="rId95">
+      <w:hyperlink r:id="rId94">
         <w:r>
           <w:rPr>
             <w:color w:val="2F5597"/>
@@ -11758,7 +11746,7 @@
             <w:pPr>
               <w:spacing w:after="0"/>
             </w:pPr>
-            <w:hyperlink r:id="rId93">
+            <w:hyperlink r:id="rId92">
               <w:r>
                 <w:rPr>
                   <w:color w:val="2F5597"/>
@@ -11821,7 +11809,7 @@
             <w:r>
               <w:t xml:space="preserve">Oquab et al., </w:t>
             </w:r>
-            <w:hyperlink r:id="rId86">
+            <w:hyperlink r:id="rId85">
               <w:r>
                 <w:rPr>
                   <w:color w:val="2F5597"/>
@@ -11868,7 +11856,7 @@
         </w:rPr>
         <w:t xml:space="preserve">Data. </w:t>
       </w:r>
-      <w:hyperlink r:id="rId93">
+      <w:hyperlink r:id="rId92">
         <w:r>
           <w:rPr>
             <w:color w:val="2F5597"/>
@@ -11880,7 +11868,7 @@
       <w:r>
         <w:t xml:space="preserve"> contains 5,354 images in 15 categories, with defect-free training images and labelled normal and defective test images. </w:t>
       </w:r>
-      <w:hyperlink r:id="rId96">
+      <w:hyperlink r:id="rId95">
         <w:r>
           <w:rPr>
             <w:color w:val="2F5597"/>
@@ -11916,7 +11904,7 @@
       <w:r>
         <w:t xml:space="preserve"> from the </w:t>
       </w:r>
-      <w:hyperlink r:id="rId87">
+      <w:hyperlink r:id="rId86">
         <w:r>
           <w:rPr>
             <w:color w:val="2F5597"/>
@@ -11928,7 +11916,7 @@
       <w:r>
         <w:t xml:space="preserve">. The frozen route follows </w:t>
       </w:r>
-      <w:hyperlink r:id="rId89">
+      <w:hyperlink r:id="rId88">
         <w:r>
           <w:rPr>
             <w:color w:val="2F5597"/>
@@ -11940,7 +11928,7 @@
       <w:r>
         <w:t xml:space="preserve">: store normal patch features and score each test patch by its distance to the memory bank. For the MSc route, keep a frozen DINOv2 teacher and train LoRA or adapters in a student model with </w:t>
       </w:r>
-      <w:hyperlink r:id="rId91">
+      <w:hyperlink r:id="rId90">
         <w:r>
           <w:rPr>
             <w:color w:val="2F5597"/>
@@ -11967,7 +11955,7 @@
       <w:r>
         <w:t xml:space="preserve">Compare frozen AnomalyDINO with </w:t>
       </w:r>
-      <w:hyperlink r:id="rId97">
+      <w:hyperlink r:id="rId96">
         <w:r>
           <w:rPr>
             <w:color w:val="2F5597"/>
@@ -12301,7 +12289,7 @@
             <w:pPr>
               <w:spacing w:after="0"/>
             </w:pPr>
-            <w:hyperlink r:id="rId98">
+            <w:hyperlink r:id="rId97">
               <w:r>
                 <w:rPr>
                   <w:color w:val="2F5597"/>
@@ -12429,7 +12417,7 @@
       <w:r>
         <w:t xml:space="preserve">Start with the pretrained DINOv3 ViT-S/16 backbone. Load the official weights through </w:t>
       </w:r>
-      <w:hyperlink r:id="rId99">
+      <w:hyperlink r:id="rId98">
         <w:r>
           <w:rPr>
             <w:color w:val="2F5597"/>
@@ -12441,7 +12429,7 @@
       <w:r>
         <w:t xml:space="preserve"> or the official DINOv3 repository. Use a compact U-Net-style decoder that combines patch features from several transformer layers. Compare this model with a conventional 2D U-Net or nnU-Net baseline. The </w:t>
       </w:r>
-      <w:hyperlink r:id="rId100">
+      <w:hyperlink r:id="rId99">
         <w:r>
           <w:rPr>
             <w:color w:val="2F5597"/>
@@ -12787,7 +12775,7 @@
             <w:pPr>
               <w:spacing w:after="0"/>
             </w:pPr>
-            <w:hyperlink r:id="rId101">
+            <w:hyperlink r:id="rId100">
               <w:r>
                 <w:rPr>
                   <w:color w:val="2F5597"/>
@@ -12799,7 +12787,7 @@
             <w:r>
               <w:t xml:space="preserve"> partitioned by scanner vendor; </w:t>
             </w:r>
-            <w:hyperlink r:id="rId102">
+            <w:hyperlink r:id="rId101">
               <w:r>
                 <w:rPr>
                   <w:color w:val="2F5597"/>
@@ -12927,7 +12915,7 @@
       <w:r>
         <w:t xml:space="preserve">Use the same compact 2D U-Net architecture for the local teachers and the global student in the core experiment. Each client trains its local U-Net to map a noisy slice to its reference image. The clients then denoise the same corrupted proxy images and transmit only their output images or predicted noise residuals. The server aggregates these predictions and trains the global student using a reconstruction loss to the aggregated teacher target. The clients' private images and model weights remain local. Use </w:t>
       </w:r>
-      <w:hyperlink r:id="rId103">
+      <w:hyperlink r:id="rId102">
         <w:r>
           <w:rPr>
             <w:color w:val="2F5597"/>
@@ -12939,7 +12927,7 @@
       <w:r>
         <w:t xml:space="preserve"> to organise the simulated clients and communication rounds; the denoising models can be implemented in PyTorch or </w:t>
       </w:r>
-      <w:hyperlink r:id="rId104">
+      <w:hyperlink r:id="rId103">
         <w:r>
           <w:rPr>
             <w:color w:val="2F5597"/>
@@ -13074,7 +13062,7 @@
       <w:r>
         <w:t xml:space="preserve">General unrolling: Gregor and LeCun, </w:t>
       </w:r>
-      <w:hyperlink r:id="rId105">
+      <w:hyperlink r:id="rId104">
         <w:r>
           <w:rPr>
             <w:color w:val="2F5597"/>
@@ -13086,7 +13074,7 @@
       <w:r>
         <w:t xml:space="preserve">, ICML 2010; Monga, Li and Eldar, </w:t>
       </w:r>
-      <w:hyperlink r:id="rId106">
+      <w:hyperlink r:id="rId105">
         <w:r>
           <w:rPr>
             <w:color w:val="2F5597"/>
@@ -13098,7 +13086,7 @@
       <w:r>
         <w:t xml:space="preserve">, IEEE SPM 2021; and Yang et al., </w:t>
       </w:r>
-      <w:hyperlink r:id="rId107">
+      <w:hyperlink r:id="rId106">
         <w:r>
           <w:rPr>
             <w:color w:val="2F5597"/>
@@ -13119,7 +13107,7 @@
       <w:r>
         <w:t xml:space="preserve">Signal decomposition: Dragomiretskiy and Zosso, </w:t>
       </w:r>
-      <w:hyperlink r:id="rId108">
+      <w:hyperlink r:id="rId107">
         <w:r>
           <w:rPr>
             <w:color w:val="2F5597"/>
@@ -13131,7 +13119,7 @@
       <w:r>
         <w:t xml:space="preserve">, with </w:t>
       </w:r>
-      <w:hyperlink r:id="rId109">
+      <w:hyperlink r:id="rId108">
         <w:r>
           <w:rPr>
             <w:color w:val="2F5597"/>
@@ -13143,7 +13131,7 @@
       <w:r>
         <w:t xml:space="preserve">, and Rehman and Aftab, </w:t>
       </w:r>
-      <w:hyperlink r:id="rId110">
+      <w:hyperlink r:id="rId109">
         <w:r>
           <w:rPr>
             <w:color w:val="2F5597"/>
@@ -13164,7 +13152,7 @@
       <w:r>
         <w:t xml:space="preserve">Ahmad et al., </w:t>
       </w:r>
-      <w:hyperlink r:id="rId111">
+      <w:hyperlink r:id="rId110">
         <w:r>
           <w:rPr>
             <w:color w:val="2F5597"/>
@@ -13176,7 +13164,7 @@
       <w:r>
         <w:t xml:space="preserve">, 2025 preprint, with the </w:t>
       </w:r>
-      <w:hyperlink r:id="rId112">
+      <w:hyperlink r:id="rId111">
         <w:r>
           <w:rPr>
             <w:color w:val="2F5597"/>
@@ -13423,7 +13411,7 @@
             <w:r>
               <w:t xml:space="preserve">Synthetic multichannel signals plus </w:t>
             </w:r>
-            <w:hyperlink r:id="rId113">
+            <w:hyperlink r:id="rId112">
               <w:r>
                 <w:rPr>
                   <w:color w:val="2F5597"/>
@@ -13486,7 +13474,7 @@
             <w:r>
               <w:t xml:space="preserve">Ahmad, Wesemann, Waschkowski &amp; Khalid, </w:t>
             </w:r>
-            <w:hyperlink r:id="rId111">
+            <w:hyperlink r:id="rId110">
               <w:r>
                 <w:rPr>
                   <w:color w:val="2F5597"/>
@@ -13560,7 +13548,7 @@
       <w:r>
         <w:t xml:space="preserve"> of </w:t>
       </w:r>
-      <w:hyperlink r:id="rId113">
+      <w:hyperlink r:id="rId112">
         <w:r>
           <w:rPr>
             <w:color w:val="2F5597"/>
@@ -13587,7 +13575,7 @@
       <w:r>
         <w:t xml:space="preserve">Validate classical MVMD using the </w:t>
       </w:r>
-      <w:hyperlink r:id="rId114">
+      <w:hyperlink r:id="rId113">
         <w:r>
           <w:rPr>
             <w:color w:val="2F5597"/>
@@ -13599,7 +13587,7 @@
       <w:r>
         <w:t xml:space="preserve"> and an </w:t>
       </w:r>
-      <w:hyperlink r:id="rId115">
+      <w:hyperlink r:id="rId114">
         <w:r>
           <w:rPr>
             <w:color w:val="2F5597"/>
@@ -13611,7 +13599,7 @@
       <w:r>
         <w:t xml:space="preserve">. Reimplement the UVMD equations from the </w:t>
       </w:r>
-      <w:hyperlink r:id="rId111">
+      <w:hyperlink r:id="rId110">
         <w:r>
           <w:rPr>
             <w:color w:val="2F5597"/>

</xml_diff>

<commit_message>
Finalize drivetrain method and evaluation text
</commit_message>
<xml_diff>
--- a/downloads/student-project-portfolio.docx
+++ b/downloads/student-project-portfolio.docx
@@ -4327,10 +4327,10 @@
           <w:b/>
           <w:color w:val="25313C"/>
         </w:rPr>
-        <w:t xml:space="preserve">Methods and code. </w:t>
-      </w:r>
-      <w:r>
-        <w:t xml:space="preserve">Start with </w:t>
+        <w:t xml:space="preserve">Method and code. </w:t>
+      </w:r>
+      <w:r>
+        <w:t xml:space="preserve">Extract spectral features from the vibration measurements and combine them with available operational data. Train a simple probabilistic model, such as </w:t>
       </w:r>
       <w:hyperlink r:id="rId23">
         <w:r>
@@ -4342,7 +4342,7 @@
         </w:r>
       </w:hyperlink>
       <w:r>
-        <w:t xml:space="preserve"> to rank the known candidate configurations using vibration and operational features. If raw spectra or time series are available, compare it with </w:t>
+        <w:t xml:space="preserve">, to assign a probability to each candidate drivetrain configuration. If raw spectra or time series are available, compare it with </w:t>
       </w:r>
       <w:hyperlink r:id="rId16">
         <w:r>
@@ -4366,7 +4366,7 @@
         </w:r>
       </w:hyperlink>
       <w:r>
-        <w:t xml:space="preserve"> is available. Vibration signatures are strongly influenced by component kinematics and structural characteristics, suggesting that machine configuration information may already be encoded within measured signals.</w:t>
+        <w:t xml:space="preserve"> is available. As a physics-informed extension, include available bearing or drivetrain kinematic information in the model and test whether it improves the configuration ranking, particularly for components with limited labelled data.</w:t>
       </w:r>
     </w:p>
     <w:p>
@@ -4378,22 +4378,10 @@
           <w:b/>
           <w:color w:val="25313C"/>
         </w:rPr>
-        <w:t xml:space="preserve">Baselines and evaluation. </w:t>
-      </w:r>
-      <w:r>
-        <w:t xml:space="preserve">Compare three inputs: operational metadata only, vibration features only, and their combination. Split the data by turbine. Evaluate whether the correct configuration is ranked first or appears among the highest-ranked candidates, and use a </w:t>
-      </w:r>
-      <w:hyperlink r:id="rId25">
-        <w:r>
-          <w:rPr>
-            <w:color w:val="2F5597"/>
-            <w:u w:val="single"/>
-          </w:rPr>
-          <w:t>reliability diagram</w:t>
-        </w:r>
-      </w:hyperlink>
-      <w:r>
-        <w:t xml:space="preserve"> to check whether the reported confidence agrees with actual accuracy.</w:t>
+        <w:t xml:space="preserve">Evaluation. </w:t>
+      </w:r>
+      <w:r>
+        <w:t>Compare models using operational data only, vibration features only, and both together, and evaluate them on turbines not used for training. Assess whether the correct configuration is ranked first or among the leading candidates and whether the reported confidence is reliable.</w:t>
       </w:r>
     </w:p>
     <w:p>
@@ -4880,7 +4868,7 @@
       <w:r>
         <w:t xml:space="preserve">Confirm the independent-cycle count and one measurable downstream target before allocation. Rerunning an unchanged self-supervised method is a baseline, not the Master contribution. Follow the </w:t>
       </w:r>
-      <w:hyperlink r:id="rId26">
+      <w:hyperlink r:id="rId25">
         <w:r>
           <w:rPr>
             <w:color w:val="2F5597"/>
@@ -5078,7 +5066,7 @@
       <w:r>
         <w:t xml:space="preserve">Begin with </w:t>
       </w:r>
-      <w:hyperlink r:id="rId27">
+      <w:hyperlink r:id="rId26">
         <w:r>
           <w:rPr>
             <w:color w:val="2F5597"/>
@@ -5090,7 +5078,7 @@
       <w:r>
         <w:t xml:space="preserve">, then use the </w:t>
       </w:r>
-      <w:hyperlink r:id="rId28">
+      <w:hyperlink r:id="rId27">
         <w:r>
           <w:rPr>
             <w:color w:val="2F5597"/>
@@ -5102,7 +5090,7 @@
       <w:r>
         <w:t xml:space="preserve"> and the </w:t>
       </w:r>
-      <w:hyperlink r:id="rId29">
+      <w:hyperlink r:id="rId28">
         <w:r>
           <w:rPr>
             <w:color w:val="2F5597"/>
@@ -5120,7 +5108,7 @@
         <w:pStyle w:val="ListBullet"/>
         <w:spacing w:before="0" w:after="40" w:line="254" w:lineRule="auto"/>
       </w:pPr>
-      <w:hyperlink r:id="rId30">
+      <w:hyperlink r:id="rId29">
         <w:r>
           <w:rPr>
             <w:color w:val="2F5597"/>
@@ -5132,7 +5120,7 @@
       <w:r>
         <w:t xml:space="preserve">, </w:t>
       </w:r>
-      <w:hyperlink r:id="rId31">
+      <w:hyperlink r:id="rId30">
         <w:r>
           <w:rPr>
             <w:color w:val="2F5597"/>
@@ -5144,7 +5132,7 @@
       <w:r>
         <w:t xml:space="preserve">, </w:t>
       </w:r>
-      <w:hyperlink r:id="rId32">
+      <w:hyperlink r:id="rId31">
         <w:r>
           <w:rPr>
             <w:color w:val="2F5597"/>
@@ -5156,7 +5144,7 @@
       <w:r>
         <w:t xml:space="preserve"> and the </w:t>
       </w:r>
-      <w:hyperlink r:id="rId33">
+      <w:hyperlink r:id="rId32">
         <w:r>
           <w:rPr>
             <w:color w:val="2F5597"/>
@@ -5177,7 +5165,7 @@
       <w:r>
         <w:t xml:space="preserve">Stanford examples: </w:t>
       </w:r>
-      <w:hyperlink r:id="rId34">
+      <w:hyperlink r:id="rId33">
         <w:r>
           <w:rPr>
             <w:color w:val="2F5597"/>
@@ -5189,7 +5177,7 @@
       <w:r>
         <w:t xml:space="preserve">, </w:t>
       </w:r>
-      <w:hyperlink r:id="rId35">
+      <w:hyperlink r:id="rId34">
         <w:r>
           <w:rPr>
             <w:color w:val="2F5597"/>
@@ -5201,7 +5189,7 @@
       <w:r>
         <w:t xml:space="preserve">, </w:t>
       </w:r>
-      <w:hyperlink r:id="rId36">
+      <w:hyperlink r:id="rId35">
         <w:r>
           <w:rPr>
             <w:color w:val="2F5597"/>
@@ -5213,7 +5201,7 @@
       <w:r>
         <w:t xml:space="preserve"> and </w:t>
       </w:r>
-      <w:hyperlink r:id="rId37">
+      <w:hyperlink r:id="rId36">
         <w:r>
           <w:rPr>
             <w:color w:val="2F5597"/>
@@ -5457,7 +5445,7 @@
             <w:pPr>
               <w:spacing w:after="0"/>
             </w:pPr>
-            <w:hyperlink r:id="rId38">
+            <w:hyperlink r:id="rId37">
               <w:r>
                 <w:rPr>
                   <w:color w:val="2F5597"/>
@@ -5520,7 +5508,7 @@
             <w:r>
               <w:t xml:space="preserve">Huang, He and Sick, </w:t>
             </w:r>
-            <w:hyperlink r:id="rId39">
+            <w:hyperlink r:id="rId38">
               <w:r>
                 <w:rPr>
                   <w:color w:val="2F5597"/>
@@ -5594,7 +5582,7 @@
       <w:r>
         <w:t xml:space="preserve">Use a GRU or TCN as the graph-free baseline and a compact GCN–GRU or GAT–GRU as the graph model. The </w:t>
       </w:r>
-      <w:hyperlink r:id="rId40">
+      <w:hyperlink r:id="rId39">
         <w:r>
           <w:rPr>
             <w:color w:val="2F5597"/>
@@ -5606,7 +5594,7 @@
       <w:r>
         <w:t xml:space="preserve"> is a useful reference; a small </w:t>
       </w:r>
-      <w:hyperlink r:id="rId41">
+      <w:hyperlink r:id="rId40">
         <w:r>
           <w:rPr>
             <w:color w:val="2F5597"/>
@@ -5961,7 +5949,7 @@
             <w:pPr>
               <w:spacing w:after="0"/>
             </w:pPr>
-            <w:hyperlink r:id="rId42">
+            <w:hyperlink r:id="rId41">
               <w:r>
                 <w:rPr>
                   <w:color w:val="2F5597"/>
@@ -6024,7 +6012,7 @@
             <w:r>
               <w:t xml:space="preserve">Wu et al., </w:t>
             </w:r>
-            <w:hyperlink r:id="rId43">
+            <w:hyperlink r:id="rId42">
               <w:r>
                 <w:rPr>
                   <w:color w:val="2F5597"/>
@@ -6089,7 +6077,7 @@
       <w:r>
         <w:t xml:space="preserve">Compare historical average and a graph-free GRU with </w:t>
       </w:r>
-      <w:hyperlink r:id="rId44">
+      <w:hyperlink r:id="rId43">
         <w:r>
           <w:rPr>
             <w:color w:val="2F5597"/>
@@ -6444,7 +6432,7 @@
             <w:pPr>
               <w:spacing w:after="0"/>
             </w:pPr>
-            <w:hyperlink r:id="rId45">
+            <w:hyperlink r:id="rId44">
               <w:r>
                 <w:rPr>
                   <w:color w:val="2F5597"/>
@@ -6507,7 +6495,7 @@
             <w:r>
               <w:t xml:space="preserve">Weber et al., </w:t>
             </w:r>
-            <w:hyperlink r:id="rId46">
+            <w:hyperlink r:id="rId45">
               <w:r>
                 <w:rPr>
                   <w:color w:val="2F5597"/>
@@ -6581,7 +6569,7 @@
       <w:r>
         <w:t xml:space="preserve">Compare logistic regression or random forest with GCN and GraphSAGE in </w:t>
       </w:r>
-      <w:hyperlink r:id="rId41">
+      <w:hyperlink r:id="rId40">
         <w:r>
           <w:rPr>
             <w:color w:val="2F5597"/>
@@ -6936,7 +6924,7 @@
             <w:pPr>
               <w:spacing w:after="0"/>
             </w:pPr>
-            <w:hyperlink r:id="rId47">
+            <w:hyperlink r:id="rId46">
               <w:r>
                 <w:rPr>
                   <w:color w:val="2F5597"/>
@@ -6999,7 +6987,7 @@
             <w:r>
               <w:t xml:space="preserve">He et al., </w:t>
             </w:r>
-            <w:hyperlink r:id="rId48">
+            <w:hyperlink r:id="rId47">
               <w:r>
                 <w:rPr>
                   <w:color w:val="2F5597"/>
@@ -7064,7 +7052,7 @@
       <w:r>
         <w:t xml:space="preserve">Compare popularity, BPR matrix factorisation and LightGCN. A direct </w:t>
       </w:r>
-      <w:hyperlink r:id="rId41">
+      <w:hyperlink r:id="rId40">
         <w:r>
           <w:rPr>
             <w:color w:val="2F5597"/>
@@ -7076,7 +7064,7 @@
       <w:r>
         <w:t xml:space="preserve"> implementation is simpler than adapting the </w:t>
       </w:r>
-      <w:hyperlink r:id="rId49">
+      <w:hyperlink r:id="rId48">
         <w:r>
           <w:rPr>
             <w:color w:val="2F5597"/>
@@ -7386,7 +7374,7 @@
             <w:pPr>
               <w:spacing w:after="0"/>
             </w:pPr>
-            <w:hyperlink r:id="rId50">
+            <w:hyperlink r:id="rId49">
               <w:r>
                 <w:rPr>
                   <w:color w:val="2F5597"/>
@@ -7449,7 +7437,7 @@
             <w:r>
               <w:t xml:space="preserve">Hu et al., </w:t>
             </w:r>
-            <w:hyperlink r:id="rId51">
+            <w:hyperlink r:id="rId50">
               <w:r>
                 <w:rPr>
                   <w:color w:val="2F5597"/>
@@ -7499,7 +7487,7 @@
       <w:r>
         <w:t xml:space="preserve">The </w:t>
       </w:r>
-      <w:hyperlink r:id="rId31">
+      <w:hyperlink r:id="rId30">
         <w:r>
           <w:rPr>
             <w:color w:val="2F5597"/>
@@ -7526,7 +7514,7 @@
       <w:r>
         <w:t xml:space="preserve">Compare Morgan fingerprints with logistic regression or random forest via </w:t>
       </w:r>
-      <w:hyperlink r:id="rId52">
+      <w:hyperlink r:id="rId51">
         <w:r>
           <w:rPr>
             <w:color w:val="2F5597"/>
@@ -7538,7 +7526,7 @@
       <w:r>
         <w:t xml:space="preserve"> against GCN and edge-aware GINE models. OGB and </w:t>
       </w:r>
-      <w:hyperlink r:id="rId41">
+      <w:hyperlink r:id="rId40">
         <w:r>
           <w:rPr>
             <w:color w:val="2F5597"/>
@@ -7770,7 +7758,7 @@
       <w:r>
         <w:t xml:space="preserve">, </w:t>
       </w:r>
-      <w:hyperlink r:id="rId53">
+      <w:hyperlink r:id="rId52">
         <w:r>
           <w:rPr>
             <w:color w:val="2F5597"/>
@@ -7803,7 +7791,7 @@
       <w:r>
         <w:t xml:space="preserve">Data sources: </w:t>
       </w:r>
-      <w:hyperlink r:id="rId54">
+      <w:hyperlink r:id="rId53">
         <w:r>
           <w:rPr>
             <w:color w:val="2F5597"/>
@@ -7815,7 +7803,7 @@
       <w:r>
         <w:t xml:space="preserve">, </w:t>
       </w:r>
-      <w:hyperlink r:id="rId55">
+      <w:hyperlink r:id="rId54">
         <w:r>
           <w:rPr>
             <w:color w:val="2F5597"/>
@@ -7827,7 +7815,7 @@
       <w:r>
         <w:t xml:space="preserve">, </w:t>
       </w:r>
-      <w:hyperlink r:id="rId56">
+      <w:hyperlink r:id="rId55">
         <w:r>
           <w:rPr>
             <w:color w:val="2F5597"/>
@@ -7839,7 +7827,7 @@
       <w:r>
         <w:t xml:space="preserve">, </w:t>
       </w:r>
-      <w:hyperlink r:id="rId57">
+      <w:hyperlink r:id="rId56">
         <w:r>
           <w:rPr>
             <w:color w:val="2F5597"/>
@@ -7851,7 +7839,7 @@
       <w:r>
         <w:t xml:space="preserve"> and </w:t>
       </w:r>
-      <w:hyperlink r:id="rId58">
+      <w:hyperlink r:id="rId57">
         <w:r>
           <w:rPr>
             <w:color w:val="2F5597"/>
@@ -8104,7 +8092,7 @@
             <w:pPr>
               <w:spacing w:after="0"/>
             </w:pPr>
-            <w:hyperlink r:id="rId59">
+            <w:hyperlink r:id="rId58">
               <w:r>
                 <w:rPr>
                   <w:color w:val="2F5597"/>
@@ -8167,7 +8155,7 @@
             <w:r>
               <w:t xml:space="preserve">Eldele et al., </w:t>
             </w:r>
-            <w:hyperlink r:id="rId60">
+            <w:hyperlink r:id="rId59">
               <w:r>
                 <w:rPr>
                   <w:color w:val="2F5597"/>
@@ -8545,7 +8533,7 @@
             <w:pPr>
               <w:spacing w:after="0"/>
             </w:pPr>
-            <w:hyperlink r:id="rId61">
+            <w:hyperlink r:id="rId60">
               <w:r>
                 <w:rPr>
                   <w:color w:val="2F5597"/>
@@ -8608,7 +8596,7 @@
             <w:r>
               <w:t xml:space="preserve">Dong et al., </w:t>
             </w:r>
-            <w:hyperlink r:id="rId62">
+            <w:hyperlink r:id="rId61">
               <w:r>
                 <w:rPr>
                   <w:color w:val="2F5597"/>
@@ -8697,7 +8685,7 @@
       <w:r>
         <w:t xml:space="preserve"> and a 1-D ResNet or compact Transformer. The </w:t>
       </w:r>
-      <w:hyperlink r:id="rId63">
+      <w:hyperlink r:id="rId62">
         <w:r>
           <w:rPr>
             <w:color w:val="2F5597"/>
@@ -9018,7 +9006,7 @@
             <w:pPr>
               <w:spacing w:after="0"/>
             </w:pPr>
-            <w:hyperlink r:id="rId64">
+            <w:hyperlink r:id="rId63">
               <w:r>
                 <w:rPr>
                   <w:color w:val="2F5597"/>
@@ -9081,7 +9069,7 @@
             <w:r>
               <w:t xml:space="preserve">Woo et al., </w:t>
             </w:r>
-            <w:hyperlink r:id="rId65">
+            <w:hyperlink r:id="rId64">
               <w:r>
                 <w:rPr>
                   <w:color w:val="2F5597"/>
@@ -9143,7 +9131,7 @@
         </w:rPr>
         <w:t xml:space="preserve">Methods and code. </w:t>
       </w:r>
-      <w:hyperlink r:id="rId66">
+      <w:hyperlink r:id="rId65">
         <w:r>
           <w:rPr>
             <w:color w:val="2F5597"/>
@@ -9179,7 +9167,7 @@
       <w:r>
         <w:t xml:space="preserve"> for pretraining. </w:t>
       </w:r>
-      <w:hyperlink r:id="rId67">
+      <w:hyperlink r:id="rId66">
         <w:r>
           <w:rPr>
             <w:color w:val="2F5597"/>
@@ -9191,7 +9179,7 @@
       <w:r>
         <w:t xml:space="preserve"> is the required supervised reference; </w:t>
       </w:r>
-      <w:hyperlink r:id="rId68">
+      <w:hyperlink r:id="rId67">
         <w:r>
           <w:rPr>
             <w:color w:val="2F5597"/>
@@ -9531,7 +9519,7 @@
             <w:pPr>
               <w:spacing w:after="0"/>
             </w:pPr>
-            <w:hyperlink r:id="rId69">
+            <w:hyperlink r:id="rId68">
               <w:r>
                 <w:rPr>
                   <w:color w:val="2F5597"/>
@@ -9594,7 +9582,7 @@
             <w:r>
               <w:t xml:space="preserve">Brudermueller et al., </w:t>
             </w:r>
-            <w:hyperlink r:id="rId70">
+            <w:hyperlink r:id="rId69">
               <w:r>
                 <w:rPr>
                   <w:color w:val="2F5597"/>
@@ -9644,7 +9632,7 @@
       <w:r>
         <w:t xml:space="preserve">The 458 MB public download contains 1,408 households; 214 have both smart-meter data and inspection information. Use the </w:t>
       </w:r>
-      <w:hyperlink r:id="rId71">
+      <w:hyperlink r:id="rId70">
         <w:r>
           <w:rPr>
             <w:color w:val="2F5597"/>
@@ -10009,7 +9997,7 @@
             <w:pPr>
               <w:spacing w:after="0"/>
             </w:pPr>
-            <w:hyperlink r:id="rId72">
+            <w:hyperlink r:id="rId71">
               <w:r>
                 <w:rPr>
                   <w:color w:val="2F5597"/>
@@ -10072,7 +10060,7 @@
             <w:r>
               <w:t xml:space="preserve">Hou et al., </w:t>
             </w:r>
-            <w:hyperlink r:id="rId73">
+            <w:hyperlink r:id="rId72">
               <w:r>
                 <w:rPr>
                   <w:color w:val="2F5597"/>
@@ -10084,7 +10072,7 @@
             <w:r>
               <w:t xml:space="preserve">, KDD 2022 — </w:t>
             </w:r>
-            <w:hyperlink r:id="rId74">
+            <w:hyperlink r:id="rId73">
               <w:r>
                 <w:rPr>
                   <w:color w:val="2F5597"/>
@@ -10146,7 +10134,7 @@
       <w:r>
         <w:t xml:space="preserve">Paderborn provides 64 kHz vibration, speed, torque and radial load for 32 physical bearings under four operating conditions. Download it from the </w:t>
       </w:r>
-      <w:hyperlink r:id="rId75">
+      <w:hyperlink r:id="rId74">
         <w:r>
           <w:rPr>
             <w:color w:val="2F5597"/>
@@ -10173,7 +10161,7 @@
       <w:r>
         <w:t xml:space="preserve">Use a GIN encoder with </w:t>
       </w:r>
-      <w:hyperlink r:id="rId74">
+      <w:hyperlink r:id="rId73">
         <w:r>
           <w:rPr>
             <w:color w:val="2F5597"/>
@@ -10478,7 +10466,7 @@
             <w:pPr>
               <w:spacing w:after="0"/>
             </w:pPr>
-            <w:hyperlink r:id="rId72">
+            <w:hyperlink r:id="rId71">
               <w:r>
                 <w:rPr>
                   <w:color w:val="2F5597"/>
@@ -10541,7 +10529,7 @@
             <w:r>
               <w:t xml:space="preserve">Zhang et al., </w:t>
             </w:r>
-            <w:hyperlink r:id="rId76">
+            <w:hyperlink r:id="rId75">
               <w:r>
                 <w:rPr>
                   <w:color w:val="2F5597"/>
@@ -10553,7 +10541,7 @@
             <w:r>
               <w:t xml:space="preserve">, NeurIPS 2022 — </w:t>
             </w:r>
-            <w:hyperlink r:id="rId53">
+            <w:hyperlink r:id="rId52">
               <w:r>
                 <w:rPr>
                   <w:color w:val="2F5597"/>
@@ -10615,7 +10603,7 @@
       <w:r>
         <w:t xml:space="preserve">Start from the </w:t>
       </w:r>
-      <w:hyperlink r:id="rId53">
+      <w:hyperlink r:id="rId52">
         <w:r>
           <w:rPr>
             <w:color w:val="2F5597"/>
@@ -10627,7 +10615,7 @@
       <w:r>
         <w:t xml:space="preserve"> and replace its time-domain CNN or Transformer with a compact </w:t>
       </w:r>
-      <w:hyperlink r:id="rId77">
+      <w:hyperlink r:id="rId76">
         <w:r>
           <w:rPr>
             <w:color w:val="2F5597"/>
@@ -10963,7 +10951,7 @@
             <w:pPr>
               <w:spacing w:after="0"/>
             </w:pPr>
-            <w:hyperlink r:id="rId78">
+            <w:hyperlink r:id="rId77">
               <w:r>
                 <w:rPr>
                   <w:color w:val="2F5597"/>
@@ -11026,7 +11014,7 @@
             <w:r>
               <w:t xml:space="preserve">Cai et al., </w:t>
             </w:r>
-            <w:hyperlink r:id="rId79">
+            <w:hyperlink r:id="rId78">
               <w:r>
                 <w:rPr>
                   <w:color w:val="2F5597"/>
@@ -11038,7 +11026,7 @@
             <w:r>
               <w:t xml:space="preserve"> — </w:t>
             </w:r>
-            <w:hyperlink r:id="rId80">
+            <w:hyperlink r:id="rId79">
               <w:r>
                 <w:rPr>
                   <w:color w:val="2F5597"/>
@@ -11085,7 +11073,7 @@
       <w:r>
         <w:t xml:space="preserve">Develop the method on Weather, which has 21 meteorological variables and 52,696 ten-minute observations. Confirm the result on Electricity, which contains 321 hourly electricity-demand series and 26,304 observations. Use chronological splits and fit scaling, correlations and graph thresholds on the training period only. The datasets and scripts are available through </w:t>
       </w:r>
-      <w:hyperlink r:id="rId78">
+      <w:hyperlink r:id="rId77">
         <w:r>
           <w:rPr>
             <w:color w:val="2F5597"/>
@@ -11097,7 +11085,7 @@
       <w:r>
         <w:t xml:space="preserve">; </w:t>
       </w:r>
-      <w:hyperlink r:id="rId81">
+      <w:hyperlink r:id="rId80">
         <w:r>
           <w:rPr>
             <w:color w:val="2F5597"/>
@@ -11124,7 +11112,7 @@
       <w:r>
         <w:t xml:space="preserve">Use </w:t>
       </w:r>
-      <w:hyperlink r:id="rId80">
+      <w:hyperlink r:id="rId79">
         <w:r>
           <w:rPr>
             <w:color w:val="2F5597"/>
@@ -11136,7 +11124,7 @@
       <w:r>
         <w:t xml:space="preserve"> as the main code base and </w:t>
       </w:r>
-      <w:hyperlink r:id="rId82">
+      <w:hyperlink r:id="rId81">
         <w:r>
           <w:rPr>
             <w:color w:val="2F5597"/>
@@ -11148,7 +11136,7 @@
       <w:r>
         <w:t xml:space="preserve"> and </w:t>
       </w:r>
-      <w:hyperlink r:id="rId83">
+      <w:hyperlink r:id="rId82">
         <w:r>
           <w:rPr>
             <w:color w:val="2F5597"/>
@@ -11175,7 +11163,7 @@
       <w:r>
         <w:t xml:space="preserve">Compare seasonal naive, </w:t>
       </w:r>
-      <w:hyperlink r:id="rId67">
+      <w:hyperlink r:id="rId66">
         <w:r>
           <w:rPr>
             <w:color w:val="2F5597"/>
@@ -11334,7 +11322,7 @@
       <w:r>
         <w:t xml:space="preserve">Core reading: </w:t>
       </w:r>
-      <w:hyperlink r:id="rId84">
+      <w:hyperlink r:id="rId83">
         <w:r>
           <w:rPr>
             <w:color w:val="2F5597"/>
@@ -11346,7 +11334,7 @@
       <w:r>
         <w:t xml:space="preserve">, </w:t>
       </w:r>
-      <w:hyperlink r:id="rId85">
+      <w:hyperlink r:id="rId84">
         <w:r>
           <w:rPr>
             <w:color w:val="2F5597"/>
@@ -11358,7 +11346,7 @@
       <w:r>
         <w:t xml:space="preserve">, the </w:t>
       </w:r>
-      <w:hyperlink r:id="rId86">
+      <w:hyperlink r:id="rId85">
         <w:r>
           <w:rPr>
             <w:color w:val="2F5597"/>
@@ -11370,7 +11358,7 @@
       <w:r>
         <w:t xml:space="preserve">, and </w:t>
       </w:r>
-      <w:hyperlink r:id="rId87">
+      <w:hyperlink r:id="rId86">
         <w:r>
           <w:rPr>
             <w:color w:val="2F5597"/>
@@ -11382,7 +11370,7 @@
       <w:r>
         <w:t xml:space="preserve"> with its </w:t>
       </w:r>
-      <w:hyperlink r:id="rId88">
+      <w:hyperlink r:id="rId87">
         <w:r>
           <w:rPr>
             <w:color w:val="2F5597"/>
@@ -11403,7 +11391,7 @@
       <w:r>
         <w:t xml:space="preserve">Parameter-efficient adaptation: </w:t>
       </w:r>
-      <w:hyperlink r:id="rId89">
+      <w:hyperlink r:id="rId88">
         <w:r>
           <w:rPr>
             <w:color w:val="2F5597"/>
@@ -11415,7 +11403,7 @@
       <w:r>
         <w:t xml:space="preserve"> and the </w:t>
       </w:r>
-      <w:hyperlink r:id="rId90">
+      <w:hyperlink r:id="rId89">
         <w:r>
           <w:rPr>
             <w:color w:val="2F5597"/>
@@ -11436,7 +11424,7 @@
       <w:r>
         <w:t xml:space="preserve">Normal-only objectives: </w:t>
       </w:r>
-      <w:hyperlink r:id="rId84">
+      <w:hyperlink r:id="rId83">
         <w:r>
           <w:rPr>
             <w:color w:val="2F5597"/>
@@ -11448,7 +11436,7 @@
       <w:r>
         <w:t xml:space="preserve"> and </w:t>
       </w:r>
-      <w:hyperlink r:id="rId91">
+      <w:hyperlink r:id="rId90">
         <w:r>
           <w:rPr>
             <w:color w:val="2F5597"/>
@@ -11469,7 +11457,7 @@
       <w:r>
         <w:t xml:space="preserve">Data and model hubs: </w:t>
       </w:r>
-      <w:hyperlink r:id="rId92">
+      <w:hyperlink r:id="rId91">
         <w:r>
           <w:rPr>
             <w:color w:val="2F5597"/>
@@ -11481,7 +11469,7 @@
       <w:r>
         <w:t xml:space="preserve">, </w:t>
       </w:r>
-      <w:hyperlink r:id="rId93">
+      <w:hyperlink r:id="rId92">
         <w:r>
           <w:rPr>
             <w:color w:val="2F5597"/>
@@ -11493,7 +11481,7 @@
       <w:r>
         <w:t xml:space="preserve"> and </w:t>
       </w:r>
-      <w:hyperlink r:id="rId94">
+      <w:hyperlink r:id="rId93">
         <w:r>
           <w:rPr>
             <w:color w:val="2F5597"/>
@@ -11746,7 +11734,7 @@
             <w:pPr>
               <w:spacing w:after="0"/>
             </w:pPr>
-            <w:hyperlink r:id="rId92">
+            <w:hyperlink r:id="rId91">
               <w:r>
                 <w:rPr>
                   <w:color w:val="2F5597"/>
@@ -11809,7 +11797,7 @@
             <w:r>
               <w:t xml:space="preserve">Oquab et al., </w:t>
             </w:r>
-            <w:hyperlink r:id="rId85">
+            <w:hyperlink r:id="rId84">
               <w:r>
                 <w:rPr>
                   <w:color w:val="2F5597"/>
@@ -11856,7 +11844,7 @@
         </w:rPr>
         <w:t xml:space="preserve">Data. </w:t>
       </w:r>
-      <w:hyperlink r:id="rId92">
+      <w:hyperlink r:id="rId91">
         <w:r>
           <w:rPr>
             <w:color w:val="2F5597"/>
@@ -11868,7 +11856,7 @@
       <w:r>
         <w:t xml:space="preserve"> contains 5,354 images in 15 categories, with defect-free training images and labelled normal and defective test images. </w:t>
       </w:r>
-      <w:hyperlink r:id="rId95">
+      <w:hyperlink r:id="rId94">
         <w:r>
           <w:rPr>
             <w:color w:val="2F5597"/>
@@ -11904,7 +11892,7 @@
       <w:r>
         <w:t xml:space="preserve"> from the </w:t>
       </w:r>
-      <w:hyperlink r:id="rId86">
+      <w:hyperlink r:id="rId85">
         <w:r>
           <w:rPr>
             <w:color w:val="2F5597"/>
@@ -11916,7 +11904,7 @@
       <w:r>
         <w:t xml:space="preserve">. The frozen route follows </w:t>
       </w:r>
-      <w:hyperlink r:id="rId88">
+      <w:hyperlink r:id="rId87">
         <w:r>
           <w:rPr>
             <w:color w:val="2F5597"/>
@@ -11928,7 +11916,7 @@
       <w:r>
         <w:t xml:space="preserve">: store normal patch features and score each test patch by its distance to the memory bank. For the MSc route, keep a frozen DINOv2 teacher and train LoRA or adapters in a student model with </w:t>
       </w:r>
-      <w:hyperlink r:id="rId90">
+      <w:hyperlink r:id="rId89">
         <w:r>
           <w:rPr>
             <w:color w:val="2F5597"/>
@@ -11955,7 +11943,7 @@
       <w:r>
         <w:t xml:space="preserve">Compare frozen AnomalyDINO with </w:t>
       </w:r>
-      <w:hyperlink r:id="rId96">
+      <w:hyperlink r:id="rId95">
         <w:r>
           <w:rPr>
             <w:color w:val="2F5597"/>
@@ -12289,7 +12277,7 @@
             <w:pPr>
               <w:spacing w:after="0"/>
             </w:pPr>
-            <w:hyperlink r:id="rId97">
+            <w:hyperlink r:id="rId96">
               <w:r>
                 <w:rPr>
                   <w:color w:val="2F5597"/>
@@ -12417,7 +12405,7 @@
       <w:r>
         <w:t xml:space="preserve">Start with the pretrained DINOv3 ViT-S/16 backbone. Load the official weights through </w:t>
       </w:r>
-      <w:hyperlink r:id="rId98">
+      <w:hyperlink r:id="rId97">
         <w:r>
           <w:rPr>
             <w:color w:val="2F5597"/>
@@ -12429,7 +12417,7 @@
       <w:r>
         <w:t xml:space="preserve"> or the official DINOv3 repository. Use a compact U-Net-style decoder that combines patch features from several transformer layers. Compare this model with a conventional 2D U-Net or nnU-Net baseline. The </w:t>
       </w:r>
-      <w:hyperlink r:id="rId99">
+      <w:hyperlink r:id="rId98">
         <w:r>
           <w:rPr>
             <w:color w:val="2F5597"/>
@@ -12775,7 +12763,7 @@
             <w:pPr>
               <w:spacing w:after="0"/>
             </w:pPr>
-            <w:hyperlink r:id="rId100">
+            <w:hyperlink r:id="rId99">
               <w:r>
                 <w:rPr>
                   <w:color w:val="2F5597"/>
@@ -12787,7 +12775,7 @@
             <w:r>
               <w:t xml:space="preserve"> partitioned by scanner vendor; </w:t>
             </w:r>
-            <w:hyperlink r:id="rId101">
+            <w:hyperlink r:id="rId100">
               <w:r>
                 <w:rPr>
                   <w:color w:val="2F5597"/>
@@ -12915,7 +12903,7 @@
       <w:r>
         <w:t xml:space="preserve">Use the same compact 2D U-Net architecture for the local teachers and the global student in the core experiment. Each client trains its local U-Net to map a noisy slice to its reference image. The clients then denoise the same corrupted proxy images and transmit only their output images or predicted noise residuals. The server aggregates these predictions and trains the global student using a reconstruction loss to the aggregated teacher target. The clients' private images and model weights remain local. Use </w:t>
       </w:r>
-      <w:hyperlink r:id="rId102">
+      <w:hyperlink r:id="rId101">
         <w:r>
           <w:rPr>
             <w:color w:val="2F5597"/>
@@ -12927,7 +12915,7 @@
       <w:r>
         <w:t xml:space="preserve"> to organise the simulated clients and communication rounds; the denoising models can be implemented in PyTorch or </w:t>
       </w:r>
-      <w:hyperlink r:id="rId103">
+      <w:hyperlink r:id="rId102">
         <w:r>
           <w:rPr>
             <w:color w:val="2F5597"/>
@@ -13062,7 +13050,7 @@
       <w:r>
         <w:t xml:space="preserve">General unrolling: Gregor and LeCun, </w:t>
       </w:r>
-      <w:hyperlink r:id="rId104">
+      <w:hyperlink r:id="rId103">
         <w:r>
           <w:rPr>
             <w:color w:val="2F5597"/>
@@ -13074,7 +13062,7 @@
       <w:r>
         <w:t xml:space="preserve">, ICML 2010; Monga, Li and Eldar, </w:t>
       </w:r>
-      <w:hyperlink r:id="rId105">
+      <w:hyperlink r:id="rId104">
         <w:r>
           <w:rPr>
             <w:color w:val="2F5597"/>
@@ -13086,7 +13074,7 @@
       <w:r>
         <w:t xml:space="preserve">, IEEE SPM 2021; and Yang et al., </w:t>
       </w:r>
-      <w:hyperlink r:id="rId106">
+      <w:hyperlink r:id="rId105">
         <w:r>
           <w:rPr>
             <w:color w:val="2F5597"/>
@@ -13107,7 +13095,7 @@
       <w:r>
         <w:t xml:space="preserve">Signal decomposition: Dragomiretskiy and Zosso, </w:t>
       </w:r>
-      <w:hyperlink r:id="rId107">
+      <w:hyperlink r:id="rId106">
         <w:r>
           <w:rPr>
             <w:color w:val="2F5597"/>
@@ -13119,7 +13107,7 @@
       <w:r>
         <w:t xml:space="preserve">, with </w:t>
       </w:r>
-      <w:hyperlink r:id="rId108">
+      <w:hyperlink r:id="rId107">
         <w:r>
           <w:rPr>
             <w:color w:val="2F5597"/>
@@ -13131,7 +13119,7 @@
       <w:r>
         <w:t xml:space="preserve">, and Rehman and Aftab, </w:t>
       </w:r>
-      <w:hyperlink r:id="rId109">
+      <w:hyperlink r:id="rId108">
         <w:r>
           <w:rPr>
             <w:color w:val="2F5597"/>
@@ -13152,7 +13140,7 @@
       <w:r>
         <w:t xml:space="preserve">Ahmad et al., </w:t>
       </w:r>
-      <w:hyperlink r:id="rId110">
+      <w:hyperlink r:id="rId109">
         <w:r>
           <w:rPr>
             <w:color w:val="2F5597"/>
@@ -13164,7 +13152,7 @@
       <w:r>
         <w:t xml:space="preserve">, 2025 preprint, with the </w:t>
       </w:r>
-      <w:hyperlink r:id="rId111">
+      <w:hyperlink r:id="rId110">
         <w:r>
           <w:rPr>
             <w:color w:val="2F5597"/>
@@ -13411,7 +13399,7 @@
             <w:r>
               <w:t xml:space="preserve">Synthetic multichannel signals plus </w:t>
             </w:r>
-            <w:hyperlink r:id="rId112">
+            <w:hyperlink r:id="rId111">
               <w:r>
                 <w:rPr>
                   <w:color w:val="2F5597"/>
@@ -13474,7 +13462,7 @@
             <w:r>
               <w:t xml:space="preserve">Ahmad, Wesemann, Waschkowski &amp; Khalid, </w:t>
             </w:r>
-            <w:hyperlink r:id="rId110">
+            <w:hyperlink r:id="rId109">
               <w:r>
                 <w:rPr>
                   <w:color w:val="2F5597"/>
@@ -13548,7 +13536,7 @@
       <w:r>
         <w:t xml:space="preserve"> of </w:t>
       </w:r>
-      <w:hyperlink r:id="rId112">
+      <w:hyperlink r:id="rId111">
         <w:r>
           <w:rPr>
             <w:color w:val="2F5597"/>
@@ -13575,7 +13563,7 @@
       <w:r>
         <w:t xml:space="preserve">Validate classical MVMD using the </w:t>
       </w:r>
-      <w:hyperlink r:id="rId113">
+      <w:hyperlink r:id="rId112">
         <w:r>
           <w:rPr>
             <w:color w:val="2F5597"/>
@@ -13587,7 +13575,7 @@
       <w:r>
         <w:t xml:space="preserve"> and an </w:t>
       </w:r>
-      <w:hyperlink r:id="rId114">
+      <w:hyperlink r:id="rId113">
         <w:r>
           <w:rPr>
             <w:color w:val="2F5597"/>
@@ -13599,7 +13587,7 @@
       <w:r>
         <w:t xml:space="preserve">. Reimplement the UVMD equations from the </w:t>
       </w:r>
-      <w:hyperlink r:id="rId110">
+      <w:hyperlink r:id="rId109">
         <w:r>
           <w:rPr>
             <w:color w:val="2F5597"/>

</xml_diff>